<commit_message>
Sprites are cheap 2
</commit_message>
<xml_diff>
--- a/LECTURES/SpritesAreCheap/SPRAJTY SĄ TANIE.docx
+++ b/LECTURES/SpritesAreCheap/SPRAJTY SĄ TANIE.docx
@@ -531,23 +531,7 @@
           <w:rFonts w:ascii="C64 Pro Mono" w:hAnsi="C64 Pro Mono"/>
           <w:color w:val="FFFFFF" w:themeColor="background1"/>
         </w:rPr>
-        <w:t xml:space="preserve"> (as </w:t>
-      </w:r>
-      <w:proofErr w:type="spellStart"/>
-      <w:r>
-        <w:rPr>
-          <w:rFonts w:ascii="C64 Pro Mono" w:hAnsi="C64 Pro Mono"/>
-          <w:color w:val="FFFFFF" w:themeColor="background1"/>
-        </w:rPr>
-        <w:t>LiveScript</w:t>
-      </w:r>
-      <w:proofErr w:type="spellEnd"/>
-      <w:r>
-        <w:rPr>
-          <w:rFonts w:ascii="C64 Pro Mono" w:hAnsi="C64 Pro Mono"/>
-          <w:color w:val="FFFFFF" w:themeColor="background1"/>
-        </w:rPr>
-        <w:t>)</w:t>
+        <w:t xml:space="preserve"> (as LiveScript)</w:t>
       </w:r>
       <w:r>
         <w:rPr>
@@ -774,7 +758,7 @@
         <w:pStyle w:val="ListParagraph"/>
         <w:numPr>
           <w:ilvl w:val="1"/>
-          <w:numId w:val="4"/>
+          <w:numId w:val="6"/>
         </w:numPr>
         <w:rPr>
           <w:rFonts w:ascii="C64 Pro Mono" w:hAnsi="C64 Pro Mono"/>
@@ -808,7 +792,7 @@
         <w:pStyle w:val="ListParagraph"/>
         <w:numPr>
           <w:ilvl w:val="1"/>
-          <w:numId w:val="4"/>
+          <w:numId w:val="6"/>
         </w:numPr>
         <w:rPr>
           <w:rFonts w:ascii="C64 Pro Mono" w:hAnsi="C64 Pro Mono"/>
@@ -919,7 +903,7 @@
         <w:pStyle w:val="ListParagraph"/>
         <w:numPr>
           <w:ilvl w:val="1"/>
-          <w:numId w:val="4"/>
+          <w:numId w:val="6"/>
         </w:numPr>
         <w:rPr>
           <w:rFonts w:ascii="C64 Pro Mono" w:hAnsi="C64 Pro Mono"/>
@@ -997,7 +981,7 @@
         <w:pStyle w:val="ListParagraph"/>
         <w:numPr>
           <w:ilvl w:val="1"/>
-          <w:numId w:val="4"/>
+          <w:numId w:val="6"/>
         </w:numPr>
         <w:rPr>
           <w:rFonts w:ascii="C64 Pro Mono" w:hAnsi="C64 Pro Mono"/>
@@ -1067,7 +1051,7 @@
         <w:pStyle w:val="ListParagraph"/>
         <w:numPr>
           <w:ilvl w:val="1"/>
-          <w:numId w:val="4"/>
+          <w:numId w:val="6"/>
         </w:numPr>
         <w:rPr>
           <w:rFonts w:ascii="C64 Pro Mono" w:hAnsi="C64 Pro Mono"/>
@@ -1217,7 +1201,7 @@
         <w:pStyle w:val="ListParagraph"/>
         <w:numPr>
           <w:ilvl w:val="1"/>
-          <w:numId w:val="4"/>
+          <w:numId w:val="6"/>
         </w:numPr>
         <w:rPr>
           <w:rFonts w:ascii="C64 Pro Mono" w:hAnsi="C64 Pro Mono"/>
@@ -1265,23 +1249,7 @@
           <w:rFonts w:ascii="C64 Pro Mono" w:hAnsi="C64 Pro Mono"/>
           <w:color w:val="FFFFFF" w:themeColor="background1"/>
         </w:rPr>
-        <w:t xml:space="preserve">), </w:t>
-      </w:r>
-      <w:proofErr w:type="gramStart"/>
-      <w:r>
-        <w:rPr>
-          <w:rFonts w:ascii="C64 Pro Mono" w:hAnsi="C64 Pro Mono"/>
-          <w:color w:val="FFFFFF" w:themeColor="background1"/>
-        </w:rPr>
-        <w:t>create(</w:t>
-      </w:r>
-      <w:proofErr w:type="gramEnd"/>
-      <w:r>
-        <w:rPr>
-          <w:rFonts w:ascii="C64 Pro Mono" w:hAnsi="C64 Pro Mono"/>
-          <w:color w:val="FFFFFF" w:themeColor="background1"/>
-        </w:rPr>
-        <w:t>) and update</w:t>
+        <w:t>), create() and update</w:t>
       </w:r>
     </w:p>
     <w:p>
@@ -1401,7 +1369,7 @@
         <w:pStyle w:val="ListParagraph"/>
         <w:numPr>
           <w:ilvl w:val="1"/>
-          <w:numId w:val="4"/>
+          <w:numId w:val="6"/>
         </w:numPr>
         <w:rPr>
           <w:rFonts w:ascii="C64 Pro Mono" w:hAnsi="C64 Pro Mono"/>
@@ -1414,17 +1382,8 @@
           <w:color w:val="FFFFFF" w:themeColor="background1"/>
         </w:rPr>
         <w:lastRenderedPageBreak/>
-        <w:t xml:space="preserve">Adding a </w:t>
-      </w:r>
-      <w:proofErr w:type="gramStart"/>
-      <w:r>
-        <w:rPr>
-          <w:rFonts w:ascii="C64 Pro Mono" w:hAnsi="C64 Pro Mono"/>
-          <w:color w:val="FFFFFF" w:themeColor="background1"/>
-        </w:rPr>
-        <w:t>sprite</w:t>
-      </w:r>
-      <w:proofErr w:type="gramEnd"/>
+        <w:t>Adding a sprite</w:t>
+      </w:r>
     </w:p>
     <w:p>
       <w:pPr>
@@ -1495,17 +1454,8 @@
           <w:color w:val="FFFFFF" w:themeColor="background1"/>
         </w:rPr>
         <w:lastRenderedPageBreak/>
-        <w:t xml:space="preserve">Our </w:t>
-      </w:r>
-      <w:proofErr w:type="gramStart"/>
-      <w:r>
-        <w:rPr>
-          <w:rFonts w:ascii="C64 Pro Mono" w:hAnsi="C64 Pro Mono"/>
-          <w:color w:val="FFFFFF" w:themeColor="background1"/>
-        </w:rPr>
-        <w:t>sprite</w:t>
-      </w:r>
-      <w:proofErr w:type="gramEnd"/>
+        <w:t>Our sprite</w:t>
+      </w:r>
       <w:r>
         <w:rPr>
           <w:rFonts w:ascii="C64 Pro Mono" w:hAnsi="C64 Pro Mono"/>
@@ -1608,10 +1558,10 @@
           <w:color w:val="FFFFFF" w:themeColor="background1"/>
         </w:rPr>
         <w:drawing>
-          <wp:inline distT="0" distB="0" distL="0" distR="0" wp14:anchorId="595A24CE" wp14:editId="64C5BEE3">
-            <wp:extent cx="1226926" cy="1707028"/>
-            <wp:effectExtent l="0" t="0" r="0" b="7620"/>
-            <wp:docPr id="122671045" name="Picture 2" descr="A white and black pixelated face&#10;&#10;AI-generated content may be incorrect."/>
+          <wp:inline distT="0" distB="0" distL="0" distR="0" wp14:anchorId="342BE4B9" wp14:editId="15C06C55">
+            <wp:extent cx="1092200" cy="1504351"/>
+            <wp:effectExtent l="0" t="0" r="0" b="635"/>
+            <wp:docPr id="583443998" name="Picture 2" descr="A blue and black pixelated heart&#10;&#10;AI-generated content may be incorrect."/>
             <wp:cNvGraphicFramePr>
               <a:graphicFrameLocks xmlns:a="http://schemas.openxmlformats.org/drawingml/2006/main" noChangeAspect="1"/>
             </wp:cNvGraphicFramePr>
@@ -1619,7 +1569,7 @@
               <a:graphicData uri="http://schemas.openxmlformats.org/drawingml/2006/picture">
                 <pic:pic xmlns:pic="http://schemas.openxmlformats.org/drawingml/2006/picture">
                   <pic:nvPicPr>
-                    <pic:cNvPr id="122671045" name="Picture 2" descr="A white and black pixelated face&#10;&#10;AI-generated content may be incorrect."/>
+                    <pic:cNvPr id="583443998" name="Picture 2" descr="A blue and black pixelated heart&#10;&#10;AI-generated content may be incorrect."/>
                     <pic:cNvPicPr/>
                   </pic:nvPicPr>
                   <pic:blipFill>
@@ -1637,7 +1587,7 @@
                   <pic:spPr>
                     <a:xfrm>
                       <a:off x="0" y="0"/>
-                      <a:ext cx="1226926" cy="1707028"/>
+                      <a:ext cx="1096545" cy="1510335"/>
                     </a:xfrm>
                     <a:prstGeom prst="rect">
                       <a:avLst/>
@@ -1649,6 +1599,183 @@
           </wp:inline>
         </w:drawing>
       </w:r>
+    </w:p>
+    <w:p>
+      <w:pPr>
+        <w:ind w:left="3600"/>
+        <w:rPr>
+          <w:rFonts w:ascii="C64 Pro Mono" w:hAnsi="C64 Pro Mono"/>
+          <w:color w:val="FFFFFF" w:themeColor="background1"/>
+        </w:rPr>
+      </w:pPr>
+    </w:p>
+    <w:p>
+      <w:pPr>
+        <w:ind w:left="3600"/>
+        <w:rPr>
+          <w:rFonts w:ascii="C64 Pro Mono" w:hAnsi="C64 Pro Mono"/>
+          <w:color w:val="FFFFFF" w:themeColor="background1"/>
+        </w:rPr>
+      </w:pPr>
+    </w:p>
+    <w:p>
+      <w:pPr>
+        <w:rPr>
+          <w:rFonts w:ascii="C64 Pro Mono" w:hAnsi="C64 Pro Mono"/>
+          <w:color w:val="FFFFFF" w:themeColor="background1"/>
+        </w:rPr>
+      </w:pPr>
+      <w:r>
+        <w:rPr>
+          <w:rFonts w:ascii="C64 Pro Mono" w:hAnsi="C64 Pro Mono"/>
+          <w:color w:val="FFFFFF" w:themeColor="background1"/>
+        </w:rPr>
+        <w:lastRenderedPageBreak/>
+        <w:t>Simple code to add a sprite:</w:t>
+      </w:r>
+    </w:p>
+    <w:p>
+      <w:pPr>
+        <w:rPr>
+          <w:rFonts w:ascii="C64 Pro Mono" w:hAnsi="C64 Pro Mono"/>
+          <w:color w:val="FFFFFF" w:themeColor="background1"/>
+        </w:rPr>
+      </w:pPr>
+      <w:r>
+        <w:rPr>
+          <w:rFonts w:ascii="C64 Pro Mono" w:hAnsi="C64 Pro Mono"/>
+          <w:noProof/>
+          <w:color w:val="FFFFFF" w:themeColor="background1"/>
+        </w:rPr>
+        <w:drawing>
+          <wp:inline distT="0" distB="0" distL="0" distR="0" wp14:anchorId="76718BFC" wp14:editId="27A325D4">
+            <wp:extent cx="5731510" cy="1790065"/>
+            <wp:effectExtent l="0" t="0" r="2540" b="635"/>
+            <wp:docPr id="1621717890" name="Picture 1" descr="A screen shot of a computer&#10;&#10;AI-generated content may be incorrect."/>
+            <wp:cNvGraphicFramePr>
+              <a:graphicFrameLocks xmlns:a="http://schemas.openxmlformats.org/drawingml/2006/main" noChangeAspect="1"/>
+            </wp:cNvGraphicFramePr>
+            <a:graphic xmlns:a="http://schemas.openxmlformats.org/drawingml/2006/main">
+              <a:graphicData uri="http://schemas.openxmlformats.org/drawingml/2006/picture">
+                <pic:pic xmlns:pic="http://schemas.openxmlformats.org/drawingml/2006/picture">
+                  <pic:nvPicPr>
+                    <pic:cNvPr id="1621717890" name="Picture 1" descr="A screen shot of a computer&#10;&#10;AI-generated content may be incorrect."/>
+                    <pic:cNvPicPr/>
+                  </pic:nvPicPr>
+                  <pic:blipFill>
+                    <a:blip r:embed="rId14"/>
+                    <a:stretch>
+                      <a:fillRect/>
+                    </a:stretch>
+                  </pic:blipFill>
+                  <pic:spPr>
+                    <a:xfrm>
+                      <a:off x="0" y="0"/>
+                      <a:ext cx="5731510" cy="1790065"/>
+                    </a:xfrm>
+                    <a:prstGeom prst="rect">
+                      <a:avLst/>
+                    </a:prstGeom>
+                  </pic:spPr>
+                </pic:pic>
+              </a:graphicData>
+            </a:graphic>
+          </wp:inline>
+        </w:drawing>
+      </w:r>
+    </w:p>
+    <w:p>
+      <w:pPr>
+        <w:jc w:val="both"/>
+        <w:rPr>
+          <w:rFonts w:ascii="C64 Pro Mono" w:hAnsi="C64 Pro Mono"/>
+          <w:color w:val="FFFFFF" w:themeColor="background1"/>
+        </w:rPr>
+      </w:pPr>
+      <w:r>
+        <w:rPr>
+          <w:rFonts w:ascii="C64 Pro Mono" w:hAnsi="C64 Pro Mono"/>
+          <w:noProof/>
+          <w:color w:val="FFFFFF" w:themeColor="background1"/>
+        </w:rPr>
+        <w:lastRenderedPageBreak/>
+        <w:drawing>
+          <wp:inline distT="0" distB="0" distL="0" distR="0" wp14:anchorId="301452B4" wp14:editId="4D97C06F">
+            <wp:extent cx="4674235" cy="3499485"/>
+            <wp:effectExtent l="0" t="0" r="0" b="5715"/>
+            <wp:docPr id="2021420401" name="Picture 1" descr="A screen shot of a computer&#10;&#10;AI-generated content may be incorrect."/>
+            <wp:cNvGraphicFramePr>
+              <a:graphicFrameLocks xmlns:a="http://schemas.openxmlformats.org/drawingml/2006/main" noChangeAspect="1"/>
+            </wp:cNvGraphicFramePr>
+            <a:graphic xmlns:a="http://schemas.openxmlformats.org/drawingml/2006/main">
+              <a:graphicData uri="http://schemas.openxmlformats.org/drawingml/2006/picture">
+                <pic:pic xmlns:pic="http://schemas.openxmlformats.org/drawingml/2006/picture">
+                  <pic:nvPicPr>
+                    <pic:cNvPr id="2021420401" name="Picture 1" descr="A screen shot of a computer&#10;&#10;AI-generated content may be incorrect."/>
+                    <pic:cNvPicPr/>
+                  </pic:nvPicPr>
+                  <pic:blipFill>
+                    <a:blip r:embed="rId15"/>
+                    <a:stretch>
+                      <a:fillRect/>
+                    </a:stretch>
+                  </pic:blipFill>
+                  <pic:spPr>
+                    <a:xfrm>
+                      <a:off x="0" y="0"/>
+                      <a:ext cx="4674235" cy="3499485"/>
+                    </a:xfrm>
+                    <a:prstGeom prst="rect">
+                      <a:avLst/>
+                    </a:prstGeom>
+                  </pic:spPr>
+                </pic:pic>
+              </a:graphicData>
+            </a:graphic>
+          </wp:inline>
+        </w:drawing>
+      </w:r>
+    </w:p>
+    <w:p>
+      <w:pPr>
+        <w:rPr>
+          <w:rFonts w:ascii="C64 Pro Mono" w:hAnsi="C64 Pro Mono"/>
+          <w:color w:val="FFFFFF" w:themeColor="background1"/>
+        </w:rPr>
+      </w:pPr>
+      <w:r>
+        <w:rPr>
+          <w:rFonts w:ascii="C64 Pro Mono" w:hAnsi="C64 Pro Mono"/>
+          <w:color w:val="FFFFFF" w:themeColor="background1"/>
+        </w:rPr>
+        <w:lastRenderedPageBreak/>
+        <w:t>3</w:t>
+      </w:r>
+      <w:r>
+        <w:rPr>
+          <w:rFonts w:ascii="C64 Pro Mono" w:hAnsi="C64 Pro Mono"/>
+          <w:color w:val="FFFFFF" w:themeColor="background1"/>
+        </w:rPr>
+        <w:t>.</w:t>
+      </w:r>
+      <w:r>
+        <w:rPr>
+          <w:rFonts w:ascii="C64 Pro Mono" w:hAnsi="C64 Pro Mono"/>
+          <w:color w:val="FFFFFF" w:themeColor="background1"/>
+          <w:sz w:val="28"/>
+          <w:szCs w:val="28"/>
+        </w:rPr>
+        <w:t>Live coding</w:t>
+      </w:r>
+    </w:p>
+    <w:p>
+      <w:pPr>
+        <w:jc w:val="both"/>
+        <w:rPr>
+          <w:rFonts w:ascii="C64 Pro Mono" w:hAnsi="C64 Pro Mono"/>
+          <w:color w:val="FFFFFF" w:themeColor="background1"/>
+        </w:rPr>
+      </w:pPr>
     </w:p>
     <w:sectPr>
       <w:pgSz w:w="11906" w:h="8391" w:orient="landscape" w:code="11"/>
@@ -2014,6 +2141,119 @@
     </w:lvl>
   </w:abstractNum>
   <w:abstractNum w:abstractNumId="3" w15:restartNumberingAfterBreak="0">
+    <w:nsid w:val="58B97065"/>
+    <w:multiLevelType w:val="multilevel"/>
+    <w:tmpl w:val="641ABADE"/>
+    <w:lvl w:ilvl="0">
+      <w:start w:val="2"/>
+      <w:numFmt w:val="decimal"/>
+      <w:lvlText w:val="%1"/>
+      <w:lvlJc w:val="left"/>
+      <w:pPr>
+        <w:ind w:left="660" w:hanging="660"/>
+      </w:pPr>
+      <w:rPr>
+        <w:rFonts w:hint="default"/>
+      </w:rPr>
+    </w:lvl>
+    <w:lvl w:ilvl="1">
+      <w:start w:val="1"/>
+      <w:numFmt w:val="decimal"/>
+      <w:lvlText w:val="%1.%2"/>
+      <w:lvlJc w:val="left"/>
+      <w:pPr>
+        <w:ind w:left="1800" w:hanging="720"/>
+      </w:pPr>
+      <w:rPr>
+        <w:rFonts w:hint="default"/>
+      </w:rPr>
+    </w:lvl>
+    <w:lvl w:ilvl="2">
+      <w:start w:val="1"/>
+      <w:numFmt w:val="decimal"/>
+      <w:lvlText w:val="%1.%2.%3"/>
+      <w:lvlJc w:val="left"/>
+      <w:pPr>
+        <w:ind w:left="3600" w:hanging="1440"/>
+      </w:pPr>
+      <w:rPr>
+        <w:rFonts w:hint="default"/>
+      </w:rPr>
+    </w:lvl>
+    <w:lvl w:ilvl="3">
+      <w:start w:val="1"/>
+      <w:numFmt w:val="decimal"/>
+      <w:lvlText w:val="%1.%2.%3.%4"/>
+      <w:lvlJc w:val="left"/>
+      <w:pPr>
+        <w:ind w:left="5040" w:hanging="1800"/>
+      </w:pPr>
+      <w:rPr>
+        <w:rFonts w:hint="default"/>
+      </w:rPr>
+    </w:lvl>
+    <w:lvl w:ilvl="4">
+      <w:start w:val="1"/>
+      <w:numFmt w:val="decimal"/>
+      <w:lvlText w:val="%1.%2.%3.%4.%5"/>
+      <w:lvlJc w:val="left"/>
+      <w:pPr>
+        <w:ind w:left="6480" w:hanging="2160"/>
+      </w:pPr>
+      <w:rPr>
+        <w:rFonts w:hint="default"/>
+      </w:rPr>
+    </w:lvl>
+    <w:lvl w:ilvl="5">
+      <w:start w:val="1"/>
+      <w:numFmt w:val="decimal"/>
+      <w:lvlText w:val="%1.%2.%3.%4.%5.%6"/>
+      <w:lvlJc w:val="left"/>
+      <w:pPr>
+        <w:ind w:left="7920" w:hanging="2520"/>
+      </w:pPr>
+      <w:rPr>
+        <w:rFonts w:hint="default"/>
+      </w:rPr>
+    </w:lvl>
+    <w:lvl w:ilvl="6">
+      <w:start w:val="1"/>
+      <w:numFmt w:val="decimal"/>
+      <w:lvlText w:val="%1.%2.%3.%4.%5.%6.%7"/>
+      <w:lvlJc w:val="left"/>
+      <w:pPr>
+        <w:ind w:left="9360" w:hanging="2880"/>
+      </w:pPr>
+      <w:rPr>
+        <w:rFonts w:hint="default"/>
+      </w:rPr>
+    </w:lvl>
+    <w:lvl w:ilvl="7">
+      <w:start w:val="1"/>
+      <w:numFmt w:val="decimal"/>
+      <w:lvlText w:val="%1.%2.%3.%4.%5.%6.%7.%8"/>
+      <w:lvlJc w:val="left"/>
+      <w:pPr>
+        <w:ind w:left="11160" w:hanging="3600"/>
+      </w:pPr>
+      <w:rPr>
+        <w:rFonts w:hint="default"/>
+      </w:rPr>
+    </w:lvl>
+    <w:lvl w:ilvl="8">
+      <w:start w:val="1"/>
+      <w:numFmt w:val="decimal"/>
+      <w:lvlText w:val="%1.%2.%3.%4.%5.%6.%7.%8.%9"/>
+      <w:lvlJc w:val="left"/>
+      <w:pPr>
+        <w:ind w:left="12600" w:hanging="3960"/>
+      </w:pPr>
+      <w:rPr>
+        <w:rFonts w:hint="default"/>
+      </w:rPr>
+    </w:lvl>
+  </w:abstractNum>
+  <w:abstractNum w:abstractNumId="4" w15:restartNumberingAfterBreak="0">
     <w:nsid w:val="6CC46C18"/>
     <w:multiLevelType w:val="multilevel"/>
     <w:tmpl w:val="A6442816"/>
@@ -2158,7 +2398,7 @@
       </w:rPr>
     </w:lvl>
   </w:abstractNum>
-  <w:abstractNum w:abstractNumId="4" w15:restartNumberingAfterBreak="0">
+  <w:abstractNum w:abstractNumId="5" w15:restartNumberingAfterBreak="0">
     <w:nsid w:val="756440C3"/>
     <w:multiLevelType w:val="hybridMultilevel"/>
     <w:tmpl w:val="2B3E460C"/>
@@ -2254,13 +2494,16 @@
     <w:abstractNumId w:val="1"/>
   </w:num>
   <w:num w:numId="3" w16cid:durableId="1854685009">
-    <w:abstractNumId w:val="4"/>
+    <w:abstractNumId w:val="5"/>
   </w:num>
   <w:num w:numId="4" w16cid:durableId="876353396">
-    <w:abstractNumId w:val="3"/>
+    <w:abstractNumId w:val="4"/>
   </w:num>
   <w:num w:numId="5" w16cid:durableId="562377112">
     <w:abstractNumId w:val="2"/>
+  </w:num>
+  <w:num w:numId="6" w16cid:durableId="871915255">
+    <w:abstractNumId w:val="3"/>
   </w:num>
 </w:numbering>
 </file>

</xml_diff>

<commit_message>
Sprites are cheap 3
</commit_message>
<xml_diff>
--- a/LECTURES/SpritesAreCheap/SPRAJTY SĄ TANIE.docx
+++ b/LECTURES/SpritesAreCheap/SPRAJTY SĄ TANIE.docx
@@ -531,7 +531,23 @@
           <w:rFonts w:ascii="C64 Pro Mono" w:hAnsi="C64 Pro Mono"/>
           <w:color w:val="FFFFFF" w:themeColor="background1"/>
         </w:rPr>
-        <w:t xml:space="preserve"> (as LiveScript)</w:t>
+        <w:t xml:space="preserve"> (as </w:t>
+      </w:r>
+      <w:proofErr w:type="spellStart"/>
+      <w:r>
+        <w:rPr>
+          <w:rFonts w:ascii="C64 Pro Mono" w:hAnsi="C64 Pro Mono"/>
+          <w:color w:val="FFFFFF" w:themeColor="background1"/>
+        </w:rPr>
+        <w:t>LiveScript</w:t>
+      </w:r>
+      <w:proofErr w:type="spellEnd"/>
+      <w:r>
+        <w:rPr>
+          <w:rFonts w:ascii="C64 Pro Mono" w:hAnsi="C64 Pro Mono"/>
+          <w:color w:val="FFFFFF" w:themeColor="background1"/>
+        </w:rPr>
+        <w:t>)</w:t>
       </w:r>
       <w:r>
         <w:rPr>
@@ -877,7 +893,7 @@
                     <pic:cNvPicPr/>
                   </pic:nvPicPr>
                   <pic:blipFill>
-                    <a:blip r:embed="rId5"/>
+                    <a:blip r:embed="rId6"/>
                     <a:stretch>
                       <a:fillRect/>
                     </a:stretch>
@@ -947,7 +963,7 @@
                     <pic:cNvPicPr/>
                   </pic:nvPicPr>
                   <pic:blipFill>
-                    <a:blip r:embed="rId6"/>
+                    <a:blip r:embed="rId7"/>
                     <a:stretch>
                       <a:fillRect/>
                     </a:stretch>
@@ -1025,7 +1041,7 @@
                     <pic:cNvPicPr/>
                   </pic:nvPicPr>
                   <pic:blipFill>
-                    <a:blip r:embed="rId7"/>
+                    <a:blip r:embed="rId8"/>
                     <a:stretch>
                       <a:fillRect/>
                     </a:stretch>
@@ -1095,7 +1111,7 @@
                     <pic:cNvPicPr/>
                   </pic:nvPicPr>
                   <pic:blipFill>
-                    <a:blip r:embed="rId8"/>
+                    <a:blip r:embed="rId9"/>
                     <a:stretch>
                       <a:fillRect/>
                     </a:stretch>
@@ -1175,7 +1191,7 @@
                     <pic:cNvPicPr/>
                   </pic:nvPicPr>
                   <pic:blipFill>
-                    <a:blip r:embed="rId9"/>
+                    <a:blip r:embed="rId10"/>
                     <a:stretch>
                       <a:fillRect/>
                     </a:stretch>
@@ -1249,7 +1265,23 @@
           <w:rFonts w:ascii="C64 Pro Mono" w:hAnsi="C64 Pro Mono"/>
           <w:color w:val="FFFFFF" w:themeColor="background1"/>
         </w:rPr>
-        <w:t>), create() and update</w:t>
+        <w:t xml:space="preserve">), </w:t>
+      </w:r>
+      <w:proofErr w:type="gramStart"/>
+      <w:r>
+        <w:rPr>
+          <w:rFonts w:ascii="C64 Pro Mono" w:hAnsi="C64 Pro Mono"/>
+          <w:color w:val="FFFFFF" w:themeColor="background1"/>
+        </w:rPr>
+        <w:t>create(</w:t>
+      </w:r>
+      <w:proofErr w:type="gramEnd"/>
+      <w:r>
+        <w:rPr>
+          <w:rFonts w:ascii="C64 Pro Mono" w:hAnsi="C64 Pro Mono"/>
+          <w:color w:val="FFFFFF" w:themeColor="background1"/>
+        </w:rPr>
+        <w:t>) and update</w:t>
       </w:r>
     </w:p>
     <w:p>
@@ -1281,7 +1313,7 @@
                     </pic:cNvPicPr>
                   </pic:nvPicPr>
                   <pic:blipFill>
-                    <a:blip r:embed="rId10">
+                    <a:blip r:embed="rId11">
                       <a:extLst>
                         <a:ext uri="{28A0092B-C50C-407E-A947-70E740481C1C}">
                           <a14:useLocalDpi xmlns:a14="http://schemas.microsoft.com/office/drawing/2010/main" val="0"/>
@@ -1343,7 +1375,7 @@
                     <pic:cNvPicPr/>
                   </pic:nvPicPr>
                   <pic:blipFill>
-                    <a:blip r:embed="rId11"/>
+                    <a:blip r:embed="rId12"/>
                     <a:stretch>
                       <a:fillRect/>
                     </a:stretch>
@@ -1382,8 +1414,17 @@
           <w:color w:val="FFFFFF" w:themeColor="background1"/>
         </w:rPr>
         <w:lastRenderedPageBreak/>
-        <w:t>Adding a sprite</w:t>
-      </w:r>
+        <w:t xml:space="preserve">Adding a </w:t>
+      </w:r>
+      <w:proofErr w:type="gramStart"/>
+      <w:r>
+        <w:rPr>
+          <w:rFonts w:ascii="C64 Pro Mono" w:hAnsi="C64 Pro Mono"/>
+          <w:color w:val="FFFFFF" w:themeColor="background1"/>
+        </w:rPr>
+        <w:t>sprite</w:t>
+      </w:r>
+      <w:proofErr w:type="gramEnd"/>
     </w:p>
     <w:p>
       <w:pPr>
@@ -1414,7 +1455,7 @@
                     <pic:cNvPicPr/>
                   </pic:nvPicPr>
                   <pic:blipFill>
-                    <a:blip r:embed="rId12">
+                    <a:blip r:embed="rId13">
                       <a:extLst>
                         <a:ext uri="{28A0092B-C50C-407E-A947-70E740481C1C}">
                           <a14:useLocalDpi xmlns:a14="http://schemas.microsoft.com/office/drawing/2010/main" val="0"/>
@@ -1454,8 +1495,17 @@
           <w:color w:val="FFFFFF" w:themeColor="background1"/>
         </w:rPr>
         <w:lastRenderedPageBreak/>
-        <w:t>Our sprite</w:t>
-      </w:r>
+        <w:t xml:space="preserve">Our </w:t>
+      </w:r>
+      <w:proofErr w:type="gramStart"/>
+      <w:r>
+        <w:rPr>
+          <w:rFonts w:ascii="C64 Pro Mono" w:hAnsi="C64 Pro Mono"/>
+          <w:color w:val="FFFFFF" w:themeColor="background1"/>
+        </w:rPr>
+        <w:t>sprite</w:t>
+      </w:r>
+      <w:proofErr w:type="gramEnd"/>
       <w:r>
         <w:rPr>
           <w:rFonts w:ascii="C64 Pro Mono" w:hAnsi="C64 Pro Mono"/>
@@ -1573,7 +1623,7 @@
                     <pic:cNvPicPr/>
                   </pic:nvPicPr>
                   <pic:blipFill>
-                    <a:blip r:embed="rId13">
+                    <a:blip r:embed="rId14">
                       <a:extLst>
                         <a:ext uri="{28A0092B-C50C-407E-A947-70E740481C1C}">
                           <a14:useLocalDpi xmlns:a14="http://schemas.microsoft.com/office/drawing/2010/main" val="0"/>
@@ -1663,7 +1713,7 @@
                     <pic:cNvPicPr/>
                   </pic:nvPicPr>
                   <pic:blipFill>
-                    <a:blip r:embed="rId14"/>
+                    <a:blip r:embed="rId15"/>
                     <a:stretch>
                       <a:fillRect/>
                     </a:stretch>
@@ -1715,7 +1765,7 @@
                     <pic:cNvPicPr/>
                   </pic:nvPicPr>
                   <pic:blipFill>
-                    <a:blip r:embed="rId15"/>
+                    <a:blip r:embed="rId16"/>
                     <a:stretch>
                       <a:fillRect/>
                     </a:stretch>
@@ -1749,14 +1799,7 @@
           <w:color w:val="FFFFFF" w:themeColor="background1"/>
         </w:rPr>
         <w:lastRenderedPageBreak/>
-        <w:t>3</w:t>
-      </w:r>
-      <w:r>
-        <w:rPr>
-          <w:rFonts w:ascii="C64 Pro Mono" w:hAnsi="C64 Pro Mono"/>
-          <w:color w:val="FFFFFF" w:themeColor="background1"/>
-        </w:rPr>
-        <w:t>.</w:t>
+        <w:t>3.</w:t>
       </w:r>
       <w:r>
         <w:rPr>
@@ -1773,6 +1816,1831 @@
         <w:jc w:val="both"/>
         <w:rPr>
           <w:rFonts w:ascii="C64 Pro Mono" w:hAnsi="C64 Pro Mono"/>
+          <w:color w:val="FFFFFF" w:themeColor="background1"/>
+        </w:rPr>
+      </w:pPr>
+    </w:p>
+    <w:p>
+      <w:pPr>
+        <w:jc w:val="both"/>
+        <w:rPr>
+          <w:rFonts w:ascii="C64 Pro Mono" w:hAnsi="C64 Pro Mono"/>
+          <w:color w:val="FFFFFF" w:themeColor="background1"/>
+        </w:rPr>
+      </w:pPr>
+    </w:p>
+    <w:p>
+      <w:pPr>
+        <w:jc w:val="both"/>
+        <w:rPr>
+          <w:rFonts w:ascii="C64 Pro Mono" w:hAnsi="C64 Pro Mono"/>
+          <w:color w:val="FFFFFF" w:themeColor="background1"/>
+        </w:rPr>
+      </w:pPr>
+    </w:p>
+    <w:p>
+      <w:pPr>
+        <w:jc w:val="both"/>
+        <w:rPr>
+          <w:rFonts w:ascii="C64 Pro Mono" w:hAnsi="C64 Pro Mono"/>
+          <w:color w:val="FFFFFF" w:themeColor="background1"/>
+        </w:rPr>
+      </w:pPr>
+    </w:p>
+    <w:p>
+      <w:pPr>
+        <w:jc w:val="both"/>
+        <w:rPr>
+          <w:rFonts w:ascii="C64 Pro Mono" w:hAnsi="C64 Pro Mono"/>
+          <w:color w:val="FFFFFF" w:themeColor="background1"/>
+        </w:rPr>
+      </w:pPr>
+    </w:p>
+    <w:p>
+      <w:pPr>
+        <w:jc w:val="both"/>
+        <w:rPr>
+          <w:rFonts w:ascii="C64 Pro Mono" w:hAnsi="C64 Pro Mono"/>
+          <w:color w:val="FFFFFF" w:themeColor="background1"/>
+        </w:rPr>
+      </w:pPr>
+    </w:p>
+    <w:p>
+      <w:pPr>
+        <w:jc w:val="both"/>
+        <w:rPr>
+          <w:rFonts w:ascii="C64 Pro Mono" w:hAnsi="C64 Pro Mono"/>
+          <w:color w:val="FFFFFF" w:themeColor="background1"/>
+        </w:rPr>
+      </w:pPr>
+    </w:p>
+    <w:p>
+      <w:pPr>
+        <w:jc w:val="both"/>
+        <w:rPr>
+          <w:rFonts w:ascii="C64 Pro Mono" w:hAnsi="C64 Pro Mono"/>
+          <w:color w:val="FFFFFF" w:themeColor="background1"/>
+        </w:rPr>
+      </w:pPr>
+    </w:p>
+    <w:p>
+      <w:pPr>
+        <w:jc w:val="both"/>
+        <w:rPr>
+          <w:rFonts w:ascii="C64 Pro Mono" w:hAnsi="C64 Pro Mono"/>
+          <w:color w:val="FFFFFF" w:themeColor="background1"/>
+        </w:rPr>
+      </w:pPr>
+    </w:p>
+    <w:p>
+      <w:pPr>
+        <w:jc w:val="both"/>
+        <w:rPr>
+          <w:rFonts w:ascii="C64 Pro Mono" w:hAnsi="C64 Pro Mono"/>
+          <w:color w:val="FFFFFF" w:themeColor="background1"/>
+        </w:rPr>
+      </w:pPr>
+    </w:p>
+    <w:p>
+      <w:pPr>
+        <w:jc w:val="both"/>
+        <w:rPr>
+          <w:rFonts w:ascii="C64 Pro Mono" w:hAnsi="C64 Pro Mono"/>
+          <w:color w:val="FFFFFF" w:themeColor="background1"/>
+        </w:rPr>
+      </w:pPr>
+    </w:p>
+    <w:p>
+      <w:pPr>
+        <w:jc w:val="both"/>
+        <w:rPr>
+          <w:rFonts w:ascii="C64 Pro Mono" w:hAnsi="C64 Pro Mono"/>
+          <w:color w:val="FFFFFF" w:themeColor="background1"/>
+        </w:rPr>
+      </w:pPr>
+    </w:p>
+    <w:p>
+      <w:pPr>
+        <w:jc w:val="both"/>
+        <w:rPr>
+          <w:rFonts w:ascii="C64 Pro Mono" w:hAnsi="C64 Pro Mono"/>
+          <w:color w:val="FFFFFF" w:themeColor="background1"/>
+        </w:rPr>
+      </w:pPr>
+    </w:p>
+    <w:p>
+      <w:pPr>
+        <w:jc w:val="both"/>
+        <w:rPr>
+          <w:rFonts w:ascii="C64 Pro Mono" w:hAnsi="C64 Pro Mono"/>
+          <w:color w:val="FFFFFF" w:themeColor="background1"/>
+        </w:rPr>
+      </w:pPr>
+      <w:r>
+        <w:rPr>
+          <w:rFonts w:asciiTheme="majorBidi" w:hAnsiTheme="majorBidi" w:cstheme="majorBidi"/>
+          <w:noProof/>
+          <w:color w:val="FFFFFF" w:themeColor="background1"/>
+          <w:sz w:val="16"/>
+          <w:szCs w:val="16"/>
+        </w:rPr>
+        <w:lastRenderedPageBreak/>
+        <mc:AlternateContent>
+          <mc:Choice Requires="wps">
+            <w:drawing>
+              <wp:anchor distT="45720" distB="45720" distL="114300" distR="114300" simplePos="0" relativeHeight="251659264" behindDoc="0" locked="0" layoutInCell="1" allowOverlap="1" wp14:anchorId="3AAE8F27" wp14:editId="15976196">
+                <wp:simplePos x="0" y="0"/>
+                <wp:positionH relativeFrom="margin">
+                  <wp:align>left</wp:align>
+                </wp:positionH>
+                <wp:positionV relativeFrom="paragraph">
+                  <wp:posOffset>203200</wp:posOffset>
+                </wp:positionV>
+                <wp:extent cx="6182360" cy="2672080"/>
+                <wp:effectExtent l="0" t="0" r="27940" b="13970"/>
+                <wp:wrapSquare wrapText="bothSides"/>
+                <wp:docPr id="217" name="Text Box 2"/>
+                <wp:cNvGraphicFramePr>
+                  <a:graphicFrameLocks xmlns:a="http://schemas.openxmlformats.org/drawingml/2006/main"/>
+                </wp:cNvGraphicFramePr>
+                <a:graphic xmlns:a="http://schemas.openxmlformats.org/drawingml/2006/main">
+                  <a:graphicData uri="http://schemas.microsoft.com/office/word/2010/wordprocessingShape">
+                    <wps:wsp>
+                      <wps:cNvSpPr txBox="1">
+                        <a:spLocks noChangeArrowheads="1"/>
+                      </wps:cNvSpPr>
+                      <wps:spPr bwMode="auto">
+                        <a:xfrm>
+                          <a:off x="0" y="0"/>
+                          <a:ext cx="6182360" cy="2672080"/>
+                        </a:xfrm>
+                        <a:prstGeom prst="rect">
+                          <a:avLst/>
+                        </a:prstGeom>
+                        <a:solidFill>
+                          <a:srgbClr val="FFFFFF"/>
+                        </a:solidFill>
+                        <a:ln w="9525">
+                          <a:solidFill>
+                            <a:srgbClr val="000000"/>
+                          </a:solidFill>
+                          <a:miter lim="800000"/>
+                          <a:headEnd/>
+                          <a:tailEnd/>
+                        </a:ln>
+                      </wps:spPr>
+                      <wps:txbx>
+                        <w:txbxContent>
+                          <w:p>
+                            <w:pPr>
+                              <w:rPr>
+                                <w:sz w:val="16"/>
+                                <w:szCs w:val="16"/>
+                              </w:rPr>
+                            </w:pPr>
+                            <w:r>
+                              <w:rPr>
+                                <w:sz w:val="16"/>
+                                <w:szCs w:val="16"/>
+                              </w:rPr>
+                              <w:t>&lt;html&gt;</w:t>
+                            </w:r>
+                            <w:r>
+                              <w:rPr>
+                                <w:sz w:val="16"/>
+                                <w:szCs w:val="16"/>
+                              </w:rPr>
+                              <w:br/>
+                              <w:t>&lt;head&gt;</w:t>
+                            </w:r>
+                            <w:r>
+                              <w:rPr>
+                                <w:sz w:val="16"/>
+                                <w:szCs w:val="16"/>
+                              </w:rPr>
+                              <w:br/>
+                              <w:t xml:space="preserve">    &lt;script src="https://cdn.jsdelivr.net/npm/phaser@3/dist/phaser.js"&gt;&lt;/script&gt;</w:t>
+                            </w:r>
+                            <w:r>
+                              <w:rPr>
+                                <w:sz w:val="16"/>
+                                <w:szCs w:val="16"/>
+                              </w:rPr>
+                              <w:br/>
+                              <w:t>&lt;/head&gt;</w:t>
+                            </w:r>
+                            <w:r>
+                              <w:rPr>
+                                <w:sz w:val="16"/>
+                                <w:szCs w:val="16"/>
+                              </w:rPr>
+                              <w:br/>
+                              <w:t>&lt;body&gt;</w:t>
+                            </w:r>
+                            <w:r>
+                              <w:rPr>
+                                <w:sz w:val="16"/>
+                                <w:szCs w:val="16"/>
+                              </w:rPr>
+                              <w:br/>
+                              <w:t xml:space="preserve">    &lt;div id="game-container"&gt;&lt;/div&gt;</w:t>
+                            </w:r>
+                            <w:r>
+                              <w:rPr>
+                                <w:sz w:val="16"/>
+                                <w:szCs w:val="16"/>
+                              </w:rPr>
+                              <w:br/>
+                              <w:t xml:space="preserve">    &lt;script&gt;</w:t>
+                            </w:r>
+                            <w:r>
+                              <w:rPr>
+                                <w:sz w:val="16"/>
+                                <w:szCs w:val="16"/>
+                              </w:rPr>
+                              <w:br/>
+                              <w:t xml:space="preserve">        const config = {</w:t>
+                            </w:r>
+                            <w:r>
+                              <w:rPr>
+                                <w:sz w:val="16"/>
+                                <w:szCs w:val="16"/>
+                              </w:rPr>
+                              <w:br/>
+                              <w:t xml:space="preserve">          type: </w:t>
+                            </w:r>
+                            <w:proofErr w:type="spellStart"/>
+                            <w:r>
+                              <w:rPr>
+                                <w:sz w:val="16"/>
+                                <w:szCs w:val="16"/>
+                              </w:rPr>
+                              <w:t>Phaser.AUTO</w:t>
+                            </w:r>
+                            <w:proofErr w:type="spellEnd"/>
+                            <w:r>
+                              <w:rPr>
+                                <w:sz w:val="16"/>
+                                <w:szCs w:val="16"/>
+                              </w:rPr>
+                              <w:t>, // rendering style (WebGL or Canvas)</w:t>
+                            </w:r>
+                            <w:r>
+                              <w:rPr>
+                                <w:sz w:val="16"/>
+                                <w:szCs w:val="16"/>
+                              </w:rPr>
+                              <w:br/>
+                              <w:t xml:space="preserve">          width: 800,</w:t>
+                            </w:r>
+                            <w:r>
+                              <w:rPr>
+                                <w:sz w:val="16"/>
+                                <w:szCs w:val="16"/>
+                              </w:rPr>
+                              <w:br/>
+                              <w:t xml:space="preserve">          height: 600,</w:t>
+                            </w:r>
+                            <w:r>
+                              <w:rPr>
+                                <w:sz w:val="16"/>
+                                <w:szCs w:val="16"/>
+                              </w:rPr>
+                              <w:br/>
+                              <w:t xml:space="preserve">          parent: 'game-container',</w:t>
+                            </w:r>
+                            <w:r>
+                              <w:rPr>
+                                <w:sz w:val="16"/>
+                                <w:szCs w:val="16"/>
+                              </w:rPr>
+                              <w:br/>
+                              <w:t xml:space="preserve">          scene: {</w:t>
+                            </w:r>
+                            <w:r>
+                              <w:rPr>
+                                <w:sz w:val="16"/>
+                                <w:szCs w:val="16"/>
+                              </w:rPr>
+                              <w:br/>
+                              <w:t xml:space="preserve">            preload: preload,</w:t>
+                            </w:r>
+                            <w:r>
+                              <w:rPr>
+                                <w:sz w:val="16"/>
+                                <w:szCs w:val="16"/>
+                              </w:rPr>
+                              <w:br/>
+                              <w:t xml:space="preserve">            create: create,</w:t>
+                            </w:r>
+                            <w:r>
+                              <w:rPr>
+                                <w:sz w:val="16"/>
+                                <w:szCs w:val="16"/>
+                              </w:rPr>
+                              <w:br/>
+                              <w:t xml:space="preserve">            update: update</w:t>
+                            </w:r>
+                            <w:r>
+                              <w:rPr>
+                                <w:sz w:val="16"/>
+                                <w:szCs w:val="16"/>
+                              </w:rPr>
+                              <w:br/>
+                              <w:t xml:space="preserve">          }</w:t>
+                            </w:r>
+                            <w:r>
+                              <w:rPr>
+                                <w:sz w:val="16"/>
+                                <w:szCs w:val="16"/>
+                              </w:rPr>
+                              <w:br/>
+                              <w:t xml:space="preserve">        };</w:t>
+                            </w:r>
+                            <w:r>
+                              <w:rPr>
+                                <w:sz w:val="16"/>
+                                <w:szCs w:val="16"/>
+                              </w:rPr>
+                              <w:br/>
+                            </w:r>
+                            <w:r>
+                              <w:rPr>
+                                <w:sz w:val="16"/>
+                                <w:szCs w:val="16"/>
+                              </w:rPr>
+                              <w:br/>
+                              <w:t xml:space="preserve">        const game = new </w:t>
+                            </w:r>
+                            <w:proofErr w:type="spellStart"/>
+                            <w:r>
+                              <w:rPr>
+                                <w:sz w:val="16"/>
+                                <w:szCs w:val="16"/>
+                              </w:rPr>
+                              <w:t>Phaser.Game</w:t>
+                            </w:r>
+                            <w:proofErr w:type="spellEnd"/>
+                            <w:r>
+                              <w:rPr>
+                                <w:sz w:val="16"/>
+                                <w:szCs w:val="16"/>
+                              </w:rPr>
+                              <w:t>(config);</w:t>
+                            </w:r>
+                            <w:r>
+                              <w:rPr>
+                                <w:sz w:val="16"/>
+                                <w:szCs w:val="16"/>
+                              </w:rPr>
+                              <w:br/>
+                              <w:t xml:space="preserve">        const </w:t>
+                            </w:r>
+                            <w:proofErr w:type="spellStart"/>
+                            <w:r>
+                              <w:rPr>
+                                <w:sz w:val="16"/>
+                                <w:szCs w:val="16"/>
+                              </w:rPr>
+                              <w:t>spritesCount</w:t>
+                            </w:r>
+                            <w:proofErr w:type="spellEnd"/>
+                            <w:r>
+                              <w:rPr>
+                                <w:sz w:val="16"/>
+                                <w:szCs w:val="16"/>
+                              </w:rPr>
+                              <w:t xml:space="preserve"> = 12;</w:t>
+                            </w:r>
+                            <w:r>
+                              <w:rPr>
+                                <w:sz w:val="16"/>
+                                <w:szCs w:val="16"/>
+                              </w:rPr>
+                              <w:br/>
+                              <w:t xml:space="preserve">        let sprites = [];</w:t>
+                            </w:r>
+                            <w:r>
+                              <w:rPr>
+                                <w:sz w:val="16"/>
+                                <w:szCs w:val="16"/>
+                              </w:rPr>
+                              <w:br/>
+                            </w:r>
+                            <w:r>
+                              <w:rPr>
+                                <w:sz w:val="16"/>
+                                <w:szCs w:val="16"/>
+                              </w:rPr>
+                              <w:br/>
+                              <w:t xml:space="preserve">        function preload() {</w:t>
+                            </w:r>
+                            <w:r>
+                              <w:rPr>
+                                <w:sz w:val="16"/>
+                                <w:szCs w:val="16"/>
+                              </w:rPr>
+                              <w:br/>
+                              <w:t xml:space="preserve">            </w:t>
+                            </w:r>
+                            <w:proofErr w:type="spellStart"/>
+                            <w:r>
+                              <w:rPr>
+                                <w:sz w:val="16"/>
+                                <w:szCs w:val="16"/>
+                              </w:rPr>
+                              <w:t>this.load.image</w:t>
+                            </w:r>
+                            <w:proofErr w:type="spellEnd"/>
+                            <w:r>
+                              <w:rPr>
+                                <w:sz w:val="16"/>
+                                <w:szCs w:val="16"/>
+                              </w:rPr>
+                              <w:t>('balloon', 'balloon.png');</w:t>
+                            </w:r>
+                            <w:r>
+                              <w:rPr>
+                                <w:sz w:val="16"/>
+                                <w:szCs w:val="16"/>
+                              </w:rPr>
+                              <w:br/>
+                              <w:t xml:space="preserve">        }</w:t>
+                            </w:r>
+                            <w:r>
+                              <w:rPr>
+                                <w:sz w:val="16"/>
+                                <w:szCs w:val="16"/>
+                              </w:rPr>
+                              <w:br/>
+                            </w:r>
+                            <w:r>
+                              <w:rPr>
+                                <w:sz w:val="16"/>
+                                <w:szCs w:val="16"/>
+                              </w:rPr>
+                              <w:br/>
+                              <w:t xml:space="preserve">        function create() {</w:t>
+                            </w:r>
+                            <w:r>
+                              <w:rPr>
+                                <w:sz w:val="16"/>
+                                <w:szCs w:val="16"/>
+                              </w:rPr>
+                              <w:br/>
+                              <w:t xml:space="preserve">            </w:t>
+                            </w:r>
+                            <w:proofErr w:type="spellStart"/>
+                            <w:r>
+                              <w:rPr>
+                                <w:sz w:val="16"/>
+                                <w:szCs w:val="16"/>
+                              </w:rPr>
+                              <w:t>this.add.text</w:t>
+                            </w:r>
+                            <w:proofErr w:type="spellEnd"/>
+                            <w:r>
+                              <w:rPr>
+                                <w:sz w:val="16"/>
+                                <w:szCs w:val="16"/>
+                              </w:rPr>
+                              <w:t xml:space="preserve">(20, 20, 'Super </w:t>
+                            </w:r>
+                            <w:proofErr w:type="spellStart"/>
+                            <w:r>
+                              <w:rPr>
+                                <w:sz w:val="16"/>
+                                <w:szCs w:val="16"/>
+                              </w:rPr>
+                              <w:t>fajna</w:t>
+                            </w:r>
+                            <w:proofErr w:type="spellEnd"/>
+                            <w:r>
+                              <w:rPr>
+                                <w:sz w:val="16"/>
+                                <w:szCs w:val="16"/>
+                              </w:rPr>
+                              <w:t xml:space="preserve"> </w:t>
+                            </w:r>
+                            <w:proofErr w:type="spellStart"/>
+                            <w:r>
+                              <w:rPr>
+                                <w:sz w:val="16"/>
+                                <w:szCs w:val="16"/>
+                              </w:rPr>
+                              <w:t>gra</w:t>
+                            </w:r>
+                            <w:proofErr w:type="spellEnd"/>
+                            <w:r>
+                              <w:rPr>
+                                <w:sz w:val="16"/>
+                                <w:szCs w:val="16"/>
+                              </w:rPr>
+                              <w:t>!', { font: '24px Arial', fill: '#</w:t>
+                            </w:r>
+                            <w:proofErr w:type="spellStart"/>
+                            <w:r>
+                              <w:rPr>
+                                <w:sz w:val="16"/>
+                                <w:szCs w:val="16"/>
+                              </w:rPr>
+                              <w:t>ffffff</w:t>
+                            </w:r>
+                            <w:proofErr w:type="spellEnd"/>
+                            <w:r>
+                              <w:rPr>
+                                <w:sz w:val="16"/>
+                                <w:szCs w:val="16"/>
+                              </w:rPr>
+                              <w:t>' });</w:t>
+                            </w:r>
+                            <w:r>
+                              <w:rPr>
+                                <w:sz w:val="16"/>
+                                <w:szCs w:val="16"/>
+                              </w:rPr>
+                              <w:br/>
+                            </w:r>
+                            <w:r>
+                              <w:rPr>
+                                <w:sz w:val="16"/>
+                                <w:szCs w:val="16"/>
+                              </w:rPr>
+                              <w:br/>
+                              <w:t xml:space="preserve">            for (let </w:t>
+                            </w:r>
+                            <w:proofErr w:type="spellStart"/>
+                            <w:r>
+                              <w:rPr>
+                                <w:sz w:val="16"/>
+                                <w:szCs w:val="16"/>
+                              </w:rPr>
+                              <w:t>i</w:t>
+                            </w:r>
+                            <w:proofErr w:type="spellEnd"/>
+                            <w:r>
+                              <w:rPr>
+                                <w:sz w:val="16"/>
+                                <w:szCs w:val="16"/>
+                              </w:rPr>
+                              <w:t xml:space="preserve"> = 0; </w:t>
+                            </w:r>
+                            <w:proofErr w:type="spellStart"/>
+                            <w:r>
+                              <w:rPr>
+                                <w:sz w:val="16"/>
+                                <w:szCs w:val="16"/>
+                              </w:rPr>
+                              <w:t>i</w:t>
+                            </w:r>
+                            <w:proofErr w:type="spellEnd"/>
+                            <w:r>
+                              <w:rPr>
+                                <w:sz w:val="16"/>
+                                <w:szCs w:val="16"/>
+                              </w:rPr>
+                              <w:t xml:space="preserve"> &lt; </w:t>
+                            </w:r>
+                            <w:proofErr w:type="spellStart"/>
+                            <w:r>
+                              <w:rPr>
+                                <w:sz w:val="16"/>
+                                <w:szCs w:val="16"/>
+                              </w:rPr>
+                              <w:t>spritesCount</w:t>
+                            </w:r>
+                            <w:proofErr w:type="spellEnd"/>
+                            <w:r>
+                              <w:rPr>
+                                <w:sz w:val="16"/>
+                                <w:szCs w:val="16"/>
+                              </w:rPr>
+                              <w:t xml:space="preserve">; </w:t>
+                            </w:r>
+                            <w:proofErr w:type="spellStart"/>
+                            <w:r>
+                              <w:rPr>
+                                <w:sz w:val="16"/>
+                                <w:szCs w:val="16"/>
+                              </w:rPr>
+                              <w:t>i</w:t>
+                            </w:r>
+                            <w:proofErr w:type="spellEnd"/>
+                            <w:r>
+                              <w:rPr>
+                                <w:sz w:val="16"/>
+                                <w:szCs w:val="16"/>
+                              </w:rPr>
+                              <w:t>++){</w:t>
+                            </w:r>
+                            <w:r>
+                              <w:rPr>
+                                <w:sz w:val="16"/>
+                                <w:szCs w:val="16"/>
+                              </w:rPr>
+                              <w:br/>
+                              <w:t xml:space="preserve">                let s = </w:t>
+                            </w:r>
+                            <w:proofErr w:type="spellStart"/>
+                            <w:r>
+                              <w:rPr>
+                                <w:sz w:val="16"/>
+                                <w:szCs w:val="16"/>
+                              </w:rPr>
+                              <w:t>this.add.sprite</w:t>
+                            </w:r>
+                            <w:proofErr w:type="spellEnd"/>
+                            <w:r>
+                              <w:rPr>
+                                <w:sz w:val="16"/>
+                                <w:szCs w:val="16"/>
+                              </w:rPr>
+                              <w:t>(</w:t>
+                            </w:r>
+                            <w:proofErr w:type="spellStart"/>
+                            <w:r>
+                              <w:rPr>
+                                <w:sz w:val="16"/>
+                                <w:szCs w:val="16"/>
+                              </w:rPr>
+                              <w:t>i</w:t>
+                            </w:r>
+                            <w:proofErr w:type="spellEnd"/>
+                            <w:r>
+                              <w:rPr>
+                                <w:sz w:val="16"/>
+                                <w:szCs w:val="16"/>
+                              </w:rPr>
+                              <w:t>, 12*i+200, 'balloon');</w:t>
+                            </w:r>
+                            <w:r>
+                              <w:rPr>
+                                <w:sz w:val="16"/>
+                                <w:szCs w:val="16"/>
+                              </w:rPr>
+                              <w:br/>
+                              <w:t xml:space="preserve">                </w:t>
+                            </w:r>
+                            <w:proofErr w:type="spellStart"/>
+                            <w:r>
+                              <w:rPr>
+                                <w:sz w:val="16"/>
+                                <w:szCs w:val="16"/>
+                              </w:rPr>
+                              <w:t>sprites.push</w:t>
+                            </w:r>
+                            <w:proofErr w:type="spellEnd"/>
+                            <w:r>
+                              <w:rPr>
+                                <w:sz w:val="16"/>
+                                <w:szCs w:val="16"/>
+                              </w:rPr>
+                              <w:t>(s);</w:t>
+                            </w:r>
+                            <w:r>
+                              <w:rPr>
+                                <w:sz w:val="16"/>
+                                <w:szCs w:val="16"/>
+                              </w:rPr>
+                              <w:br/>
+                              <w:t xml:space="preserve">            }</w:t>
+                            </w:r>
+                            <w:r>
+                              <w:rPr>
+                                <w:sz w:val="16"/>
+                                <w:szCs w:val="16"/>
+                              </w:rPr>
+                              <w:br/>
+                              <w:t xml:space="preserve">        }</w:t>
+                            </w:r>
+                            <w:r>
+                              <w:rPr>
+                                <w:sz w:val="16"/>
+                                <w:szCs w:val="16"/>
+                              </w:rPr>
+                              <w:br/>
+                            </w:r>
+                            <w:r>
+                              <w:rPr>
+                                <w:sz w:val="16"/>
+                                <w:szCs w:val="16"/>
+                              </w:rPr>
+                              <w:br/>
+                              <w:t xml:space="preserve">        function update() {</w:t>
+                            </w:r>
+                            <w:r>
+                              <w:rPr>
+                                <w:sz w:val="16"/>
+                                <w:szCs w:val="16"/>
+                              </w:rPr>
+                              <w:br/>
+                              <w:t xml:space="preserve">            for (let </w:t>
+                            </w:r>
+                            <w:proofErr w:type="spellStart"/>
+                            <w:r>
+                              <w:rPr>
+                                <w:sz w:val="16"/>
+                                <w:szCs w:val="16"/>
+                              </w:rPr>
+                              <w:t>i</w:t>
+                            </w:r>
+                            <w:proofErr w:type="spellEnd"/>
+                            <w:r>
+                              <w:rPr>
+                                <w:sz w:val="16"/>
+                                <w:szCs w:val="16"/>
+                              </w:rPr>
+                              <w:t xml:space="preserve"> = 0; </w:t>
+                            </w:r>
+                            <w:proofErr w:type="spellStart"/>
+                            <w:r>
+                              <w:rPr>
+                                <w:sz w:val="16"/>
+                                <w:szCs w:val="16"/>
+                              </w:rPr>
+                              <w:t>i</w:t>
+                            </w:r>
+                            <w:proofErr w:type="spellEnd"/>
+                            <w:r>
+                              <w:rPr>
+                                <w:sz w:val="16"/>
+                                <w:szCs w:val="16"/>
+                              </w:rPr>
+                              <w:t xml:space="preserve"> &lt; </w:t>
+                            </w:r>
+                            <w:proofErr w:type="spellStart"/>
+                            <w:r>
+                              <w:rPr>
+                                <w:sz w:val="16"/>
+                                <w:szCs w:val="16"/>
+                              </w:rPr>
+                              <w:t>spritesCount</w:t>
+                            </w:r>
+                            <w:proofErr w:type="spellEnd"/>
+                            <w:r>
+                              <w:rPr>
+                                <w:sz w:val="16"/>
+                                <w:szCs w:val="16"/>
+                              </w:rPr>
+                              <w:t xml:space="preserve">; </w:t>
+                            </w:r>
+                            <w:proofErr w:type="spellStart"/>
+                            <w:r>
+                              <w:rPr>
+                                <w:sz w:val="16"/>
+                                <w:szCs w:val="16"/>
+                              </w:rPr>
+                              <w:t>i</w:t>
+                            </w:r>
+                            <w:proofErr w:type="spellEnd"/>
+                            <w:r>
+                              <w:rPr>
+                                <w:sz w:val="16"/>
+                                <w:szCs w:val="16"/>
+                              </w:rPr>
+                              <w:t>++){</w:t>
+                            </w:r>
+                            <w:r>
+                              <w:rPr>
+                                <w:sz w:val="16"/>
+                                <w:szCs w:val="16"/>
+                              </w:rPr>
+                              <w:br/>
+                              <w:t xml:space="preserve">                if (sprites[</w:t>
+                            </w:r>
+                            <w:proofErr w:type="spellStart"/>
+                            <w:r>
+                              <w:rPr>
+                                <w:sz w:val="16"/>
+                                <w:szCs w:val="16"/>
+                              </w:rPr>
+                              <w:t>i</w:t>
+                            </w:r>
+                            <w:proofErr w:type="spellEnd"/>
+                            <w:r>
+                              <w:rPr>
+                                <w:sz w:val="16"/>
+                                <w:szCs w:val="16"/>
+                              </w:rPr>
+                              <w:t>].x &lt; 800)</w:t>
+                            </w:r>
+                            <w:r>
+                              <w:rPr>
+                                <w:sz w:val="16"/>
+                                <w:szCs w:val="16"/>
+                              </w:rPr>
+                              <w:br/>
+                              <w:t xml:space="preserve">                    sprites[</w:t>
+                            </w:r>
+                            <w:proofErr w:type="spellStart"/>
+                            <w:r>
+                              <w:rPr>
+                                <w:sz w:val="16"/>
+                                <w:szCs w:val="16"/>
+                              </w:rPr>
+                              <w:t>i</w:t>
+                            </w:r>
+                            <w:proofErr w:type="spellEnd"/>
+                            <w:r>
+                              <w:rPr>
+                                <w:sz w:val="16"/>
+                                <w:szCs w:val="16"/>
+                              </w:rPr>
+                              <w:t>].x += i+1;</w:t>
+                            </w:r>
+                            <w:r>
+                              <w:rPr>
+                                <w:sz w:val="16"/>
+                                <w:szCs w:val="16"/>
+                              </w:rPr>
+                              <w:br/>
+                              <w:t xml:space="preserve">                else</w:t>
+                            </w:r>
+                            <w:r>
+                              <w:rPr>
+                                <w:sz w:val="16"/>
+                                <w:szCs w:val="16"/>
+                              </w:rPr>
+                              <w:br/>
+                              <w:t xml:space="preserve">                    sprites[</w:t>
+                            </w:r>
+                            <w:proofErr w:type="spellStart"/>
+                            <w:r>
+                              <w:rPr>
+                                <w:sz w:val="16"/>
+                                <w:szCs w:val="16"/>
+                              </w:rPr>
+                              <w:t>i</w:t>
+                            </w:r>
+                            <w:proofErr w:type="spellEnd"/>
+                            <w:r>
+                              <w:rPr>
+                                <w:sz w:val="16"/>
+                                <w:szCs w:val="16"/>
+                              </w:rPr>
+                              <w:t>].x = 0;</w:t>
+                            </w:r>
+                            <w:r>
+                              <w:rPr>
+                                <w:sz w:val="16"/>
+                                <w:szCs w:val="16"/>
+                              </w:rPr>
+                              <w:br/>
+                              <w:t xml:space="preserve">            }</w:t>
+                            </w:r>
+                            <w:r>
+                              <w:rPr>
+                                <w:sz w:val="16"/>
+                                <w:szCs w:val="16"/>
+                              </w:rPr>
+                              <w:br/>
+                              <w:t xml:space="preserve">        }</w:t>
+                            </w:r>
+                            <w:r>
+                              <w:rPr>
+                                <w:sz w:val="16"/>
+                                <w:szCs w:val="16"/>
+                              </w:rPr>
+                              <w:br/>
+                              <w:t xml:space="preserve">    &lt;/script&gt;</w:t>
+                            </w:r>
+                            <w:r>
+                              <w:rPr>
+                                <w:sz w:val="16"/>
+                                <w:szCs w:val="16"/>
+                              </w:rPr>
+                              <w:br/>
+                              <w:t>&lt;/body&gt;</w:t>
+                            </w:r>
+                            <w:r>
+                              <w:rPr>
+                                <w:sz w:val="16"/>
+                                <w:szCs w:val="16"/>
+                              </w:rPr>
+                              <w:br/>
+                              <w:t>&lt;/html&gt;</w:t>
+                            </w:r>
+                          </w:p>
+                          <w:p>
+                            <w:pPr>
+                              <w:rPr>
+                                <w:sz w:val="16"/>
+                                <w:szCs w:val="16"/>
+                              </w:rPr>
+                            </w:pPr>
+                          </w:p>
+                        </w:txbxContent>
+                      </wps:txbx>
+                      <wps:bodyPr rot="0" vert="horz" wrap="square" lIns="91440" tIns="45720" rIns="91440" bIns="45720" anchor="t" anchorCtr="0">
+                        <a:noAutofit/>
+                      </wps:bodyPr>
+                    </wps:wsp>
+                  </a:graphicData>
+                </a:graphic>
+                <wp14:sizeRelH relativeFrom="margin">
+                  <wp14:pctWidth>0</wp14:pctWidth>
+                </wp14:sizeRelH>
+                <wp14:sizeRelV relativeFrom="margin">
+                  <wp14:pctHeight>0</wp14:pctHeight>
+                </wp14:sizeRelV>
+              </wp:anchor>
+            </w:drawing>
+          </mc:Choice>
+          <mc:Fallback>
+            <w:pict>
+              <v:shapetype w14:anchorId="3AAE8F27" id="_x0000_t202" coordsize="21600,21600" o:spt="202" path="m,l,21600r21600,l21600,xe">
+                <v:stroke joinstyle="miter"/>
+                <v:path gradientshapeok="t" o:connecttype="rect"/>
+              </v:shapetype>
+              <v:shape id="Text Box 2" o:spid="_x0000_s1026" type="#_x0000_t202" style="position:absolute;left:0;text-align:left;margin-left:0;margin-top:16pt;width:486.8pt;height:210.4pt;z-index:251659264;visibility:visible;mso-wrap-style:square;mso-width-percent:0;mso-height-percent:0;mso-wrap-distance-left:9pt;mso-wrap-distance-top:3.6pt;mso-wrap-distance-right:9pt;mso-wrap-distance-bottom:3.6pt;mso-position-horizontal:left;mso-position-horizontal-relative:margin;mso-position-vertical:absolute;mso-position-vertical-relative:text;mso-width-percent:0;mso-height-percent:0;mso-width-relative:margin;mso-height-relative:margin;v-text-anchor:top" o:gfxdata="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">
+                <v:textbox>
+                  <w:txbxContent>
+                    <w:p>
+                      <w:pPr>
+                        <w:rPr>
+                          <w:sz w:val="16"/>
+                          <w:szCs w:val="16"/>
+                        </w:rPr>
+                      </w:pPr>
+                      <w:r>
+                        <w:rPr>
+                          <w:sz w:val="16"/>
+                          <w:szCs w:val="16"/>
+                        </w:rPr>
+                        <w:t>&lt;html&gt;</w:t>
+                      </w:r>
+                      <w:r>
+                        <w:rPr>
+                          <w:sz w:val="16"/>
+                          <w:szCs w:val="16"/>
+                        </w:rPr>
+                        <w:br/>
+                        <w:t>&lt;head&gt;</w:t>
+                      </w:r>
+                      <w:r>
+                        <w:rPr>
+                          <w:sz w:val="16"/>
+                          <w:szCs w:val="16"/>
+                        </w:rPr>
+                        <w:br/>
+                        <w:t xml:space="preserve">    &lt;script src="https://cdn.jsdelivr.net/npm/phaser@3/dist/phaser.js"&gt;&lt;/script&gt;</w:t>
+                      </w:r>
+                      <w:r>
+                        <w:rPr>
+                          <w:sz w:val="16"/>
+                          <w:szCs w:val="16"/>
+                        </w:rPr>
+                        <w:br/>
+                        <w:t>&lt;/head&gt;</w:t>
+                      </w:r>
+                      <w:r>
+                        <w:rPr>
+                          <w:sz w:val="16"/>
+                          <w:szCs w:val="16"/>
+                        </w:rPr>
+                        <w:br/>
+                        <w:t>&lt;body&gt;</w:t>
+                      </w:r>
+                      <w:r>
+                        <w:rPr>
+                          <w:sz w:val="16"/>
+                          <w:szCs w:val="16"/>
+                        </w:rPr>
+                        <w:br/>
+                        <w:t xml:space="preserve">    &lt;div id="game-container"&gt;&lt;/div&gt;</w:t>
+                      </w:r>
+                      <w:r>
+                        <w:rPr>
+                          <w:sz w:val="16"/>
+                          <w:szCs w:val="16"/>
+                        </w:rPr>
+                        <w:br/>
+                        <w:t xml:space="preserve">    &lt;script&gt;</w:t>
+                      </w:r>
+                      <w:r>
+                        <w:rPr>
+                          <w:sz w:val="16"/>
+                          <w:szCs w:val="16"/>
+                        </w:rPr>
+                        <w:br/>
+                        <w:t xml:space="preserve">        const config = {</w:t>
+                      </w:r>
+                      <w:r>
+                        <w:rPr>
+                          <w:sz w:val="16"/>
+                          <w:szCs w:val="16"/>
+                        </w:rPr>
+                        <w:br/>
+                        <w:t xml:space="preserve">          type: </w:t>
+                      </w:r>
+                      <w:proofErr w:type="spellStart"/>
+                      <w:r>
+                        <w:rPr>
+                          <w:sz w:val="16"/>
+                          <w:szCs w:val="16"/>
+                        </w:rPr>
+                        <w:t>Phaser.AUTO</w:t>
+                      </w:r>
+                      <w:proofErr w:type="spellEnd"/>
+                      <w:r>
+                        <w:rPr>
+                          <w:sz w:val="16"/>
+                          <w:szCs w:val="16"/>
+                        </w:rPr>
+                        <w:t>, // rendering style (WebGL or Canvas)</w:t>
+                      </w:r>
+                      <w:r>
+                        <w:rPr>
+                          <w:sz w:val="16"/>
+                          <w:szCs w:val="16"/>
+                        </w:rPr>
+                        <w:br/>
+                        <w:t xml:space="preserve">          width: 800,</w:t>
+                      </w:r>
+                      <w:r>
+                        <w:rPr>
+                          <w:sz w:val="16"/>
+                          <w:szCs w:val="16"/>
+                        </w:rPr>
+                        <w:br/>
+                        <w:t xml:space="preserve">          height: 600,</w:t>
+                      </w:r>
+                      <w:r>
+                        <w:rPr>
+                          <w:sz w:val="16"/>
+                          <w:szCs w:val="16"/>
+                        </w:rPr>
+                        <w:br/>
+                        <w:t xml:space="preserve">          parent: 'game-container',</w:t>
+                      </w:r>
+                      <w:r>
+                        <w:rPr>
+                          <w:sz w:val="16"/>
+                          <w:szCs w:val="16"/>
+                        </w:rPr>
+                        <w:br/>
+                        <w:t xml:space="preserve">          scene: {</w:t>
+                      </w:r>
+                      <w:r>
+                        <w:rPr>
+                          <w:sz w:val="16"/>
+                          <w:szCs w:val="16"/>
+                        </w:rPr>
+                        <w:br/>
+                        <w:t xml:space="preserve">            preload: preload,</w:t>
+                      </w:r>
+                      <w:r>
+                        <w:rPr>
+                          <w:sz w:val="16"/>
+                          <w:szCs w:val="16"/>
+                        </w:rPr>
+                        <w:br/>
+                        <w:t xml:space="preserve">            create: create,</w:t>
+                      </w:r>
+                      <w:r>
+                        <w:rPr>
+                          <w:sz w:val="16"/>
+                          <w:szCs w:val="16"/>
+                        </w:rPr>
+                        <w:br/>
+                        <w:t xml:space="preserve">            update: update</w:t>
+                      </w:r>
+                      <w:r>
+                        <w:rPr>
+                          <w:sz w:val="16"/>
+                          <w:szCs w:val="16"/>
+                        </w:rPr>
+                        <w:br/>
+                        <w:t xml:space="preserve">          }</w:t>
+                      </w:r>
+                      <w:r>
+                        <w:rPr>
+                          <w:sz w:val="16"/>
+                          <w:szCs w:val="16"/>
+                        </w:rPr>
+                        <w:br/>
+                        <w:t xml:space="preserve">        };</w:t>
+                      </w:r>
+                      <w:r>
+                        <w:rPr>
+                          <w:sz w:val="16"/>
+                          <w:szCs w:val="16"/>
+                        </w:rPr>
+                        <w:br/>
+                      </w:r>
+                      <w:r>
+                        <w:rPr>
+                          <w:sz w:val="16"/>
+                          <w:szCs w:val="16"/>
+                        </w:rPr>
+                        <w:br/>
+                        <w:t xml:space="preserve">        const game = new </w:t>
+                      </w:r>
+                      <w:proofErr w:type="spellStart"/>
+                      <w:r>
+                        <w:rPr>
+                          <w:sz w:val="16"/>
+                          <w:szCs w:val="16"/>
+                        </w:rPr>
+                        <w:t>Phaser.Game</w:t>
+                      </w:r>
+                      <w:proofErr w:type="spellEnd"/>
+                      <w:r>
+                        <w:rPr>
+                          <w:sz w:val="16"/>
+                          <w:szCs w:val="16"/>
+                        </w:rPr>
+                        <w:t>(config);</w:t>
+                      </w:r>
+                      <w:r>
+                        <w:rPr>
+                          <w:sz w:val="16"/>
+                          <w:szCs w:val="16"/>
+                        </w:rPr>
+                        <w:br/>
+                        <w:t xml:space="preserve">        const </w:t>
+                      </w:r>
+                      <w:proofErr w:type="spellStart"/>
+                      <w:r>
+                        <w:rPr>
+                          <w:sz w:val="16"/>
+                          <w:szCs w:val="16"/>
+                        </w:rPr>
+                        <w:t>spritesCount</w:t>
+                      </w:r>
+                      <w:proofErr w:type="spellEnd"/>
+                      <w:r>
+                        <w:rPr>
+                          <w:sz w:val="16"/>
+                          <w:szCs w:val="16"/>
+                        </w:rPr>
+                        <w:t xml:space="preserve"> = 12;</w:t>
+                      </w:r>
+                      <w:r>
+                        <w:rPr>
+                          <w:sz w:val="16"/>
+                          <w:szCs w:val="16"/>
+                        </w:rPr>
+                        <w:br/>
+                        <w:t xml:space="preserve">        let sprites = [];</w:t>
+                      </w:r>
+                      <w:r>
+                        <w:rPr>
+                          <w:sz w:val="16"/>
+                          <w:szCs w:val="16"/>
+                        </w:rPr>
+                        <w:br/>
+                      </w:r>
+                      <w:r>
+                        <w:rPr>
+                          <w:sz w:val="16"/>
+                          <w:szCs w:val="16"/>
+                        </w:rPr>
+                        <w:br/>
+                        <w:t xml:space="preserve">        function preload() {</w:t>
+                      </w:r>
+                      <w:r>
+                        <w:rPr>
+                          <w:sz w:val="16"/>
+                          <w:szCs w:val="16"/>
+                        </w:rPr>
+                        <w:br/>
+                        <w:t xml:space="preserve">            </w:t>
+                      </w:r>
+                      <w:proofErr w:type="spellStart"/>
+                      <w:r>
+                        <w:rPr>
+                          <w:sz w:val="16"/>
+                          <w:szCs w:val="16"/>
+                        </w:rPr>
+                        <w:t>this.load.image</w:t>
+                      </w:r>
+                      <w:proofErr w:type="spellEnd"/>
+                      <w:r>
+                        <w:rPr>
+                          <w:sz w:val="16"/>
+                          <w:szCs w:val="16"/>
+                        </w:rPr>
+                        <w:t>('balloon', 'balloon.png');</w:t>
+                      </w:r>
+                      <w:r>
+                        <w:rPr>
+                          <w:sz w:val="16"/>
+                          <w:szCs w:val="16"/>
+                        </w:rPr>
+                        <w:br/>
+                        <w:t xml:space="preserve">        }</w:t>
+                      </w:r>
+                      <w:r>
+                        <w:rPr>
+                          <w:sz w:val="16"/>
+                          <w:szCs w:val="16"/>
+                        </w:rPr>
+                        <w:br/>
+                      </w:r>
+                      <w:r>
+                        <w:rPr>
+                          <w:sz w:val="16"/>
+                          <w:szCs w:val="16"/>
+                        </w:rPr>
+                        <w:br/>
+                        <w:t xml:space="preserve">        function create() {</w:t>
+                      </w:r>
+                      <w:r>
+                        <w:rPr>
+                          <w:sz w:val="16"/>
+                          <w:szCs w:val="16"/>
+                        </w:rPr>
+                        <w:br/>
+                        <w:t xml:space="preserve">            </w:t>
+                      </w:r>
+                      <w:proofErr w:type="spellStart"/>
+                      <w:r>
+                        <w:rPr>
+                          <w:sz w:val="16"/>
+                          <w:szCs w:val="16"/>
+                        </w:rPr>
+                        <w:t>this.add.text</w:t>
+                      </w:r>
+                      <w:proofErr w:type="spellEnd"/>
+                      <w:r>
+                        <w:rPr>
+                          <w:sz w:val="16"/>
+                          <w:szCs w:val="16"/>
+                        </w:rPr>
+                        <w:t xml:space="preserve">(20, 20, 'Super </w:t>
+                      </w:r>
+                      <w:proofErr w:type="spellStart"/>
+                      <w:r>
+                        <w:rPr>
+                          <w:sz w:val="16"/>
+                          <w:szCs w:val="16"/>
+                        </w:rPr>
+                        <w:t>fajna</w:t>
+                      </w:r>
+                      <w:proofErr w:type="spellEnd"/>
+                      <w:r>
+                        <w:rPr>
+                          <w:sz w:val="16"/>
+                          <w:szCs w:val="16"/>
+                        </w:rPr>
+                        <w:t xml:space="preserve"> </w:t>
+                      </w:r>
+                      <w:proofErr w:type="spellStart"/>
+                      <w:r>
+                        <w:rPr>
+                          <w:sz w:val="16"/>
+                          <w:szCs w:val="16"/>
+                        </w:rPr>
+                        <w:t>gra</w:t>
+                      </w:r>
+                      <w:proofErr w:type="spellEnd"/>
+                      <w:r>
+                        <w:rPr>
+                          <w:sz w:val="16"/>
+                          <w:szCs w:val="16"/>
+                        </w:rPr>
+                        <w:t>!', { font: '24px Arial', fill: '#</w:t>
+                      </w:r>
+                      <w:proofErr w:type="spellStart"/>
+                      <w:r>
+                        <w:rPr>
+                          <w:sz w:val="16"/>
+                          <w:szCs w:val="16"/>
+                        </w:rPr>
+                        <w:t>ffffff</w:t>
+                      </w:r>
+                      <w:proofErr w:type="spellEnd"/>
+                      <w:r>
+                        <w:rPr>
+                          <w:sz w:val="16"/>
+                          <w:szCs w:val="16"/>
+                        </w:rPr>
+                        <w:t>' });</w:t>
+                      </w:r>
+                      <w:r>
+                        <w:rPr>
+                          <w:sz w:val="16"/>
+                          <w:szCs w:val="16"/>
+                        </w:rPr>
+                        <w:br/>
+                      </w:r>
+                      <w:r>
+                        <w:rPr>
+                          <w:sz w:val="16"/>
+                          <w:szCs w:val="16"/>
+                        </w:rPr>
+                        <w:br/>
+                        <w:t xml:space="preserve">            for (let </w:t>
+                      </w:r>
+                      <w:proofErr w:type="spellStart"/>
+                      <w:r>
+                        <w:rPr>
+                          <w:sz w:val="16"/>
+                          <w:szCs w:val="16"/>
+                        </w:rPr>
+                        <w:t>i</w:t>
+                      </w:r>
+                      <w:proofErr w:type="spellEnd"/>
+                      <w:r>
+                        <w:rPr>
+                          <w:sz w:val="16"/>
+                          <w:szCs w:val="16"/>
+                        </w:rPr>
+                        <w:t xml:space="preserve"> = 0; </w:t>
+                      </w:r>
+                      <w:proofErr w:type="spellStart"/>
+                      <w:r>
+                        <w:rPr>
+                          <w:sz w:val="16"/>
+                          <w:szCs w:val="16"/>
+                        </w:rPr>
+                        <w:t>i</w:t>
+                      </w:r>
+                      <w:proofErr w:type="spellEnd"/>
+                      <w:r>
+                        <w:rPr>
+                          <w:sz w:val="16"/>
+                          <w:szCs w:val="16"/>
+                        </w:rPr>
+                        <w:t xml:space="preserve"> &lt; </w:t>
+                      </w:r>
+                      <w:proofErr w:type="spellStart"/>
+                      <w:r>
+                        <w:rPr>
+                          <w:sz w:val="16"/>
+                          <w:szCs w:val="16"/>
+                        </w:rPr>
+                        <w:t>spritesCount</w:t>
+                      </w:r>
+                      <w:proofErr w:type="spellEnd"/>
+                      <w:r>
+                        <w:rPr>
+                          <w:sz w:val="16"/>
+                          <w:szCs w:val="16"/>
+                        </w:rPr>
+                        <w:t xml:space="preserve">; </w:t>
+                      </w:r>
+                      <w:proofErr w:type="spellStart"/>
+                      <w:r>
+                        <w:rPr>
+                          <w:sz w:val="16"/>
+                          <w:szCs w:val="16"/>
+                        </w:rPr>
+                        <w:t>i</w:t>
+                      </w:r>
+                      <w:proofErr w:type="spellEnd"/>
+                      <w:r>
+                        <w:rPr>
+                          <w:sz w:val="16"/>
+                          <w:szCs w:val="16"/>
+                        </w:rPr>
+                        <w:t>++){</w:t>
+                      </w:r>
+                      <w:r>
+                        <w:rPr>
+                          <w:sz w:val="16"/>
+                          <w:szCs w:val="16"/>
+                        </w:rPr>
+                        <w:br/>
+                        <w:t xml:space="preserve">                let s = </w:t>
+                      </w:r>
+                      <w:proofErr w:type="spellStart"/>
+                      <w:r>
+                        <w:rPr>
+                          <w:sz w:val="16"/>
+                          <w:szCs w:val="16"/>
+                        </w:rPr>
+                        <w:t>this.add.sprite</w:t>
+                      </w:r>
+                      <w:proofErr w:type="spellEnd"/>
+                      <w:r>
+                        <w:rPr>
+                          <w:sz w:val="16"/>
+                          <w:szCs w:val="16"/>
+                        </w:rPr>
+                        <w:t>(</w:t>
+                      </w:r>
+                      <w:proofErr w:type="spellStart"/>
+                      <w:r>
+                        <w:rPr>
+                          <w:sz w:val="16"/>
+                          <w:szCs w:val="16"/>
+                        </w:rPr>
+                        <w:t>i</w:t>
+                      </w:r>
+                      <w:proofErr w:type="spellEnd"/>
+                      <w:r>
+                        <w:rPr>
+                          <w:sz w:val="16"/>
+                          <w:szCs w:val="16"/>
+                        </w:rPr>
+                        <w:t>, 12*i+200, 'balloon');</w:t>
+                      </w:r>
+                      <w:r>
+                        <w:rPr>
+                          <w:sz w:val="16"/>
+                          <w:szCs w:val="16"/>
+                        </w:rPr>
+                        <w:br/>
+                        <w:t xml:space="preserve">                </w:t>
+                      </w:r>
+                      <w:proofErr w:type="spellStart"/>
+                      <w:r>
+                        <w:rPr>
+                          <w:sz w:val="16"/>
+                          <w:szCs w:val="16"/>
+                        </w:rPr>
+                        <w:t>sprites.push</w:t>
+                      </w:r>
+                      <w:proofErr w:type="spellEnd"/>
+                      <w:r>
+                        <w:rPr>
+                          <w:sz w:val="16"/>
+                          <w:szCs w:val="16"/>
+                        </w:rPr>
+                        <w:t>(s);</w:t>
+                      </w:r>
+                      <w:r>
+                        <w:rPr>
+                          <w:sz w:val="16"/>
+                          <w:szCs w:val="16"/>
+                        </w:rPr>
+                        <w:br/>
+                        <w:t xml:space="preserve">            }</w:t>
+                      </w:r>
+                      <w:r>
+                        <w:rPr>
+                          <w:sz w:val="16"/>
+                          <w:szCs w:val="16"/>
+                        </w:rPr>
+                        <w:br/>
+                        <w:t xml:space="preserve">        }</w:t>
+                      </w:r>
+                      <w:r>
+                        <w:rPr>
+                          <w:sz w:val="16"/>
+                          <w:szCs w:val="16"/>
+                        </w:rPr>
+                        <w:br/>
+                      </w:r>
+                      <w:r>
+                        <w:rPr>
+                          <w:sz w:val="16"/>
+                          <w:szCs w:val="16"/>
+                        </w:rPr>
+                        <w:br/>
+                        <w:t xml:space="preserve">        function update() {</w:t>
+                      </w:r>
+                      <w:r>
+                        <w:rPr>
+                          <w:sz w:val="16"/>
+                          <w:szCs w:val="16"/>
+                        </w:rPr>
+                        <w:br/>
+                        <w:t xml:space="preserve">            for (let </w:t>
+                      </w:r>
+                      <w:proofErr w:type="spellStart"/>
+                      <w:r>
+                        <w:rPr>
+                          <w:sz w:val="16"/>
+                          <w:szCs w:val="16"/>
+                        </w:rPr>
+                        <w:t>i</w:t>
+                      </w:r>
+                      <w:proofErr w:type="spellEnd"/>
+                      <w:r>
+                        <w:rPr>
+                          <w:sz w:val="16"/>
+                          <w:szCs w:val="16"/>
+                        </w:rPr>
+                        <w:t xml:space="preserve"> = 0; </w:t>
+                      </w:r>
+                      <w:proofErr w:type="spellStart"/>
+                      <w:r>
+                        <w:rPr>
+                          <w:sz w:val="16"/>
+                          <w:szCs w:val="16"/>
+                        </w:rPr>
+                        <w:t>i</w:t>
+                      </w:r>
+                      <w:proofErr w:type="spellEnd"/>
+                      <w:r>
+                        <w:rPr>
+                          <w:sz w:val="16"/>
+                          <w:szCs w:val="16"/>
+                        </w:rPr>
+                        <w:t xml:space="preserve"> &lt; </w:t>
+                      </w:r>
+                      <w:proofErr w:type="spellStart"/>
+                      <w:r>
+                        <w:rPr>
+                          <w:sz w:val="16"/>
+                          <w:szCs w:val="16"/>
+                        </w:rPr>
+                        <w:t>spritesCount</w:t>
+                      </w:r>
+                      <w:proofErr w:type="spellEnd"/>
+                      <w:r>
+                        <w:rPr>
+                          <w:sz w:val="16"/>
+                          <w:szCs w:val="16"/>
+                        </w:rPr>
+                        <w:t xml:space="preserve">; </w:t>
+                      </w:r>
+                      <w:proofErr w:type="spellStart"/>
+                      <w:r>
+                        <w:rPr>
+                          <w:sz w:val="16"/>
+                          <w:szCs w:val="16"/>
+                        </w:rPr>
+                        <w:t>i</w:t>
+                      </w:r>
+                      <w:proofErr w:type="spellEnd"/>
+                      <w:r>
+                        <w:rPr>
+                          <w:sz w:val="16"/>
+                          <w:szCs w:val="16"/>
+                        </w:rPr>
+                        <w:t>++){</w:t>
+                      </w:r>
+                      <w:r>
+                        <w:rPr>
+                          <w:sz w:val="16"/>
+                          <w:szCs w:val="16"/>
+                        </w:rPr>
+                        <w:br/>
+                        <w:t xml:space="preserve">                if (sprites[</w:t>
+                      </w:r>
+                      <w:proofErr w:type="spellStart"/>
+                      <w:r>
+                        <w:rPr>
+                          <w:sz w:val="16"/>
+                          <w:szCs w:val="16"/>
+                        </w:rPr>
+                        <w:t>i</w:t>
+                      </w:r>
+                      <w:proofErr w:type="spellEnd"/>
+                      <w:r>
+                        <w:rPr>
+                          <w:sz w:val="16"/>
+                          <w:szCs w:val="16"/>
+                        </w:rPr>
+                        <w:t>].x &lt; 800)</w:t>
+                      </w:r>
+                      <w:r>
+                        <w:rPr>
+                          <w:sz w:val="16"/>
+                          <w:szCs w:val="16"/>
+                        </w:rPr>
+                        <w:br/>
+                        <w:t xml:space="preserve">                    sprites[</w:t>
+                      </w:r>
+                      <w:proofErr w:type="spellStart"/>
+                      <w:r>
+                        <w:rPr>
+                          <w:sz w:val="16"/>
+                          <w:szCs w:val="16"/>
+                        </w:rPr>
+                        <w:t>i</w:t>
+                      </w:r>
+                      <w:proofErr w:type="spellEnd"/>
+                      <w:r>
+                        <w:rPr>
+                          <w:sz w:val="16"/>
+                          <w:szCs w:val="16"/>
+                        </w:rPr>
+                        <w:t>].x += i+1;</w:t>
+                      </w:r>
+                      <w:r>
+                        <w:rPr>
+                          <w:sz w:val="16"/>
+                          <w:szCs w:val="16"/>
+                        </w:rPr>
+                        <w:br/>
+                        <w:t xml:space="preserve">                else</w:t>
+                      </w:r>
+                      <w:r>
+                        <w:rPr>
+                          <w:sz w:val="16"/>
+                          <w:szCs w:val="16"/>
+                        </w:rPr>
+                        <w:br/>
+                        <w:t xml:space="preserve">                    sprites[</w:t>
+                      </w:r>
+                      <w:proofErr w:type="spellStart"/>
+                      <w:r>
+                        <w:rPr>
+                          <w:sz w:val="16"/>
+                          <w:szCs w:val="16"/>
+                        </w:rPr>
+                        <w:t>i</w:t>
+                      </w:r>
+                      <w:proofErr w:type="spellEnd"/>
+                      <w:r>
+                        <w:rPr>
+                          <w:sz w:val="16"/>
+                          <w:szCs w:val="16"/>
+                        </w:rPr>
+                        <w:t>].x = 0;</w:t>
+                      </w:r>
+                      <w:r>
+                        <w:rPr>
+                          <w:sz w:val="16"/>
+                          <w:szCs w:val="16"/>
+                        </w:rPr>
+                        <w:br/>
+                        <w:t xml:space="preserve">            }</w:t>
+                      </w:r>
+                      <w:r>
+                        <w:rPr>
+                          <w:sz w:val="16"/>
+                          <w:szCs w:val="16"/>
+                        </w:rPr>
+                        <w:br/>
+                        <w:t xml:space="preserve">        }</w:t>
+                      </w:r>
+                      <w:r>
+                        <w:rPr>
+                          <w:sz w:val="16"/>
+                          <w:szCs w:val="16"/>
+                        </w:rPr>
+                        <w:br/>
+                        <w:t xml:space="preserve">    &lt;/script&gt;</w:t>
+                      </w:r>
+                      <w:r>
+                        <w:rPr>
+                          <w:sz w:val="16"/>
+                          <w:szCs w:val="16"/>
+                        </w:rPr>
+                        <w:br/>
+                        <w:t>&lt;/body&gt;</w:t>
+                      </w:r>
+                      <w:r>
+                        <w:rPr>
+                          <w:sz w:val="16"/>
+                          <w:szCs w:val="16"/>
+                        </w:rPr>
+                        <w:br/>
+                        <w:t>&lt;/html&gt;</w:t>
+                      </w:r>
+                    </w:p>
+                    <w:p>
+                      <w:pPr>
+                        <w:rPr>
+                          <w:sz w:val="16"/>
+                          <w:szCs w:val="16"/>
+                        </w:rPr>
+                      </w:pPr>
+                    </w:p>
+                  </w:txbxContent>
+                </v:textbox>
+                <w10:wrap type="square" anchorx="margin"/>
+              </v:shape>
+            </w:pict>
+          </mc:Fallback>
+        </mc:AlternateContent>
+      </w:r>
+      <w:r>
+        <w:rPr>
+          <w:rFonts w:ascii="C64 Pro Mono" w:hAnsi="C64 Pro Mono"/>
+          <w:color w:val="FFFFFF" w:themeColor="background1"/>
+        </w:rPr>
+        <w:t>Code with 12 sprites:</w:t>
+      </w:r>
+    </w:p>
+    <w:p>
+      <w:pPr>
+        <w:jc w:val="both"/>
+        <w:rPr>
+          <w:rFonts w:ascii="C64 Pro Mono" w:hAnsi="C64 Pro Mono"/>
+          <w:color w:val="FFFFFF" w:themeColor="background1"/>
+        </w:rPr>
+      </w:pPr>
+    </w:p>
+    <w:p>
+      <w:pPr>
+        <w:jc w:val="both"/>
+        <w:rPr>
+          <w:rFonts w:asciiTheme="majorBidi" w:hAnsiTheme="majorBidi" w:cstheme="majorBidi"/>
+          <w:color w:val="FFFFFF" w:themeColor="background1"/>
+          <w:sz w:val="16"/>
+          <w:szCs w:val="16"/>
+        </w:rPr>
+      </w:pPr>
+    </w:p>
+    <w:p>
+      <w:pPr>
+        <w:jc w:val="both"/>
+        <w:rPr>
+          <w:rFonts w:ascii="C64 Pro Mono" w:hAnsi="C64 Pro Mono" w:cstheme="majorBidi"/>
+          <w:color w:val="FFFFFF" w:themeColor="background1"/>
+        </w:rPr>
+      </w:pPr>
+      <w:r>
+        <w:rPr>
+          <w:rFonts w:ascii="C64 Pro Mono" w:hAnsi="C64 Pro Mono" w:cstheme="majorBidi"/>
+          <w:color w:val="FFFFFF" w:themeColor="background1"/>
+        </w:rPr>
+        <w:lastRenderedPageBreak/>
+        <w:t>Code with 1234 sprites</w:t>
+      </w:r>
+    </w:p>
+    <w:p>
+      <w:pPr>
+        <w:jc w:val="both"/>
+        <w:rPr>
+          <w:rFonts w:asciiTheme="majorBidi" w:hAnsiTheme="majorBidi" w:cstheme="majorBidi"/>
+          <w:color w:val="FFFFFF" w:themeColor="background1"/>
+          <w:sz w:val="16"/>
+          <w:szCs w:val="16"/>
+        </w:rPr>
+      </w:pPr>
+      <w:r>
+        <w:rPr>
+          <w:rFonts w:asciiTheme="majorBidi" w:hAnsiTheme="majorBidi" w:cstheme="majorBidi"/>
+          <w:noProof/>
+          <w:color w:val="FFFFFF" w:themeColor="background1"/>
+          <w:sz w:val="16"/>
+          <w:szCs w:val="16"/>
+        </w:rPr>
+        <w:drawing>
+          <wp:inline distT="0" distB="0" distL="0" distR="0" wp14:anchorId="42C8F893" wp14:editId="4C347C64">
+            <wp:extent cx="4272280" cy="3217785"/>
+            <wp:effectExtent l="0" t="0" r="0" b="1905"/>
+            <wp:docPr id="294895731" name="Picture 1" descr="A screenshot of a computer program"/>
+            <wp:cNvGraphicFramePr>
+              <a:graphicFrameLocks xmlns:a="http://schemas.openxmlformats.org/drawingml/2006/main" noChangeAspect="1"/>
+            </wp:cNvGraphicFramePr>
+            <a:graphic xmlns:a="http://schemas.openxmlformats.org/drawingml/2006/main">
+              <a:graphicData uri="http://schemas.openxmlformats.org/drawingml/2006/picture">
+                <pic:pic xmlns:pic="http://schemas.openxmlformats.org/drawingml/2006/picture">
+                  <pic:nvPicPr>
+                    <pic:cNvPr id="294895731" name="Picture 1" descr="A screenshot of a computer program"/>
+                    <pic:cNvPicPr/>
+                  </pic:nvPicPr>
+                  <pic:blipFill>
+                    <a:blip r:embed="rId17"/>
+                    <a:stretch>
+                      <a:fillRect/>
+                    </a:stretch>
+                  </pic:blipFill>
+                  <pic:spPr>
+                    <a:xfrm>
+                      <a:off x="0" y="0"/>
+                      <a:ext cx="4279594" cy="3223293"/>
+                    </a:xfrm>
+                    <a:prstGeom prst="rect">
+                      <a:avLst/>
+                    </a:prstGeom>
+                  </pic:spPr>
+                </pic:pic>
+              </a:graphicData>
+            </a:graphic>
+          </wp:inline>
+        </w:drawing>
+      </w:r>
+    </w:p>
+    <w:p>
+      <w:pPr>
+        <w:jc w:val="both"/>
+        <w:rPr>
+          <w:rFonts w:ascii="C64 Pro Mono" w:hAnsi="C64 Pro Mono" w:cstheme="majorBidi"/>
+          <w:color w:val="FFFFFF" w:themeColor="background1"/>
+        </w:rPr>
+      </w:pPr>
+      <w:r>
+        <w:rPr>
+          <w:rFonts w:ascii="C64 Pro Mono" w:hAnsi="C64 Pro Mono" w:cstheme="majorBidi"/>
+          <w:color w:val="FFFFFF" w:themeColor="background1"/>
+        </w:rPr>
+        <w:lastRenderedPageBreak/>
+        <w:t xml:space="preserve">Introducing </w:t>
+      </w:r>
+      <w:proofErr w:type="gramStart"/>
+      <w:r>
+        <w:rPr>
+          <w:rFonts w:ascii="C64 Pro Mono" w:hAnsi="C64 Pro Mono" w:cstheme="majorBidi"/>
+          <w:color w:val="FFFFFF" w:themeColor="background1"/>
+        </w:rPr>
+        <w:t>player</w:t>
+      </w:r>
+      <w:proofErr w:type="gramEnd"/>
+    </w:p>
+    <w:p>
+      <w:pPr>
+        <w:jc w:val="both"/>
+        <w:rPr>
+          <w:rFonts w:ascii="C64 Pro Mono" w:hAnsi="C64 Pro Mono" w:cstheme="majorBidi"/>
+          <w:color w:val="FFFFFF" w:themeColor="background1"/>
+        </w:rPr>
+      </w:pPr>
+    </w:p>
+    <w:p>
+      <w:pPr>
+        <w:jc w:val="both"/>
+        <w:rPr>
+          <w:rFonts w:ascii="C64 Pro Mono" w:hAnsi="C64 Pro Mono" w:cstheme="majorBidi"/>
           <w:color w:val="FFFFFF" w:themeColor="background1"/>
         </w:rPr>
       </w:pPr>
@@ -3816,4 +5684,16 @@
     </a:ext>
   </a:extLst>
 </a:theme>
+</file>
+
+<file path=customXml/item1.xml><?xml version="1.0" encoding="utf-8"?>
+<b:Sources xmlns:b="http://schemas.openxmlformats.org/officeDocument/2006/bibliography" xmlns="http://schemas.openxmlformats.org/officeDocument/2006/bibliography" SelectedStyle="\APASixthEditionOfficeOnline.xsl" StyleName="APA" Version="6"/>
+</file>
+
+<file path=customXml/itemProps1.xml><?xml version="1.0" encoding="utf-8"?>
+<ds:datastoreItem xmlns:ds="http://schemas.openxmlformats.org/officeDocument/2006/customXml" ds:itemID="{B796134C-3B5C-4597-92B1-6A3C990E78E3}">
+  <ds:schemaRefs>
+    <ds:schemaRef ds:uri="http://schemas.openxmlformats.org/officeDocument/2006/bibliography"/>
+  </ds:schemaRefs>
+</ds:datastoreItem>
 </file>
</xml_diff>

<commit_message>
Sprites are cheap 4
</commit_message>
<xml_diff>
--- a/LECTURES/SpritesAreCheap/SPRAJTY SĄ TANIE.docx
+++ b/LECTURES/SpritesAreCheap/SPRAJTY SĄ TANIE.docx
@@ -55,19 +55,17 @@
           <w:iCs/>
           <w:color w:val="FFFFFF" w:themeColor="background1"/>
         </w:rPr>
-        <w:t>How to write a retro-style game in JavaScript</w:t>
-      </w:r>
-    </w:p>
-    <w:p>
-      <w:pPr>
-        <w:jc w:val="center"/>
+        <w:t>Writing</w:t>
+      </w:r>
+      <w:r>
         <w:rPr>
           <w:rFonts w:ascii="C64 Pro Mono" w:hAnsi="C64 Pro Mono"/>
           <w:i/>
           <w:iCs/>
           <w:color w:val="FFFFFF" w:themeColor="background1"/>
         </w:rPr>
-      </w:pPr>
+        <w:t xml:space="preserve"> a retro-style game in JavaScript</w:t>
+      </w:r>
     </w:p>
     <w:p>
       <w:pPr>
@@ -127,6 +125,191 @@
     <w:p>
       <w:pPr>
         <w:jc w:val="center"/>
+        <w:rPr>
+          <w:rFonts w:ascii="C64 Pro Mono" w:hAnsi="C64 Pro Mono"/>
+          <w:i/>
+          <w:iCs/>
+          <w:color w:val="FFFFFF" w:themeColor="background1"/>
+        </w:rPr>
+      </w:pPr>
+    </w:p>
+    <w:p>
+      <w:pPr>
+        <w:rPr>
+          <w:rFonts w:ascii="C64 Pro Mono" w:hAnsi="C64 Pro Mono"/>
+          <w:color w:val="FFFFFF" w:themeColor="background1"/>
+          <w:sz w:val="28"/>
+          <w:szCs w:val="28"/>
+        </w:rPr>
+      </w:pPr>
+      <w:r>
+        <w:rPr>
+          <w:rFonts w:ascii="C64 Pro Mono" w:hAnsi="C64 Pro Mono"/>
+          <w:color w:val="FFFFFF" w:themeColor="background1"/>
+          <w:sz w:val="28"/>
+          <w:szCs w:val="28"/>
+        </w:rPr>
+        <w:br w:type="page"/>
+      </w:r>
+      <w:r>
+        <w:rPr>
+          <w:rFonts w:ascii="C64 Pro Mono" w:hAnsi="C64 Pro Mono"/>
+          <w:color w:val="FFFFFF" w:themeColor="background1"/>
+          <w:sz w:val="28"/>
+          <w:szCs w:val="28"/>
+        </w:rPr>
+        <w:lastRenderedPageBreak/>
+        <w:t xml:space="preserve">Is writing a 2D game easier nowadays than 30-40 years ago? </w:t>
+      </w:r>
+    </w:p>
+    <w:p>
+      <w:pPr>
+        <w:rPr>
+          <w:rFonts w:ascii="C64 Pro Mono" w:hAnsi="C64 Pro Mono"/>
+          <w:i/>
+          <w:iCs/>
+          <w:color w:val="FFFFFF" w:themeColor="background1"/>
+          <w:sz w:val="28"/>
+          <w:szCs w:val="28"/>
+        </w:rPr>
+      </w:pPr>
+    </w:p>
+    <w:p>
+      <w:pPr>
+        <w:rPr>
+          <w:rFonts w:ascii="C64 Pro Mono" w:hAnsi="C64 Pro Mono"/>
+          <w:color w:val="FFFFFF" w:themeColor="background1"/>
+          <w:sz w:val="28"/>
+          <w:szCs w:val="28"/>
+        </w:rPr>
+      </w:pPr>
+      <w:r>
+        <w:rPr>
+          <w:rFonts w:ascii="C64 Pro Mono" w:hAnsi="C64 Pro Mono"/>
+          <w:color w:val="FFFFFF" w:themeColor="background1"/>
+          <w:sz w:val="28"/>
+          <w:szCs w:val="28"/>
+        </w:rPr>
+        <w:t>Do</w:t>
+      </w:r>
+      <w:r>
+        <w:rPr>
+          <w:rFonts w:ascii="C64 Pro Mono" w:hAnsi="C64 Pro Mono"/>
+          <w:color w:val="FFFFFF" w:themeColor="background1"/>
+          <w:sz w:val="28"/>
+          <w:szCs w:val="28"/>
+        </w:rPr>
+        <w:t xml:space="preserve"> current tools </w:t>
+      </w:r>
+      <w:r>
+        <w:rPr>
+          <w:rFonts w:ascii="C64 Pro Mono" w:hAnsi="C64 Pro Mono"/>
+          <w:color w:val="FFFFFF" w:themeColor="background1"/>
+          <w:sz w:val="28"/>
+          <w:szCs w:val="28"/>
+        </w:rPr>
+        <w:t>allow us</w:t>
+      </w:r>
+      <w:r>
+        <w:rPr>
+          <w:rFonts w:ascii="C64 Pro Mono" w:hAnsi="C64 Pro Mono"/>
+          <w:color w:val="FFFFFF" w:themeColor="background1"/>
+          <w:sz w:val="28"/>
+          <w:szCs w:val="28"/>
+        </w:rPr>
+        <w:t xml:space="preserve"> to easily create and manage sprites?</w:t>
+      </w:r>
+    </w:p>
+    <w:p>
+      <w:pPr>
+        <w:rPr>
+          <w:rFonts w:ascii="C64 Pro Mono" w:hAnsi="C64 Pro Mono"/>
+          <w:color w:val="FFFFFF" w:themeColor="background1"/>
+          <w:sz w:val="28"/>
+          <w:szCs w:val="28"/>
+        </w:rPr>
+      </w:pPr>
+    </w:p>
+    <w:p>
+      <w:pPr>
+        <w:rPr>
+          <w:rFonts w:ascii="C64 Pro Mono" w:hAnsi="C64 Pro Mono"/>
+          <w:color w:val="FFFFFF" w:themeColor="background1"/>
+          <w:sz w:val="28"/>
+          <w:szCs w:val="28"/>
+        </w:rPr>
+      </w:pPr>
+      <w:r>
+        <w:rPr>
+          <w:rFonts w:ascii="C64 Pro Mono" w:hAnsi="C64 Pro Mono"/>
+          <w:color w:val="FFFFFF" w:themeColor="background1"/>
+          <w:sz w:val="28"/>
+          <w:szCs w:val="28"/>
+        </w:rPr>
+        <w:t xml:space="preserve">Are sprites cheap nowadays? </w:t>
+      </w:r>
+    </w:p>
+    <w:p>
+      <w:pPr>
+        <w:rPr>
+          <w:rFonts w:ascii="C64 Pro Mono" w:hAnsi="C64 Pro Mono"/>
+          <w:color w:val="FFFFFF" w:themeColor="background1"/>
+          <w:sz w:val="28"/>
+          <w:szCs w:val="28"/>
+        </w:rPr>
+      </w:pPr>
+    </w:p>
+    <w:p>
+      <w:pPr>
+        <w:rPr>
+          <w:rFonts w:ascii="C64 Pro Mono" w:hAnsi="C64 Pro Mono"/>
+          <w:color w:val="FFFFFF" w:themeColor="background1"/>
+          <w:sz w:val="28"/>
+          <w:szCs w:val="28"/>
+        </w:rPr>
+      </w:pPr>
+    </w:p>
+    <w:p>
+      <w:pPr>
+        <w:rPr>
+          <w:rFonts w:ascii="C64 Pro Mono" w:hAnsi="C64 Pro Mono"/>
+          <w:color w:val="FFFFFF" w:themeColor="background1"/>
+          <w:sz w:val="28"/>
+          <w:szCs w:val="28"/>
+        </w:rPr>
+      </w:pPr>
+    </w:p>
+    <w:p>
+      <w:pPr>
+        <w:rPr>
+          <w:rFonts w:ascii="C64 Pro Mono" w:hAnsi="C64 Pro Mono"/>
+          <w:color w:val="FFFFFF" w:themeColor="background1"/>
+          <w:sz w:val="28"/>
+          <w:szCs w:val="28"/>
+        </w:rPr>
+      </w:pPr>
+    </w:p>
+    <w:p>
+      <w:pPr>
+        <w:rPr>
+          <w:rFonts w:ascii="C64 Pro Mono" w:hAnsi="C64 Pro Mono"/>
+          <w:color w:val="FFFFFF" w:themeColor="background1"/>
+          <w:sz w:val="28"/>
+          <w:szCs w:val="28"/>
+        </w:rPr>
+      </w:pPr>
+      <w:r>
+        <w:rPr>
+          <w:rFonts w:ascii="C64 Pro Mono" w:hAnsi="C64 Pro Mono"/>
+          <w:color w:val="FFFFFF" w:themeColor="background1"/>
+          <w:sz w:val="28"/>
+          <w:szCs w:val="28"/>
+        </w:rPr>
+        <w:br w:type="page"/>
+      </w:r>
+    </w:p>
+    <w:p>
+      <w:pPr>
         <w:rPr>
           <w:rFonts w:ascii="C64 Pro Mono" w:hAnsi="C64 Pro Mono"/>
           <w:i/>
@@ -264,21 +447,7 @@
           <w:rFonts w:ascii="C64 Pro Mono" w:hAnsi="C64 Pro Mono"/>
           <w:color w:val="FFFFFF" w:themeColor="background1"/>
         </w:rPr>
-        <w:t xml:space="preserve"> +</w:t>
-      </w:r>
-      <w:r>
-        <w:rPr>
-          <w:rFonts w:ascii="C64 Pro Mono" w:hAnsi="C64 Pro Mono"/>
-          <w:color w:val="FFFFFF" w:themeColor="background1"/>
-        </w:rPr>
         <w:t xml:space="preserve"> </w:t>
-      </w:r>
-      <w:r>
-        <w:rPr>
-          <w:rFonts w:ascii="C64 Pro Mono" w:hAnsi="C64 Pro Mono"/>
-          <w:color w:val="FFFFFF" w:themeColor="background1"/>
-        </w:rPr>
-        <w:t>sprites creation</w:t>
       </w:r>
     </w:p>
     <w:p>
@@ -310,11 +479,111 @@
         </w:rPr>
         <w:t>Live coding</w:t>
       </w:r>
+      <w:r>
+        <w:rPr>
+          <w:rFonts w:ascii="C64 Pro Mono" w:hAnsi="C64 Pro Mono"/>
+          <w:color w:val="FFFFFF" w:themeColor="background1"/>
+        </w:rPr>
+        <w:t>:</w:t>
+      </w:r>
+    </w:p>
+    <w:p>
+      <w:pPr>
+        <w:pStyle w:val="ListParagraph"/>
+        <w:rPr>
+          <w:rFonts w:ascii="C64 Pro Mono" w:hAnsi="C64 Pro Mono"/>
+          <w:color w:val="FFFFFF" w:themeColor="background1"/>
+        </w:rPr>
+      </w:pPr>
     </w:p>
     <w:p>
       <w:pPr>
         <w:pStyle w:val="ListParagraph"/>
         <w:ind w:left="1080"/>
+        <w:rPr>
+          <w:rFonts w:ascii="C64 Pro Mono" w:hAnsi="C64 Pro Mono"/>
+          <w:color w:val="FFFFFF" w:themeColor="background1"/>
+        </w:rPr>
+      </w:pPr>
+      <w:r>
+        <w:rPr>
+          <w:rFonts w:ascii="C64 Pro Mono" w:hAnsi="C64 Pro Mono"/>
+          <w:color w:val="FFFFFF" w:themeColor="background1"/>
+        </w:rPr>
+        <w:t>static sprite</w:t>
+      </w:r>
+    </w:p>
+    <w:p>
+      <w:pPr>
+        <w:pStyle w:val="ListParagraph"/>
+        <w:ind w:left="1080"/>
+        <w:rPr>
+          <w:rFonts w:ascii="C64 Pro Mono" w:hAnsi="C64 Pro Mono"/>
+          <w:color w:val="FFFFFF" w:themeColor="background1"/>
+        </w:rPr>
+      </w:pPr>
+      <w:r>
+        <w:rPr>
+          <w:rFonts w:ascii="C64 Pro Mono" w:hAnsi="C64 Pro Mono"/>
+          <w:color w:val="FFFFFF" w:themeColor="background1"/>
+        </w:rPr>
+        <w:t>multiple sprites</w:t>
+      </w:r>
+    </w:p>
+    <w:p>
+      <w:pPr>
+        <w:pStyle w:val="ListParagraph"/>
+        <w:ind w:left="1080"/>
+        <w:rPr>
+          <w:rFonts w:ascii="C64 Pro Mono" w:hAnsi="C64 Pro Mono"/>
+          <w:color w:val="FFFFFF" w:themeColor="background1"/>
+        </w:rPr>
+      </w:pPr>
+      <w:r>
+        <w:rPr>
+          <w:rFonts w:ascii="C64 Pro Mono" w:hAnsi="C64 Pro Mono"/>
+          <w:color w:val="FFFFFF" w:themeColor="background1"/>
+        </w:rPr>
+        <w:t>animated sprite</w:t>
+      </w:r>
+    </w:p>
+    <w:p>
+      <w:pPr>
+        <w:pStyle w:val="ListParagraph"/>
+        <w:ind w:left="1080"/>
+        <w:rPr>
+          <w:rFonts w:ascii="C64 Pro Mono" w:hAnsi="C64 Pro Mono"/>
+          <w:color w:val="FFFFFF" w:themeColor="background1"/>
+        </w:rPr>
+      </w:pPr>
+      <w:r>
+        <w:rPr>
+          <w:rFonts w:ascii="C64 Pro Mono" w:hAnsi="C64 Pro Mono"/>
+          <w:color w:val="FFFFFF" w:themeColor="background1"/>
+        </w:rPr>
+        <w:t>sprite controls</w:t>
+      </w:r>
+    </w:p>
+    <w:p>
+      <w:pPr>
+        <w:pStyle w:val="ListParagraph"/>
+        <w:ind w:left="1080"/>
+        <w:rPr>
+          <w:rFonts w:ascii="C64 Pro Mono" w:hAnsi="C64 Pro Mono"/>
+          <w:color w:val="FFFFFF" w:themeColor="background1"/>
+        </w:rPr>
+      </w:pPr>
+      <w:r>
+        <w:rPr>
+          <w:rFonts w:ascii="C64 Pro Mono" w:hAnsi="C64 Pro Mono"/>
+          <w:color w:val="FFFFFF" w:themeColor="background1"/>
+        </w:rPr>
+        <w:t>collisions</w:t>
+      </w:r>
+    </w:p>
+    <w:p>
+      <w:pPr>
+        <w:pStyle w:val="ListParagraph"/>
         <w:rPr>
           <w:rFonts w:ascii="C64 Pro Mono" w:hAnsi="C64 Pro Mono"/>
           <w:color w:val="FFFFFF" w:themeColor="background1"/>
@@ -338,99 +607,37 @@
           <w:rFonts w:ascii="C64 Pro Mono" w:hAnsi="C64 Pro Mono"/>
           <w:color w:val="FFFFFF" w:themeColor="background1"/>
         </w:rPr>
-        <w:t>Other examples</w:t>
-      </w:r>
-    </w:p>
-    <w:p>
-      <w:pPr>
-        <w:pStyle w:val="ListParagraph"/>
-        <w:rPr>
-          <w:rFonts w:ascii="C64 Pro Mono" w:hAnsi="C64 Pro Mono"/>
-          <w:color w:val="FFFFFF" w:themeColor="background1"/>
-        </w:rPr>
-      </w:pPr>
-    </w:p>
-    <w:p>
-      <w:pPr>
-        <w:pStyle w:val="ListParagraph"/>
-        <w:numPr>
-          <w:ilvl w:val="0"/>
-          <w:numId w:val="1"/>
-        </w:numPr>
-        <w:rPr>
-          <w:rFonts w:ascii="C64 Pro Mono" w:hAnsi="C64 Pro Mono"/>
-          <w:color w:val="FFFFFF" w:themeColor="background1"/>
-        </w:rPr>
-      </w:pPr>
-      <w:r>
-        <w:rPr>
-          <w:rFonts w:ascii="C64 Pro Mono" w:hAnsi="C64 Pro Mono"/>
-          <w:color w:val="FFFFFF" w:themeColor="background1"/>
-        </w:rPr>
         <w:t>Summary</w:t>
       </w:r>
     </w:p>
     <w:p>
       <w:pPr>
-        <w:pStyle w:val="ListParagraph"/>
-        <w:rPr>
-          <w:rFonts w:ascii="C64 Pro Mono" w:hAnsi="C64 Pro Mono"/>
-          <w:color w:val="FFFFFF" w:themeColor="background1"/>
-        </w:rPr>
-      </w:pPr>
-    </w:p>
-    <w:p>
-      <w:pPr>
-        <w:rPr>
-          <w:rFonts w:ascii="C64 Pro Mono" w:hAnsi="C64 Pro Mono"/>
-          <w:color w:val="FFFFFF" w:themeColor="background1"/>
-        </w:rPr>
-      </w:pPr>
-    </w:p>
-    <w:p>
-      <w:pPr>
-        <w:rPr>
-          <w:rFonts w:ascii="C64 Pro Mono" w:hAnsi="C64 Pro Mono"/>
-          <w:color w:val="FFFFFF" w:themeColor="background1"/>
-        </w:rPr>
-      </w:pPr>
-    </w:p>
-    <w:p>
-      <w:pPr>
-        <w:rPr>
-          <w:rFonts w:ascii="C64 Pro Mono" w:hAnsi="C64 Pro Mono"/>
-          <w:color w:val="FFFFFF" w:themeColor="background1"/>
-        </w:rPr>
-      </w:pPr>
-    </w:p>
-    <w:p>
-      <w:pPr>
-        <w:rPr>
-          <w:rFonts w:ascii="C64 Pro Mono" w:hAnsi="C64 Pro Mono"/>
-          <w:color w:val="FFFFFF" w:themeColor="background1"/>
-        </w:rPr>
-      </w:pPr>
-    </w:p>
-    <w:p>
-      <w:pPr>
-        <w:rPr>
-          <w:rFonts w:ascii="C64 Pro Mono" w:hAnsi="C64 Pro Mono"/>
-          <w:color w:val="FFFFFF" w:themeColor="background1"/>
-        </w:rPr>
-      </w:pPr>
-    </w:p>
-    <w:p>
-      <w:pPr>
-        <w:rPr>
-          <w:rFonts w:ascii="C64 Pro Mono" w:hAnsi="C64 Pro Mono"/>
-          <w:color w:val="FFFFFF" w:themeColor="background1"/>
-        </w:rPr>
-      </w:pPr>
-      <w:r>
-        <w:rPr>
-          <w:rFonts w:ascii="C64 Pro Mono" w:hAnsi="C64 Pro Mono"/>
-          <w:color w:val="FFFFFF" w:themeColor="background1"/>
-        </w:rPr>
+        <w:rPr>
+          <w:rFonts w:ascii="C64 Pro Mono" w:hAnsi="C64 Pro Mono"/>
+          <w:color w:val="FFFFFF" w:themeColor="background1"/>
+        </w:rPr>
+      </w:pPr>
+      <w:r>
+        <w:rPr>
+          <w:rFonts w:ascii="C64 Pro Mono" w:hAnsi="C64 Pro Mono"/>
+          <w:color w:val="FFFFFF" w:themeColor="background1"/>
+        </w:rPr>
+        <w:br w:type="page"/>
+      </w:r>
+    </w:p>
+    <w:p>
+      <w:pPr>
+        <w:rPr>
+          <w:rFonts w:ascii="C64 Pro Mono" w:hAnsi="C64 Pro Mono"/>
+          <w:color w:val="FFFFFF" w:themeColor="background1"/>
+        </w:rPr>
+      </w:pPr>
+      <w:r>
+        <w:rPr>
+          <w:rFonts w:ascii="C64 Pro Mono" w:hAnsi="C64 Pro Mono"/>
+          <w:color w:val="FFFFFF" w:themeColor="background1"/>
+        </w:rPr>
+        <w:lastRenderedPageBreak/>
         <w:t>1.</w:t>
       </w:r>
       <w:r>
@@ -531,23 +738,7 @@
           <w:rFonts w:ascii="C64 Pro Mono" w:hAnsi="C64 Pro Mono"/>
           <w:color w:val="FFFFFF" w:themeColor="background1"/>
         </w:rPr>
-        <w:t xml:space="preserve"> (as </w:t>
-      </w:r>
-      <w:proofErr w:type="spellStart"/>
-      <w:r>
-        <w:rPr>
-          <w:rFonts w:ascii="C64 Pro Mono" w:hAnsi="C64 Pro Mono"/>
-          <w:color w:val="FFFFFF" w:themeColor="background1"/>
-        </w:rPr>
-        <w:t>LiveScript</w:t>
-      </w:r>
-      <w:proofErr w:type="spellEnd"/>
-      <w:r>
-        <w:rPr>
-          <w:rFonts w:ascii="C64 Pro Mono" w:hAnsi="C64 Pro Mono"/>
-          <w:color w:val="FFFFFF" w:themeColor="background1"/>
-        </w:rPr>
-        <w:t>)</w:t>
+        <w:t xml:space="preserve"> (as LiveScript)</w:t>
       </w:r>
       <w:r>
         <w:rPr>
@@ -620,6 +811,7 @@
           <w:rFonts w:ascii="C64 Pro Mono" w:hAnsi="C64 Pro Mono"/>
           <w:color w:val="FFFFFF" w:themeColor="background1"/>
         </w:rPr>
+        <w:lastRenderedPageBreak/>
         <w:t>2.</w:t>
       </w:r>
       <w:r>
@@ -766,6 +958,7 @@
           <w:sz w:val="28"/>
           <w:szCs w:val="28"/>
         </w:rPr>
+        <w:lastRenderedPageBreak/>
         <w:t>PHASER SETUP</w:t>
       </w:r>
     </w:p>
@@ -849,6 +1042,168 @@
       <w:r>
         <w:rPr>
           <w:rFonts w:ascii="C64 Pro Mono" w:hAnsi="C64 Pro Mono"/>
+          <w:noProof/>
+          <w:color w:val="FFFFFF" w:themeColor="background1"/>
+        </w:rPr>
+        <mc:AlternateContent>
+          <mc:Choice Requires="wps">
+            <w:drawing>
+              <wp:anchor distT="45720" distB="45720" distL="114300" distR="114300" simplePos="0" relativeHeight="251661312" behindDoc="0" locked="0" layoutInCell="1" allowOverlap="1" wp14:anchorId="306E1092" wp14:editId="173AAA14">
+                <wp:simplePos x="0" y="0"/>
+                <wp:positionH relativeFrom="column">
+                  <wp:posOffset>307340</wp:posOffset>
+                </wp:positionH>
+                <wp:positionV relativeFrom="paragraph">
+                  <wp:posOffset>337820</wp:posOffset>
+                </wp:positionV>
+                <wp:extent cx="5816600" cy="1052195"/>
+                <wp:effectExtent l="0" t="0" r="12700" b="14605"/>
+                <wp:wrapSquare wrapText="bothSides"/>
+                <wp:docPr id="1104325745" name="Text Box 2"/>
+                <wp:cNvGraphicFramePr>
+                  <a:graphicFrameLocks xmlns:a="http://schemas.openxmlformats.org/drawingml/2006/main"/>
+                </wp:cNvGraphicFramePr>
+                <a:graphic xmlns:a="http://schemas.openxmlformats.org/drawingml/2006/main">
+                  <a:graphicData uri="http://schemas.microsoft.com/office/word/2010/wordprocessingShape">
+                    <wps:wsp>
+                      <wps:cNvSpPr txBox="1">
+                        <a:spLocks noChangeArrowheads="1"/>
+                      </wps:cNvSpPr>
+                      <wps:spPr bwMode="auto">
+                        <a:xfrm>
+                          <a:off x="0" y="0"/>
+                          <a:ext cx="5816600" cy="1052195"/>
+                        </a:xfrm>
+                        <a:prstGeom prst="rect">
+                          <a:avLst/>
+                        </a:prstGeom>
+                        <a:solidFill>
+                          <a:srgbClr val="FFFFFF"/>
+                        </a:solidFill>
+                        <a:ln w="9525">
+                          <a:solidFill>
+                            <a:srgbClr val="000000"/>
+                          </a:solidFill>
+                          <a:miter lim="800000"/>
+                          <a:headEnd/>
+                          <a:tailEnd/>
+                        </a:ln>
+                      </wps:spPr>
+                      <wps:txbx>
+                        <w:txbxContent>
+                          <w:p>
+                            <w:r>
+                              <w:t>&lt;html&gt;</w:t>
+                            </w:r>
+                            <w:r>
+                              <w:br/>
+                            </w:r>
+                            <w:r>
+                              <w:t xml:space="preserve">   </w:t>
+                            </w:r>
+                            <w:r>
+                              <w:t>&lt;head&gt;</w:t>
+                            </w:r>
+                            <w:r>
+                              <w:br/>
+                              <w:t xml:space="preserve">    </w:t>
+                            </w:r>
+                            <w:r>
+                              <w:tab/>
+                            </w:r>
+                            <w:r>
+                              <w:t>&lt;script src="https://cdn.jsdelivr.net/npm/phaser@3/dist/phaser.js"&gt;&lt;/script&gt;</w:t>
+                            </w:r>
+                            <w:r>
+                              <w:br/>
+                            </w:r>
+                            <w:r>
+                              <w:t xml:space="preserve">   </w:t>
+                            </w:r>
+                            <w:r>
+                              <w:t>&lt;/head&gt;</w:t>
+                            </w:r>
+                            <w:r>
+                              <w:br/>
+                              <w:t>&lt;/html&gt;</w:t>
+                            </w:r>
+                          </w:p>
+                          <w:p/>
+                        </w:txbxContent>
+                      </wps:txbx>
+                      <wps:bodyPr rot="0" vert="horz" wrap="square" lIns="91440" tIns="45720" rIns="91440" bIns="45720" anchor="t" anchorCtr="0">
+                        <a:noAutofit/>
+                      </wps:bodyPr>
+                    </wps:wsp>
+                  </a:graphicData>
+                </a:graphic>
+                <wp14:sizeRelH relativeFrom="margin">
+                  <wp14:pctWidth>0</wp14:pctWidth>
+                </wp14:sizeRelH>
+                <wp14:sizeRelV relativeFrom="margin">
+                  <wp14:pctHeight>0</wp14:pctHeight>
+                </wp14:sizeRelV>
+              </wp:anchor>
+            </w:drawing>
+          </mc:Choice>
+          <mc:Fallback>
+            <w:pict>
+              <v:shapetype w14:anchorId="306E1092" id="_x0000_t202" coordsize="21600,21600" o:spt="202" path="m,l,21600r21600,l21600,xe">
+                <v:stroke joinstyle="miter"/>
+                <v:path gradientshapeok="t" o:connecttype="rect"/>
+              </v:shapetype>
+              <v:shape id="Text Box 2" o:spid="_x0000_s1026" type="#_x0000_t202" style="position:absolute;left:0;text-align:left;margin-left:24.2pt;margin-top:26.6pt;width:458pt;height:82.85pt;z-index:251661312;visibility:visible;mso-wrap-style:square;mso-width-percent:0;mso-height-percent:0;mso-wrap-distance-left:9pt;mso-wrap-distance-top:3.6pt;mso-wrap-distance-right:9pt;mso-wrap-distance-bottom:3.6pt;mso-position-horizontal:absolute;mso-position-horizontal-relative:text;mso-position-vertical:absolute;mso-position-vertical-relative:text;mso-width-percent:0;mso-height-percent:0;mso-width-relative:margin;mso-height-relative:margin;v-text-anchor:top" o:gfxdata="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">
+                <v:textbox>
+                  <w:txbxContent>
+                    <w:p>
+                      <w:r>
+                        <w:t>&lt;html&gt;</w:t>
+                      </w:r>
+                      <w:r>
+                        <w:br/>
+                      </w:r>
+                      <w:r>
+                        <w:t xml:space="preserve">   </w:t>
+                      </w:r>
+                      <w:r>
+                        <w:t>&lt;head&gt;</w:t>
+                      </w:r>
+                      <w:r>
+                        <w:br/>
+                        <w:t xml:space="preserve">    </w:t>
+                      </w:r>
+                      <w:r>
+                        <w:tab/>
+                      </w:r>
+                      <w:r>
+                        <w:t>&lt;script src="https://cdn.jsdelivr.net/npm/phaser@3/dist/phaser.js"&gt;&lt;/script&gt;</w:t>
+                      </w:r>
+                      <w:r>
+                        <w:br/>
+                      </w:r>
+                      <w:r>
+                        <w:t xml:space="preserve">   </w:t>
+                      </w:r>
+                      <w:r>
+                        <w:t>&lt;/head&gt;</w:t>
+                      </w:r>
+                      <w:r>
+                        <w:br/>
+                        <w:t>&lt;/html&gt;</w:t>
+                      </w:r>
+                    </w:p>
+                    <w:p/>
+                  </w:txbxContent>
+                </v:textbox>
+                <w10:wrap type="square"/>
+              </v:shape>
+            </w:pict>
+          </mc:Fallback>
+        </mc:AlternateContent>
+      </w:r>
+      <w:r>
+        <w:rPr>
+          <w:rFonts w:ascii="C64 Pro Mono" w:hAnsi="C64 Pro Mono"/>
           <w:color w:val="FFFFFF" w:themeColor="background1"/>
         </w:rPr>
         <w:t>https://cdn.jsdelivr.net/npm/phaser@3/dist/phaser.js</w:t>
@@ -856,63 +1211,11 @@
     </w:p>
     <w:p>
       <w:pPr>
-        <w:pStyle w:val="ListParagraph"/>
-        <w:ind w:left="1800"/>
-        <w:rPr>
-          <w:rFonts w:ascii="C64 Pro Mono" w:hAnsi="C64 Pro Mono"/>
-          <w:color w:val="FFFFFF" w:themeColor="background1"/>
-        </w:rPr>
-      </w:pPr>
-    </w:p>
-    <w:p>
-      <w:pPr>
-        <w:rPr>
-          <w:rFonts w:ascii="C64 Pro Mono" w:hAnsi="C64 Pro Mono"/>
-          <w:color w:val="FFFFFF" w:themeColor="background1"/>
-        </w:rPr>
-      </w:pPr>
-      <w:r>
-        <w:rPr>
-          <w:rFonts w:ascii="C64 Pro Mono" w:hAnsi="C64 Pro Mono"/>
-          <w:noProof/>
-          <w:color w:val="FFFFFF" w:themeColor="background1"/>
-        </w:rPr>
-        <w:drawing>
-          <wp:inline distT="0" distB="0" distL="0" distR="0" wp14:anchorId="391DDED1" wp14:editId="581CA60C">
-            <wp:extent cx="5731510" cy="862965"/>
-            <wp:effectExtent l="0" t="0" r="2540" b="0"/>
-            <wp:docPr id="1255339300" name="Picture 1" descr="A close-up of a computer screen&#10;&#10;AI-generated content may be incorrect."/>
-            <wp:cNvGraphicFramePr>
-              <a:graphicFrameLocks xmlns:a="http://schemas.openxmlformats.org/drawingml/2006/main" noChangeAspect="1"/>
-            </wp:cNvGraphicFramePr>
-            <a:graphic xmlns:a="http://schemas.openxmlformats.org/drawingml/2006/main">
-              <a:graphicData uri="http://schemas.openxmlformats.org/drawingml/2006/picture">
-                <pic:pic xmlns:pic="http://schemas.openxmlformats.org/drawingml/2006/picture">
-                  <pic:nvPicPr>
-                    <pic:cNvPr id="1255339300" name="Picture 1" descr="A close-up of a computer screen&#10;&#10;AI-generated content may be incorrect."/>
-                    <pic:cNvPicPr/>
-                  </pic:nvPicPr>
-                  <pic:blipFill>
-                    <a:blip r:embed="rId6"/>
-                    <a:stretch>
-                      <a:fillRect/>
-                    </a:stretch>
-                  </pic:blipFill>
-                  <pic:spPr>
-                    <a:xfrm>
-                      <a:off x="0" y="0"/>
-                      <a:ext cx="5731510" cy="862965"/>
-                    </a:xfrm>
-                    <a:prstGeom prst="rect">
-                      <a:avLst/>
-                    </a:prstGeom>
-                  </pic:spPr>
-                </pic:pic>
-              </a:graphicData>
-            </a:graphic>
-          </wp:inline>
-        </w:drawing>
-      </w:r>
+        <w:rPr>
+          <w:rFonts w:ascii="C64 Pro Mono" w:hAnsi="C64 Pro Mono"/>
+          <w:color w:val="FFFFFF" w:themeColor="background1"/>
+        </w:rPr>
+      </w:pPr>
     </w:p>
     <w:p>
       <w:pPr>
@@ -929,68 +1232,140 @@
       <w:r>
         <w:rPr>
           <w:rFonts w:ascii="C64 Pro Mono" w:hAnsi="C64 Pro Mono"/>
+          <w:noProof/>
+          <w:color w:val="FFFFFF" w:themeColor="background1"/>
+        </w:rPr>
+        <mc:AlternateContent>
+          <mc:Choice Requires="wps">
+            <w:drawing>
+              <wp:anchor distT="45720" distB="45720" distL="114300" distR="114300" simplePos="0" relativeHeight="251663360" behindDoc="0" locked="0" layoutInCell="1" allowOverlap="1" wp14:anchorId="01ECEE84" wp14:editId="16739423">
+                <wp:simplePos x="0" y="0"/>
+                <wp:positionH relativeFrom="margin">
+                  <wp:posOffset>253573</wp:posOffset>
+                </wp:positionH>
+                <wp:positionV relativeFrom="paragraph">
+                  <wp:posOffset>381075</wp:posOffset>
+                </wp:positionV>
+                <wp:extent cx="5816600" cy="645459"/>
+                <wp:effectExtent l="0" t="0" r="12700" b="21590"/>
+                <wp:wrapSquare wrapText="bothSides"/>
+                <wp:docPr id="1604966630" name="Text Box 2"/>
+                <wp:cNvGraphicFramePr>
+                  <a:graphicFrameLocks xmlns:a="http://schemas.openxmlformats.org/drawingml/2006/main"/>
+                </wp:cNvGraphicFramePr>
+                <a:graphic xmlns:a="http://schemas.openxmlformats.org/drawingml/2006/main">
+                  <a:graphicData uri="http://schemas.microsoft.com/office/word/2010/wordprocessingShape">
+                    <wps:wsp>
+                      <wps:cNvSpPr txBox="1">
+                        <a:spLocks noChangeArrowheads="1"/>
+                      </wps:cNvSpPr>
+                      <wps:spPr bwMode="auto">
+                        <a:xfrm>
+                          <a:off x="0" y="0"/>
+                          <a:ext cx="5816600" cy="645459"/>
+                        </a:xfrm>
+                        <a:prstGeom prst="rect">
+                          <a:avLst/>
+                        </a:prstGeom>
+                        <a:solidFill>
+                          <a:srgbClr val="FFFFFF"/>
+                        </a:solidFill>
+                        <a:ln w="9525">
+                          <a:solidFill>
+                            <a:srgbClr val="000000"/>
+                          </a:solidFill>
+                          <a:miter lim="800000"/>
+                          <a:headEnd/>
+                          <a:tailEnd/>
+                        </a:ln>
+                      </wps:spPr>
+                      <wps:txbx>
+                        <w:txbxContent>
+                          <w:p>
+                            <w:r>
+                              <w:t>&lt;body&gt;</w:t>
+                            </w:r>
+                            <w:r>
+                              <w:br/>
+                            </w:r>
+                            <w:r>
+                              <w:t xml:space="preserve">         </w:t>
+                            </w:r>
+                            <w:r>
+                              <w:t>&lt;div id="game-container"&gt;&lt;/div&gt;</w:t>
+                            </w:r>
+                            <w:r>
+                              <w:br/>
+                              <w:t>&lt;/body&gt;</w:t>
+                            </w:r>
+                          </w:p>
+                          <w:p>
+                            <w:r>
+                              <w:br/>
+                            </w:r>
+                          </w:p>
+                          <w:p/>
+                        </w:txbxContent>
+                      </wps:txbx>
+                      <wps:bodyPr rot="0" vert="horz" wrap="square" lIns="91440" tIns="45720" rIns="91440" bIns="45720" anchor="t" anchorCtr="0">
+                        <a:noAutofit/>
+                      </wps:bodyPr>
+                    </wps:wsp>
+                  </a:graphicData>
+                </a:graphic>
+                <wp14:sizeRelH relativeFrom="margin">
+                  <wp14:pctWidth>0</wp14:pctWidth>
+                </wp14:sizeRelH>
+                <wp14:sizeRelV relativeFrom="margin">
+                  <wp14:pctHeight>0</wp14:pctHeight>
+                </wp14:sizeRelV>
+              </wp:anchor>
+            </w:drawing>
+          </mc:Choice>
+          <mc:Fallback>
+            <w:pict>
+              <v:shape w14:anchorId="01ECEE84" id="_x0000_s1027" type="#_x0000_t202" style="position:absolute;left:0;text-align:left;margin-left:19.95pt;margin-top:30pt;width:458pt;height:50.8pt;z-index:251663360;visibility:visible;mso-wrap-style:square;mso-width-percent:0;mso-height-percent:0;mso-wrap-distance-left:9pt;mso-wrap-distance-top:3.6pt;mso-wrap-distance-right:9pt;mso-wrap-distance-bottom:3.6pt;mso-position-horizontal:absolute;mso-position-horizontal-relative:margin;mso-position-vertical:absolute;mso-position-vertical-relative:text;mso-width-percent:0;mso-height-percent:0;mso-width-relative:margin;mso-height-relative:margin;v-text-anchor:top" o:gfxdata="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">
+                <v:textbox>
+                  <w:txbxContent>
+                    <w:p>
+                      <w:r>
+                        <w:t>&lt;body&gt;</w:t>
+                      </w:r>
+                      <w:r>
+                        <w:br/>
+                      </w:r>
+                      <w:r>
+                        <w:t xml:space="preserve">         </w:t>
+                      </w:r>
+                      <w:r>
+                        <w:t>&lt;div id="game-container"&gt;&lt;/div&gt;</w:t>
+                      </w:r>
+                      <w:r>
+                        <w:br/>
+                        <w:t>&lt;/body&gt;</w:t>
+                      </w:r>
+                    </w:p>
+                    <w:p>
+                      <w:r>
+                        <w:br/>
+                      </w:r>
+                    </w:p>
+                    <w:p/>
+                  </w:txbxContent>
+                </v:textbox>
+                <w10:wrap type="square" anchorx="margin"/>
+              </v:shape>
+            </w:pict>
+          </mc:Fallback>
+        </mc:AlternateContent>
+      </w:r>
+      <w:r>
+        <w:rPr>
+          <w:rFonts w:ascii="C64 Pro Mono" w:hAnsi="C64 Pro Mono"/>
           <w:color w:val="FFFFFF" w:themeColor="background1"/>
         </w:rPr>
         <w:t>Create an HTML div to display the game</w:t>
       </w:r>
-    </w:p>
-    <w:p>
-      <w:pPr>
-        <w:rPr>
-          <w:rFonts w:ascii="C64 Pro Mono" w:hAnsi="C64 Pro Mono"/>
-          <w:color w:val="FFFFFF" w:themeColor="background1"/>
-        </w:rPr>
-      </w:pPr>
-      <w:r>
-        <w:rPr>
-          <w:rFonts w:ascii="C64 Pro Mono" w:hAnsi="C64 Pro Mono"/>
-          <w:noProof/>
-          <w:color w:val="FFFFFF" w:themeColor="background1"/>
-        </w:rPr>
-        <w:drawing>
-          <wp:inline distT="0" distB="0" distL="0" distR="0" wp14:anchorId="24B5006C" wp14:editId="7C43E193">
-            <wp:extent cx="5731510" cy="512445"/>
-            <wp:effectExtent l="0" t="0" r="2540" b="1905"/>
-            <wp:docPr id="1110918254" name="Picture 1"/>
-            <wp:cNvGraphicFramePr>
-              <a:graphicFrameLocks xmlns:a="http://schemas.openxmlformats.org/drawingml/2006/main" noChangeAspect="1"/>
-            </wp:cNvGraphicFramePr>
-            <a:graphic xmlns:a="http://schemas.openxmlformats.org/drawingml/2006/main">
-              <a:graphicData uri="http://schemas.openxmlformats.org/drawingml/2006/picture">
-                <pic:pic xmlns:pic="http://schemas.openxmlformats.org/drawingml/2006/picture">
-                  <pic:nvPicPr>
-                    <pic:cNvPr id="1110918254" name=""/>
-                    <pic:cNvPicPr/>
-                  </pic:nvPicPr>
-                  <pic:blipFill>
-                    <a:blip r:embed="rId7"/>
-                    <a:stretch>
-                      <a:fillRect/>
-                    </a:stretch>
-                  </pic:blipFill>
-                  <pic:spPr>
-                    <a:xfrm>
-                      <a:off x="0" y="0"/>
-                      <a:ext cx="5731510" cy="512445"/>
-                    </a:xfrm>
-                    <a:prstGeom prst="rect">
-                      <a:avLst/>
-                    </a:prstGeom>
-                  </pic:spPr>
-                </pic:pic>
-              </a:graphicData>
-            </a:graphic>
-          </wp:inline>
-        </w:drawing>
-      </w:r>
-    </w:p>
-    <w:p>
-      <w:pPr>
-        <w:rPr>
-          <w:rFonts w:ascii="C64 Pro Mono" w:hAnsi="C64 Pro Mono"/>
-          <w:color w:val="FFFFFF" w:themeColor="background1"/>
-        </w:rPr>
-      </w:pPr>
     </w:p>
     <w:p>
       <w:pPr>
@@ -1007,6 +1382,167 @@
       <w:r>
         <w:rPr>
           <w:rFonts w:ascii="C64 Pro Mono" w:hAnsi="C64 Pro Mono"/>
+          <w:noProof/>
+          <w:color w:val="FFFFFF" w:themeColor="background1"/>
+        </w:rPr>
+        <w:lastRenderedPageBreak/>
+        <mc:AlternateContent>
+          <mc:Choice Requires="wps">
+            <w:drawing>
+              <wp:anchor distT="45720" distB="45720" distL="114300" distR="114300" simplePos="0" relativeHeight="251665408" behindDoc="0" locked="0" layoutInCell="1" allowOverlap="1" wp14:anchorId="7F934354" wp14:editId="10DD82A4">
+                <wp:simplePos x="0" y="0"/>
+                <wp:positionH relativeFrom="margin">
+                  <wp:align>left</wp:align>
+                </wp:positionH>
+                <wp:positionV relativeFrom="paragraph">
+                  <wp:posOffset>368722</wp:posOffset>
+                </wp:positionV>
+                <wp:extent cx="5816600" cy="1551940"/>
+                <wp:effectExtent l="0" t="0" r="12700" b="10160"/>
+                <wp:wrapSquare wrapText="bothSides"/>
+                <wp:docPr id="1041898151" name="Text Box 2"/>
+                <wp:cNvGraphicFramePr>
+                  <a:graphicFrameLocks xmlns:a="http://schemas.openxmlformats.org/drawingml/2006/main"/>
+                </wp:cNvGraphicFramePr>
+                <a:graphic xmlns:a="http://schemas.openxmlformats.org/drawingml/2006/main">
+                  <a:graphicData uri="http://schemas.microsoft.com/office/word/2010/wordprocessingShape">
+                    <wps:wsp>
+                      <wps:cNvSpPr txBox="1">
+                        <a:spLocks noChangeArrowheads="1"/>
+                      </wps:cNvSpPr>
+                      <wps:spPr bwMode="auto">
+                        <a:xfrm>
+                          <a:off x="0" y="0"/>
+                          <a:ext cx="5816600" cy="1551940"/>
+                        </a:xfrm>
+                        <a:prstGeom prst="rect">
+                          <a:avLst/>
+                        </a:prstGeom>
+                        <a:solidFill>
+                          <a:srgbClr val="FFFFFF"/>
+                        </a:solidFill>
+                        <a:ln w="9525">
+                          <a:solidFill>
+                            <a:srgbClr val="000000"/>
+                          </a:solidFill>
+                          <a:miter lim="800000"/>
+                          <a:headEnd/>
+                          <a:tailEnd/>
+                        </a:ln>
+                      </wps:spPr>
+                      <wps:txbx>
+                        <w:txbxContent>
+                          <w:p>
+                            <w:r>
+                              <w:t>&lt;script&gt;</w:t>
+                            </w:r>
+                            <w:r>
+                              <w:br/>
+                              <w:t xml:space="preserve">    const config = {</w:t>
+                            </w:r>
+                            <w:r>
+                              <w:br/>
+                              <w:t xml:space="preserve">      type: Phaser.CANVAS, // rendering style (WebGL or Canvas)</w:t>
+                            </w:r>
+                            <w:r>
+                              <w:br/>
+                              <w:t xml:space="preserve">      width: 800,</w:t>
+                            </w:r>
+                            <w:r>
+                              <w:br/>
+                              <w:t xml:space="preserve">      height: 600,</w:t>
+                            </w:r>
+                            <w:r>
+                              <w:br/>
+                              <w:t xml:space="preserve">      parent: 'game-container'</w:t>
+                            </w:r>
+                            <w:r>
+                              <w:br/>
+                              <w:t xml:space="preserve">    };</w:t>
+                            </w:r>
+                            <w:r>
+                              <w:br/>
+                              <w:t>&lt;/script&gt;</w:t>
+                            </w:r>
+                          </w:p>
+                          <w:p>
+                            <w:r>
+                              <w:br/>
+                            </w:r>
+                          </w:p>
+                          <w:p/>
+                        </w:txbxContent>
+                      </wps:txbx>
+                      <wps:bodyPr rot="0" vert="horz" wrap="square" lIns="91440" tIns="45720" rIns="91440" bIns="45720" anchor="t" anchorCtr="0">
+                        <a:noAutofit/>
+                      </wps:bodyPr>
+                    </wps:wsp>
+                  </a:graphicData>
+                </a:graphic>
+                <wp14:sizeRelH relativeFrom="margin">
+                  <wp14:pctWidth>0</wp14:pctWidth>
+                </wp14:sizeRelH>
+                <wp14:sizeRelV relativeFrom="margin">
+                  <wp14:pctHeight>0</wp14:pctHeight>
+                </wp14:sizeRelV>
+              </wp:anchor>
+            </w:drawing>
+          </mc:Choice>
+          <mc:Fallback>
+            <w:pict>
+              <v:shape w14:anchorId="7F934354" id="_x0000_s1028" type="#_x0000_t202" style="position:absolute;left:0;text-align:left;margin-left:0;margin-top:29.05pt;width:458pt;height:122.2pt;z-index:251665408;visibility:visible;mso-wrap-style:square;mso-width-percent:0;mso-height-percent:0;mso-wrap-distance-left:9pt;mso-wrap-distance-top:3.6pt;mso-wrap-distance-right:9pt;mso-wrap-distance-bottom:3.6pt;mso-position-horizontal:left;mso-position-horizontal-relative:margin;mso-position-vertical:absolute;mso-position-vertical-relative:text;mso-width-percent:0;mso-height-percent:0;mso-width-relative:margin;mso-height-relative:margin;v-text-anchor:top" o:gfxdata="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">
+                <v:textbox>
+                  <w:txbxContent>
+                    <w:p>
+                      <w:r>
+                        <w:t>&lt;script&gt;</w:t>
+                      </w:r>
+                      <w:r>
+                        <w:br/>
+                        <w:t xml:space="preserve">    const config = {</w:t>
+                      </w:r>
+                      <w:r>
+                        <w:br/>
+                        <w:t xml:space="preserve">      type: Phaser.CANVAS, // rendering style (WebGL or Canvas)</w:t>
+                      </w:r>
+                      <w:r>
+                        <w:br/>
+                        <w:t xml:space="preserve">      width: 800,</w:t>
+                      </w:r>
+                      <w:r>
+                        <w:br/>
+                        <w:t xml:space="preserve">      height: 600,</w:t>
+                      </w:r>
+                      <w:r>
+                        <w:br/>
+                        <w:t xml:space="preserve">      parent: 'game-container'</w:t>
+                      </w:r>
+                      <w:r>
+                        <w:br/>
+                        <w:t xml:space="preserve">    };</w:t>
+                      </w:r>
+                      <w:r>
+                        <w:br/>
+                        <w:t>&lt;/script&gt;</w:t>
+                      </w:r>
+                    </w:p>
+                    <w:p>
+                      <w:r>
+                        <w:br/>
+                      </w:r>
+                    </w:p>
+                    <w:p/>
+                  </w:txbxContent>
+                </v:textbox>
+                <w10:wrap type="square" anchorx="margin"/>
+              </v:shape>
+            </w:pict>
+          </mc:Fallback>
+        </mc:AlternateContent>
+      </w:r>
+      <w:r>
+        <w:rPr>
+          <w:rFonts w:ascii="C64 Pro Mono" w:hAnsi="C64 Pro Mono"/>
           <w:color w:val="FFFFFF" w:themeColor="background1"/>
         </w:rPr>
         <w:t>Add JS section with phaser parameters</w:t>
@@ -1019,48 +1555,6 @@
           <w:color w:val="FFFFFF" w:themeColor="background1"/>
         </w:rPr>
       </w:pPr>
-      <w:r>
-        <w:rPr>
-          <w:rFonts w:ascii="C64 Pro Mono" w:hAnsi="C64 Pro Mono"/>
-          <w:noProof/>
-          <w:color w:val="FFFFFF" w:themeColor="background1"/>
-        </w:rPr>
-        <w:drawing>
-          <wp:inline distT="0" distB="0" distL="0" distR="0" wp14:anchorId="00BDA090" wp14:editId="0059AB80">
-            <wp:extent cx="5502117" cy="1676545"/>
-            <wp:effectExtent l="0" t="0" r="3810" b="0"/>
-            <wp:docPr id="1822697328" name="Picture 1" descr="A computer code with black text&#10;&#10;AI-generated content may be incorrect."/>
-            <wp:cNvGraphicFramePr>
-              <a:graphicFrameLocks xmlns:a="http://schemas.openxmlformats.org/drawingml/2006/main" noChangeAspect="1"/>
-            </wp:cNvGraphicFramePr>
-            <a:graphic xmlns:a="http://schemas.openxmlformats.org/drawingml/2006/main">
-              <a:graphicData uri="http://schemas.openxmlformats.org/drawingml/2006/picture">
-                <pic:pic xmlns:pic="http://schemas.openxmlformats.org/drawingml/2006/picture">
-                  <pic:nvPicPr>
-                    <pic:cNvPr id="1822697328" name="Picture 1" descr="A computer code with black text&#10;&#10;AI-generated content may be incorrect."/>
-                    <pic:cNvPicPr/>
-                  </pic:nvPicPr>
-                  <pic:blipFill>
-                    <a:blip r:embed="rId8"/>
-                    <a:stretch>
-                      <a:fillRect/>
-                    </a:stretch>
-                  </pic:blipFill>
-                  <pic:spPr>
-                    <a:xfrm>
-                      <a:off x="0" y="0"/>
-                      <a:ext cx="5502117" cy="1676545"/>
-                    </a:xfrm>
-                    <a:prstGeom prst="rect">
-                      <a:avLst/>
-                    </a:prstGeom>
-                  </pic:spPr>
-                </pic:pic>
-              </a:graphicData>
-            </a:graphic>
-          </wp:inline>
-        </w:drawing>
-      </w:r>
     </w:p>
     <w:p>
       <w:pPr>
@@ -1077,6 +1571,110 @@
       <w:r>
         <w:rPr>
           <w:rFonts w:ascii="C64 Pro Mono" w:hAnsi="C64 Pro Mono"/>
+          <w:noProof/>
+          <w:color w:val="FFFFFF" w:themeColor="background1"/>
+        </w:rPr>
+        <mc:AlternateContent>
+          <mc:Choice Requires="wps">
+            <w:drawing>
+              <wp:anchor distT="45720" distB="45720" distL="114300" distR="114300" simplePos="0" relativeHeight="251667456" behindDoc="0" locked="0" layoutInCell="1" allowOverlap="1" wp14:anchorId="358938BE" wp14:editId="20B68007">
+                <wp:simplePos x="0" y="0"/>
+                <wp:positionH relativeFrom="margin">
+                  <wp:align>left</wp:align>
+                </wp:positionH>
+                <wp:positionV relativeFrom="paragraph">
+                  <wp:posOffset>236135</wp:posOffset>
+                </wp:positionV>
+                <wp:extent cx="5816600" cy="384175"/>
+                <wp:effectExtent l="0" t="0" r="12700" b="15875"/>
+                <wp:wrapSquare wrapText="bothSides"/>
+                <wp:docPr id="1488357610" name="Text Box 2"/>
+                <wp:cNvGraphicFramePr>
+                  <a:graphicFrameLocks xmlns:a="http://schemas.openxmlformats.org/drawingml/2006/main"/>
+                </wp:cNvGraphicFramePr>
+                <a:graphic xmlns:a="http://schemas.openxmlformats.org/drawingml/2006/main">
+                  <a:graphicData uri="http://schemas.microsoft.com/office/word/2010/wordprocessingShape">
+                    <wps:wsp>
+                      <wps:cNvSpPr txBox="1">
+                        <a:spLocks noChangeArrowheads="1"/>
+                      </wps:cNvSpPr>
+                      <wps:spPr bwMode="auto">
+                        <a:xfrm>
+                          <a:off x="0" y="0"/>
+                          <a:ext cx="5816600" cy="384201"/>
+                        </a:xfrm>
+                        <a:prstGeom prst="rect">
+                          <a:avLst/>
+                        </a:prstGeom>
+                        <a:solidFill>
+                          <a:srgbClr val="FFFFFF"/>
+                        </a:solidFill>
+                        <a:ln w="9525">
+                          <a:solidFill>
+                            <a:srgbClr val="000000"/>
+                          </a:solidFill>
+                          <a:miter lim="800000"/>
+                          <a:headEnd/>
+                          <a:tailEnd/>
+                        </a:ln>
+                      </wps:spPr>
+                      <wps:txbx>
+                        <w:txbxContent>
+                          <w:p>
+                            <w:r>
+                              <w:t>const game = new Phaser.Game(config);</w:t>
+                            </w:r>
+                          </w:p>
+                          <w:p>
+                            <w:r>
+                              <w:br/>
+                            </w:r>
+                          </w:p>
+                          <w:p/>
+                        </w:txbxContent>
+                      </wps:txbx>
+                      <wps:bodyPr rot="0" vert="horz" wrap="square" lIns="91440" tIns="45720" rIns="91440" bIns="45720" anchor="t" anchorCtr="0">
+                        <a:noAutofit/>
+                      </wps:bodyPr>
+                    </wps:wsp>
+                  </a:graphicData>
+                </a:graphic>
+                <wp14:sizeRelH relativeFrom="margin">
+                  <wp14:pctWidth>0</wp14:pctWidth>
+                </wp14:sizeRelH>
+                <wp14:sizeRelV relativeFrom="margin">
+                  <wp14:pctHeight>0</wp14:pctHeight>
+                </wp14:sizeRelV>
+              </wp:anchor>
+            </w:drawing>
+          </mc:Choice>
+          <mc:Fallback>
+            <w:pict>
+              <v:shape w14:anchorId="358938BE" id="_x0000_s1029" type="#_x0000_t202" style="position:absolute;left:0;text-align:left;margin-left:0;margin-top:18.6pt;width:458pt;height:30.25pt;z-index:251667456;visibility:visible;mso-wrap-style:square;mso-width-percent:0;mso-height-percent:0;mso-wrap-distance-left:9pt;mso-wrap-distance-top:3.6pt;mso-wrap-distance-right:9pt;mso-wrap-distance-bottom:3.6pt;mso-position-horizontal:left;mso-position-horizontal-relative:margin;mso-position-vertical:absolute;mso-position-vertical-relative:text;mso-width-percent:0;mso-height-percent:0;mso-width-relative:margin;mso-height-relative:margin;v-text-anchor:top" o:gfxdata="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">
+                <v:textbox>
+                  <w:txbxContent>
+                    <w:p>
+                      <w:r>
+                        <w:t>const game = new Phaser.Game(config);</w:t>
+                      </w:r>
+                    </w:p>
+                    <w:p>
+                      <w:r>
+                        <w:br/>
+                      </w:r>
+                    </w:p>
+                    <w:p/>
+                  </w:txbxContent>
+                </v:textbox>
+                <w10:wrap type="square" anchorx="margin"/>
+              </v:shape>
+            </w:pict>
+          </mc:Fallback>
+        </mc:AlternateContent>
+      </w:r>
+      <w:r>
+        <w:rPr>
+          <w:rFonts w:ascii="C64 Pro Mono" w:hAnsi="C64 Pro Mono"/>
           <w:color w:val="FFFFFF" w:themeColor="background1"/>
         </w:rPr>
         <w:t>Create game object</w:t>
@@ -1089,48 +1687,6 @@
           <w:color w:val="FFFFFF" w:themeColor="background1"/>
         </w:rPr>
       </w:pPr>
-      <w:r>
-        <w:rPr>
-          <w:rFonts w:ascii="C64 Pro Mono" w:hAnsi="C64 Pro Mono"/>
-          <w:noProof/>
-          <w:color w:val="FFFFFF" w:themeColor="background1"/>
-        </w:rPr>
-        <w:drawing>
-          <wp:inline distT="0" distB="0" distL="0" distR="0" wp14:anchorId="3B4F8CC1" wp14:editId="75D7943D">
-            <wp:extent cx="4046571" cy="312447"/>
-            <wp:effectExtent l="0" t="0" r="0" b="0"/>
-            <wp:docPr id="1804457932" name="Picture 1"/>
-            <wp:cNvGraphicFramePr>
-              <a:graphicFrameLocks xmlns:a="http://schemas.openxmlformats.org/drawingml/2006/main" noChangeAspect="1"/>
-            </wp:cNvGraphicFramePr>
-            <a:graphic xmlns:a="http://schemas.openxmlformats.org/drawingml/2006/main">
-              <a:graphicData uri="http://schemas.openxmlformats.org/drawingml/2006/picture">
-                <pic:pic xmlns:pic="http://schemas.openxmlformats.org/drawingml/2006/picture">
-                  <pic:nvPicPr>
-                    <pic:cNvPr id="1804457932" name=""/>
-                    <pic:cNvPicPr/>
-                  </pic:nvPicPr>
-                  <pic:blipFill>
-                    <a:blip r:embed="rId9"/>
-                    <a:stretch>
-                      <a:fillRect/>
-                    </a:stretch>
-                  </pic:blipFill>
-                  <pic:spPr>
-                    <a:xfrm>
-                      <a:off x="0" y="0"/>
-                      <a:ext cx="4046571" cy="312447"/>
-                    </a:xfrm>
-                    <a:prstGeom prst="rect">
-                      <a:avLst/>
-                    </a:prstGeom>
-                  </pic:spPr>
-                </pic:pic>
-              </a:graphicData>
-            </a:graphic>
-          </wp:inline>
-        </w:drawing>
-      </w:r>
     </w:p>
     <w:p>
       <w:pPr>
@@ -1191,7 +1747,7 @@
                     <pic:cNvPicPr/>
                   </pic:nvPicPr>
                   <pic:blipFill>
-                    <a:blip r:embed="rId10"/>
+                    <a:blip r:embed="rId8"/>
                     <a:stretch>
                       <a:fillRect/>
                     </a:stretch>
@@ -1226,10 +1782,288 @@
       </w:pPr>
       <w:r>
         <w:rPr>
-          <w:rFonts w:ascii="C64 Pro Mono" w:hAnsi="C64 Pro Mono"/>
-          <w:color w:val="FFFFFF" w:themeColor="background1"/>
+          <w:noProof/>
         </w:rPr>
         <w:lastRenderedPageBreak/>
+        <mc:AlternateContent>
+          <mc:Choice Requires="wps">
+            <w:drawing>
+              <wp:anchor distT="45720" distB="45720" distL="114300" distR="114300" simplePos="0" relativeHeight="251669504" behindDoc="0" locked="0" layoutInCell="1" allowOverlap="1" wp14:anchorId="52EB1F55" wp14:editId="4E645AB3">
+                <wp:simplePos x="0" y="0"/>
+                <wp:positionH relativeFrom="margin">
+                  <wp:align>left</wp:align>
+                </wp:positionH>
+                <wp:positionV relativeFrom="paragraph">
+                  <wp:posOffset>346075</wp:posOffset>
+                </wp:positionV>
+                <wp:extent cx="5816600" cy="1838325"/>
+                <wp:effectExtent l="0" t="0" r="12700" b="28575"/>
+                <wp:wrapSquare wrapText="bothSides"/>
+                <wp:docPr id="1962952658" name="Text Box 2"/>
+                <wp:cNvGraphicFramePr>
+                  <a:graphicFrameLocks xmlns:a="http://schemas.openxmlformats.org/drawingml/2006/main"/>
+                </wp:cNvGraphicFramePr>
+                <a:graphic xmlns:a="http://schemas.openxmlformats.org/drawingml/2006/main">
+                  <a:graphicData uri="http://schemas.microsoft.com/office/word/2010/wordprocessingShape">
+                    <wps:wsp>
+                      <wps:cNvSpPr txBox="1">
+                        <a:spLocks noChangeArrowheads="1"/>
+                      </wps:cNvSpPr>
+                      <wps:spPr bwMode="auto">
+                        <a:xfrm>
+                          <a:off x="0" y="0"/>
+                          <a:ext cx="5816600" cy="1838426"/>
+                        </a:xfrm>
+                        <a:prstGeom prst="rect">
+                          <a:avLst/>
+                        </a:prstGeom>
+                        <a:solidFill>
+                          <a:srgbClr val="FFFFFF"/>
+                        </a:solidFill>
+                        <a:ln w="9525">
+                          <a:solidFill>
+                            <a:srgbClr val="000000"/>
+                          </a:solidFill>
+                          <a:miter lim="800000"/>
+                          <a:headEnd/>
+                          <a:tailEnd/>
+                        </a:ln>
+                      </wps:spPr>
+                      <wps:txbx>
+                        <w:txbxContent>
+                          <w:p>
+                            <w:r>
+                              <w:t>function preload(){</w:t>
+                            </w:r>
+                            <w:r>
+                              <w:br/>
+                              <w:t>}</w:t>
+                            </w:r>
+                            <w:r>
+                              <w:br/>
+                            </w:r>
+                            <w:r>
+                              <w:br/>
+                              <w:t>function create(){</w:t>
+                            </w:r>
+                            <w:r>
+                              <w:br/>
+                              <w:t xml:space="preserve">    this.add.text(20, 20, 'Super fajna gra!', { font: '24px Arial', fill: '#ffffff' });</w:t>
+                            </w:r>
+                            <w:r>
+                              <w:br/>
+                              <w:t>}</w:t>
+                            </w:r>
+                            <w:r>
+                              <w:br/>
+                            </w:r>
+                            <w:r>
+                              <w:br/>
+                              <w:t>function update(){</w:t>
+                            </w:r>
+                            <w:r>
+                              <w:br/>
+                              <w:t>}</w:t>
+                            </w:r>
+                          </w:p>
+                          <w:p/>
+                        </w:txbxContent>
+                      </wps:txbx>
+                      <wps:bodyPr rot="0" vert="horz" wrap="square" lIns="91440" tIns="45720" rIns="91440" bIns="45720" anchor="t" anchorCtr="0">
+                        <a:noAutofit/>
+                      </wps:bodyPr>
+                    </wps:wsp>
+                  </a:graphicData>
+                </a:graphic>
+                <wp14:sizeRelH relativeFrom="margin">
+                  <wp14:pctWidth>0</wp14:pctWidth>
+                </wp14:sizeRelH>
+                <wp14:sizeRelV relativeFrom="margin">
+                  <wp14:pctHeight>0</wp14:pctHeight>
+                </wp14:sizeRelV>
+              </wp:anchor>
+            </w:drawing>
+          </mc:Choice>
+          <mc:Fallback>
+            <w:pict>
+              <v:shape w14:anchorId="52EB1F55" id="_x0000_s1030" type="#_x0000_t202" style="position:absolute;left:0;text-align:left;margin-left:0;margin-top:27.25pt;width:458pt;height:144.75pt;z-index:251669504;visibility:visible;mso-wrap-style:square;mso-width-percent:0;mso-height-percent:0;mso-wrap-distance-left:9pt;mso-wrap-distance-top:3.6pt;mso-wrap-distance-right:9pt;mso-wrap-distance-bottom:3.6pt;mso-position-horizontal:left;mso-position-horizontal-relative:margin;mso-position-vertical:absolute;mso-position-vertical-relative:text;mso-width-percent:0;mso-height-percent:0;mso-width-relative:margin;mso-height-relative:margin;v-text-anchor:top" o:gfxdata="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">
+                <v:textbox>
+                  <w:txbxContent>
+                    <w:p>
+                      <w:r>
+                        <w:t>function preload(){</w:t>
+                      </w:r>
+                      <w:r>
+                        <w:br/>
+                        <w:t>}</w:t>
+                      </w:r>
+                      <w:r>
+                        <w:br/>
+                      </w:r>
+                      <w:r>
+                        <w:br/>
+                        <w:t>function create(){</w:t>
+                      </w:r>
+                      <w:r>
+                        <w:br/>
+                        <w:t xml:space="preserve">    this.add.text(20, 20, 'Super fajna gra!', { font: '24px Arial', fill: '#ffffff' });</w:t>
+                      </w:r>
+                      <w:r>
+                        <w:br/>
+                        <w:t>}</w:t>
+                      </w:r>
+                      <w:r>
+                        <w:br/>
+                      </w:r>
+                      <w:r>
+                        <w:br/>
+                        <w:t>function update(){</w:t>
+                      </w:r>
+                      <w:r>
+                        <w:br/>
+                        <w:t>}</w:t>
+                      </w:r>
+                    </w:p>
+                    <w:p/>
+                  </w:txbxContent>
+                </v:textbox>
+                <w10:wrap type="square" anchorx="margin"/>
+              </v:shape>
+            </w:pict>
+          </mc:Fallback>
+        </mc:AlternateContent>
+      </w:r>
+      <w:r>
+        <w:rPr>
+          <w:rFonts w:ascii="C64 Pro Mono" w:hAnsi="C64 Pro Mono"/>
+          <w:noProof/>
+          <w:color w:val="FFFFFF" w:themeColor="background1"/>
+        </w:rPr>
+        <mc:AlternateContent>
+          <mc:Choice Requires="wps">
+            <w:drawing>
+              <wp:anchor distT="45720" distB="45720" distL="114300" distR="114300" simplePos="0" relativeHeight="251671552" behindDoc="0" locked="0" layoutInCell="1" allowOverlap="1" wp14:anchorId="7F2C766E" wp14:editId="350372C4">
+                <wp:simplePos x="0" y="0"/>
+                <wp:positionH relativeFrom="margin">
+                  <wp:align>left</wp:align>
+                </wp:positionH>
+                <wp:positionV relativeFrom="paragraph">
+                  <wp:posOffset>2248468</wp:posOffset>
+                </wp:positionV>
+                <wp:extent cx="5816600" cy="1106170"/>
+                <wp:effectExtent l="0" t="0" r="12700" b="17780"/>
+                <wp:wrapSquare wrapText="bothSides"/>
+                <wp:docPr id="238915346" name="Text Box 2"/>
+                <wp:cNvGraphicFramePr>
+                  <a:graphicFrameLocks xmlns:a="http://schemas.openxmlformats.org/drawingml/2006/main"/>
+                </wp:cNvGraphicFramePr>
+                <a:graphic xmlns:a="http://schemas.openxmlformats.org/drawingml/2006/main">
+                  <a:graphicData uri="http://schemas.microsoft.com/office/word/2010/wordprocessingShape">
+                    <wps:wsp>
+                      <wps:cNvSpPr txBox="1">
+                        <a:spLocks noChangeArrowheads="1"/>
+                      </wps:cNvSpPr>
+                      <wps:spPr bwMode="auto">
+                        <a:xfrm>
+                          <a:off x="0" y="0"/>
+                          <a:ext cx="5816600" cy="1106170"/>
+                        </a:xfrm>
+                        <a:prstGeom prst="rect">
+                          <a:avLst/>
+                        </a:prstGeom>
+                        <a:solidFill>
+                          <a:srgbClr val="FFFFFF"/>
+                        </a:solidFill>
+                        <a:ln w="9525">
+                          <a:solidFill>
+                            <a:srgbClr val="000000"/>
+                          </a:solidFill>
+                          <a:miter lim="800000"/>
+                          <a:headEnd/>
+                          <a:tailEnd/>
+                        </a:ln>
+                      </wps:spPr>
+                      <wps:txbx>
+                        <w:txbxContent>
+                          <w:p>
+                            <w:r>
+                              <w:t>scene: {</w:t>
+                            </w:r>
+                            <w:r>
+                              <w:br/>
+                              <w:t xml:space="preserve">  preload: preload,</w:t>
+                            </w:r>
+                            <w:r>
+                              <w:br/>
+                              <w:t xml:space="preserve">  create: create,</w:t>
+                            </w:r>
+                            <w:r>
+                              <w:br/>
+                              <w:t xml:space="preserve">  update: update</w:t>
+                            </w:r>
+                            <w:r>
+                              <w:br/>
+                              <w:t>}</w:t>
+                            </w:r>
+                          </w:p>
+                          <w:p/>
+                        </w:txbxContent>
+                      </wps:txbx>
+                      <wps:bodyPr rot="0" vert="horz" wrap="square" lIns="91440" tIns="45720" rIns="91440" bIns="45720" anchor="t" anchorCtr="0">
+                        <a:noAutofit/>
+                      </wps:bodyPr>
+                    </wps:wsp>
+                  </a:graphicData>
+                </a:graphic>
+                <wp14:sizeRelH relativeFrom="margin">
+                  <wp14:pctWidth>0</wp14:pctWidth>
+                </wp14:sizeRelH>
+                <wp14:sizeRelV relativeFrom="margin">
+                  <wp14:pctHeight>0</wp14:pctHeight>
+                </wp14:sizeRelV>
+              </wp:anchor>
+            </w:drawing>
+          </mc:Choice>
+          <mc:Fallback>
+            <w:pict>
+              <v:shape w14:anchorId="7F2C766E" id="_x0000_s1031" type="#_x0000_t202" style="position:absolute;left:0;text-align:left;margin-left:0;margin-top:177.05pt;width:458pt;height:87.1pt;z-index:251671552;visibility:visible;mso-wrap-style:square;mso-width-percent:0;mso-height-percent:0;mso-wrap-distance-left:9pt;mso-wrap-distance-top:3.6pt;mso-wrap-distance-right:9pt;mso-wrap-distance-bottom:3.6pt;mso-position-horizontal:left;mso-position-horizontal-relative:margin;mso-position-vertical:absolute;mso-position-vertical-relative:text;mso-width-percent:0;mso-height-percent:0;mso-width-relative:margin;mso-height-relative:margin;v-text-anchor:top" o:gfxdata="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">
+                <v:textbox>
+                  <w:txbxContent>
+                    <w:p>
+                      <w:r>
+                        <w:t>scene: {</w:t>
+                      </w:r>
+                      <w:r>
+                        <w:br/>
+                        <w:t xml:space="preserve">  preload: preload,</w:t>
+                      </w:r>
+                      <w:r>
+                        <w:br/>
+                        <w:t xml:space="preserve">  create: create,</w:t>
+                      </w:r>
+                      <w:r>
+                        <w:br/>
+                        <w:t xml:space="preserve">  update: update</w:t>
+                      </w:r>
+                      <w:r>
+                        <w:br/>
+                        <w:t>}</w:t>
+                      </w:r>
+                    </w:p>
+                    <w:p/>
+                  </w:txbxContent>
+                </v:textbox>
+                <w10:wrap type="square" anchorx="margin"/>
+              </v:shape>
+            </w:pict>
+          </mc:Fallback>
+        </mc:AlternateContent>
+      </w:r>
+      <w:r>
+        <w:rPr>
+          <w:rFonts w:ascii="C64 Pro Mono" w:hAnsi="C64 Pro Mono"/>
+          <w:color w:val="FFFFFF" w:themeColor="background1"/>
+        </w:rPr>
         <w:t>Add</w:t>
       </w:r>
       <w:r>
@@ -1265,135 +2099,7 @@
           <w:rFonts w:ascii="C64 Pro Mono" w:hAnsi="C64 Pro Mono"/>
           <w:color w:val="FFFFFF" w:themeColor="background1"/>
         </w:rPr>
-        <w:t xml:space="preserve">), </w:t>
-      </w:r>
-      <w:proofErr w:type="gramStart"/>
-      <w:r>
-        <w:rPr>
-          <w:rFonts w:ascii="C64 Pro Mono" w:hAnsi="C64 Pro Mono"/>
-          <w:color w:val="FFFFFF" w:themeColor="background1"/>
-        </w:rPr>
-        <w:t>create(</w:t>
-      </w:r>
-      <w:proofErr w:type="gramEnd"/>
-      <w:r>
-        <w:rPr>
-          <w:rFonts w:ascii="C64 Pro Mono" w:hAnsi="C64 Pro Mono"/>
-          <w:color w:val="FFFFFF" w:themeColor="background1"/>
-        </w:rPr>
-        <w:t>) and update</w:t>
-      </w:r>
-    </w:p>
-    <w:p>
-      <w:pPr>
-        <w:rPr>
-          <w:rFonts w:ascii="C64 Pro Mono" w:hAnsi="C64 Pro Mono"/>
-          <w:color w:val="FFFFFF" w:themeColor="background1"/>
-        </w:rPr>
-      </w:pPr>
-      <w:r>
-        <w:rPr>
-          <w:noProof/>
-        </w:rPr>
-        <w:drawing>
-          <wp:inline distT="0" distB="0" distL="0" distR="0" wp14:anchorId="7773D335" wp14:editId="1E499F0E">
-            <wp:extent cx="4191000" cy="2814256"/>
-            <wp:effectExtent l="0" t="0" r="0" b="5715"/>
-            <wp:docPr id="1134152647" name="Picture 3"/>
-            <wp:cNvGraphicFramePr>
-              <a:graphicFrameLocks xmlns:a="http://schemas.openxmlformats.org/drawingml/2006/main" noChangeAspect="1"/>
-            </wp:cNvGraphicFramePr>
-            <a:graphic xmlns:a="http://schemas.openxmlformats.org/drawingml/2006/main">
-              <a:graphicData uri="http://schemas.openxmlformats.org/drawingml/2006/picture">
-                <pic:pic xmlns:pic="http://schemas.openxmlformats.org/drawingml/2006/picture">
-                  <pic:nvPicPr>
-                    <pic:cNvPr id="0" name="Picture 3"/>
-                    <pic:cNvPicPr>
-                      <a:picLocks noChangeAspect="1" noChangeArrowheads="1"/>
-                    </pic:cNvPicPr>
-                  </pic:nvPicPr>
-                  <pic:blipFill>
-                    <a:blip r:embed="rId11">
-                      <a:extLst>
-                        <a:ext uri="{28A0092B-C50C-407E-A947-70E740481C1C}">
-                          <a14:useLocalDpi xmlns:a14="http://schemas.microsoft.com/office/drawing/2010/main" val="0"/>
-                        </a:ext>
-                      </a:extLst>
-                    </a:blip>
-                    <a:srcRect/>
-                    <a:stretch>
-                      <a:fillRect/>
-                    </a:stretch>
-                  </pic:blipFill>
-                  <pic:spPr bwMode="auto">
-                    <a:xfrm>
-                      <a:off x="0" y="0"/>
-                      <a:ext cx="4222718" cy="2835554"/>
-                    </a:xfrm>
-                    <a:prstGeom prst="rect">
-                      <a:avLst/>
-                    </a:prstGeom>
-                    <a:noFill/>
-                    <a:ln>
-                      <a:noFill/>
-                    </a:ln>
-                  </pic:spPr>
-                </pic:pic>
-              </a:graphicData>
-            </a:graphic>
-          </wp:inline>
-        </w:drawing>
-      </w:r>
-    </w:p>
-    <w:p>
-      <w:pPr>
-        <w:rPr>
-          <w:rFonts w:ascii="C64 Pro Mono" w:hAnsi="C64 Pro Mono"/>
-          <w:color w:val="FFFFFF" w:themeColor="background1"/>
-        </w:rPr>
-      </w:pPr>
-      <w:r>
-        <w:rPr>
-          <w:rFonts w:ascii="C64 Pro Mono" w:hAnsi="C64 Pro Mono"/>
-          <w:noProof/>
-          <w:color w:val="FFFFFF" w:themeColor="background1"/>
-        </w:rPr>
-        <w:lastRenderedPageBreak/>
-        <w:drawing>
-          <wp:inline distT="0" distB="0" distL="0" distR="0" wp14:anchorId="5AD6F3AB" wp14:editId="7E89F7D4">
-            <wp:extent cx="4677410" cy="3499485"/>
-            <wp:effectExtent l="0" t="0" r="8890" b="5715"/>
-            <wp:docPr id="735074437" name="Picture 1" descr="A black screen with white text&#10;&#10;AI-generated content may be incorrect."/>
-            <wp:cNvGraphicFramePr>
-              <a:graphicFrameLocks xmlns:a="http://schemas.openxmlformats.org/drawingml/2006/main" noChangeAspect="1"/>
-            </wp:cNvGraphicFramePr>
-            <a:graphic xmlns:a="http://schemas.openxmlformats.org/drawingml/2006/main">
-              <a:graphicData uri="http://schemas.openxmlformats.org/drawingml/2006/picture">
-                <pic:pic xmlns:pic="http://schemas.openxmlformats.org/drawingml/2006/picture">
-                  <pic:nvPicPr>
-                    <pic:cNvPr id="735074437" name="Picture 1" descr="A black screen with white text&#10;&#10;AI-generated content may be incorrect."/>
-                    <pic:cNvPicPr/>
-                  </pic:nvPicPr>
-                  <pic:blipFill>
-                    <a:blip r:embed="rId12"/>
-                    <a:stretch>
-                      <a:fillRect/>
-                    </a:stretch>
-                  </pic:blipFill>
-                  <pic:spPr>
-                    <a:xfrm>
-                      <a:off x="0" y="0"/>
-                      <a:ext cx="4677410" cy="3499485"/>
-                    </a:xfrm>
-                    <a:prstGeom prst="rect">
-                      <a:avLst/>
-                    </a:prstGeom>
-                  </pic:spPr>
-                </pic:pic>
-              </a:graphicData>
-            </a:graphic>
-          </wp:inline>
-        </w:drawing>
+        <w:t>), create() and update</w:t>
       </w:r>
     </w:p>
     <w:p>
@@ -1414,17 +2120,8 @@
           <w:color w:val="FFFFFF" w:themeColor="background1"/>
         </w:rPr>
         <w:lastRenderedPageBreak/>
-        <w:t xml:space="preserve">Adding a </w:t>
-      </w:r>
-      <w:proofErr w:type="gramStart"/>
-      <w:r>
-        <w:rPr>
-          <w:rFonts w:ascii="C64 Pro Mono" w:hAnsi="C64 Pro Mono"/>
-          <w:color w:val="FFFFFF" w:themeColor="background1"/>
-        </w:rPr>
-        <w:t>sprite</w:t>
-      </w:r>
-      <w:proofErr w:type="gramEnd"/>
+        <w:t>Adding a sprite</w:t>
+      </w:r>
     </w:p>
     <w:p>
       <w:pPr>
@@ -1455,7 +2152,7 @@
                     <pic:cNvPicPr/>
                   </pic:nvPicPr>
                   <pic:blipFill>
-                    <a:blip r:embed="rId13">
+                    <a:blip r:embed="rId9">
                       <a:extLst>
                         <a:ext uri="{28A0092B-C50C-407E-A947-70E740481C1C}">
                           <a14:useLocalDpi xmlns:a14="http://schemas.microsoft.com/office/drawing/2010/main" val="0"/>
@@ -1495,17 +2192,8 @@
           <w:color w:val="FFFFFF" w:themeColor="background1"/>
         </w:rPr>
         <w:lastRenderedPageBreak/>
-        <w:t xml:space="preserve">Our </w:t>
-      </w:r>
-      <w:proofErr w:type="gramStart"/>
-      <w:r>
-        <w:rPr>
-          <w:rFonts w:ascii="C64 Pro Mono" w:hAnsi="C64 Pro Mono"/>
-          <w:color w:val="FFFFFF" w:themeColor="background1"/>
-        </w:rPr>
-        <w:t>sprite</w:t>
-      </w:r>
-      <w:proofErr w:type="gramEnd"/>
+        <w:t>Our sprite</w:t>
+      </w:r>
       <w:r>
         <w:rPr>
           <w:rFonts w:ascii="C64 Pro Mono" w:hAnsi="C64 Pro Mono"/>
@@ -1623,7 +2311,7 @@
                     <pic:cNvPicPr/>
                   </pic:nvPicPr>
                   <pic:blipFill>
-                    <a:blip r:embed="rId14">
+                    <a:blip r:embed="rId10">
                       <a:extLst>
                         <a:ext uri="{28A0092B-C50C-407E-A947-70E740481C1C}">
                           <a14:useLocalDpi xmlns:a14="http://schemas.microsoft.com/office/drawing/2010/main" val="0"/>
@@ -1697,269 +2385,21 @@
           <w:noProof/>
           <w:color w:val="FFFFFF" w:themeColor="background1"/>
         </w:rPr>
-        <w:drawing>
-          <wp:inline distT="0" distB="0" distL="0" distR="0" wp14:anchorId="76718BFC" wp14:editId="27A325D4">
-            <wp:extent cx="5731510" cy="1790065"/>
-            <wp:effectExtent l="0" t="0" r="2540" b="635"/>
-            <wp:docPr id="1621717890" name="Picture 1" descr="A screen shot of a computer&#10;&#10;AI-generated content may be incorrect."/>
-            <wp:cNvGraphicFramePr>
-              <a:graphicFrameLocks xmlns:a="http://schemas.openxmlformats.org/drawingml/2006/main" noChangeAspect="1"/>
-            </wp:cNvGraphicFramePr>
-            <a:graphic xmlns:a="http://schemas.openxmlformats.org/drawingml/2006/main">
-              <a:graphicData uri="http://schemas.openxmlformats.org/drawingml/2006/picture">
-                <pic:pic xmlns:pic="http://schemas.openxmlformats.org/drawingml/2006/picture">
-                  <pic:nvPicPr>
-                    <pic:cNvPr id="1621717890" name="Picture 1" descr="A screen shot of a computer&#10;&#10;AI-generated content may be incorrect."/>
-                    <pic:cNvPicPr/>
-                  </pic:nvPicPr>
-                  <pic:blipFill>
-                    <a:blip r:embed="rId15"/>
-                    <a:stretch>
-                      <a:fillRect/>
-                    </a:stretch>
-                  </pic:blipFill>
-                  <pic:spPr>
-                    <a:xfrm>
-                      <a:off x="0" y="0"/>
-                      <a:ext cx="5731510" cy="1790065"/>
-                    </a:xfrm>
-                    <a:prstGeom prst="rect">
-                      <a:avLst/>
-                    </a:prstGeom>
-                  </pic:spPr>
-                </pic:pic>
-              </a:graphicData>
-            </a:graphic>
-          </wp:inline>
-        </w:drawing>
-      </w:r>
-    </w:p>
-    <w:p>
-      <w:pPr>
-        <w:jc w:val="both"/>
-        <w:rPr>
-          <w:rFonts w:ascii="C64 Pro Mono" w:hAnsi="C64 Pro Mono"/>
-          <w:color w:val="FFFFFF" w:themeColor="background1"/>
-        </w:rPr>
-      </w:pPr>
-      <w:r>
-        <w:rPr>
-          <w:rFonts w:ascii="C64 Pro Mono" w:hAnsi="C64 Pro Mono"/>
-          <w:noProof/>
-          <w:color w:val="FFFFFF" w:themeColor="background1"/>
-        </w:rPr>
-        <w:lastRenderedPageBreak/>
-        <w:drawing>
-          <wp:inline distT="0" distB="0" distL="0" distR="0" wp14:anchorId="301452B4" wp14:editId="4D97C06F">
-            <wp:extent cx="4674235" cy="3499485"/>
-            <wp:effectExtent l="0" t="0" r="0" b="5715"/>
-            <wp:docPr id="2021420401" name="Picture 1" descr="A screen shot of a computer&#10;&#10;AI-generated content may be incorrect."/>
-            <wp:cNvGraphicFramePr>
-              <a:graphicFrameLocks xmlns:a="http://schemas.openxmlformats.org/drawingml/2006/main" noChangeAspect="1"/>
-            </wp:cNvGraphicFramePr>
-            <a:graphic xmlns:a="http://schemas.openxmlformats.org/drawingml/2006/main">
-              <a:graphicData uri="http://schemas.openxmlformats.org/drawingml/2006/picture">
-                <pic:pic xmlns:pic="http://schemas.openxmlformats.org/drawingml/2006/picture">
-                  <pic:nvPicPr>
-                    <pic:cNvPr id="2021420401" name="Picture 1" descr="A screen shot of a computer&#10;&#10;AI-generated content may be incorrect."/>
-                    <pic:cNvPicPr/>
-                  </pic:nvPicPr>
-                  <pic:blipFill>
-                    <a:blip r:embed="rId16"/>
-                    <a:stretch>
-                      <a:fillRect/>
-                    </a:stretch>
-                  </pic:blipFill>
-                  <pic:spPr>
-                    <a:xfrm>
-                      <a:off x="0" y="0"/>
-                      <a:ext cx="4674235" cy="3499485"/>
-                    </a:xfrm>
-                    <a:prstGeom prst="rect">
-                      <a:avLst/>
-                    </a:prstGeom>
-                  </pic:spPr>
-                </pic:pic>
-              </a:graphicData>
-            </a:graphic>
-          </wp:inline>
-        </w:drawing>
-      </w:r>
-    </w:p>
-    <w:p>
-      <w:pPr>
-        <w:rPr>
-          <w:rFonts w:ascii="C64 Pro Mono" w:hAnsi="C64 Pro Mono"/>
-          <w:color w:val="FFFFFF" w:themeColor="background1"/>
-        </w:rPr>
-      </w:pPr>
-      <w:r>
-        <w:rPr>
-          <w:rFonts w:ascii="C64 Pro Mono" w:hAnsi="C64 Pro Mono"/>
-          <w:color w:val="FFFFFF" w:themeColor="background1"/>
-        </w:rPr>
-        <w:lastRenderedPageBreak/>
-        <w:t>3.</w:t>
-      </w:r>
-      <w:r>
-        <w:rPr>
-          <w:rFonts w:ascii="C64 Pro Mono" w:hAnsi="C64 Pro Mono"/>
-          <w:color w:val="FFFFFF" w:themeColor="background1"/>
-          <w:sz w:val="28"/>
-          <w:szCs w:val="28"/>
-        </w:rPr>
-        <w:t>Live coding</w:t>
-      </w:r>
-    </w:p>
-    <w:p>
-      <w:pPr>
-        <w:jc w:val="both"/>
-        <w:rPr>
-          <w:rFonts w:ascii="C64 Pro Mono" w:hAnsi="C64 Pro Mono"/>
-          <w:color w:val="FFFFFF" w:themeColor="background1"/>
-        </w:rPr>
-      </w:pPr>
-    </w:p>
-    <w:p>
-      <w:pPr>
-        <w:jc w:val="both"/>
-        <w:rPr>
-          <w:rFonts w:ascii="C64 Pro Mono" w:hAnsi="C64 Pro Mono"/>
-          <w:color w:val="FFFFFF" w:themeColor="background1"/>
-        </w:rPr>
-      </w:pPr>
-    </w:p>
-    <w:p>
-      <w:pPr>
-        <w:jc w:val="both"/>
-        <w:rPr>
-          <w:rFonts w:ascii="C64 Pro Mono" w:hAnsi="C64 Pro Mono"/>
-          <w:color w:val="FFFFFF" w:themeColor="background1"/>
-        </w:rPr>
-      </w:pPr>
-    </w:p>
-    <w:p>
-      <w:pPr>
-        <w:jc w:val="both"/>
-        <w:rPr>
-          <w:rFonts w:ascii="C64 Pro Mono" w:hAnsi="C64 Pro Mono"/>
-          <w:color w:val="FFFFFF" w:themeColor="background1"/>
-        </w:rPr>
-      </w:pPr>
-    </w:p>
-    <w:p>
-      <w:pPr>
-        <w:jc w:val="both"/>
-        <w:rPr>
-          <w:rFonts w:ascii="C64 Pro Mono" w:hAnsi="C64 Pro Mono"/>
-          <w:color w:val="FFFFFF" w:themeColor="background1"/>
-        </w:rPr>
-      </w:pPr>
-    </w:p>
-    <w:p>
-      <w:pPr>
-        <w:jc w:val="both"/>
-        <w:rPr>
-          <w:rFonts w:ascii="C64 Pro Mono" w:hAnsi="C64 Pro Mono"/>
-          <w:color w:val="FFFFFF" w:themeColor="background1"/>
-        </w:rPr>
-      </w:pPr>
-    </w:p>
-    <w:p>
-      <w:pPr>
-        <w:jc w:val="both"/>
-        <w:rPr>
-          <w:rFonts w:ascii="C64 Pro Mono" w:hAnsi="C64 Pro Mono"/>
-          <w:color w:val="FFFFFF" w:themeColor="background1"/>
-        </w:rPr>
-      </w:pPr>
-    </w:p>
-    <w:p>
-      <w:pPr>
-        <w:jc w:val="both"/>
-        <w:rPr>
-          <w:rFonts w:ascii="C64 Pro Mono" w:hAnsi="C64 Pro Mono"/>
-          <w:color w:val="FFFFFF" w:themeColor="background1"/>
-        </w:rPr>
-      </w:pPr>
-    </w:p>
-    <w:p>
-      <w:pPr>
-        <w:jc w:val="both"/>
-        <w:rPr>
-          <w:rFonts w:ascii="C64 Pro Mono" w:hAnsi="C64 Pro Mono"/>
-          <w:color w:val="FFFFFF" w:themeColor="background1"/>
-        </w:rPr>
-      </w:pPr>
-    </w:p>
-    <w:p>
-      <w:pPr>
-        <w:jc w:val="both"/>
-        <w:rPr>
-          <w:rFonts w:ascii="C64 Pro Mono" w:hAnsi="C64 Pro Mono"/>
-          <w:color w:val="FFFFFF" w:themeColor="background1"/>
-        </w:rPr>
-      </w:pPr>
-    </w:p>
-    <w:p>
-      <w:pPr>
-        <w:jc w:val="both"/>
-        <w:rPr>
-          <w:rFonts w:ascii="C64 Pro Mono" w:hAnsi="C64 Pro Mono"/>
-          <w:color w:val="FFFFFF" w:themeColor="background1"/>
-        </w:rPr>
-      </w:pPr>
-    </w:p>
-    <w:p>
-      <w:pPr>
-        <w:jc w:val="both"/>
-        <w:rPr>
-          <w:rFonts w:ascii="C64 Pro Mono" w:hAnsi="C64 Pro Mono"/>
-          <w:color w:val="FFFFFF" w:themeColor="background1"/>
-        </w:rPr>
-      </w:pPr>
-    </w:p>
-    <w:p>
-      <w:pPr>
-        <w:jc w:val="both"/>
-        <w:rPr>
-          <w:rFonts w:ascii="C64 Pro Mono" w:hAnsi="C64 Pro Mono"/>
-          <w:color w:val="FFFFFF" w:themeColor="background1"/>
-        </w:rPr>
-      </w:pPr>
-    </w:p>
-    <w:p>
-      <w:pPr>
-        <w:jc w:val="both"/>
-        <w:rPr>
-          <w:rFonts w:ascii="C64 Pro Mono" w:hAnsi="C64 Pro Mono"/>
-          <w:color w:val="FFFFFF" w:themeColor="background1"/>
-        </w:rPr>
-      </w:pPr>
-      <w:r>
-        <w:rPr>
-          <w:rFonts w:asciiTheme="majorBidi" w:hAnsiTheme="majorBidi" w:cstheme="majorBidi"/>
-          <w:noProof/>
-          <w:color w:val="FFFFFF" w:themeColor="background1"/>
-          <w:sz w:val="16"/>
-          <w:szCs w:val="16"/>
-        </w:rPr>
-        <w:lastRenderedPageBreak/>
         <mc:AlternateContent>
           <mc:Choice Requires="wps">
             <w:drawing>
-              <wp:anchor distT="45720" distB="45720" distL="114300" distR="114300" simplePos="0" relativeHeight="251659264" behindDoc="0" locked="0" layoutInCell="1" allowOverlap="1" wp14:anchorId="3AAE8F27" wp14:editId="15976196">
+              <wp:anchor distT="45720" distB="45720" distL="114300" distR="114300" simplePos="0" relativeHeight="251673600" behindDoc="0" locked="0" layoutInCell="1" allowOverlap="1" wp14:anchorId="3CF1FF4C" wp14:editId="1DCD603B">
                 <wp:simplePos x="0" y="0"/>
                 <wp:positionH relativeFrom="margin">
                   <wp:align>left</wp:align>
                 </wp:positionH>
                 <wp:positionV relativeFrom="paragraph">
-                  <wp:posOffset>203200</wp:posOffset>
+                  <wp:posOffset>295910</wp:posOffset>
                 </wp:positionV>
-                <wp:extent cx="6182360" cy="2672080"/>
-                <wp:effectExtent l="0" t="0" r="27940" b="13970"/>
+                <wp:extent cx="5816600" cy="2049780"/>
+                <wp:effectExtent l="0" t="0" r="12700" b="26670"/>
                 <wp:wrapSquare wrapText="bothSides"/>
-                <wp:docPr id="217" name="Text Box 2"/>
+                <wp:docPr id="272408545" name="Text Box 2"/>
                 <wp:cNvGraphicFramePr>
                   <a:graphicFrameLocks xmlns:a="http://schemas.openxmlformats.org/drawingml/2006/main"/>
                 </wp:cNvGraphicFramePr>
@@ -1972,7 +2412,7 @@
                       <wps:spPr bwMode="auto">
                         <a:xfrm>
                           <a:off x="0" y="0"/>
-                          <a:ext cx="6182360" cy="2672080"/>
+                          <a:ext cx="5816600" cy="2049780"/>
                         </a:xfrm>
                         <a:prstGeom prst="rect">
                           <a:avLst/>
@@ -1992,733 +2432,246 @@
                       <wps:txbx>
                         <w:txbxContent>
                           <w:p>
-                            <w:pPr>
-                              <w:rPr>
-                                <w:sz w:val="16"/>
-                                <w:szCs w:val="16"/>
-                              </w:rPr>
-                            </w:pPr>
-                            <w:r>
-                              <w:rPr>
-                                <w:sz w:val="16"/>
-                                <w:szCs w:val="16"/>
-                              </w:rPr>
-                              <w:t>&lt;html&gt;</w:t>
-                            </w:r>
-                            <w:r>
-                              <w:rPr>
-                                <w:sz w:val="16"/>
-                                <w:szCs w:val="16"/>
-                              </w:rPr>
+                            <w:r>
+                              <w:t>let sprite = null;</w:t>
+                            </w:r>
+                            <w:r>
                               <w:br/>
-                              <w:t>&lt;head&gt;</w:t>
-                            </w:r>
-                            <w:r>
-                              <w:rPr>
-                                <w:sz w:val="16"/>
-                                <w:szCs w:val="16"/>
-                              </w:rPr>
+                            </w:r>
+                            <w:r>
                               <w:br/>
-                              <w:t xml:space="preserve">    &lt;script src="https://cdn.jsdelivr.net/npm/phaser@3/dist/phaser.js"&gt;&lt;/script&gt;</w:t>
-                            </w:r>
-                            <w:r>
-                              <w:rPr>
-                                <w:sz w:val="16"/>
-                                <w:szCs w:val="16"/>
-                              </w:rPr>
+                              <w:t>function preload() {</w:t>
+                            </w:r>
+                            <w:r>
                               <w:br/>
-                              <w:t>&lt;/head&gt;</w:t>
-                            </w:r>
-                            <w:r>
-                              <w:rPr>
-                                <w:sz w:val="16"/>
-                                <w:szCs w:val="16"/>
-                              </w:rPr>
+                              <w:t xml:space="preserve">    this.load.image('balloon', 'balloon.png');</w:t>
+                            </w:r>
+                            <w:r>
                               <w:br/>
-                              <w:t>&lt;body&gt;</w:t>
-                            </w:r>
-                            <w:r>
-                              <w:rPr>
-                                <w:sz w:val="16"/>
-                                <w:szCs w:val="16"/>
-                              </w:rPr>
+                              <w:t>}</w:t>
+                            </w:r>
+                            <w:r>
                               <w:br/>
-                              <w:t xml:space="preserve">    &lt;div id="game-container"&gt;&lt;/div&gt;</w:t>
-                            </w:r>
-                            <w:r>
-                              <w:rPr>
-                                <w:sz w:val="16"/>
-                                <w:szCs w:val="16"/>
-                              </w:rPr>
+                            </w:r>
+                            <w:r>
                               <w:br/>
-                              <w:t xml:space="preserve">    &lt;script&gt;</w:t>
-                            </w:r>
-                            <w:r>
-                              <w:rPr>
-                                <w:sz w:val="16"/>
-                                <w:szCs w:val="16"/>
-                              </w:rPr>
+                              <w:t>function create() {</w:t>
+                            </w:r>
+                            <w:r>
                               <w:br/>
-                              <w:t xml:space="preserve">        const config = {</w:t>
-                            </w:r>
-                            <w:r>
-                              <w:rPr>
-                                <w:sz w:val="16"/>
-                                <w:szCs w:val="16"/>
-                              </w:rPr>
+                              <w:t xml:space="preserve">    this.add.text(20, 20, 'Super fajna gra!', { font: '24px Arial', fill: '#ffffff' });</w:t>
+                            </w:r>
+                            <w:r>
                               <w:br/>
-                              <w:t xml:space="preserve">          type: </w:t>
-                            </w:r>
-                            <w:proofErr w:type="spellStart"/>
-                            <w:r>
-                              <w:rPr>
-                                <w:sz w:val="16"/>
-                                <w:szCs w:val="16"/>
-                              </w:rPr>
-                              <w:t>Phaser.AUTO</w:t>
-                            </w:r>
-                            <w:proofErr w:type="spellEnd"/>
-                            <w:r>
-                              <w:rPr>
-                                <w:sz w:val="16"/>
-                                <w:szCs w:val="16"/>
-                              </w:rPr>
-                              <w:t>, // rendering style (WebGL or Canvas)</w:t>
-                            </w:r>
-                            <w:r>
-                              <w:rPr>
-                                <w:sz w:val="16"/>
-                                <w:szCs w:val="16"/>
-                              </w:rPr>
+                              <w:t xml:space="preserve">    sprite = this.add.sprite(200, 200, 'balloon');</w:t>
+                            </w:r>
+                            <w:r>
                               <w:br/>
-                              <w:t xml:space="preserve">          width: 800,</w:t>
-                            </w:r>
-                            <w:r>
-                              <w:rPr>
-                                <w:sz w:val="16"/>
-                                <w:szCs w:val="16"/>
-                              </w:rPr>
+                              <w:t>}</w:t>
+                            </w:r>
+                          </w:p>
+                          <w:p/>
+                        </w:txbxContent>
+                      </wps:txbx>
+                      <wps:bodyPr rot="0" vert="horz" wrap="square" lIns="91440" tIns="45720" rIns="91440" bIns="45720" anchor="t" anchorCtr="0">
+                        <a:noAutofit/>
+                      </wps:bodyPr>
+                    </wps:wsp>
+                  </a:graphicData>
+                </a:graphic>
+                <wp14:sizeRelH relativeFrom="margin">
+                  <wp14:pctWidth>0</wp14:pctWidth>
+                </wp14:sizeRelH>
+                <wp14:sizeRelV relativeFrom="margin">
+                  <wp14:pctHeight>0</wp14:pctHeight>
+                </wp14:sizeRelV>
+              </wp:anchor>
+            </w:drawing>
+          </mc:Choice>
+          <mc:Fallback>
+            <w:pict>
+              <v:shape w14:anchorId="3CF1FF4C" id="_x0000_s1032" type="#_x0000_t202" style="position:absolute;margin-left:0;margin-top:23.3pt;width:458pt;height:161.4pt;z-index:251673600;visibility:visible;mso-wrap-style:square;mso-width-percent:0;mso-height-percent:0;mso-wrap-distance-left:9pt;mso-wrap-distance-top:3.6pt;mso-wrap-distance-right:9pt;mso-wrap-distance-bottom:3.6pt;mso-position-horizontal:left;mso-position-horizontal-relative:margin;mso-position-vertical:absolute;mso-position-vertical-relative:text;mso-width-percent:0;mso-height-percent:0;mso-width-relative:margin;mso-height-relative:margin;v-text-anchor:top" o:gfxdata="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">
+                <v:textbox>
+                  <w:txbxContent>
+                    <w:p>
+                      <w:r>
+                        <w:t>let sprite = null;</w:t>
+                      </w:r>
+                      <w:r>
+                        <w:br/>
+                      </w:r>
+                      <w:r>
+                        <w:br/>
+                        <w:t>function preload() {</w:t>
+                      </w:r>
+                      <w:r>
+                        <w:br/>
+                        <w:t xml:space="preserve">    this.load.image('balloon', 'balloon.png');</w:t>
+                      </w:r>
+                      <w:r>
+                        <w:br/>
+                        <w:t>}</w:t>
+                      </w:r>
+                      <w:r>
+                        <w:br/>
+                      </w:r>
+                      <w:r>
+                        <w:br/>
+                        <w:t>function create() {</w:t>
+                      </w:r>
+                      <w:r>
+                        <w:br/>
+                        <w:t xml:space="preserve">    this.add.text(20, 20, 'Super fajna gra!', { font: '24px Arial', fill: '#ffffff' });</w:t>
+                      </w:r>
+                      <w:r>
+                        <w:br/>
+                        <w:t xml:space="preserve">    sprite = this.add.sprite(200, 200, 'balloon');</w:t>
+                      </w:r>
+                      <w:r>
+                        <w:br/>
+                        <w:t>}</w:t>
+                      </w:r>
+                    </w:p>
+                    <w:p/>
+                  </w:txbxContent>
+                </v:textbox>
+                <w10:wrap type="square" anchorx="margin"/>
+              </v:shape>
+            </w:pict>
+          </mc:Fallback>
+        </mc:AlternateContent>
+      </w:r>
+    </w:p>
+    <w:p>
+      <w:pPr>
+        <w:rPr>
+          <w:rFonts w:ascii="C64 Pro Mono" w:hAnsi="C64 Pro Mono"/>
+          <w:color w:val="FFFFFF" w:themeColor="background1"/>
+        </w:rPr>
+      </w:pPr>
+    </w:p>
+    <w:p>
+      <w:pPr>
+        <w:jc w:val="both"/>
+        <w:rPr>
+          <w:rFonts w:ascii="C64 Pro Mono" w:hAnsi="C64 Pro Mono"/>
+          <w:color w:val="FFFFFF" w:themeColor="background1"/>
+        </w:rPr>
+      </w:pPr>
+      <w:r>
+        <w:rPr>
+          <w:rFonts w:ascii="C64 Pro Mono" w:hAnsi="C64 Pro Mono"/>
+          <w:noProof/>
+          <w:color w:val="FFFFFF" w:themeColor="background1"/>
+        </w:rPr>
+        <w:lastRenderedPageBreak/>
+        <w:drawing>
+          <wp:inline distT="0" distB="0" distL="0" distR="0" wp14:anchorId="301452B4" wp14:editId="4D97C06F">
+            <wp:extent cx="4674235" cy="3499485"/>
+            <wp:effectExtent l="0" t="0" r="0" b="5715"/>
+            <wp:docPr id="2021420401" name="Picture 1" descr="A screen shot of a computer&#10;&#10;AI-generated content may be incorrect."/>
+            <wp:cNvGraphicFramePr>
+              <a:graphicFrameLocks xmlns:a="http://schemas.openxmlformats.org/drawingml/2006/main" noChangeAspect="1"/>
+            </wp:cNvGraphicFramePr>
+            <a:graphic xmlns:a="http://schemas.openxmlformats.org/drawingml/2006/main">
+              <a:graphicData uri="http://schemas.openxmlformats.org/drawingml/2006/picture">
+                <pic:pic xmlns:pic="http://schemas.openxmlformats.org/drawingml/2006/picture">
+                  <pic:nvPicPr>
+                    <pic:cNvPr id="2021420401" name="Picture 1" descr="A screen shot of a computer&#10;&#10;AI-generated content may be incorrect."/>
+                    <pic:cNvPicPr/>
+                  </pic:nvPicPr>
+                  <pic:blipFill>
+                    <a:blip r:embed="rId11"/>
+                    <a:stretch>
+                      <a:fillRect/>
+                    </a:stretch>
+                  </pic:blipFill>
+                  <pic:spPr>
+                    <a:xfrm>
+                      <a:off x="0" y="0"/>
+                      <a:ext cx="4674235" cy="3499485"/>
+                    </a:xfrm>
+                    <a:prstGeom prst="rect">
+                      <a:avLst/>
+                    </a:prstGeom>
+                  </pic:spPr>
+                </pic:pic>
+              </a:graphicData>
+            </a:graphic>
+          </wp:inline>
+        </w:drawing>
+      </w:r>
+    </w:p>
+    <w:p>
+      <w:pPr>
+        <w:jc w:val="both"/>
+        <w:rPr>
+          <w:rFonts w:ascii="C64 Pro Mono" w:hAnsi="C64 Pro Mono"/>
+          <w:color w:val="FFFFFF" w:themeColor="background1"/>
+        </w:rPr>
+      </w:pPr>
+      <w:r>
+        <w:rPr>
+          <w:rFonts w:asciiTheme="majorBidi" w:hAnsiTheme="majorBidi" w:cstheme="majorBidi"/>
+          <w:noProof/>
+          <w:color w:val="FFFFFF" w:themeColor="background1"/>
+          <w:sz w:val="16"/>
+          <w:szCs w:val="16"/>
+        </w:rPr>
+        <w:lastRenderedPageBreak/>
+        <mc:AlternateContent>
+          <mc:Choice Requires="wps">
+            <w:drawing>
+              <wp:anchor distT="45720" distB="45720" distL="114300" distR="114300" simplePos="0" relativeHeight="251659264" behindDoc="0" locked="0" layoutInCell="1" allowOverlap="1" wp14:anchorId="3AAE8F27" wp14:editId="6D729BEC">
+                <wp:simplePos x="0" y="0"/>
+                <wp:positionH relativeFrom="margin">
+                  <wp:align>left</wp:align>
+                </wp:positionH>
+                <wp:positionV relativeFrom="paragraph">
+                  <wp:posOffset>203200</wp:posOffset>
+                </wp:positionV>
+                <wp:extent cx="6182360" cy="586740"/>
+                <wp:effectExtent l="0" t="0" r="27940" b="22860"/>
+                <wp:wrapSquare wrapText="bothSides"/>
+                <wp:docPr id="217" name="Text Box 2"/>
+                <wp:cNvGraphicFramePr>
+                  <a:graphicFrameLocks xmlns:a="http://schemas.openxmlformats.org/drawingml/2006/main"/>
+                </wp:cNvGraphicFramePr>
+                <a:graphic xmlns:a="http://schemas.openxmlformats.org/drawingml/2006/main">
+                  <a:graphicData uri="http://schemas.microsoft.com/office/word/2010/wordprocessingShape">
+                    <wps:wsp>
+                      <wps:cNvSpPr txBox="1">
+                        <a:spLocks noChangeArrowheads="1"/>
+                      </wps:cNvSpPr>
+                      <wps:spPr bwMode="auto">
+                        <a:xfrm>
+                          <a:off x="0" y="0"/>
+                          <a:ext cx="6182360" cy="587141"/>
+                        </a:xfrm>
+                        <a:prstGeom prst="rect">
+                          <a:avLst/>
+                        </a:prstGeom>
+                        <a:solidFill>
+                          <a:srgbClr val="FFFFFF"/>
+                        </a:solidFill>
+                        <a:ln w="9525">
+                          <a:solidFill>
+                            <a:srgbClr val="000000"/>
+                          </a:solidFill>
+                          <a:miter lim="800000"/>
+                          <a:headEnd/>
+                          <a:tailEnd/>
+                        </a:ln>
+                      </wps:spPr>
+                      <wps:txbx>
+                        <w:txbxContent>
+                          <w:p>
+                            <w:r>
+                              <w:t>const spritesCount = 12;</w:t>
+                            </w:r>
+                            <w:r>
                               <w:br/>
-                              <w:t xml:space="preserve">          height: 600,</w:t>
-                            </w:r>
-                            <w:r>
-                              <w:rPr>
-                                <w:sz w:val="16"/>
-                                <w:szCs w:val="16"/>
-                              </w:rPr>
-                              <w:br/>
-                              <w:t xml:space="preserve">          parent: 'game-container',</w:t>
-                            </w:r>
-                            <w:r>
-                              <w:rPr>
-                                <w:sz w:val="16"/>
-                                <w:szCs w:val="16"/>
-                              </w:rPr>
-                              <w:br/>
-                              <w:t xml:space="preserve">          scene: {</w:t>
-                            </w:r>
-                            <w:r>
-                              <w:rPr>
-                                <w:sz w:val="16"/>
-                                <w:szCs w:val="16"/>
-                              </w:rPr>
-                              <w:br/>
-                              <w:t xml:space="preserve">            preload: preload,</w:t>
-                            </w:r>
-                            <w:r>
-                              <w:rPr>
-                                <w:sz w:val="16"/>
-                                <w:szCs w:val="16"/>
-                              </w:rPr>
-                              <w:br/>
-                              <w:t xml:space="preserve">            create: create,</w:t>
-                            </w:r>
-                            <w:r>
-                              <w:rPr>
-                                <w:sz w:val="16"/>
-                                <w:szCs w:val="16"/>
-                              </w:rPr>
-                              <w:br/>
-                              <w:t xml:space="preserve">            update: update</w:t>
-                            </w:r>
-                            <w:r>
-                              <w:rPr>
-                                <w:sz w:val="16"/>
-                                <w:szCs w:val="16"/>
-                              </w:rPr>
-                              <w:br/>
-                              <w:t xml:space="preserve">          }</w:t>
-                            </w:r>
-                            <w:r>
-                              <w:rPr>
-                                <w:sz w:val="16"/>
-                                <w:szCs w:val="16"/>
-                              </w:rPr>
-                              <w:br/>
-                              <w:t xml:space="preserve">        };</w:t>
-                            </w:r>
-                            <w:r>
-                              <w:rPr>
-                                <w:sz w:val="16"/>
-                                <w:szCs w:val="16"/>
-                              </w:rPr>
-                              <w:br/>
-                            </w:r>
-                            <w:r>
-                              <w:rPr>
-                                <w:sz w:val="16"/>
-                                <w:szCs w:val="16"/>
-                              </w:rPr>
-                              <w:br/>
-                              <w:t xml:space="preserve">        const game = new </w:t>
-                            </w:r>
-                            <w:proofErr w:type="spellStart"/>
-                            <w:r>
-                              <w:rPr>
-                                <w:sz w:val="16"/>
-                                <w:szCs w:val="16"/>
-                              </w:rPr>
-                              <w:t>Phaser.Game</w:t>
-                            </w:r>
-                            <w:proofErr w:type="spellEnd"/>
-                            <w:r>
-                              <w:rPr>
-                                <w:sz w:val="16"/>
-                                <w:szCs w:val="16"/>
-                              </w:rPr>
-                              <w:t>(config);</w:t>
-                            </w:r>
-                            <w:r>
-                              <w:rPr>
-                                <w:sz w:val="16"/>
-                                <w:szCs w:val="16"/>
-                              </w:rPr>
-                              <w:br/>
-                              <w:t xml:space="preserve">        const </w:t>
-                            </w:r>
-                            <w:proofErr w:type="spellStart"/>
-                            <w:r>
-                              <w:rPr>
-                                <w:sz w:val="16"/>
-                                <w:szCs w:val="16"/>
-                              </w:rPr>
-                              <w:t>spritesCount</w:t>
-                            </w:r>
-                            <w:proofErr w:type="spellEnd"/>
-                            <w:r>
-                              <w:rPr>
-                                <w:sz w:val="16"/>
-                                <w:szCs w:val="16"/>
-                              </w:rPr>
-                              <w:t xml:space="preserve"> = 12;</w:t>
-                            </w:r>
-                            <w:r>
-                              <w:rPr>
-                                <w:sz w:val="16"/>
-                                <w:szCs w:val="16"/>
-                              </w:rPr>
-                              <w:br/>
-                              <w:t xml:space="preserve">        let sprites = [];</w:t>
-                            </w:r>
-                            <w:r>
-                              <w:rPr>
-                                <w:sz w:val="16"/>
-                                <w:szCs w:val="16"/>
-                              </w:rPr>
-                              <w:br/>
-                            </w:r>
-                            <w:r>
-                              <w:rPr>
-                                <w:sz w:val="16"/>
-                                <w:szCs w:val="16"/>
-                              </w:rPr>
-                              <w:br/>
-                              <w:t xml:space="preserve">        function preload() {</w:t>
-                            </w:r>
-                            <w:r>
-                              <w:rPr>
-                                <w:sz w:val="16"/>
-                                <w:szCs w:val="16"/>
-                              </w:rPr>
-                              <w:br/>
-                              <w:t xml:space="preserve">            </w:t>
-                            </w:r>
-                            <w:proofErr w:type="spellStart"/>
-                            <w:r>
-                              <w:rPr>
-                                <w:sz w:val="16"/>
-                                <w:szCs w:val="16"/>
-                              </w:rPr>
-                              <w:t>this.load.image</w:t>
-                            </w:r>
-                            <w:proofErr w:type="spellEnd"/>
-                            <w:r>
-                              <w:rPr>
-                                <w:sz w:val="16"/>
-                                <w:szCs w:val="16"/>
-                              </w:rPr>
-                              <w:t>('balloon', 'balloon.png');</w:t>
-                            </w:r>
-                            <w:r>
-                              <w:rPr>
-                                <w:sz w:val="16"/>
-                                <w:szCs w:val="16"/>
-                              </w:rPr>
-                              <w:br/>
-                              <w:t xml:space="preserve">        }</w:t>
-                            </w:r>
-                            <w:r>
-                              <w:rPr>
-                                <w:sz w:val="16"/>
-                                <w:szCs w:val="16"/>
-                              </w:rPr>
-                              <w:br/>
-                            </w:r>
-                            <w:r>
-                              <w:rPr>
-                                <w:sz w:val="16"/>
-                                <w:szCs w:val="16"/>
-                              </w:rPr>
-                              <w:br/>
-                              <w:t xml:space="preserve">        function create() {</w:t>
-                            </w:r>
-                            <w:r>
-                              <w:rPr>
-                                <w:sz w:val="16"/>
-                                <w:szCs w:val="16"/>
-                              </w:rPr>
-                              <w:br/>
-                              <w:t xml:space="preserve">            </w:t>
-                            </w:r>
-                            <w:proofErr w:type="spellStart"/>
-                            <w:r>
-                              <w:rPr>
-                                <w:sz w:val="16"/>
-                                <w:szCs w:val="16"/>
-                              </w:rPr>
-                              <w:t>this.add.text</w:t>
-                            </w:r>
-                            <w:proofErr w:type="spellEnd"/>
-                            <w:r>
-                              <w:rPr>
-                                <w:sz w:val="16"/>
-                                <w:szCs w:val="16"/>
-                              </w:rPr>
-                              <w:t xml:space="preserve">(20, 20, 'Super </w:t>
-                            </w:r>
-                            <w:proofErr w:type="spellStart"/>
-                            <w:r>
-                              <w:rPr>
-                                <w:sz w:val="16"/>
-                                <w:szCs w:val="16"/>
-                              </w:rPr>
-                              <w:t>fajna</w:t>
-                            </w:r>
-                            <w:proofErr w:type="spellEnd"/>
-                            <w:r>
-                              <w:rPr>
-                                <w:sz w:val="16"/>
-                                <w:szCs w:val="16"/>
-                              </w:rPr>
-                              <w:t xml:space="preserve"> </w:t>
-                            </w:r>
-                            <w:proofErr w:type="spellStart"/>
-                            <w:r>
-                              <w:rPr>
-                                <w:sz w:val="16"/>
-                                <w:szCs w:val="16"/>
-                              </w:rPr>
-                              <w:t>gra</w:t>
-                            </w:r>
-                            <w:proofErr w:type="spellEnd"/>
-                            <w:r>
-                              <w:rPr>
-                                <w:sz w:val="16"/>
-                                <w:szCs w:val="16"/>
-                              </w:rPr>
-                              <w:t>!', { font: '24px Arial', fill: '#</w:t>
-                            </w:r>
-                            <w:proofErr w:type="spellStart"/>
-                            <w:r>
-                              <w:rPr>
-                                <w:sz w:val="16"/>
-                                <w:szCs w:val="16"/>
-                              </w:rPr>
-                              <w:t>ffffff</w:t>
-                            </w:r>
-                            <w:proofErr w:type="spellEnd"/>
-                            <w:r>
-                              <w:rPr>
-                                <w:sz w:val="16"/>
-                                <w:szCs w:val="16"/>
-                              </w:rPr>
-                              <w:t>' });</w:t>
-                            </w:r>
-                            <w:r>
-                              <w:rPr>
-                                <w:sz w:val="16"/>
-                                <w:szCs w:val="16"/>
-                              </w:rPr>
-                              <w:br/>
-                            </w:r>
-                            <w:r>
-                              <w:rPr>
-                                <w:sz w:val="16"/>
-                                <w:szCs w:val="16"/>
-                              </w:rPr>
-                              <w:br/>
-                              <w:t xml:space="preserve">            for (let </w:t>
-                            </w:r>
-                            <w:proofErr w:type="spellStart"/>
-                            <w:r>
-                              <w:rPr>
-                                <w:sz w:val="16"/>
-                                <w:szCs w:val="16"/>
-                              </w:rPr>
-                              <w:t>i</w:t>
-                            </w:r>
-                            <w:proofErr w:type="spellEnd"/>
-                            <w:r>
-                              <w:rPr>
-                                <w:sz w:val="16"/>
-                                <w:szCs w:val="16"/>
-                              </w:rPr>
-                              <w:t xml:space="preserve"> = 0; </w:t>
-                            </w:r>
-                            <w:proofErr w:type="spellStart"/>
-                            <w:r>
-                              <w:rPr>
-                                <w:sz w:val="16"/>
-                                <w:szCs w:val="16"/>
-                              </w:rPr>
-                              <w:t>i</w:t>
-                            </w:r>
-                            <w:proofErr w:type="spellEnd"/>
-                            <w:r>
-                              <w:rPr>
-                                <w:sz w:val="16"/>
-                                <w:szCs w:val="16"/>
-                              </w:rPr>
-                              <w:t xml:space="preserve"> &lt; </w:t>
-                            </w:r>
-                            <w:proofErr w:type="spellStart"/>
-                            <w:r>
-                              <w:rPr>
-                                <w:sz w:val="16"/>
-                                <w:szCs w:val="16"/>
-                              </w:rPr>
-                              <w:t>spritesCount</w:t>
-                            </w:r>
-                            <w:proofErr w:type="spellEnd"/>
-                            <w:r>
-                              <w:rPr>
-                                <w:sz w:val="16"/>
-                                <w:szCs w:val="16"/>
-                              </w:rPr>
-                              <w:t xml:space="preserve">; </w:t>
-                            </w:r>
-                            <w:proofErr w:type="spellStart"/>
-                            <w:r>
-                              <w:rPr>
-                                <w:sz w:val="16"/>
-                                <w:szCs w:val="16"/>
-                              </w:rPr>
-                              <w:t>i</w:t>
-                            </w:r>
-                            <w:proofErr w:type="spellEnd"/>
-                            <w:r>
-                              <w:rPr>
-                                <w:sz w:val="16"/>
-                                <w:szCs w:val="16"/>
-                              </w:rPr>
-                              <w:t>++){</w:t>
-                            </w:r>
-                            <w:r>
-                              <w:rPr>
-                                <w:sz w:val="16"/>
-                                <w:szCs w:val="16"/>
-                              </w:rPr>
-                              <w:br/>
-                              <w:t xml:space="preserve">                let s = </w:t>
-                            </w:r>
-                            <w:proofErr w:type="spellStart"/>
-                            <w:r>
-                              <w:rPr>
-                                <w:sz w:val="16"/>
-                                <w:szCs w:val="16"/>
-                              </w:rPr>
-                              <w:t>this.add.sprite</w:t>
-                            </w:r>
-                            <w:proofErr w:type="spellEnd"/>
-                            <w:r>
-                              <w:rPr>
-                                <w:sz w:val="16"/>
-                                <w:szCs w:val="16"/>
-                              </w:rPr>
-                              <w:t>(</w:t>
-                            </w:r>
-                            <w:proofErr w:type="spellStart"/>
-                            <w:r>
-                              <w:rPr>
-                                <w:sz w:val="16"/>
-                                <w:szCs w:val="16"/>
-                              </w:rPr>
-                              <w:t>i</w:t>
-                            </w:r>
-                            <w:proofErr w:type="spellEnd"/>
-                            <w:r>
-                              <w:rPr>
-                                <w:sz w:val="16"/>
-                                <w:szCs w:val="16"/>
-                              </w:rPr>
-                              <w:t>, 12*i+200, 'balloon');</w:t>
-                            </w:r>
-                            <w:r>
-                              <w:rPr>
-                                <w:sz w:val="16"/>
-                                <w:szCs w:val="16"/>
-                              </w:rPr>
-                              <w:br/>
-                              <w:t xml:space="preserve">                </w:t>
-                            </w:r>
-                            <w:proofErr w:type="spellStart"/>
-                            <w:r>
-                              <w:rPr>
-                                <w:sz w:val="16"/>
-                                <w:szCs w:val="16"/>
-                              </w:rPr>
-                              <w:t>sprites.push</w:t>
-                            </w:r>
-                            <w:proofErr w:type="spellEnd"/>
-                            <w:r>
-                              <w:rPr>
-                                <w:sz w:val="16"/>
-                                <w:szCs w:val="16"/>
-                              </w:rPr>
-                              <w:t>(s);</w:t>
-                            </w:r>
-                            <w:r>
-                              <w:rPr>
-                                <w:sz w:val="16"/>
-                                <w:szCs w:val="16"/>
-                              </w:rPr>
-                              <w:br/>
-                              <w:t xml:space="preserve">            }</w:t>
-                            </w:r>
-                            <w:r>
-                              <w:rPr>
-                                <w:sz w:val="16"/>
-                                <w:szCs w:val="16"/>
-                              </w:rPr>
-                              <w:br/>
-                              <w:t xml:space="preserve">        }</w:t>
-                            </w:r>
-                            <w:r>
-                              <w:rPr>
-                                <w:sz w:val="16"/>
-                                <w:szCs w:val="16"/>
-                              </w:rPr>
-                              <w:br/>
-                            </w:r>
-                            <w:r>
-                              <w:rPr>
-                                <w:sz w:val="16"/>
-                                <w:szCs w:val="16"/>
-                              </w:rPr>
-                              <w:br/>
-                              <w:t xml:space="preserve">        function update() {</w:t>
-                            </w:r>
-                            <w:r>
-                              <w:rPr>
-                                <w:sz w:val="16"/>
-                                <w:szCs w:val="16"/>
-                              </w:rPr>
-                              <w:br/>
-                              <w:t xml:space="preserve">            for (let </w:t>
-                            </w:r>
-                            <w:proofErr w:type="spellStart"/>
-                            <w:r>
-                              <w:rPr>
-                                <w:sz w:val="16"/>
-                                <w:szCs w:val="16"/>
-                              </w:rPr>
-                              <w:t>i</w:t>
-                            </w:r>
-                            <w:proofErr w:type="spellEnd"/>
-                            <w:r>
-                              <w:rPr>
-                                <w:sz w:val="16"/>
-                                <w:szCs w:val="16"/>
-                              </w:rPr>
-                              <w:t xml:space="preserve"> = 0; </w:t>
-                            </w:r>
-                            <w:proofErr w:type="spellStart"/>
-                            <w:r>
-                              <w:rPr>
-                                <w:sz w:val="16"/>
-                                <w:szCs w:val="16"/>
-                              </w:rPr>
-                              <w:t>i</w:t>
-                            </w:r>
-                            <w:proofErr w:type="spellEnd"/>
-                            <w:r>
-                              <w:rPr>
-                                <w:sz w:val="16"/>
-                                <w:szCs w:val="16"/>
-                              </w:rPr>
-                              <w:t xml:space="preserve"> &lt; </w:t>
-                            </w:r>
-                            <w:proofErr w:type="spellStart"/>
-                            <w:r>
-                              <w:rPr>
-                                <w:sz w:val="16"/>
-                                <w:szCs w:val="16"/>
-                              </w:rPr>
-                              <w:t>spritesCount</w:t>
-                            </w:r>
-                            <w:proofErr w:type="spellEnd"/>
-                            <w:r>
-                              <w:rPr>
-                                <w:sz w:val="16"/>
-                                <w:szCs w:val="16"/>
-                              </w:rPr>
-                              <w:t xml:space="preserve">; </w:t>
-                            </w:r>
-                            <w:proofErr w:type="spellStart"/>
-                            <w:r>
-                              <w:rPr>
-                                <w:sz w:val="16"/>
-                                <w:szCs w:val="16"/>
-                              </w:rPr>
-                              <w:t>i</w:t>
-                            </w:r>
-                            <w:proofErr w:type="spellEnd"/>
-                            <w:r>
-                              <w:rPr>
-                                <w:sz w:val="16"/>
-                                <w:szCs w:val="16"/>
-                              </w:rPr>
-                              <w:t>++){</w:t>
-                            </w:r>
-                            <w:r>
-                              <w:rPr>
-                                <w:sz w:val="16"/>
-                                <w:szCs w:val="16"/>
-                              </w:rPr>
-                              <w:br/>
-                              <w:t xml:space="preserve">                if (sprites[</w:t>
-                            </w:r>
-                            <w:proofErr w:type="spellStart"/>
-                            <w:r>
-                              <w:rPr>
-                                <w:sz w:val="16"/>
-                                <w:szCs w:val="16"/>
-                              </w:rPr>
-                              <w:t>i</w:t>
-                            </w:r>
-                            <w:proofErr w:type="spellEnd"/>
-                            <w:r>
-                              <w:rPr>
-                                <w:sz w:val="16"/>
-                                <w:szCs w:val="16"/>
-                              </w:rPr>
-                              <w:t>].x &lt; 800)</w:t>
-                            </w:r>
-                            <w:r>
-                              <w:rPr>
-                                <w:sz w:val="16"/>
-                                <w:szCs w:val="16"/>
-                              </w:rPr>
-                              <w:br/>
-                              <w:t xml:space="preserve">                    sprites[</w:t>
-                            </w:r>
-                            <w:proofErr w:type="spellStart"/>
-                            <w:r>
-                              <w:rPr>
-                                <w:sz w:val="16"/>
-                                <w:szCs w:val="16"/>
-                              </w:rPr>
-                              <w:t>i</w:t>
-                            </w:r>
-                            <w:proofErr w:type="spellEnd"/>
-                            <w:r>
-                              <w:rPr>
-                                <w:sz w:val="16"/>
-                                <w:szCs w:val="16"/>
-                              </w:rPr>
-                              <w:t>].x += i+1;</w:t>
-                            </w:r>
-                            <w:r>
-                              <w:rPr>
-                                <w:sz w:val="16"/>
-                                <w:szCs w:val="16"/>
-                              </w:rPr>
-                              <w:br/>
-                              <w:t xml:space="preserve">                else</w:t>
-                            </w:r>
-                            <w:r>
-                              <w:rPr>
-                                <w:sz w:val="16"/>
-                                <w:szCs w:val="16"/>
-                              </w:rPr>
-                              <w:br/>
-                              <w:t xml:space="preserve">                    sprites[</w:t>
-                            </w:r>
-                            <w:proofErr w:type="spellStart"/>
-                            <w:r>
-                              <w:rPr>
-                                <w:sz w:val="16"/>
-                                <w:szCs w:val="16"/>
-                              </w:rPr>
-                              <w:t>i</w:t>
-                            </w:r>
-                            <w:proofErr w:type="spellEnd"/>
-                            <w:r>
-                              <w:rPr>
-                                <w:sz w:val="16"/>
-                                <w:szCs w:val="16"/>
-                              </w:rPr>
-                              <w:t>].x = 0;</w:t>
-                            </w:r>
-                            <w:r>
-                              <w:rPr>
-                                <w:sz w:val="16"/>
-                                <w:szCs w:val="16"/>
-                              </w:rPr>
-                              <w:br/>
-                              <w:t xml:space="preserve">            }</w:t>
-                            </w:r>
-                            <w:r>
-                              <w:rPr>
-                                <w:sz w:val="16"/>
-                                <w:szCs w:val="16"/>
-                              </w:rPr>
-                              <w:br/>
-                              <w:t xml:space="preserve">        }</w:t>
-                            </w:r>
-                            <w:r>
-                              <w:rPr>
-                                <w:sz w:val="16"/>
-                                <w:szCs w:val="16"/>
-                              </w:rPr>
-                              <w:br/>
-                              <w:t xml:space="preserve">    &lt;/script&gt;</w:t>
-                            </w:r>
-                            <w:r>
-                              <w:rPr>
-                                <w:sz w:val="16"/>
-                                <w:szCs w:val="16"/>
-                              </w:rPr>
-                              <w:br/>
-                              <w:t>&lt;/body&gt;</w:t>
-                            </w:r>
-                            <w:r>
-                              <w:rPr>
-                                <w:sz w:val="16"/>
-                                <w:szCs w:val="16"/>
-                              </w:rPr>
-                              <w:br/>
-                              <w:t>&lt;/html&gt;</w:t>
+                              <w:t>let sprites = [];</w:t>
                             </w:r>
                           </w:p>
                           <w:p>
@@ -2748,741 +2701,16 @@
           </mc:Choice>
           <mc:Fallback>
             <w:pict>
-              <v:shapetype w14:anchorId="3AAE8F27" id="_x0000_t202" coordsize="21600,21600" o:spt="202" path="m,l,21600r21600,l21600,xe">
-                <v:stroke joinstyle="miter"/>
-                <v:path gradientshapeok="t" o:connecttype="rect"/>
-              </v:shapetype>
-              <v:shape id="Text Box 2" o:spid="_x0000_s1026" type="#_x0000_t202" style="position:absolute;left:0;text-align:left;margin-left:0;margin-top:16pt;width:486.8pt;height:210.4pt;z-index:251659264;visibility:visible;mso-wrap-style:square;mso-width-percent:0;mso-height-percent:0;mso-wrap-distance-left:9pt;mso-wrap-distance-top:3.6pt;mso-wrap-distance-right:9pt;mso-wrap-distance-bottom:3.6pt;mso-position-horizontal:left;mso-position-horizontal-relative:margin;mso-position-vertical:absolute;mso-position-vertical-relative:text;mso-width-percent:0;mso-height-percent:0;mso-width-relative:margin;mso-height-relative:margin;v-text-anchor:top" o:gfxdata="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">
+              <v:shape w14:anchorId="3AAE8F27" id="_x0000_s1033" type="#_x0000_t202" style="position:absolute;left:0;text-align:left;margin-left:0;margin-top:16pt;width:486.8pt;height:46.2pt;z-index:251659264;visibility:visible;mso-wrap-style:square;mso-width-percent:0;mso-height-percent:0;mso-wrap-distance-left:9pt;mso-wrap-distance-top:3.6pt;mso-wrap-distance-right:9pt;mso-wrap-distance-bottom:3.6pt;mso-position-horizontal:left;mso-position-horizontal-relative:margin;mso-position-vertical:absolute;mso-position-vertical-relative:text;mso-width-percent:0;mso-height-percent:0;mso-width-relative:margin;mso-height-relative:margin;v-text-anchor:top" o:gfxdata="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">
                 <v:textbox>
                   <w:txbxContent>
                     <w:p>
-                      <w:pPr>
-                        <w:rPr>
-                          <w:sz w:val="16"/>
-                          <w:szCs w:val="16"/>
-                        </w:rPr>
-                      </w:pPr>
-                      <w:r>
-                        <w:rPr>
-                          <w:sz w:val="16"/>
-                          <w:szCs w:val="16"/>
-                        </w:rPr>
-                        <w:t>&lt;html&gt;</w:t>
-                      </w:r>
-                      <w:r>
-                        <w:rPr>
-                          <w:sz w:val="16"/>
-                          <w:szCs w:val="16"/>
-                        </w:rPr>
+                      <w:r>
+                        <w:t>const spritesCount = 12;</w:t>
+                      </w:r>
+                      <w:r>
                         <w:br/>
-                        <w:t>&lt;head&gt;</w:t>
-                      </w:r>
-                      <w:r>
-                        <w:rPr>
-                          <w:sz w:val="16"/>
-                          <w:szCs w:val="16"/>
-                        </w:rPr>
-                        <w:br/>
-                        <w:t xml:space="preserve">    &lt;script src="https://cdn.jsdelivr.net/npm/phaser@3/dist/phaser.js"&gt;&lt;/script&gt;</w:t>
-                      </w:r>
-                      <w:r>
-                        <w:rPr>
-                          <w:sz w:val="16"/>
-                          <w:szCs w:val="16"/>
-                        </w:rPr>
-                        <w:br/>
-                        <w:t>&lt;/head&gt;</w:t>
-                      </w:r>
-                      <w:r>
-                        <w:rPr>
-                          <w:sz w:val="16"/>
-                          <w:szCs w:val="16"/>
-                        </w:rPr>
-                        <w:br/>
-                        <w:t>&lt;body&gt;</w:t>
-                      </w:r>
-                      <w:r>
-                        <w:rPr>
-                          <w:sz w:val="16"/>
-                          <w:szCs w:val="16"/>
-                        </w:rPr>
-                        <w:br/>
-                        <w:t xml:space="preserve">    &lt;div id="game-container"&gt;&lt;/div&gt;</w:t>
-                      </w:r>
-                      <w:r>
-                        <w:rPr>
-                          <w:sz w:val="16"/>
-                          <w:szCs w:val="16"/>
-                        </w:rPr>
-                        <w:br/>
-                        <w:t xml:space="preserve">    &lt;script&gt;</w:t>
-                      </w:r>
-                      <w:r>
-                        <w:rPr>
-                          <w:sz w:val="16"/>
-                          <w:szCs w:val="16"/>
-                        </w:rPr>
-                        <w:br/>
-                        <w:t xml:space="preserve">        const config = {</w:t>
-                      </w:r>
-                      <w:r>
-                        <w:rPr>
-                          <w:sz w:val="16"/>
-                          <w:szCs w:val="16"/>
-                        </w:rPr>
-                        <w:br/>
-                        <w:t xml:space="preserve">          type: </w:t>
-                      </w:r>
-                      <w:proofErr w:type="spellStart"/>
-                      <w:r>
-                        <w:rPr>
-                          <w:sz w:val="16"/>
-                          <w:szCs w:val="16"/>
-                        </w:rPr>
-                        <w:t>Phaser.AUTO</w:t>
-                      </w:r>
-                      <w:proofErr w:type="spellEnd"/>
-                      <w:r>
-                        <w:rPr>
-                          <w:sz w:val="16"/>
-                          <w:szCs w:val="16"/>
-                        </w:rPr>
-                        <w:t>, // rendering style (WebGL or Canvas)</w:t>
-                      </w:r>
-                      <w:r>
-                        <w:rPr>
-                          <w:sz w:val="16"/>
-                          <w:szCs w:val="16"/>
-                        </w:rPr>
-                        <w:br/>
-                        <w:t xml:space="preserve">          width: 800,</w:t>
-                      </w:r>
-                      <w:r>
-                        <w:rPr>
-                          <w:sz w:val="16"/>
-                          <w:szCs w:val="16"/>
-                        </w:rPr>
-                        <w:br/>
-                        <w:t xml:space="preserve">          height: 600,</w:t>
-                      </w:r>
-                      <w:r>
-                        <w:rPr>
-                          <w:sz w:val="16"/>
-                          <w:szCs w:val="16"/>
-                        </w:rPr>
-                        <w:br/>
-                        <w:t xml:space="preserve">          parent: 'game-container',</w:t>
-                      </w:r>
-                      <w:r>
-                        <w:rPr>
-                          <w:sz w:val="16"/>
-                          <w:szCs w:val="16"/>
-                        </w:rPr>
-                        <w:br/>
-                        <w:t xml:space="preserve">          scene: {</w:t>
-                      </w:r>
-                      <w:r>
-                        <w:rPr>
-                          <w:sz w:val="16"/>
-                          <w:szCs w:val="16"/>
-                        </w:rPr>
-                        <w:br/>
-                        <w:t xml:space="preserve">            preload: preload,</w:t>
-                      </w:r>
-                      <w:r>
-                        <w:rPr>
-                          <w:sz w:val="16"/>
-                          <w:szCs w:val="16"/>
-                        </w:rPr>
-                        <w:br/>
-                        <w:t xml:space="preserve">            create: create,</w:t>
-                      </w:r>
-                      <w:r>
-                        <w:rPr>
-                          <w:sz w:val="16"/>
-                          <w:szCs w:val="16"/>
-                        </w:rPr>
-                        <w:br/>
-                        <w:t xml:space="preserve">            update: update</w:t>
-                      </w:r>
-                      <w:r>
-                        <w:rPr>
-                          <w:sz w:val="16"/>
-                          <w:szCs w:val="16"/>
-                        </w:rPr>
-                        <w:br/>
-                        <w:t xml:space="preserve">          }</w:t>
-                      </w:r>
-                      <w:r>
-                        <w:rPr>
-                          <w:sz w:val="16"/>
-                          <w:szCs w:val="16"/>
-                        </w:rPr>
-                        <w:br/>
-                        <w:t xml:space="preserve">        };</w:t>
-                      </w:r>
-                      <w:r>
-                        <w:rPr>
-                          <w:sz w:val="16"/>
-                          <w:szCs w:val="16"/>
-                        </w:rPr>
-                        <w:br/>
-                      </w:r>
-                      <w:r>
-                        <w:rPr>
-                          <w:sz w:val="16"/>
-                          <w:szCs w:val="16"/>
-                        </w:rPr>
-                        <w:br/>
-                        <w:t xml:space="preserve">        const game = new </w:t>
-                      </w:r>
-                      <w:proofErr w:type="spellStart"/>
-                      <w:r>
-                        <w:rPr>
-                          <w:sz w:val="16"/>
-                          <w:szCs w:val="16"/>
-                        </w:rPr>
-                        <w:t>Phaser.Game</w:t>
-                      </w:r>
-                      <w:proofErr w:type="spellEnd"/>
-                      <w:r>
-                        <w:rPr>
-                          <w:sz w:val="16"/>
-                          <w:szCs w:val="16"/>
-                        </w:rPr>
-                        <w:t>(config);</w:t>
-                      </w:r>
-                      <w:r>
-                        <w:rPr>
-                          <w:sz w:val="16"/>
-                          <w:szCs w:val="16"/>
-                        </w:rPr>
-                        <w:br/>
-                        <w:t xml:space="preserve">        const </w:t>
-                      </w:r>
-                      <w:proofErr w:type="spellStart"/>
-                      <w:r>
-                        <w:rPr>
-                          <w:sz w:val="16"/>
-                          <w:szCs w:val="16"/>
-                        </w:rPr>
-                        <w:t>spritesCount</w:t>
-                      </w:r>
-                      <w:proofErr w:type="spellEnd"/>
-                      <w:r>
-                        <w:rPr>
-                          <w:sz w:val="16"/>
-                          <w:szCs w:val="16"/>
-                        </w:rPr>
-                        <w:t xml:space="preserve"> = 12;</w:t>
-                      </w:r>
-                      <w:r>
-                        <w:rPr>
-                          <w:sz w:val="16"/>
-                          <w:szCs w:val="16"/>
-                        </w:rPr>
-                        <w:br/>
-                        <w:t xml:space="preserve">        let sprites = [];</w:t>
-                      </w:r>
-                      <w:r>
-                        <w:rPr>
-                          <w:sz w:val="16"/>
-                          <w:szCs w:val="16"/>
-                        </w:rPr>
-                        <w:br/>
-                      </w:r>
-                      <w:r>
-                        <w:rPr>
-                          <w:sz w:val="16"/>
-                          <w:szCs w:val="16"/>
-                        </w:rPr>
-                        <w:br/>
-                        <w:t xml:space="preserve">        function preload() {</w:t>
-                      </w:r>
-                      <w:r>
-                        <w:rPr>
-                          <w:sz w:val="16"/>
-                          <w:szCs w:val="16"/>
-                        </w:rPr>
-                        <w:br/>
-                        <w:t xml:space="preserve">            </w:t>
-                      </w:r>
-                      <w:proofErr w:type="spellStart"/>
-                      <w:r>
-                        <w:rPr>
-                          <w:sz w:val="16"/>
-                          <w:szCs w:val="16"/>
-                        </w:rPr>
-                        <w:t>this.load.image</w:t>
-                      </w:r>
-                      <w:proofErr w:type="spellEnd"/>
-                      <w:r>
-                        <w:rPr>
-                          <w:sz w:val="16"/>
-                          <w:szCs w:val="16"/>
-                        </w:rPr>
-                        <w:t>('balloon', 'balloon.png');</w:t>
-                      </w:r>
-                      <w:r>
-                        <w:rPr>
-                          <w:sz w:val="16"/>
-                          <w:szCs w:val="16"/>
-                        </w:rPr>
-                        <w:br/>
-                        <w:t xml:space="preserve">        }</w:t>
-                      </w:r>
-                      <w:r>
-                        <w:rPr>
-                          <w:sz w:val="16"/>
-                          <w:szCs w:val="16"/>
-                        </w:rPr>
-                        <w:br/>
-                      </w:r>
-                      <w:r>
-                        <w:rPr>
-                          <w:sz w:val="16"/>
-                          <w:szCs w:val="16"/>
-                        </w:rPr>
-                        <w:br/>
-                        <w:t xml:space="preserve">        function create() {</w:t>
-                      </w:r>
-                      <w:r>
-                        <w:rPr>
-                          <w:sz w:val="16"/>
-                          <w:szCs w:val="16"/>
-                        </w:rPr>
-                        <w:br/>
-                        <w:t xml:space="preserve">            </w:t>
-                      </w:r>
-                      <w:proofErr w:type="spellStart"/>
-                      <w:r>
-                        <w:rPr>
-                          <w:sz w:val="16"/>
-                          <w:szCs w:val="16"/>
-                        </w:rPr>
-                        <w:t>this.add.text</w:t>
-                      </w:r>
-                      <w:proofErr w:type="spellEnd"/>
-                      <w:r>
-                        <w:rPr>
-                          <w:sz w:val="16"/>
-                          <w:szCs w:val="16"/>
-                        </w:rPr>
-                        <w:t xml:space="preserve">(20, 20, 'Super </w:t>
-                      </w:r>
-                      <w:proofErr w:type="spellStart"/>
-                      <w:r>
-                        <w:rPr>
-                          <w:sz w:val="16"/>
-                          <w:szCs w:val="16"/>
-                        </w:rPr>
-                        <w:t>fajna</w:t>
-                      </w:r>
-                      <w:proofErr w:type="spellEnd"/>
-                      <w:r>
-                        <w:rPr>
-                          <w:sz w:val="16"/>
-                          <w:szCs w:val="16"/>
-                        </w:rPr>
-                        <w:t xml:space="preserve"> </w:t>
-                      </w:r>
-                      <w:proofErr w:type="spellStart"/>
-                      <w:r>
-                        <w:rPr>
-                          <w:sz w:val="16"/>
-                          <w:szCs w:val="16"/>
-                        </w:rPr>
-                        <w:t>gra</w:t>
-                      </w:r>
-                      <w:proofErr w:type="spellEnd"/>
-                      <w:r>
-                        <w:rPr>
-                          <w:sz w:val="16"/>
-                          <w:szCs w:val="16"/>
-                        </w:rPr>
-                        <w:t>!', { font: '24px Arial', fill: '#</w:t>
-                      </w:r>
-                      <w:proofErr w:type="spellStart"/>
-                      <w:r>
-                        <w:rPr>
-                          <w:sz w:val="16"/>
-                          <w:szCs w:val="16"/>
-                        </w:rPr>
-                        <w:t>ffffff</w:t>
-                      </w:r>
-                      <w:proofErr w:type="spellEnd"/>
-                      <w:r>
-                        <w:rPr>
-                          <w:sz w:val="16"/>
-                          <w:szCs w:val="16"/>
-                        </w:rPr>
-                        <w:t>' });</w:t>
-                      </w:r>
-                      <w:r>
-                        <w:rPr>
-                          <w:sz w:val="16"/>
-                          <w:szCs w:val="16"/>
-                        </w:rPr>
-                        <w:br/>
-                      </w:r>
-                      <w:r>
-                        <w:rPr>
-                          <w:sz w:val="16"/>
-                          <w:szCs w:val="16"/>
-                        </w:rPr>
-                        <w:br/>
-                        <w:t xml:space="preserve">            for (let </w:t>
-                      </w:r>
-                      <w:proofErr w:type="spellStart"/>
-                      <w:r>
-                        <w:rPr>
-                          <w:sz w:val="16"/>
-                          <w:szCs w:val="16"/>
-                        </w:rPr>
-                        <w:t>i</w:t>
-                      </w:r>
-                      <w:proofErr w:type="spellEnd"/>
-                      <w:r>
-                        <w:rPr>
-                          <w:sz w:val="16"/>
-                          <w:szCs w:val="16"/>
-                        </w:rPr>
-                        <w:t xml:space="preserve"> = 0; </w:t>
-                      </w:r>
-                      <w:proofErr w:type="spellStart"/>
-                      <w:r>
-                        <w:rPr>
-                          <w:sz w:val="16"/>
-                          <w:szCs w:val="16"/>
-                        </w:rPr>
-                        <w:t>i</w:t>
-                      </w:r>
-                      <w:proofErr w:type="spellEnd"/>
-                      <w:r>
-                        <w:rPr>
-                          <w:sz w:val="16"/>
-                          <w:szCs w:val="16"/>
-                        </w:rPr>
-                        <w:t xml:space="preserve"> &lt; </w:t>
-                      </w:r>
-                      <w:proofErr w:type="spellStart"/>
-                      <w:r>
-                        <w:rPr>
-                          <w:sz w:val="16"/>
-                          <w:szCs w:val="16"/>
-                        </w:rPr>
-                        <w:t>spritesCount</w:t>
-                      </w:r>
-                      <w:proofErr w:type="spellEnd"/>
-                      <w:r>
-                        <w:rPr>
-                          <w:sz w:val="16"/>
-                          <w:szCs w:val="16"/>
-                        </w:rPr>
-                        <w:t xml:space="preserve">; </w:t>
-                      </w:r>
-                      <w:proofErr w:type="spellStart"/>
-                      <w:r>
-                        <w:rPr>
-                          <w:sz w:val="16"/>
-                          <w:szCs w:val="16"/>
-                        </w:rPr>
-                        <w:t>i</w:t>
-                      </w:r>
-                      <w:proofErr w:type="spellEnd"/>
-                      <w:r>
-                        <w:rPr>
-                          <w:sz w:val="16"/>
-                          <w:szCs w:val="16"/>
-                        </w:rPr>
-                        <w:t>++){</w:t>
-                      </w:r>
-                      <w:r>
-                        <w:rPr>
-                          <w:sz w:val="16"/>
-                          <w:szCs w:val="16"/>
-                        </w:rPr>
-                        <w:br/>
-                        <w:t xml:space="preserve">                let s = </w:t>
-                      </w:r>
-                      <w:proofErr w:type="spellStart"/>
-                      <w:r>
-                        <w:rPr>
-                          <w:sz w:val="16"/>
-                          <w:szCs w:val="16"/>
-                        </w:rPr>
-                        <w:t>this.add.sprite</w:t>
-                      </w:r>
-                      <w:proofErr w:type="spellEnd"/>
-                      <w:r>
-                        <w:rPr>
-                          <w:sz w:val="16"/>
-                          <w:szCs w:val="16"/>
-                        </w:rPr>
-                        <w:t>(</w:t>
-                      </w:r>
-                      <w:proofErr w:type="spellStart"/>
-                      <w:r>
-                        <w:rPr>
-                          <w:sz w:val="16"/>
-                          <w:szCs w:val="16"/>
-                        </w:rPr>
-                        <w:t>i</w:t>
-                      </w:r>
-                      <w:proofErr w:type="spellEnd"/>
-                      <w:r>
-                        <w:rPr>
-                          <w:sz w:val="16"/>
-                          <w:szCs w:val="16"/>
-                        </w:rPr>
-                        <w:t>, 12*i+200, 'balloon');</w:t>
-                      </w:r>
-                      <w:r>
-                        <w:rPr>
-                          <w:sz w:val="16"/>
-                          <w:szCs w:val="16"/>
-                        </w:rPr>
-                        <w:br/>
-                        <w:t xml:space="preserve">                </w:t>
-                      </w:r>
-                      <w:proofErr w:type="spellStart"/>
-                      <w:r>
-                        <w:rPr>
-                          <w:sz w:val="16"/>
-                          <w:szCs w:val="16"/>
-                        </w:rPr>
-                        <w:t>sprites.push</w:t>
-                      </w:r>
-                      <w:proofErr w:type="spellEnd"/>
-                      <w:r>
-                        <w:rPr>
-                          <w:sz w:val="16"/>
-                          <w:szCs w:val="16"/>
-                        </w:rPr>
-                        <w:t>(s);</w:t>
-                      </w:r>
-                      <w:r>
-                        <w:rPr>
-                          <w:sz w:val="16"/>
-                          <w:szCs w:val="16"/>
-                        </w:rPr>
-                        <w:br/>
-                        <w:t xml:space="preserve">            }</w:t>
-                      </w:r>
-                      <w:r>
-                        <w:rPr>
-                          <w:sz w:val="16"/>
-                          <w:szCs w:val="16"/>
-                        </w:rPr>
-                        <w:br/>
-                        <w:t xml:space="preserve">        }</w:t>
-                      </w:r>
-                      <w:r>
-                        <w:rPr>
-                          <w:sz w:val="16"/>
-                          <w:szCs w:val="16"/>
-                        </w:rPr>
-                        <w:br/>
-                      </w:r>
-                      <w:r>
-                        <w:rPr>
-                          <w:sz w:val="16"/>
-                          <w:szCs w:val="16"/>
-                        </w:rPr>
-                        <w:br/>
-                        <w:t xml:space="preserve">        function update() {</w:t>
-                      </w:r>
-                      <w:r>
-                        <w:rPr>
-                          <w:sz w:val="16"/>
-                          <w:szCs w:val="16"/>
-                        </w:rPr>
-                        <w:br/>
-                        <w:t xml:space="preserve">            for (let </w:t>
-                      </w:r>
-                      <w:proofErr w:type="spellStart"/>
-                      <w:r>
-                        <w:rPr>
-                          <w:sz w:val="16"/>
-                          <w:szCs w:val="16"/>
-                        </w:rPr>
-                        <w:t>i</w:t>
-                      </w:r>
-                      <w:proofErr w:type="spellEnd"/>
-                      <w:r>
-                        <w:rPr>
-                          <w:sz w:val="16"/>
-                          <w:szCs w:val="16"/>
-                        </w:rPr>
-                        <w:t xml:space="preserve"> = 0; </w:t>
-                      </w:r>
-                      <w:proofErr w:type="spellStart"/>
-                      <w:r>
-                        <w:rPr>
-                          <w:sz w:val="16"/>
-                          <w:szCs w:val="16"/>
-                        </w:rPr>
-                        <w:t>i</w:t>
-                      </w:r>
-                      <w:proofErr w:type="spellEnd"/>
-                      <w:r>
-                        <w:rPr>
-                          <w:sz w:val="16"/>
-                          <w:szCs w:val="16"/>
-                        </w:rPr>
-                        <w:t xml:space="preserve"> &lt; </w:t>
-                      </w:r>
-                      <w:proofErr w:type="spellStart"/>
-                      <w:r>
-                        <w:rPr>
-                          <w:sz w:val="16"/>
-                          <w:szCs w:val="16"/>
-                        </w:rPr>
-                        <w:t>spritesCount</w:t>
-                      </w:r>
-                      <w:proofErr w:type="spellEnd"/>
-                      <w:r>
-                        <w:rPr>
-                          <w:sz w:val="16"/>
-                          <w:szCs w:val="16"/>
-                        </w:rPr>
-                        <w:t xml:space="preserve">; </w:t>
-                      </w:r>
-                      <w:proofErr w:type="spellStart"/>
-                      <w:r>
-                        <w:rPr>
-                          <w:sz w:val="16"/>
-                          <w:szCs w:val="16"/>
-                        </w:rPr>
-                        <w:t>i</w:t>
-                      </w:r>
-                      <w:proofErr w:type="spellEnd"/>
-                      <w:r>
-                        <w:rPr>
-                          <w:sz w:val="16"/>
-                          <w:szCs w:val="16"/>
-                        </w:rPr>
-                        <w:t>++){</w:t>
-                      </w:r>
-                      <w:r>
-                        <w:rPr>
-                          <w:sz w:val="16"/>
-                          <w:szCs w:val="16"/>
-                        </w:rPr>
-                        <w:br/>
-                        <w:t xml:space="preserve">                if (sprites[</w:t>
-                      </w:r>
-                      <w:proofErr w:type="spellStart"/>
-                      <w:r>
-                        <w:rPr>
-                          <w:sz w:val="16"/>
-                          <w:szCs w:val="16"/>
-                        </w:rPr>
-                        <w:t>i</w:t>
-                      </w:r>
-                      <w:proofErr w:type="spellEnd"/>
-                      <w:r>
-                        <w:rPr>
-                          <w:sz w:val="16"/>
-                          <w:szCs w:val="16"/>
-                        </w:rPr>
-                        <w:t>].x &lt; 800)</w:t>
-                      </w:r>
-                      <w:r>
-                        <w:rPr>
-                          <w:sz w:val="16"/>
-                          <w:szCs w:val="16"/>
-                        </w:rPr>
-                        <w:br/>
-                        <w:t xml:space="preserve">                    sprites[</w:t>
-                      </w:r>
-                      <w:proofErr w:type="spellStart"/>
-                      <w:r>
-                        <w:rPr>
-                          <w:sz w:val="16"/>
-                          <w:szCs w:val="16"/>
-                        </w:rPr>
-                        <w:t>i</w:t>
-                      </w:r>
-                      <w:proofErr w:type="spellEnd"/>
-                      <w:r>
-                        <w:rPr>
-                          <w:sz w:val="16"/>
-                          <w:szCs w:val="16"/>
-                        </w:rPr>
-                        <w:t>].x += i+1;</w:t>
-                      </w:r>
-                      <w:r>
-                        <w:rPr>
-                          <w:sz w:val="16"/>
-                          <w:szCs w:val="16"/>
-                        </w:rPr>
-                        <w:br/>
-                        <w:t xml:space="preserve">                else</w:t>
-                      </w:r>
-                      <w:r>
-                        <w:rPr>
-                          <w:sz w:val="16"/>
-                          <w:szCs w:val="16"/>
-                        </w:rPr>
-                        <w:br/>
-                        <w:t xml:space="preserve">                    sprites[</w:t>
-                      </w:r>
-                      <w:proofErr w:type="spellStart"/>
-                      <w:r>
-                        <w:rPr>
-                          <w:sz w:val="16"/>
-                          <w:szCs w:val="16"/>
-                        </w:rPr>
-                        <w:t>i</w:t>
-                      </w:r>
-                      <w:proofErr w:type="spellEnd"/>
-                      <w:r>
-                        <w:rPr>
-                          <w:sz w:val="16"/>
-                          <w:szCs w:val="16"/>
-                        </w:rPr>
-                        <w:t>].x = 0;</w:t>
-                      </w:r>
-                      <w:r>
-                        <w:rPr>
-                          <w:sz w:val="16"/>
-                          <w:szCs w:val="16"/>
-                        </w:rPr>
-                        <w:br/>
-                        <w:t xml:space="preserve">            }</w:t>
-                      </w:r>
-                      <w:r>
-                        <w:rPr>
-                          <w:sz w:val="16"/>
-                          <w:szCs w:val="16"/>
-                        </w:rPr>
-                        <w:br/>
-                        <w:t xml:space="preserve">        }</w:t>
-                      </w:r>
-                      <w:r>
-                        <w:rPr>
-                          <w:sz w:val="16"/>
-                          <w:szCs w:val="16"/>
-                        </w:rPr>
-                        <w:br/>
-                        <w:t xml:space="preserve">    &lt;/script&gt;</w:t>
-                      </w:r>
-                      <w:r>
-                        <w:rPr>
-                          <w:sz w:val="16"/>
-                          <w:szCs w:val="16"/>
-                        </w:rPr>
-                        <w:br/>
-                        <w:t>&lt;/body&gt;</w:t>
-                      </w:r>
-                      <w:r>
-                        <w:rPr>
-                          <w:sz w:val="16"/>
-                          <w:szCs w:val="16"/>
-                        </w:rPr>
-                        <w:br/>
-                        <w:t>&lt;/html&gt;</w:t>
+                        <w:t>let sprites = [];</w:t>
                       </w:r>
                     </w:p>
                     <w:p>
@@ -3506,7 +2734,21 @@
           <w:rFonts w:ascii="C64 Pro Mono" w:hAnsi="C64 Pro Mono"/>
           <w:color w:val="FFFFFF" w:themeColor="background1"/>
         </w:rPr>
-        <w:t>Code with 12 sprites:</w:t>
+        <w:t>C</w:t>
+      </w:r>
+      <w:r>
+        <w:rPr>
+          <w:rFonts w:ascii="C64 Pro Mono" w:hAnsi="C64 Pro Mono"/>
+          <w:color w:val="FFFFFF" w:themeColor="background1"/>
+        </w:rPr>
+        <w:t>reate</w:t>
+      </w:r>
+      <w:r>
+        <w:rPr>
+          <w:rFonts w:ascii="C64 Pro Mono" w:hAnsi="C64 Pro Mono"/>
+          <w:color w:val="FFFFFF" w:themeColor="background1"/>
+        </w:rPr>
+        <w:t xml:space="preserve"> 12 sprites:</w:t>
       </w:r>
     </w:p>
     <w:p>
@@ -3517,33 +2759,167 @@
           <w:color w:val="FFFFFF" w:themeColor="background1"/>
         </w:rPr>
       </w:pPr>
-    </w:p>
-    <w:p>
-      <w:pPr>
-        <w:jc w:val="both"/>
+      <w:r>
         <w:rPr>
           <w:rFonts w:asciiTheme="majorBidi" w:hAnsiTheme="majorBidi" w:cstheme="majorBidi"/>
+          <w:noProof/>
           <w:color w:val="FFFFFF" w:themeColor="background1"/>
           <w:sz w:val="16"/>
           <w:szCs w:val="16"/>
         </w:rPr>
-      </w:pPr>
-    </w:p>
-    <w:p>
-      <w:pPr>
-        <w:jc w:val="both"/>
-        <w:rPr>
-          <w:rFonts w:ascii="C64 Pro Mono" w:hAnsi="C64 Pro Mono" w:cstheme="majorBidi"/>
-          <w:color w:val="FFFFFF" w:themeColor="background1"/>
-        </w:rPr>
-      </w:pPr>
-      <w:r>
-        <w:rPr>
-          <w:rFonts w:ascii="C64 Pro Mono" w:hAnsi="C64 Pro Mono" w:cstheme="majorBidi"/>
-          <w:color w:val="FFFFFF" w:themeColor="background1"/>
-        </w:rPr>
-        <w:lastRenderedPageBreak/>
-        <w:t>Code with 1234 sprites</w:t>
+        <mc:AlternateContent>
+          <mc:Choice Requires="wps">
+            <w:drawing>
+              <wp:anchor distT="45720" distB="45720" distL="114300" distR="114300" simplePos="0" relativeHeight="251675648" behindDoc="0" locked="0" layoutInCell="1" allowOverlap="1" wp14:anchorId="0C0A8937" wp14:editId="54248B24">
+                <wp:simplePos x="0" y="0"/>
+                <wp:positionH relativeFrom="margin">
+                  <wp:align>left</wp:align>
+                </wp:positionH>
+                <wp:positionV relativeFrom="paragraph">
+                  <wp:posOffset>902335</wp:posOffset>
+                </wp:positionV>
+                <wp:extent cx="6182360" cy="1674495"/>
+                <wp:effectExtent l="0" t="0" r="27940" b="20955"/>
+                <wp:wrapSquare wrapText="bothSides"/>
+                <wp:docPr id="33260327" name="Text Box 2"/>
+                <wp:cNvGraphicFramePr>
+                  <a:graphicFrameLocks xmlns:a="http://schemas.openxmlformats.org/drawingml/2006/main"/>
+                </wp:cNvGraphicFramePr>
+                <a:graphic xmlns:a="http://schemas.openxmlformats.org/drawingml/2006/main">
+                  <a:graphicData uri="http://schemas.microsoft.com/office/word/2010/wordprocessingShape">
+                    <wps:wsp>
+                      <wps:cNvSpPr txBox="1">
+                        <a:spLocks noChangeArrowheads="1"/>
+                      </wps:cNvSpPr>
+                      <wps:spPr bwMode="auto">
+                        <a:xfrm>
+                          <a:off x="0" y="0"/>
+                          <a:ext cx="6182360" cy="1674495"/>
+                        </a:xfrm>
+                        <a:prstGeom prst="rect">
+                          <a:avLst/>
+                        </a:prstGeom>
+                        <a:solidFill>
+                          <a:srgbClr val="FFFFFF"/>
+                        </a:solidFill>
+                        <a:ln w="9525">
+                          <a:solidFill>
+                            <a:srgbClr val="000000"/>
+                          </a:solidFill>
+                          <a:miter lim="800000"/>
+                          <a:headEnd/>
+                          <a:tailEnd/>
+                        </a:ln>
+                      </wps:spPr>
+                      <wps:txbx>
+                        <w:txbxContent>
+                          <w:p>
+                            <w:r>
+                              <w:t>function create() {</w:t>
+                            </w:r>
+                            <w:r>
+                              <w:br/>
+                              <w:t xml:space="preserve">    this.add.text(20, 20, 'Super fajna gra!', { font: '24px Arial', fill: '#ffffff' });</w:t>
+                            </w:r>
+                            <w:r>
+                              <w:br/>
+                            </w:r>
+                            <w:r>
+                              <w:br/>
+                              <w:t xml:space="preserve">    for (let i = 0; i &lt; spritesCount; i++){</w:t>
+                            </w:r>
+                            <w:r>
+                              <w:br/>
+                              <w:t xml:space="preserve">        let s = this.add.sprite(i, 50*i, 'balloon');</w:t>
+                            </w:r>
+                            <w:r>
+                              <w:t xml:space="preserve"> </w:t>
+                            </w:r>
+                            <w:r>
+                              <w:br/>
+                              <w:t xml:space="preserve">        sprites.push(s);</w:t>
+                            </w:r>
+                            <w:r>
+                              <w:br/>
+                              <w:t xml:space="preserve">    }</w:t>
+                            </w:r>
+                          </w:p>
+                          <w:p>
+                            <w:pPr>
+                              <w:rPr>
+                                <w:sz w:val="16"/>
+                                <w:szCs w:val="16"/>
+                              </w:rPr>
+                            </w:pPr>
+                          </w:p>
+                        </w:txbxContent>
+                      </wps:txbx>
+                      <wps:bodyPr rot="0" vert="horz" wrap="square" lIns="91440" tIns="45720" rIns="91440" bIns="45720" anchor="t" anchorCtr="0">
+                        <a:noAutofit/>
+                      </wps:bodyPr>
+                    </wps:wsp>
+                  </a:graphicData>
+                </a:graphic>
+                <wp14:sizeRelH relativeFrom="margin">
+                  <wp14:pctWidth>0</wp14:pctWidth>
+                </wp14:sizeRelH>
+                <wp14:sizeRelV relativeFrom="margin">
+                  <wp14:pctHeight>0</wp14:pctHeight>
+                </wp14:sizeRelV>
+              </wp:anchor>
+            </w:drawing>
+          </mc:Choice>
+          <mc:Fallback>
+            <w:pict>
+              <v:shape w14:anchorId="0C0A8937" id="_x0000_s1034" type="#_x0000_t202" style="position:absolute;left:0;text-align:left;margin-left:0;margin-top:71.05pt;width:486.8pt;height:131.85pt;z-index:251675648;visibility:visible;mso-wrap-style:square;mso-width-percent:0;mso-height-percent:0;mso-wrap-distance-left:9pt;mso-wrap-distance-top:3.6pt;mso-wrap-distance-right:9pt;mso-wrap-distance-bottom:3.6pt;mso-position-horizontal:left;mso-position-horizontal-relative:margin;mso-position-vertical:absolute;mso-position-vertical-relative:text;mso-width-percent:0;mso-height-percent:0;mso-width-relative:margin;mso-height-relative:margin;v-text-anchor:top" o:gfxdata="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">
+                <v:textbox>
+                  <w:txbxContent>
+                    <w:p>
+                      <w:r>
+                        <w:t>function create() {</w:t>
+                      </w:r>
+                      <w:r>
+                        <w:br/>
+                        <w:t xml:space="preserve">    this.add.text(20, 20, 'Super fajna gra!', { font: '24px Arial', fill: '#ffffff' });</w:t>
+                      </w:r>
+                      <w:r>
+                        <w:br/>
+                      </w:r>
+                      <w:r>
+                        <w:br/>
+                        <w:t xml:space="preserve">    for (let i = 0; i &lt; spritesCount; i++){</w:t>
+                      </w:r>
+                      <w:r>
+                        <w:br/>
+                        <w:t xml:space="preserve">        let s = this.add.sprite(i, 50*i, 'balloon');</w:t>
+                      </w:r>
+                      <w:r>
+                        <w:t xml:space="preserve"> </w:t>
+                      </w:r>
+                      <w:r>
+                        <w:br/>
+                        <w:t xml:space="preserve">        sprites.push(s);</w:t>
+                      </w:r>
+                      <w:r>
+                        <w:br/>
+                        <w:t xml:space="preserve">    }</w:t>
+                      </w:r>
+                    </w:p>
+                    <w:p>
+                      <w:pPr>
+                        <w:rPr>
+                          <w:sz w:val="16"/>
+                          <w:szCs w:val="16"/>
+                        </w:rPr>
+                      </w:pPr>
+                    </w:p>
+                  </w:txbxContent>
+                </v:textbox>
+                <w10:wrap type="square" anchorx="margin"/>
+              </v:shape>
+            </w:pict>
+          </mc:Fallback>
+        </mc:AlternateContent>
       </w:r>
     </w:p>
     <w:p>
@@ -3556,6 +2932,61 @@
           <w:szCs w:val="16"/>
         </w:rPr>
       </w:pPr>
+    </w:p>
+    <w:p>
+      <w:pPr>
+        <w:jc w:val="both"/>
+        <w:rPr>
+          <w:rFonts w:asciiTheme="majorBidi" w:hAnsiTheme="majorBidi" w:cstheme="majorBidi"/>
+          <w:color w:val="FFFFFF" w:themeColor="background1"/>
+          <w:sz w:val="16"/>
+          <w:szCs w:val="16"/>
+        </w:rPr>
+      </w:pPr>
+    </w:p>
+    <w:p>
+      <w:pPr>
+        <w:jc w:val="both"/>
+        <w:rPr>
+          <w:rFonts w:asciiTheme="majorBidi" w:hAnsiTheme="majorBidi" w:cstheme="majorBidi"/>
+          <w:color w:val="FFFFFF" w:themeColor="background1"/>
+          <w:sz w:val="16"/>
+          <w:szCs w:val="16"/>
+        </w:rPr>
+      </w:pPr>
+    </w:p>
+    <w:p>
+      <w:pPr>
+        <w:jc w:val="both"/>
+        <w:rPr>
+          <w:rFonts w:ascii="Courier New" w:hAnsi="Courier New" w:cs="Courier New"/>
+          <w:color w:val="FFFFFF" w:themeColor="background1"/>
+        </w:rPr>
+      </w:pPr>
+      <w:r>
+        <w:rPr>
+          <w:rFonts w:ascii="C64 Pro Mono" w:hAnsi="C64 Pro Mono" w:cstheme="majorBidi"/>
+          <w:color w:val="FFFFFF" w:themeColor="background1"/>
+        </w:rPr>
+        <w:lastRenderedPageBreak/>
+        <w:t>Let’s get movin’</w:t>
+      </w:r>
+      <w:r>
+        <w:rPr>
+          <w:rFonts w:ascii="Courier New" w:hAnsi="Courier New" w:cs="Courier New"/>
+          <w:color w:val="FFFFFF" w:themeColor="background1"/>
+        </w:rPr>
+        <w:t>...</w:t>
+      </w:r>
+    </w:p>
+    <w:p>
+      <w:pPr>
+        <w:jc w:val="both"/>
+        <w:rPr>
+          <w:rFonts w:ascii="C64 Pro Mono" w:hAnsi="C64 Pro Mono" w:cstheme="majorBidi"/>
+          <w:color w:val="FFFFFF" w:themeColor="background1"/>
+        </w:rPr>
+      </w:pPr>
       <w:r>
         <w:rPr>
           <w:rFonts w:asciiTheme="majorBidi" w:hAnsiTheme="majorBidi" w:cstheme="majorBidi"/>
@@ -3564,11 +2995,273 @@
           <w:sz w:val="16"/>
           <w:szCs w:val="16"/>
         </w:rPr>
+        <mc:AlternateContent>
+          <mc:Choice Requires="wps">
+            <w:drawing>
+              <wp:anchor distT="45720" distB="45720" distL="114300" distR="114300" simplePos="0" relativeHeight="251677696" behindDoc="0" locked="0" layoutInCell="1" allowOverlap="1" wp14:anchorId="29C54F28" wp14:editId="696EE00C">
+                <wp:simplePos x="0" y="0"/>
+                <wp:positionH relativeFrom="margin">
+                  <wp:align>left</wp:align>
+                </wp:positionH>
+                <wp:positionV relativeFrom="paragraph">
+                  <wp:posOffset>299085</wp:posOffset>
+                </wp:positionV>
+                <wp:extent cx="6182360" cy="2213610"/>
+                <wp:effectExtent l="0" t="0" r="27940" b="15240"/>
+                <wp:wrapSquare wrapText="bothSides"/>
+                <wp:docPr id="1593283980" name="Text Box 2"/>
+                <wp:cNvGraphicFramePr>
+                  <a:graphicFrameLocks xmlns:a="http://schemas.openxmlformats.org/drawingml/2006/main"/>
+                </wp:cNvGraphicFramePr>
+                <a:graphic xmlns:a="http://schemas.openxmlformats.org/drawingml/2006/main">
+                  <a:graphicData uri="http://schemas.microsoft.com/office/word/2010/wordprocessingShape">
+                    <wps:wsp>
+                      <wps:cNvSpPr txBox="1">
+                        <a:spLocks noChangeArrowheads="1"/>
+                      </wps:cNvSpPr>
+                      <wps:spPr bwMode="auto">
+                        <a:xfrm>
+                          <a:off x="0" y="0"/>
+                          <a:ext cx="6182360" cy="2213610"/>
+                        </a:xfrm>
+                        <a:prstGeom prst="rect">
+                          <a:avLst/>
+                        </a:prstGeom>
+                        <a:solidFill>
+                          <a:srgbClr val="FFFFFF"/>
+                        </a:solidFill>
+                        <a:ln w="9525">
+                          <a:solidFill>
+                            <a:srgbClr val="000000"/>
+                          </a:solidFill>
+                          <a:miter lim="800000"/>
+                          <a:headEnd/>
+                          <a:tailEnd/>
+                        </a:ln>
+                      </wps:spPr>
+                      <wps:txbx>
+                        <w:txbxContent>
+                          <w:p>
+                            <w:r>
+                              <w:t>function update() {</w:t>
+                            </w:r>
+                            <w:r>
+                              <w:br/>
+                              <w:t xml:space="preserve">    for (let i = 0; i &lt; spritesCount; i++){</w:t>
+                            </w:r>
+                            <w:r>
+                              <w:br/>
+                              <w:t xml:space="preserve">        if (sprites[i].x &lt; 800)</w:t>
+                            </w:r>
+                            <w:r>
+                              <w:br/>
+                              <w:t xml:space="preserve">            sprites[i].x += </w:t>
+                            </w:r>
+                            <w:r>
+                              <w:t xml:space="preserve"> i; //</w:t>
+                            </w:r>
+                            <w:r>
+                              <w:t>(i+1) % 20;</w:t>
+                            </w:r>
+                            <w:r>
+                              <w:br/>
+                              <w:t xml:space="preserve">        else</w:t>
+                            </w:r>
+                            <w:r>
+                              <w:br/>
+                              <w:t xml:space="preserve">            sprites[i].x = 0;</w:t>
+                            </w:r>
+                            <w:r>
+                              <w:br/>
+                              <w:t xml:space="preserve">    }</w:t>
+                            </w:r>
+                            <w:r>
+                              <w:br/>
+                              <w:t>}</w:t>
+                            </w:r>
+                          </w:p>
+                          <w:p/>
+                        </w:txbxContent>
+                      </wps:txbx>
+                      <wps:bodyPr rot="0" vert="horz" wrap="square" lIns="91440" tIns="45720" rIns="91440" bIns="45720" anchor="t" anchorCtr="0">
+                        <a:noAutofit/>
+                      </wps:bodyPr>
+                    </wps:wsp>
+                  </a:graphicData>
+                </a:graphic>
+                <wp14:sizeRelH relativeFrom="margin">
+                  <wp14:pctWidth>0</wp14:pctWidth>
+                </wp14:sizeRelH>
+                <wp14:sizeRelV relativeFrom="margin">
+                  <wp14:pctHeight>0</wp14:pctHeight>
+                </wp14:sizeRelV>
+              </wp:anchor>
+            </w:drawing>
+          </mc:Choice>
+          <mc:Fallback>
+            <w:pict>
+              <v:shape w14:anchorId="29C54F28" id="_x0000_s1035" type="#_x0000_t202" style="position:absolute;left:0;text-align:left;margin-left:0;margin-top:23.55pt;width:486.8pt;height:174.3pt;z-index:251677696;visibility:visible;mso-wrap-style:square;mso-width-percent:0;mso-height-percent:0;mso-wrap-distance-left:9pt;mso-wrap-distance-top:3.6pt;mso-wrap-distance-right:9pt;mso-wrap-distance-bottom:3.6pt;mso-position-horizontal:left;mso-position-horizontal-relative:margin;mso-position-vertical:absolute;mso-position-vertical-relative:text;mso-width-percent:0;mso-height-percent:0;mso-width-relative:margin;mso-height-relative:margin;v-text-anchor:top" o:gfxdata="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">
+                <v:textbox>
+                  <w:txbxContent>
+                    <w:p>
+                      <w:r>
+                        <w:t>function update() {</w:t>
+                      </w:r>
+                      <w:r>
+                        <w:br/>
+                        <w:t xml:space="preserve">    for (let i = 0; i &lt; spritesCount; i++){</w:t>
+                      </w:r>
+                      <w:r>
+                        <w:br/>
+                        <w:t xml:space="preserve">        if (sprites[i].x &lt; 800)</w:t>
+                      </w:r>
+                      <w:r>
+                        <w:br/>
+                        <w:t xml:space="preserve">            sprites[i].x += </w:t>
+                      </w:r>
+                      <w:r>
+                        <w:t xml:space="preserve"> i; //</w:t>
+                      </w:r>
+                      <w:r>
+                        <w:t>(i+1) % 20;</w:t>
+                      </w:r>
+                      <w:r>
+                        <w:br/>
+                        <w:t xml:space="preserve">        else</w:t>
+                      </w:r>
+                      <w:r>
+                        <w:br/>
+                        <w:t xml:space="preserve">            sprites[i].x = 0;</w:t>
+                      </w:r>
+                      <w:r>
+                        <w:br/>
+                        <w:t xml:space="preserve">    }</w:t>
+                      </w:r>
+                      <w:r>
+                        <w:br/>
+                        <w:t>}</w:t>
+                      </w:r>
+                    </w:p>
+                    <w:p/>
+                  </w:txbxContent>
+                </v:textbox>
+                <w10:wrap type="square" anchorx="margin"/>
+              </v:shape>
+            </w:pict>
+          </mc:Fallback>
+        </mc:AlternateContent>
+      </w:r>
+    </w:p>
+    <w:p>
+      <w:pPr>
+        <w:jc w:val="both"/>
+        <w:rPr>
+          <w:rFonts w:asciiTheme="majorBidi" w:hAnsiTheme="majorBidi" w:cstheme="majorBidi"/>
+          <w:color w:val="FFFFFF" w:themeColor="background1"/>
+          <w:sz w:val="16"/>
+          <w:szCs w:val="16"/>
+        </w:rPr>
+      </w:pPr>
+    </w:p>
+    <w:p>
+      <w:pPr>
+        <w:rPr>
+          <w:rFonts w:asciiTheme="majorBidi" w:hAnsiTheme="majorBidi" w:cstheme="majorBidi"/>
+          <w:color w:val="FFFFFF" w:themeColor="background1"/>
+          <w:sz w:val="16"/>
+          <w:szCs w:val="16"/>
+        </w:rPr>
+      </w:pPr>
+      <w:r>
+        <w:rPr>
+          <w:rFonts w:asciiTheme="majorBidi" w:hAnsiTheme="majorBidi" w:cstheme="majorBidi"/>
+          <w:color w:val="FFFFFF" w:themeColor="background1"/>
+          <w:sz w:val="16"/>
+          <w:szCs w:val="16"/>
+        </w:rPr>
+        <w:br w:type="page"/>
+      </w:r>
+    </w:p>
+    <w:p>
+      <w:pPr>
+        <w:jc w:val="both"/>
+        <w:rPr>
+          <w:rFonts w:asciiTheme="majorBidi" w:hAnsiTheme="majorBidi" w:cstheme="majorBidi"/>
+          <w:color w:val="FFFFFF" w:themeColor="background1"/>
+          <w:sz w:val="16"/>
+          <w:szCs w:val="16"/>
+        </w:rPr>
+      </w:pPr>
+    </w:p>
+    <w:p>
+      <w:pPr>
+        <w:jc w:val="both"/>
+        <w:rPr>
+          <w:rFonts w:ascii="C64 Pro Mono" w:hAnsi="C64 Pro Mono" w:cstheme="majorBidi"/>
+          <w:color w:val="FFFFFF" w:themeColor="background1"/>
+        </w:rPr>
+      </w:pPr>
+      <w:r>
+        <w:rPr>
+          <w:rFonts w:ascii="C64 Pro Mono" w:hAnsi="C64 Pro Mono" w:cstheme="majorBidi"/>
+          <w:color w:val="FFFFFF" w:themeColor="background1"/>
+        </w:rPr>
+        <w:t>Introducing player</w:t>
+      </w:r>
+    </w:p>
+    <w:p>
+      <w:pPr>
+        <w:jc w:val="both"/>
+        <w:rPr>
+          <w:rFonts w:ascii="C64 Pro Mono" w:hAnsi="C64 Pro Mono" w:cstheme="majorBidi"/>
+          <w:color w:val="FFFFFF" w:themeColor="background1"/>
+        </w:rPr>
+      </w:pPr>
+    </w:p>
+    <w:p>
+      <w:pPr>
+        <w:jc w:val="both"/>
+        <w:rPr>
+          <w:rFonts w:ascii="C64 Pro Mono" w:hAnsi="C64 Pro Mono" w:cstheme="majorBidi"/>
+          <w:color w:val="FFFFFF" w:themeColor="background1"/>
+        </w:rPr>
+      </w:pPr>
+      <w:r>
+        <w:rPr>
+          <w:rFonts w:ascii="C64 Pro Mono" w:hAnsi="C64 Pro Mono" w:cstheme="majorBidi"/>
+          <w:color w:val="FFFFFF" w:themeColor="background1"/>
+        </w:rPr>
+        <w:t>Animated player sprite</w:t>
+      </w:r>
+    </w:p>
+    <w:p>
+      <w:pPr>
+        <w:jc w:val="both"/>
+        <w:rPr>
+          <w:rFonts w:ascii="C64 Pro Mono" w:hAnsi="C64 Pro Mono" w:cstheme="majorBidi"/>
+          <w:color w:val="FFFFFF" w:themeColor="background1"/>
+        </w:rPr>
+      </w:pPr>
+    </w:p>
+    <w:p>
+      <w:pPr>
+        <w:jc w:val="both"/>
+        <w:rPr>
+          <w:rFonts w:ascii="C64 Pro Mono" w:hAnsi="C64 Pro Mono" w:cstheme="majorBidi"/>
+          <w:color w:val="FFFFFF" w:themeColor="background1"/>
+        </w:rPr>
+      </w:pPr>
+      <w:r>
+        <w:rPr>
+          <w:rFonts w:ascii="C64 Pro Mono" w:hAnsi="C64 Pro Mono" w:cstheme="majorBidi"/>
+          <w:noProof/>
+          <w:color w:val="FFFFFF" w:themeColor="background1"/>
+        </w:rPr>
         <w:drawing>
-          <wp:inline distT="0" distB="0" distL="0" distR="0" wp14:anchorId="42C8F893" wp14:editId="4C347C64">
-            <wp:extent cx="4272280" cy="3217785"/>
-            <wp:effectExtent l="0" t="0" r="0" b="1905"/>
-            <wp:docPr id="294895731" name="Picture 1" descr="A screenshot of a computer program"/>
+          <wp:inline distT="0" distB="0" distL="0" distR="0" wp14:anchorId="2093BE9E" wp14:editId="29B4B584">
+            <wp:extent cx="2814320" cy="938107"/>
+            <wp:effectExtent l="0" t="0" r="5080" b="0"/>
+            <wp:docPr id="902525083" name="Picture 2" descr="A purple and red pixelated character&#10;&#10;AI-generated content may be incorrect."/>
             <wp:cNvGraphicFramePr>
               <a:graphicFrameLocks xmlns:a="http://schemas.openxmlformats.org/drawingml/2006/main" noChangeAspect="1"/>
             </wp:cNvGraphicFramePr>
@@ -3576,11 +3269,17 @@
               <a:graphicData uri="http://schemas.openxmlformats.org/drawingml/2006/picture">
                 <pic:pic xmlns:pic="http://schemas.openxmlformats.org/drawingml/2006/picture">
                   <pic:nvPicPr>
-                    <pic:cNvPr id="294895731" name="Picture 1" descr="A screenshot of a computer program"/>
+                    <pic:cNvPr id="902525083" name="Picture 2" descr="A purple and red pixelated character&#10;&#10;AI-generated content may be incorrect."/>
                     <pic:cNvPicPr/>
                   </pic:nvPicPr>
                   <pic:blipFill>
-                    <a:blip r:embed="rId17"/>
+                    <a:blip r:embed="rId12">
+                      <a:extLst>
+                        <a:ext uri="{28A0092B-C50C-407E-A947-70E740481C1C}">
+                          <a14:useLocalDpi xmlns:a14="http://schemas.microsoft.com/office/drawing/2010/main" val="0"/>
+                        </a:ext>
+                      </a:extLst>
+                    </a:blip>
                     <a:stretch>
                       <a:fillRect/>
                     </a:stretch>
@@ -3588,7 +3287,7 @@
                   <pic:spPr>
                     <a:xfrm>
                       <a:off x="0" y="0"/>
-                      <a:ext cx="4279594" cy="3223293"/>
+                      <a:ext cx="2830080" cy="943360"/>
                     </a:xfrm>
                     <a:prstGeom prst="rect">
                       <a:avLst/>
@@ -3609,41 +3308,58 @@
           <w:color w:val="FFFFFF" w:themeColor="background1"/>
         </w:rPr>
       </w:pPr>
-      <w:r>
+    </w:p>
+    <w:p>
+      <w:pPr>
+        <w:jc w:val="both"/>
         <w:rPr>
           <w:rFonts w:ascii="C64 Pro Mono" w:hAnsi="C64 Pro Mono" w:cstheme="majorBidi"/>
           <w:color w:val="FFFFFF" w:themeColor="background1"/>
         </w:rPr>
+      </w:pPr>
+      <w:r>
+        <w:rPr>
+          <w:rFonts w:ascii="C64 Pro Mono" w:hAnsi="C64 Pro Mono" w:cstheme="majorBidi"/>
+          <w:noProof/>
+          <w:color w:val="FFFFFF" w:themeColor="background1"/>
+        </w:rPr>
         <w:lastRenderedPageBreak/>
-        <w:t xml:space="preserve">Introducing </w:t>
-      </w:r>
-      <w:proofErr w:type="gramStart"/>
-      <w:r>
-        <w:rPr>
-          <w:rFonts w:ascii="C64 Pro Mono" w:hAnsi="C64 Pro Mono" w:cstheme="majorBidi"/>
-          <w:color w:val="FFFFFF" w:themeColor="background1"/>
-        </w:rPr>
-        <w:t>player</w:t>
-      </w:r>
-      <w:proofErr w:type="gramEnd"/>
-    </w:p>
-    <w:p>
-      <w:pPr>
-        <w:jc w:val="both"/>
-        <w:rPr>
-          <w:rFonts w:ascii="C64 Pro Mono" w:hAnsi="C64 Pro Mono" w:cstheme="majorBidi"/>
-          <w:color w:val="FFFFFF" w:themeColor="background1"/>
-        </w:rPr>
-      </w:pPr>
-    </w:p>
-    <w:p>
-      <w:pPr>
-        <w:jc w:val="both"/>
-        <w:rPr>
-          <w:rFonts w:ascii="C64 Pro Mono" w:hAnsi="C64 Pro Mono" w:cstheme="majorBidi"/>
-          <w:color w:val="FFFFFF" w:themeColor="background1"/>
-        </w:rPr>
-      </w:pPr>
+        <w:drawing>
+          <wp:inline distT="0" distB="0" distL="0" distR="0" wp14:anchorId="3919E782" wp14:editId="628041A2">
+            <wp:extent cx="5731510" cy="3186430"/>
+            <wp:effectExtent l="0" t="0" r="2540" b="0"/>
+            <wp:docPr id="1160405660" name="Picture 1" descr="A screen shot of a computer code&#10;&#10;AI-generated content may be incorrect."/>
+            <wp:cNvGraphicFramePr>
+              <a:graphicFrameLocks xmlns:a="http://schemas.openxmlformats.org/drawingml/2006/main" noChangeAspect="1"/>
+            </wp:cNvGraphicFramePr>
+            <a:graphic xmlns:a="http://schemas.openxmlformats.org/drawingml/2006/main">
+              <a:graphicData uri="http://schemas.openxmlformats.org/drawingml/2006/picture">
+                <pic:pic xmlns:pic="http://schemas.openxmlformats.org/drawingml/2006/picture">
+                  <pic:nvPicPr>
+                    <pic:cNvPr id="1160405660" name="Picture 1" descr="A screen shot of a computer code&#10;&#10;AI-generated content may be incorrect."/>
+                    <pic:cNvPicPr/>
+                  </pic:nvPicPr>
+                  <pic:blipFill>
+                    <a:blip r:embed="rId13"/>
+                    <a:stretch>
+                      <a:fillRect/>
+                    </a:stretch>
+                  </pic:blipFill>
+                  <pic:spPr>
+                    <a:xfrm>
+                      <a:off x="0" y="0"/>
+                      <a:ext cx="5731510" cy="3186430"/>
+                    </a:xfrm>
+                    <a:prstGeom prst="rect">
+                      <a:avLst/>
+                    </a:prstGeom>
+                  </pic:spPr>
+                </pic:pic>
+              </a:graphicData>
+            </a:graphic>
+          </wp:inline>
+        </w:drawing>
+      </w:r>
     </w:p>
     <w:sectPr>
       <w:pgSz w:w="11906" w:h="8391" w:orient="landscape" w:code="11"/>
@@ -3653,6 +3369,56 @@
     </w:sectPr>
   </w:body>
 </w:document>
+</file>
+
+<file path=word/endnotes.xml><?xml version="1.0" encoding="utf-8"?>
+<w:endnotes xmlns:wpc="http://schemas.microsoft.com/office/word/2010/wordprocessingCanvas" xmlns:cx="http://schemas.microsoft.com/office/drawing/2014/chartex" xmlns:cx1="http://schemas.microsoft.com/office/drawing/2015/9/8/chartex" xmlns:cx2="http://schemas.microsoft.com/office/drawing/2015/10/21/chartex" xmlns:cx3="http://schemas.microsoft.com/office/drawing/2016/5/9/chartex" xmlns:cx4="http://schemas.microsoft.com/office/drawing/2016/5/10/chartex" xmlns:cx5="http://schemas.microsoft.com/office/drawing/2016/5/11/chartex" xmlns:cx6="http://schemas.microsoft.com/office/drawing/2016/5/12/chartex" xmlns:cx7="http://schemas.microsoft.com/office/drawing/2016/5/13/chartex" xmlns:cx8="http://schemas.microsoft.com/office/drawing/2016/5/14/chartex" xmlns:mc="http://schemas.openxmlformats.org/markup-compatibility/2006" xmlns:aink="http://schemas.microsoft.com/office/drawing/2016/ink" xmlns:am3d="http://schemas.microsoft.com/office/drawing/2017/model3d" xmlns:o="urn:schemas-microsoft-com:office:office" xmlns:oel="http://schemas.microsoft.com/office/2019/extlst" xmlns:r="http://schemas.openxmlformats.org/officeDocument/2006/relationships" xmlns:m="http://schemas.openxmlformats.org/officeDocument/2006/math" xmlns:v="urn:schemas-microsoft-com:vml" xmlns:wp14="http://schemas.microsoft.com/office/word/2010/wordprocessingDrawing" xmlns:wp="http://schemas.openxmlformats.org/drawingml/2006/wordprocessingDrawing" xmlns:w10="urn:schemas-microsoft-com:office:word" xmlns:w="http://schemas.openxmlformats.org/wordprocessingml/2006/main" xmlns:w14="http://schemas.microsoft.com/office/word/2010/wordml" xmlns:w15="http://schemas.microsoft.com/office/word/2012/wordml" xmlns:w16cex="http://schemas.microsoft.com/office/word/2018/wordml/cex" xmlns:w16cid="http://schemas.microsoft.com/office/word/2016/wordml/cid" xmlns:w16="http://schemas.microsoft.com/office/word/2018/wordml" xmlns:w16du="http://schemas.microsoft.com/office/word/2023/wordml/word16du" xmlns:w16sdtdh="http://schemas.microsoft.com/office/word/2020/wordml/sdtdatahash" xmlns:w16sdtfl="http://schemas.microsoft.com/office/word/2024/wordml/sdtformatlock" xmlns:w16se="http://schemas.microsoft.com/office/word/2015/wordml/symex" xmlns:wpg="http://schemas.microsoft.com/office/word/2010/wordprocessingGroup" xmlns:wpi="http://schemas.microsoft.com/office/word/2010/wordprocessingInk" xmlns:wne="http://schemas.microsoft.com/office/word/2006/wordml" xmlns:wps="http://schemas.microsoft.com/office/word/2010/wordprocessingShape" mc:Ignorable="w14 w15 w16se w16cid w16 w16cex w16sdtdh w16sdtfl w16du wp14">
+  <w:endnote w:type="separator" w:id="-1">
+    <w:p>
+      <w:pPr>
+        <w:spacing w:after="0" w:line="240" w:lineRule="auto"/>
+      </w:pPr>
+      <w:r>
+        <w:separator/>
+      </w:r>
+    </w:p>
+  </w:endnote>
+  <w:endnote w:type="continuationSeparator" w:id="0">
+    <w:p>
+      <w:pPr>
+        <w:spacing w:after="0" w:line="240" w:lineRule="auto"/>
+      </w:pPr>
+      <w:r>
+        <w:continuationSeparator/>
+      </w:r>
+    </w:p>
+  </w:endnote>
+</w:endnotes>
+</file>
+
+<file path=word/footnotes.xml><?xml version="1.0" encoding="utf-8"?>
+<w:footnotes xmlns:wpc="http://schemas.microsoft.com/office/word/2010/wordprocessingCanvas" xmlns:cx="http://schemas.microsoft.com/office/drawing/2014/chartex" xmlns:cx1="http://schemas.microsoft.com/office/drawing/2015/9/8/chartex" xmlns:cx2="http://schemas.microsoft.com/office/drawing/2015/10/21/chartex" xmlns:cx3="http://schemas.microsoft.com/office/drawing/2016/5/9/chartex" xmlns:cx4="http://schemas.microsoft.com/office/drawing/2016/5/10/chartex" xmlns:cx5="http://schemas.microsoft.com/office/drawing/2016/5/11/chartex" xmlns:cx6="http://schemas.microsoft.com/office/drawing/2016/5/12/chartex" xmlns:cx7="http://schemas.microsoft.com/office/drawing/2016/5/13/chartex" xmlns:cx8="http://schemas.microsoft.com/office/drawing/2016/5/14/chartex" xmlns:mc="http://schemas.openxmlformats.org/markup-compatibility/2006" xmlns:aink="http://schemas.microsoft.com/office/drawing/2016/ink" xmlns:am3d="http://schemas.microsoft.com/office/drawing/2017/model3d" xmlns:o="urn:schemas-microsoft-com:office:office" xmlns:oel="http://schemas.microsoft.com/office/2019/extlst" xmlns:r="http://schemas.openxmlformats.org/officeDocument/2006/relationships" xmlns:m="http://schemas.openxmlformats.org/officeDocument/2006/math" xmlns:v="urn:schemas-microsoft-com:vml" xmlns:wp14="http://schemas.microsoft.com/office/word/2010/wordprocessingDrawing" xmlns:wp="http://schemas.openxmlformats.org/drawingml/2006/wordprocessingDrawing" xmlns:w10="urn:schemas-microsoft-com:office:word" xmlns:w="http://schemas.openxmlformats.org/wordprocessingml/2006/main" xmlns:w14="http://schemas.microsoft.com/office/word/2010/wordml" xmlns:w15="http://schemas.microsoft.com/office/word/2012/wordml" xmlns:w16cex="http://schemas.microsoft.com/office/word/2018/wordml/cex" xmlns:w16cid="http://schemas.microsoft.com/office/word/2016/wordml/cid" xmlns:w16="http://schemas.microsoft.com/office/word/2018/wordml" xmlns:w16du="http://schemas.microsoft.com/office/word/2023/wordml/word16du" xmlns:w16sdtdh="http://schemas.microsoft.com/office/word/2020/wordml/sdtdatahash" xmlns:w16sdtfl="http://schemas.microsoft.com/office/word/2024/wordml/sdtformatlock" xmlns:w16se="http://schemas.microsoft.com/office/word/2015/wordml/symex" xmlns:wpg="http://schemas.microsoft.com/office/word/2010/wordprocessingGroup" xmlns:wpi="http://schemas.microsoft.com/office/word/2010/wordprocessingInk" xmlns:wne="http://schemas.microsoft.com/office/word/2006/wordml" xmlns:wps="http://schemas.microsoft.com/office/word/2010/wordprocessingShape" mc:Ignorable="w14 w15 w16se w16cid w16 w16cex w16sdtdh w16sdtfl w16du wp14">
+  <w:footnote w:type="separator" w:id="-1">
+    <w:p>
+      <w:pPr>
+        <w:spacing w:after="0" w:line="240" w:lineRule="auto"/>
+      </w:pPr>
+      <w:r>
+        <w:separator/>
+      </w:r>
+    </w:p>
+  </w:footnote>
+  <w:footnote w:type="continuationSeparator" w:id="0">
+    <w:p>
+      <w:pPr>
+        <w:spacing w:after="0" w:line="240" w:lineRule="auto"/>
+      </w:pPr>
+      <w:r>
+        <w:continuationSeparator/>
+      </w:r>
+    </w:p>
+  </w:footnote>
+</w:footnotes>
 </file>
 
 <file path=word/numbering.xml><?xml version="1.0" encoding="utf-8"?>
@@ -4979,7 +4745,6 @@
   <w:style w:type="character" w:default="1" w:styleId="DefaultParagraphFont">
     <w:name w:val="Default Paragraph Font"/>
     <w:uiPriority w:val="1"/>
-    <w:semiHidden/>
     <w:unhideWhenUsed/>
   </w:style>
   <w:style w:type="table" w:default="1" w:styleId="TableNormal">
@@ -5368,6 +5133,50 @@
       <w:shd w:val="clear" w:color="auto" w:fill="E1DFDD"/>
     </w:rPr>
   </w:style>
+  <w:style w:type="paragraph" w:styleId="Header">
+    <w:name w:val="header"/>
+    <w:basedOn w:val="Normal"/>
+    <w:link w:val="HeaderChar"/>
+    <w:uiPriority w:val="99"/>
+    <w:unhideWhenUsed/>
+    <w:rsid w:val="00F63A49"/>
+    <w:pPr>
+      <w:tabs>
+        <w:tab w:val="center" w:pos="4680"/>
+        <w:tab w:val="right" w:pos="9360"/>
+      </w:tabs>
+      <w:spacing w:after="0" w:line="240" w:lineRule="auto"/>
+    </w:pPr>
+  </w:style>
+  <w:style w:type="character" w:customStyle="1" w:styleId="HeaderChar">
+    <w:name w:val="Header Char"/>
+    <w:basedOn w:val="DefaultParagraphFont"/>
+    <w:link w:val="Header"/>
+    <w:uiPriority w:val="99"/>
+    <w:rsid w:val="00F63A49"/>
+  </w:style>
+  <w:style w:type="paragraph" w:styleId="Footer">
+    <w:name w:val="footer"/>
+    <w:basedOn w:val="Normal"/>
+    <w:link w:val="FooterChar"/>
+    <w:uiPriority w:val="99"/>
+    <w:unhideWhenUsed/>
+    <w:rsid w:val="00F63A49"/>
+    <w:pPr>
+      <w:tabs>
+        <w:tab w:val="center" w:pos="4680"/>
+        <w:tab w:val="right" w:pos="9360"/>
+      </w:tabs>
+      <w:spacing w:after="0" w:line="240" w:lineRule="auto"/>
+    </w:pPr>
+  </w:style>
+  <w:style w:type="character" w:customStyle="1" w:styleId="FooterChar">
+    <w:name w:val="Footer Char"/>
+    <w:basedOn w:val="DefaultParagraphFont"/>
+    <w:link w:val="Footer"/>
+    <w:uiPriority w:val="99"/>
+    <w:rsid w:val="00F63A49"/>
+  </w:style>
 </w:styles>
 </file>
 

</xml_diff>

<commit_message>
Sprites are cheap 6
</commit_message>
<xml_diff>
--- a/LECTURES/SpritesAreCheap/SPRAJTY SĄ TANIE.docx
+++ b/LECTURES/SpritesAreCheap/SPRAJTY SĄ TANIE.docx
@@ -738,7 +738,23 @@
           <w:rFonts w:ascii="C64 Pro Mono" w:hAnsi="C64 Pro Mono"/>
           <w:color w:val="FFFFFF" w:themeColor="background1"/>
         </w:rPr>
-        <w:t xml:space="preserve"> (as LiveScript)</w:t>
+        <w:t xml:space="preserve"> (as </w:t>
+      </w:r>
+      <w:proofErr w:type="spellStart"/>
+      <w:r>
+        <w:rPr>
+          <w:rFonts w:ascii="C64 Pro Mono" w:hAnsi="C64 Pro Mono"/>
+          <w:color w:val="FFFFFF" w:themeColor="background1"/>
+        </w:rPr>
+        <w:t>LiveScript</w:t>
+      </w:r>
+      <w:proofErr w:type="spellEnd"/>
+      <w:r>
+        <w:rPr>
+          <w:rFonts w:ascii="C64 Pro Mono" w:hAnsi="C64 Pro Mono"/>
+          <w:color w:val="FFFFFF" w:themeColor="background1"/>
+        </w:rPr>
+        <w:t>)</w:t>
       </w:r>
       <w:r>
         <w:rPr>
@@ -1442,7 +1458,15 @@
                             </w:r>
                             <w:r>
                               <w:br/>
-                              <w:t xml:space="preserve">      type: Phaser.CANVAS, // rendering style (WebGL or Canvas)</w:t>
+                              <w:t xml:space="preserve">      type: </w:t>
+                            </w:r>
+                            <w:proofErr w:type="spellStart"/>
+                            <w:r>
+                              <w:t>Phaser.CANVAS</w:t>
+                            </w:r>
+                            <w:proofErr w:type="spellEnd"/>
+                            <w:r>
+                              <w:t>, // rendering style (WebGL or Canvas)</w:t>
                             </w:r>
                             <w:r>
                               <w:br/>
@@ -1503,7 +1527,15 @@
                       </w:r>
                       <w:r>
                         <w:br/>
-                        <w:t xml:space="preserve">      type: Phaser.CANVAS, // rendering style (WebGL or Canvas)</w:t>
+                        <w:t xml:space="preserve">      type: </w:t>
+                      </w:r>
+                      <w:proofErr w:type="spellStart"/>
+                      <w:r>
+                        <w:t>Phaser.CANVAS</w:t>
+                      </w:r>
+                      <w:proofErr w:type="spellEnd"/>
+                      <w:r>
+                        <w:t>, // rendering style (WebGL or Canvas)</w:t>
                       </w:r>
                       <w:r>
                         <w:br/>
@@ -1622,8 +1654,21 @@
                         <w:txbxContent>
                           <w:p>
                             <w:r>
-                              <w:t>const game = new Phaser.Game(config);</w:t>
-                            </w:r>
+                              <w:t xml:space="preserve">const game = new </w:t>
+                            </w:r>
+                            <w:proofErr w:type="spellStart"/>
+                            <w:r>
+                              <w:t>Phaser.Game</w:t>
+                            </w:r>
+                            <w:proofErr w:type="spellEnd"/>
+                            <w:r>
+                              <w:t>(config</w:t>
+                            </w:r>
+                            <w:proofErr w:type="gramStart"/>
+                            <w:r>
+                              <w:t>);</w:t>
+                            </w:r>
+                            <w:proofErr w:type="gramEnd"/>
                           </w:p>
                           <w:p>
                             <w:r>
@@ -1655,8 +1700,21 @@
                   <w:txbxContent>
                     <w:p>
                       <w:r>
-                        <w:t>const game = new Phaser.Game(config);</w:t>
-                      </w:r>
+                        <w:t xml:space="preserve">const game = new </w:t>
+                      </w:r>
+                      <w:proofErr w:type="spellStart"/>
+                      <w:r>
+                        <w:t>Phaser.Game</w:t>
+                      </w:r>
+                      <w:proofErr w:type="spellEnd"/>
+                      <w:r>
+                        <w:t>(config</w:t>
+                      </w:r>
+                      <w:proofErr w:type="gramStart"/>
+                      <w:r>
+                        <w:t>);</w:t>
+                      </w:r>
+                      <w:proofErr w:type="gramEnd"/>
                     </w:p>
                     <w:p>
                       <w:r>
@@ -1833,8 +1891,13 @@
                         <w:txbxContent>
                           <w:p>
                             <w:r>
-                              <w:t>function preload(){</w:t>
-                            </w:r>
+                              <w:t xml:space="preserve">function </w:t>
+                            </w:r>
+                            <w:proofErr w:type="gramStart"/>
+                            <w:r>
+                              <w:t>preload(){</w:t>
+                            </w:r>
+                            <w:proofErr w:type="gramEnd"/>
                             <w:r>
                               <w:br/>
                               <w:t>}</w:t>
@@ -1844,11 +1907,64 @@
                             </w:r>
                             <w:r>
                               <w:br/>
-                              <w:t>function create(){</w:t>
-                            </w:r>
+                              <w:t xml:space="preserve">function </w:t>
+                            </w:r>
+                            <w:proofErr w:type="gramStart"/>
+                            <w:r>
+                              <w:t>create(){</w:t>
+                            </w:r>
+                            <w:proofErr w:type="gramEnd"/>
                             <w:r>
                               <w:br/>
-                              <w:t xml:space="preserve">    this.add.text(20, 20, 'Super fajna gra!', { font: '24px Arial', fill: '#ffffff' });</w:t>
+                              <w:t xml:space="preserve">    </w:t>
+                            </w:r>
+                            <w:proofErr w:type="spellStart"/>
+                            <w:r>
+                              <w:t>this.add.</w:t>
+                            </w:r>
+                            <w:proofErr w:type="gramStart"/>
+                            <w:r>
+                              <w:t>text</w:t>
+                            </w:r>
+                            <w:proofErr w:type="spellEnd"/>
+                            <w:r>
+                              <w:t>(</w:t>
+                            </w:r>
+                            <w:proofErr w:type="gramEnd"/>
+                            <w:r>
+                              <w:t xml:space="preserve">20, 20, 'Super </w:t>
+                            </w:r>
+                            <w:proofErr w:type="spellStart"/>
+                            <w:r>
+                              <w:t>fajna</w:t>
+                            </w:r>
+                            <w:proofErr w:type="spellEnd"/>
+                            <w:r>
+                              <w:t xml:space="preserve"> </w:t>
+                            </w:r>
+                            <w:proofErr w:type="spellStart"/>
+                            <w:r>
+                              <w:t>gra</w:t>
+                            </w:r>
+                            <w:proofErr w:type="spellEnd"/>
+                            <w:r>
+                              <w:t xml:space="preserve">!', </w:t>
+                            </w:r>
+                            <w:proofErr w:type="gramStart"/>
+                            <w:r>
+                              <w:t>{ font</w:t>
+                            </w:r>
+                            <w:proofErr w:type="gramEnd"/>
+                            <w:r>
+                              <w:t>: '24px Arial', fill: '#</w:t>
+                            </w:r>
+                            <w:proofErr w:type="spellStart"/>
+                            <w:r>
+                              <w:t>ffffff</w:t>
+                            </w:r>
+                            <w:proofErr w:type="spellEnd"/>
+                            <w:r>
+                              <w:t>' });</w:t>
                             </w:r>
                             <w:r>
                               <w:br/>
@@ -1859,8 +1975,13 @@
                             </w:r>
                             <w:r>
                               <w:br/>
-                              <w:t>function update(){</w:t>
-                            </w:r>
+                              <w:t xml:space="preserve">function </w:t>
+                            </w:r>
+                            <w:proofErr w:type="gramStart"/>
+                            <w:r>
+                              <w:t>update(){</w:t>
+                            </w:r>
+                            <w:proofErr w:type="gramEnd"/>
                             <w:r>
                               <w:br/>
                               <w:t>}</w:t>
@@ -1891,8 +2012,13 @@
                   <w:txbxContent>
                     <w:p>
                       <w:r>
-                        <w:t>function preload(){</w:t>
-                      </w:r>
+                        <w:t xml:space="preserve">function </w:t>
+                      </w:r>
+                      <w:proofErr w:type="gramStart"/>
+                      <w:r>
+                        <w:t>preload(){</w:t>
+                      </w:r>
+                      <w:proofErr w:type="gramEnd"/>
                       <w:r>
                         <w:br/>
                         <w:t>}</w:t>
@@ -1902,11 +2028,64 @@
                       </w:r>
                       <w:r>
                         <w:br/>
-                        <w:t>function create(){</w:t>
-                      </w:r>
+                        <w:t xml:space="preserve">function </w:t>
+                      </w:r>
+                      <w:proofErr w:type="gramStart"/>
+                      <w:r>
+                        <w:t>create(){</w:t>
+                      </w:r>
+                      <w:proofErr w:type="gramEnd"/>
                       <w:r>
                         <w:br/>
-                        <w:t xml:space="preserve">    this.add.text(20, 20, 'Super fajna gra!', { font: '24px Arial', fill: '#ffffff' });</w:t>
+                        <w:t xml:space="preserve">    </w:t>
+                      </w:r>
+                      <w:proofErr w:type="spellStart"/>
+                      <w:r>
+                        <w:t>this.add.</w:t>
+                      </w:r>
+                      <w:proofErr w:type="gramStart"/>
+                      <w:r>
+                        <w:t>text</w:t>
+                      </w:r>
+                      <w:proofErr w:type="spellEnd"/>
+                      <w:r>
+                        <w:t>(</w:t>
+                      </w:r>
+                      <w:proofErr w:type="gramEnd"/>
+                      <w:r>
+                        <w:t xml:space="preserve">20, 20, 'Super </w:t>
+                      </w:r>
+                      <w:proofErr w:type="spellStart"/>
+                      <w:r>
+                        <w:t>fajna</w:t>
+                      </w:r>
+                      <w:proofErr w:type="spellEnd"/>
+                      <w:r>
+                        <w:t xml:space="preserve"> </w:t>
+                      </w:r>
+                      <w:proofErr w:type="spellStart"/>
+                      <w:r>
+                        <w:t>gra</w:t>
+                      </w:r>
+                      <w:proofErr w:type="spellEnd"/>
+                      <w:r>
+                        <w:t xml:space="preserve">!', </w:t>
+                      </w:r>
+                      <w:proofErr w:type="gramStart"/>
+                      <w:r>
+                        <w:t>{ font</w:t>
+                      </w:r>
+                      <w:proofErr w:type="gramEnd"/>
+                      <w:r>
+                        <w:t>: '24px Arial', fill: '#</w:t>
+                      </w:r>
+                      <w:proofErr w:type="spellStart"/>
+                      <w:r>
+                        <w:t>ffffff</w:t>
+                      </w:r>
+                      <w:proofErr w:type="spellEnd"/>
+                      <w:r>
+                        <w:t>' });</w:t>
                       </w:r>
                       <w:r>
                         <w:br/>
@@ -1917,8 +2096,13 @@
                       </w:r>
                       <w:r>
                         <w:br/>
-                        <w:t>function update(){</w:t>
-                      </w:r>
+                        <w:t xml:space="preserve">function </w:t>
+                      </w:r>
+                      <w:proofErr w:type="gramStart"/>
+                      <w:r>
+                        <w:t>update(){</w:t>
+                      </w:r>
+                      <w:proofErr w:type="gramEnd"/>
                       <w:r>
                         <w:br/>
                         <w:t>}</w:t>
@@ -1995,7 +2179,15 @@
                             </w:r>
                             <w:r>
                               <w:br/>
-                              <w:t xml:space="preserve">  create: create,</w:t>
+                              <w:t xml:space="preserve">  </w:t>
+                            </w:r>
+                            <w:proofErr w:type="gramStart"/>
+                            <w:r>
+                              <w:t>create:</w:t>
+                            </w:r>
+                            <w:proofErr w:type="gramEnd"/>
+                            <w:r>
+                              <w:t xml:space="preserve"> create,</w:t>
                             </w:r>
                             <w:r>
                               <w:br/>
@@ -2039,7 +2231,15 @@
                       </w:r>
                       <w:r>
                         <w:br/>
-                        <w:t xml:space="preserve">  create: create,</w:t>
+                        <w:t xml:space="preserve">  </w:t>
+                      </w:r>
+                      <w:proofErr w:type="gramStart"/>
+                      <w:r>
+                        <w:t>create:</w:t>
+                      </w:r>
+                      <w:proofErr w:type="gramEnd"/>
+                      <w:r>
+                        <w:t xml:space="preserve"> create,</w:t>
                       </w:r>
                       <w:r>
                         <w:br/>
@@ -2099,7 +2299,23 @@
           <w:rFonts w:ascii="C64 Pro Mono" w:hAnsi="C64 Pro Mono"/>
           <w:color w:val="FFFFFF" w:themeColor="background1"/>
         </w:rPr>
-        <w:t>), create() and update</w:t>
+        <w:t xml:space="preserve">), </w:t>
+      </w:r>
+      <w:proofErr w:type="gramStart"/>
+      <w:r>
+        <w:rPr>
+          <w:rFonts w:ascii="C64 Pro Mono" w:hAnsi="C64 Pro Mono"/>
+          <w:color w:val="FFFFFF" w:themeColor="background1"/>
+        </w:rPr>
+        <w:t>create(</w:t>
+      </w:r>
+      <w:proofErr w:type="gramEnd"/>
+      <w:r>
+        <w:rPr>
+          <w:rFonts w:ascii="C64 Pro Mono" w:hAnsi="C64 Pro Mono"/>
+          <w:color w:val="FFFFFF" w:themeColor="background1"/>
+        </w:rPr>
+        <w:t>) and update</w:t>
       </w:r>
     </w:p>
     <w:p>
@@ -2120,8 +2336,17 @@
           <w:color w:val="FFFFFF" w:themeColor="background1"/>
         </w:rPr>
         <w:lastRenderedPageBreak/>
-        <w:t>Adding a sprite</w:t>
-      </w:r>
+        <w:t xml:space="preserve">Adding a </w:t>
+      </w:r>
+      <w:proofErr w:type="gramStart"/>
+      <w:r>
+        <w:rPr>
+          <w:rFonts w:ascii="C64 Pro Mono" w:hAnsi="C64 Pro Mono"/>
+          <w:color w:val="FFFFFF" w:themeColor="background1"/>
+        </w:rPr>
+        <w:t>sprite</w:t>
+      </w:r>
+      <w:proofErr w:type="gramEnd"/>
     </w:p>
     <w:p>
       <w:pPr>
@@ -2192,8 +2417,17 @@
           <w:color w:val="FFFFFF" w:themeColor="background1"/>
         </w:rPr>
         <w:lastRenderedPageBreak/>
-        <w:t>Our sprite</w:t>
-      </w:r>
+        <w:t xml:space="preserve">Our </w:t>
+      </w:r>
+      <w:proofErr w:type="gramStart"/>
+      <w:r>
+        <w:rPr>
+          <w:rFonts w:ascii="C64 Pro Mono" w:hAnsi="C64 Pro Mono"/>
+          <w:color w:val="FFFFFF" w:themeColor="background1"/>
+        </w:rPr>
+        <w:t>sprite</w:t>
+      </w:r>
+      <w:proofErr w:type="gramEnd"/>
       <w:r>
         <w:rPr>
           <w:rFonts w:ascii="C64 Pro Mono" w:hAnsi="C64 Pro Mono"/>
@@ -2440,11 +2674,40 @@
                             </w:r>
                             <w:r>
                               <w:br/>
-                              <w:t>function preload() {</w:t>
+                              <w:t xml:space="preserve">function </w:t>
+                            </w:r>
+                            <w:proofErr w:type="gramStart"/>
+                            <w:r>
+                              <w:t>preload(</w:t>
+                            </w:r>
+                            <w:proofErr w:type="gramEnd"/>
+                            <w:r>
+                              <w:t>) {</w:t>
                             </w:r>
                             <w:r>
                               <w:br/>
-                              <w:t xml:space="preserve">    this.load.image('balloon', 'balloon.png');</w:t>
+                              <w:t xml:space="preserve">    </w:t>
+                            </w:r>
+                            <w:proofErr w:type="spellStart"/>
+                            <w:proofErr w:type="gramStart"/>
+                            <w:r>
+                              <w:t>this.load</w:t>
+                            </w:r>
+                            <w:proofErr w:type="gramEnd"/>
+                            <w:r>
+                              <w:t>.</w:t>
+                            </w:r>
+                            <w:proofErr w:type="gramStart"/>
+                            <w:r>
+                              <w:t>image</w:t>
+                            </w:r>
+                            <w:proofErr w:type="spellEnd"/>
+                            <w:r>
+                              <w:t>(</w:t>
+                            </w:r>
+                            <w:proofErr w:type="gramEnd"/>
+                            <w:r>
+                              <w:t>'balloon', 'balloon.png');</w:t>
                             </w:r>
                             <w:r>
                               <w:br/>
@@ -2455,15 +2718,81 @@
                             </w:r>
                             <w:r>
                               <w:br/>
-                              <w:t>function create() {</w:t>
+                              <w:t xml:space="preserve">function </w:t>
+                            </w:r>
+                            <w:proofErr w:type="gramStart"/>
+                            <w:r>
+                              <w:t>create(</w:t>
+                            </w:r>
+                            <w:proofErr w:type="gramEnd"/>
+                            <w:r>
+                              <w:t>) {</w:t>
                             </w:r>
                             <w:r>
                               <w:br/>
-                              <w:t xml:space="preserve">    this.add.text(20, 20, 'Super fajna gra!', { font: '24px Arial', fill: '#ffffff' });</w:t>
+                              <w:t xml:space="preserve">    </w:t>
+                            </w:r>
+                            <w:proofErr w:type="spellStart"/>
+                            <w:r>
+                              <w:t>this.add.</w:t>
+                            </w:r>
+                            <w:proofErr w:type="gramStart"/>
+                            <w:r>
+                              <w:t>text</w:t>
+                            </w:r>
+                            <w:proofErr w:type="spellEnd"/>
+                            <w:r>
+                              <w:t>(</w:t>
+                            </w:r>
+                            <w:proofErr w:type="gramEnd"/>
+                            <w:r>
+                              <w:t xml:space="preserve">20, 20, 'Super </w:t>
+                            </w:r>
+                            <w:proofErr w:type="spellStart"/>
+                            <w:r>
+                              <w:t>fajna</w:t>
+                            </w:r>
+                            <w:proofErr w:type="spellEnd"/>
+                            <w:r>
+                              <w:t xml:space="preserve"> </w:t>
+                            </w:r>
+                            <w:proofErr w:type="spellStart"/>
+                            <w:r>
+                              <w:t>gra</w:t>
+                            </w:r>
+                            <w:proofErr w:type="spellEnd"/>
+                            <w:r>
+                              <w:t xml:space="preserve">!', </w:t>
+                            </w:r>
+                            <w:proofErr w:type="gramStart"/>
+                            <w:r>
+                              <w:t>{ font</w:t>
+                            </w:r>
+                            <w:proofErr w:type="gramEnd"/>
+                            <w:r>
+                              <w:t>: '24px Arial', fill: '#</w:t>
+                            </w:r>
+                            <w:proofErr w:type="spellStart"/>
+                            <w:r>
+                              <w:t>ffffff</w:t>
+                            </w:r>
+                            <w:proofErr w:type="spellEnd"/>
+                            <w:r>
+                              <w:t>' });</w:t>
                             </w:r>
                             <w:r>
                               <w:br/>
-                              <w:t xml:space="preserve">    sprite = this.add.sprite(200, 200, 'balloon');</w:t>
+                              <w:t xml:space="preserve">    sprite = </w:t>
+                            </w:r>
+                            <w:proofErr w:type="spellStart"/>
+                            <w:proofErr w:type="gramStart"/>
+                            <w:r>
+                              <w:t>this.add.sprite</w:t>
+                            </w:r>
+                            <w:proofErr w:type="spellEnd"/>
+                            <w:proofErr w:type="gramEnd"/>
+                            <w:r>
+                              <w:t>(200, 200, 'balloon');</w:t>
                             </w:r>
                             <w:r>
                               <w:br/>
@@ -2502,11 +2831,40 @@
                       </w:r>
                       <w:r>
                         <w:br/>
-                        <w:t>function preload() {</w:t>
+                        <w:t xml:space="preserve">function </w:t>
+                      </w:r>
+                      <w:proofErr w:type="gramStart"/>
+                      <w:r>
+                        <w:t>preload(</w:t>
+                      </w:r>
+                      <w:proofErr w:type="gramEnd"/>
+                      <w:r>
+                        <w:t>) {</w:t>
                       </w:r>
                       <w:r>
                         <w:br/>
-                        <w:t xml:space="preserve">    this.load.image('balloon', 'balloon.png');</w:t>
+                        <w:t xml:space="preserve">    </w:t>
+                      </w:r>
+                      <w:proofErr w:type="spellStart"/>
+                      <w:proofErr w:type="gramStart"/>
+                      <w:r>
+                        <w:t>this.load</w:t>
+                      </w:r>
+                      <w:proofErr w:type="gramEnd"/>
+                      <w:r>
+                        <w:t>.</w:t>
+                      </w:r>
+                      <w:proofErr w:type="gramStart"/>
+                      <w:r>
+                        <w:t>image</w:t>
+                      </w:r>
+                      <w:proofErr w:type="spellEnd"/>
+                      <w:r>
+                        <w:t>(</w:t>
+                      </w:r>
+                      <w:proofErr w:type="gramEnd"/>
+                      <w:r>
+                        <w:t>'balloon', 'balloon.png');</w:t>
                       </w:r>
                       <w:r>
                         <w:br/>
@@ -2517,15 +2875,81 @@
                       </w:r>
                       <w:r>
                         <w:br/>
-                        <w:t>function create() {</w:t>
+                        <w:t xml:space="preserve">function </w:t>
+                      </w:r>
+                      <w:proofErr w:type="gramStart"/>
+                      <w:r>
+                        <w:t>create(</w:t>
+                      </w:r>
+                      <w:proofErr w:type="gramEnd"/>
+                      <w:r>
+                        <w:t>) {</w:t>
                       </w:r>
                       <w:r>
                         <w:br/>
-                        <w:t xml:space="preserve">    this.add.text(20, 20, 'Super fajna gra!', { font: '24px Arial', fill: '#ffffff' });</w:t>
+                        <w:t xml:space="preserve">    </w:t>
+                      </w:r>
+                      <w:proofErr w:type="spellStart"/>
+                      <w:r>
+                        <w:t>this.add.</w:t>
+                      </w:r>
+                      <w:proofErr w:type="gramStart"/>
+                      <w:r>
+                        <w:t>text</w:t>
+                      </w:r>
+                      <w:proofErr w:type="spellEnd"/>
+                      <w:r>
+                        <w:t>(</w:t>
+                      </w:r>
+                      <w:proofErr w:type="gramEnd"/>
+                      <w:r>
+                        <w:t xml:space="preserve">20, 20, 'Super </w:t>
+                      </w:r>
+                      <w:proofErr w:type="spellStart"/>
+                      <w:r>
+                        <w:t>fajna</w:t>
+                      </w:r>
+                      <w:proofErr w:type="spellEnd"/>
+                      <w:r>
+                        <w:t xml:space="preserve"> </w:t>
+                      </w:r>
+                      <w:proofErr w:type="spellStart"/>
+                      <w:r>
+                        <w:t>gra</w:t>
+                      </w:r>
+                      <w:proofErr w:type="spellEnd"/>
+                      <w:r>
+                        <w:t xml:space="preserve">!', </w:t>
+                      </w:r>
+                      <w:proofErr w:type="gramStart"/>
+                      <w:r>
+                        <w:t>{ font</w:t>
+                      </w:r>
+                      <w:proofErr w:type="gramEnd"/>
+                      <w:r>
+                        <w:t>: '24px Arial', fill: '#</w:t>
+                      </w:r>
+                      <w:proofErr w:type="spellStart"/>
+                      <w:r>
+                        <w:t>ffffff</w:t>
+                      </w:r>
+                      <w:proofErr w:type="spellEnd"/>
+                      <w:r>
+                        <w:t>' });</w:t>
                       </w:r>
                       <w:r>
                         <w:br/>
-                        <w:t xml:space="preserve">    sprite = this.add.sprite(200, 200, 'balloon');</w:t>
+                        <w:t xml:space="preserve">    sprite = </w:t>
+                      </w:r>
+                      <w:proofErr w:type="spellStart"/>
+                      <w:proofErr w:type="gramStart"/>
+                      <w:r>
+                        <w:t>this.add.sprite</w:t>
+                      </w:r>
+                      <w:proofErr w:type="spellEnd"/>
+                      <w:proofErr w:type="gramEnd"/>
+                      <w:r>
+                        <w:t>(200, 200, 'balloon');</w:t>
                       </w:r>
                       <w:r>
                         <w:br/>
@@ -2622,13 +3046,13 @@
         <mc:AlternateContent>
           <mc:Choice Requires="wps">
             <w:drawing>
-              <wp:anchor distT="45720" distB="45720" distL="114300" distR="114300" simplePos="0" relativeHeight="251659264" behindDoc="0" locked="0" layoutInCell="1" allowOverlap="1" wp14:anchorId="3AAE8F27" wp14:editId="6D729BEC">
+              <wp:anchor distT="45720" distB="45720" distL="114300" distR="114300" simplePos="0" relativeHeight="251659264" behindDoc="0" locked="0" layoutInCell="1" allowOverlap="1" wp14:anchorId="3AAE8F27" wp14:editId="0B907019">
                 <wp:simplePos x="0" y="0"/>
                 <wp:positionH relativeFrom="margin">
                   <wp:align>left</wp:align>
                 </wp:positionH>
                 <wp:positionV relativeFrom="paragraph">
-                  <wp:posOffset>203200</wp:posOffset>
+                  <wp:posOffset>404963</wp:posOffset>
                 </wp:positionV>
                 <wp:extent cx="6182360" cy="586740"/>
                 <wp:effectExtent l="0" t="0" r="27940" b="22860"/>
@@ -2646,7 +3070,7 @@
                       <wps:spPr bwMode="auto">
                         <a:xfrm>
                           <a:off x="0" y="0"/>
-                          <a:ext cx="6182360" cy="587141"/>
+                          <a:ext cx="6182360" cy="586740"/>
                         </a:xfrm>
                         <a:prstGeom prst="rect">
                           <a:avLst/>
@@ -2667,12 +3091,25 @@
                         <w:txbxContent>
                           <w:p>
                             <w:r>
-                              <w:t>const spritesCount = 12;</w:t>
+                              <w:t xml:space="preserve">const </w:t>
+                            </w:r>
+                            <w:proofErr w:type="spellStart"/>
+                            <w:r>
+                              <w:t>spritesCount</w:t>
+                            </w:r>
+                            <w:proofErr w:type="spellEnd"/>
+                            <w:r>
+                              <w:t xml:space="preserve"> = 12;</w:t>
                             </w:r>
                             <w:r>
                               <w:br/>
-                              <w:t>let sprites = [];</w:t>
-                            </w:r>
+                              <w:t>let sprites = [</w:t>
+                            </w:r>
+                            <w:proofErr w:type="gramStart"/>
+                            <w:r>
+                              <w:t>];</w:t>
+                            </w:r>
+                            <w:proofErr w:type="gramEnd"/>
                           </w:p>
                           <w:p>
                             <w:pPr>
@@ -2701,17 +3138,30 @@
           </mc:Choice>
           <mc:Fallback>
             <w:pict>
-              <v:shape w14:anchorId="3AAE8F27" id="_x0000_s1033" type="#_x0000_t202" style="position:absolute;left:0;text-align:left;margin-left:0;margin-top:16pt;width:486.8pt;height:46.2pt;z-index:251659264;visibility:visible;mso-wrap-style:square;mso-width-percent:0;mso-height-percent:0;mso-wrap-distance-left:9pt;mso-wrap-distance-top:3.6pt;mso-wrap-distance-right:9pt;mso-wrap-distance-bottom:3.6pt;mso-position-horizontal:left;mso-position-horizontal-relative:margin;mso-position-vertical:absolute;mso-position-vertical-relative:text;mso-width-percent:0;mso-height-percent:0;mso-width-relative:margin;mso-height-relative:margin;v-text-anchor:top" o:gfxdata="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">
+              <v:shape w14:anchorId="3AAE8F27" id="_x0000_s1033" type="#_x0000_t202" style="position:absolute;left:0;text-align:left;margin-left:0;margin-top:31.9pt;width:486.8pt;height:46.2pt;z-index:251659264;visibility:visible;mso-wrap-style:square;mso-width-percent:0;mso-height-percent:0;mso-wrap-distance-left:9pt;mso-wrap-distance-top:3.6pt;mso-wrap-distance-right:9pt;mso-wrap-distance-bottom:3.6pt;mso-position-horizontal:left;mso-position-horizontal-relative:margin;mso-position-vertical:absolute;mso-position-vertical-relative:text;mso-width-percent:0;mso-height-percent:0;mso-width-relative:margin;mso-height-relative:margin;v-text-anchor:top" o:gfxdata="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">
                 <v:textbox>
                   <w:txbxContent>
                     <w:p>
                       <w:r>
-                        <w:t>const spritesCount = 12;</w:t>
+                        <w:t xml:space="preserve">const </w:t>
+                      </w:r>
+                      <w:proofErr w:type="spellStart"/>
+                      <w:r>
+                        <w:t>spritesCount</w:t>
+                      </w:r>
+                      <w:proofErr w:type="spellEnd"/>
+                      <w:r>
+                        <w:t xml:space="preserve"> = 12;</w:t>
                       </w:r>
                       <w:r>
                         <w:br/>
-                        <w:t>let sprites = [];</w:t>
-                      </w:r>
+                        <w:t>let sprites = [</w:t>
+                      </w:r>
+                      <w:proofErr w:type="gramStart"/>
+                      <w:r>
+                        <w:t>];</w:t>
+                      </w:r>
+                      <w:proofErr w:type="gramEnd"/>
                     </w:p>
                     <w:p>
                       <w:pPr>
@@ -2815,34 +3265,168 @@
                         <w:txbxContent>
                           <w:p>
                             <w:r>
-                              <w:t>function create() {</w:t>
+                              <w:t xml:space="preserve">function </w:t>
+                            </w:r>
+                            <w:proofErr w:type="gramStart"/>
+                            <w:r>
+                              <w:t>create(</w:t>
+                            </w:r>
+                            <w:proofErr w:type="gramEnd"/>
+                            <w:r>
+                              <w:t>) {</w:t>
                             </w:r>
                             <w:r>
                               <w:br/>
-                              <w:t xml:space="preserve">    this.add.text(20, 20, 'Super fajna gra!', { font: '24px Arial', fill: '#ffffff' });</w:t>
+                              <w:t xml:space="preserve">    </w:t>
+                            </w:r>
+                            <w:proofErr w:type="spellStart"/>
+                            <w:r>
+                              <w:t>this.add.</w:t>
+                            </w:r>
+                            <w:proofErr w:type="gramStart"/>
+                            <w:r>
+                              <w:t>text</w:t>
+                            </w:r>
+                            <w:proofErr w:type="spellEnd"/>
+                            <w:r>
+                              <w:t>(</w:t>
+                            </w:r>
+                            <w:proofErr w:type="gramEnd"/>
+                            <w:r>
+                              <w:t xml:space="preserve">20, 20, 'Super </w:t>
+                            </w:r>
+                            <w:proofErr w:type="spellStart"/>
+                            <w:r>
+                              <w:t>fajna</w:t>
+                            </w:r>
+                            <w:proofErr w:type="spellEnd"/>
+                            <w:r>
+                              <w:t xml:space="preserve"> </w:t>
+                            </w:r>
+                            <w:proofErr w:type="spellStart"/>
+                            <w:r>
+                              <w:t>gra</w:t>
+                            </w:r>
+                            <w:proofErr w:type="spellEnd"/>
+                            <w:r>
+                              <w:t xml:space="preserve">!', </w:t>
+                            </w:r>
+                            <w:proofErr w:type="gramStart"/>
+                            <w:r>
+                              <w:t>{ font</w:t>
+                            </w:r>
+                            <w:proofErr w:type="gramEnd"/>
+                            <w:r>
+                              <w:t>: '24px Arial', fill: '#</w:t>
+                            </w:r>
+                            <w:proofErr w:type="spellStart"/>
+                            <w:r>
+                              <w:t>ffffff</w:t>
+                            </w:r>
+                            <w:proofErr w:type="spellEnd"/>
+                            <w:r>
+                              <w:t>' });</w:t>
                             </w:r>
                             <w:r>
                               <w:br/>
                             </w:r>
                             <w:r>
                               <w:br/>
-                              <w:t xml:space="preserve">    for (let i = 0; i &lt; spritesCount; i++){</w:t>
-                            </w:r>
+                              <w:t xml:space="preserve">    for (let </w:t>
+                            </w:r>
+                            <w:proofErr w:type="spellStart"/>
+                            <w:r>
+                              <w:t>i</w:t>
+                            </w:r>
+                            <w:proofErr w:type="spellEnd"/>
+                            <w:r>
+                              <w:t xml:space="preserve"> = 0; </w:t>
+                            </w:r>
+                            <w:proofErr w:type="spellStart"/>
+                            <w:r>
+                              <w:t>i</w:t>
+                            </w:r>
+                            <w:proofErr w:type="spellEnd"/>
+                            <w:r>
+                              <w:t xml:space="preserve"> &lt; </w:t>
+                            </w:r>
+                            <w:proofErr w:type="spellStart"/>
+                            <w:r>
+                              <w:t>spritesCount</w:t>
+                            </w:r>
+                            <w:proofErr w:type="spellEnd"/>
+                            <w:r>
+                              <w:t xml:space="preserve">; </w:t>
+                            </w:r>
+                            <w:proofErr w:type="spellStart"/>
+                            <w:r>
+                              <w:t>i</w:t>
+                            </w:r>
+                            <w:proofErr w:type="spellEnd"/>
+                            <w:r>
+                              <w:t>+</w:t>
+                            </w:r>
+                            <w:proofErr w:type="gramStart"/>
+                            <w:r>
+                              <w:t>+){</w:t>
+                            </w:r>
+                            <w:proofErr w:type="gramEnd"/>
                             <w:r>
                               <w:br/>
-                              <w:t xml:space="preserve">        let s = this.add.sprite(i, 50*i, 'balloon');</w:t>
+                              <w:t xml:space="preserve">        let s = </w:t>
+                            </w:r>
+                            <w:proofErr w:type="spellStart"/>
+                            <w:proofErr w:type="gramStart"/>
+                            <w:r>
+                              <w:t>this.add.sprite</w:t>
+                            </w:r>
+                            <w:proofErr w:type="spellEnd"/>
+                            <w:proofErr w:type="gramEnd"/>
+                            <w:r>
+                              <w:t>(</w:t>
+                            </w:r>
+                            <w:proofErr w:type="spellStart"/>
+                            <w:r>
+                              <w:t>i</w:t>
+                            </w:r>
+                            <w:proofErr w:type="spellEnd"/>
+                            <w:r>
+                              <w:t>, 50*</w:t>
+                            </w:r>
+                            <w:proofErr w:type="spellStart"/>
+                            <w:r>
+                              <w:t>i</w:t>
+                            </w:r>
+                            <w:proofErr w:type="spellEnd"/>
+                            <w:r>
+                              <w:t>, 'balloon');</w:t>
                             </w:r>
                             <w:r>
                               <w:t xml:space="preserve"> </w:t>
                             </w:r>
                             <w:r>
                               <w:br/>
-                              <w:t xml:space="preserve">        sprites.push(s);</w:t>
+                              <w:t xml:space="preserve">        </w:t>
+                            </w:r>
+                            <w:proofErr w:type="spellStart"/>
+                            <w:proofErr w:type="gramStart"/>
+                            <w:r>
+                              <w:t>sprites.push</w:t>
+                            </w:r>
+                            <w:proofErr w:type="spellEnd"/>
+                            <w:proofErr w:type="gramEnd"/>
+                            <w:r>
+                              <w:t>(s);</w:t>
                             </w:r>
                             <w:r>
                               <w:br/>
-                              <w:t xml:space="preserve">    }</w:t>
-                            </w:r>
+                              <w:t xml:space="preserve">  </w:t>
+                            </w:r>
+                            <w:proofErr w:type="gramStart"/>
+                            <w:r>
+                              <w:t xml:space="preserve">  }</w:t>
+                            </w:r>
+                            <w:proofErr w:type="gramEnd"/>
                           </w:p>
                           <w:p>
                             <w:pPr>
@@ -2876,34 +3460,168 @@
                   <w:txbxContent>
                     <w:p>
                       <w:r>
-                        <w:t>function create() {</w:t>
+                        <w:t xml:space="preserve">function </w:t>
+                      </w:r>
+                      <w:proofErr w:type="gramStart"/>
+                      <w:r>
+                        <w:t>create(</w:t>
+                      </w:r>
+                      <w:proofErr w:type="gramEnd"/>
+                      <w:r>
+                        <w:t>) {</w:t>
                       </w:r>
                       <w:r>
                         <w:br/>
-                        <w:t xml:space="preserve">    this.add.text(20, 20, 'Super fajna gra!', { font: '24px Arial', fill: '#ffffff' });</w:t>
+                        <w:t xml:space="preserve">    </w:t>
+                      </w:r>
+                      <w:proofErr w:type="spellStart"/>
+                      <w:r>
+                        <w:t>this.add.</w:t>
+                      </w:r>
+                      <w:proofErr w:type="gramStart"/>
+                      <w:r>
+                        <w:t>text</w:t>
+                      </w:r>
+                      <w:proofErr w:type="spellEnd"/>
+                      <w:r>
+                        <w:t>(</w:t>
+                      </w:r>
+                      <w:proofErr w:type="gramEnd"/>
+                      <w:r>
+                        <w:t xml:space="preserve">20, 20, 'Super </w:t>
+                      </w:r>
+                      <w:proofErr w:type="spellStart"/>
+                      <w:r>
+                        <w:t>fajna</w:t>
+                      </w:r>
+                      <w:proofErr w:type="spellEnd"/>
+                      <w:r>
+                        <w:t xml:space="preserve"> </w:t>
+                      </w:r>
+                      <w:proofErr w:type="spellStart"/>
+                      <w:r>
+                        <w:t>gra</w:t>
+                      </w:r>
+                      <w:proofErr w:type="spellEnd"/>
+                      <w:r>
+                        <w:t xml:space="preserve">!', </w:t>
+                      </w:r>
+                      <w:proofErr w:type="gramStart"/>
+                      <w:r>
+                        <w:t>{ font</w:t>
+                      </w:r>
+                      <w:proofErr w:type="gramEnd"/>
+                      <w:r>
+                        <w:t>: '24px Arial', fill: '#</w:t>
+                      </w:r>
+                      <w:proofErr w:type="spellStart"/>
+                      <w:r>
+                        <w:t>ffffff</w:t>
+                      </w:r>
+                      <w:proofErr w:type="spellEnd"/>
+                      <w:r>
+                        <w:t>' });</w:t>
                       </w:r>
                       <w:r>
                         <w:br/>
                       </w:r>
                       <w:r>
                         <w:br/>
-                        <w:t xml:space="preserve">    for (let i = 0; i &lt; spritesCount; i++){</w:t>
-                      </w:r>
+                        <w:t xml:space="preserve">    for (let </w:t>
+                      </w:r>
+                      <w:proofErr w:type="spellStart"/>
+                      <w:r>
+                        <w:t>i</w:t>
+                      </w:r>
+                      <w:proofErr w:type="spellEnd"/>
+                      <w:r>
+                        <w:t xml:space="preserve"> = 0; </w:t>
+                      </w:r>
+                      <w:proofErr w:type="spellStart"/>
+                      <w:r>
+                        <w:t>i</w:t>
+                      </w:r>
+                      <w:proofErr w:type="spellEnd"/>
+                      <w:r>
+                        <w:t xml:space="preserve"> &lt; </w:t>
+                      </w:r>
+                      <w:proofErr w:type="spellStart"/>
+                      <w:r>
+                        <w:t>spritesCount</w:t>
+                      </w:r>
+                      <w:proofErr w:type="spellEnd"/>
+                      <w:r>
+                        <w:t xml:space="preserve">; </w:t>
+                      </w:r>
+                      <w:proofErr w:type="spellStart"/>
+                      <w:r>
+                        <w:t>i</w:t>
+                      </w:r>
+                      <w:proofErr w:type="spellEnd"/>
+                      <w:r>
+                        <w:t>+</w:t>
+                      </w:r>
+                      <w:proofErr w:type="gramStart"/>
+                      <w:r>
+                        <w:t>+){</w:t>
+                      </w:r>
+                      <w:proofErr w:type="gramEnd"/>
                       <w:r>
                         <w:br/>
-                        <w:t xml:space="preserve">        let s = this.add.sprite(i, 50*i, 'balloon');</w:t>
+                        <w:t xml:space="preserve">        let s = </w:t>
+                      </w:r>
+                      <w:proofErr w:type="spellStart"/>
+                      <w:proofErr w:type="gramStart"/>
+                      <w:r>
+                        <w:t>this.add.sprite</w:t>
+                      </w:r>
+                      <w:proofErr w:type="spellEnd"/>
+                      <w:proofErr w:type="gramEnd"/>
+                      <w:r>
+                        <w:t>(</w:t>
+                      </w:r>
+                      <w:proofErr w:type="spellStart"/>
+                      <w:r>
+                        <w:t>i</w:t>
+                      </w:r>
+                      <w:proofErr w:type="spellEnd"/>
+                      <w:r>
+                        <w:t>, 50*</w:t>
+                      </w:r>
+                      <w:proofErr w:type="spellStart"/>
+                      <w:r>
+                        <w:t>i</w:t>
+                      </w:r>
+                      <w:proofErr w:type="spellEnd"/>
+                      <w:r>
+                        <w:t>, 'balloon');</w:t>
                       </w:r>
                       <w:r>
                         <w:t xml:space="preserve"> </w:t>
                       </w:r>
                       <w:r>
                         <w:br/>
-                        <w:t xml:space="preserve">        sprites.push(s);</w:t>
+                        <w:t xml:space="preserve">        </w:t>
+                      </w:r>
+                      <w:proofErr w:type="spellStart"/>
+                      <w:proofErr w:type="gramStart"/>
+                      <w:r>
+                        <w:t>sprites.push</w:t>
+                      </w:r>
+                      <w:proofErr w:type="spellEnd"/>
+                      <w:proofErr w:type="gramEnd"/>
+                      <w:r>
+                        <w:t>(s);</w:t>
                       </w:r>
                       <w:r>
                         <w:br/>
-                        <w:t xml:space="preserve">    }</w:t>
-                      </w:r>
+                        <w:t xml:space="preserve">  </w:t>
+                      </w:r>
+                      <w:proofErr w:type="gramStart"/>
+                      <w:r>
+                        <w:t xml:space="preserve">  }</w:t>
+                      </w:r>
+                      <w:proofErr w:type="gramEnd"/>
                     </w:p>
                     <w:p>
                       <w:pPr>
@@ -2948,17 +3666,6 @@
       <w:pPr>
         <w:jc w:val="both"/>
         <w:rPr>
-          <w:rFonts w:asciiTheme="majorBidi" w:hAnsiTheme="majorBidi" w:cstheme="majorBidi"/>
-          <w:color w:val="FFFFFF" w:themeColor="background1"/>
-          <w:sz w:val="16"/>
-          <w:szCs w:val="16"/>
-        </w:rPr>
-      </w:pPr>
-    </w:p>
-    <w:p>
-      <w:pPr>
-        <w:jc w:val="both"/>
-        <w:rPr>
           <w:rFonts w:ascii="Courier New" w:hAnsi="Courier New" w:cs="Courier New"/>
           <w:color w:val="FFFFFF" w:themeColor="background1"/>
         </w:rPr>
@@ -2969,7 +3676,23 @@
           <w:color w:val="FFFFFF" w:themeColor="background1"/>
         </w:rPr>
         <w:lastRenderedPageBreak/>
-        <w:t>Let’s get movin’</w:t>
+        <w:t xml:space="preserve">Let’s get </w:t>
+      </w:r>
+      <w:proofErr w:type="spellStart"/>
+      <w:r>
+        <w:rPr>
+          <w:rFonts w:ascii="C64 Pro Mono" w:hAnsi="C64 Pro Mono" w:cstheme="majorBidi"/>
+          <w:color w:val="FFFFFF" w:themeColor="background1"/>
+        </w:rPr>
+        <w:t>movin</w:t>
+      </w:r>
+      <w:proofErr w:type="spellEnd"/>
+      <w:r>
+        <w:rPr>
+          <w:rFonts w:ascii="C64 Pro Mono" w:hAnsi="C64 Pro Mono" w:cstheme="majorBidi"/>
+          <w:color w:val="FFFFFF" w:themeColor="background1"/>
+        </w:rPr>
+        <w:t>’</w:t>
       </w:r>
       <w:r>
         <w:rPr>
@@ -2998,7 +3721,7 @@
         <mc:AlternateContent>
           <mc:Choice Requires="wps">
             <w:drawing>
-              <wp:anchor distT="45720" distB="45720" distL="114300" distR="114300" simplePos="0" relativeHeight="251677696" behindDoc="0" locked="0" layoutInCell="1" allowOverlap="1" wp14:anchorId="29C54F28" wp14:editId="696EE00C">
+              <wp:anchor distT="45720" distB="45720" distL="114300" distR="114300" simplePos="0" relativeHeight="251677696" behindDoc="0" locked="0" layoutInCell="1" allowOverlap="1" wp14:anchorId="29C54F28" wp14:editId="723E7909">
                 <wp:simplePos x="0" y="0"/>
                 <wp:positionH relativeFrom="margin">
                   <wp:align>left</wp:align>
@@ -3006,8 +3729,8 @@
                 <wp:positionV relativeFrom="paragraph">
                   <wp:posOffset>299085</wp:posOffset>
                 </wp:positionV>
-                <wp:extent cx="6182360" cy="2213610"/>
-                <wp:effectExtent l="0" t="0" r="27940" b="15240"/>
+                <wp:extent cx="6182360" cy="1684020"/>
+                <wp:effectExtent l="0" t="0" r="27940" b="11430"/>
                 <wp:wrapSquare wrapText="bothSides"/>
                 <wp:docPr id="1593283980" name="Text Box 2"/>
                 <wp:cNvGraphicFramePr>
@@ -3022,7 +3745,7 @@
                       <wps:spPr bwMode="auto">
                         <a:xfrm>
                           <a:off x="0" y="0"/>
-                          <a:ext cx="6182360" cy="2213610"/>
+                          <a:ext cx="6182360" cy="1684421"/>
                         </a:xfrm>
                         <a:prstGeom prst="rect">
                           <a:avLst/>
@@ -3043,22 +3766,96 @@
                         <w:txbxContent>
                           <w:p>
                             <w:r>
-                              <w:t>function update() {</w:t>
+                              <w:t xml:space="preserve">function </w:t>
+                            </w:r>
+                            <w:proofErr w:type="gramStart"/>
+                            <w:r>
+                              <w:t>update(</w:t>
+                            </w:r>
+                            <w:proofErr w:type="gramEnd"/>
+                            <w:r>
+                              <w:t>) {</w:t>
                             </w:r>
                             <w:r>
                               <w:br/>
-                              <w:t xml:space="preserve">    for (let i = 0; i &lt; spritesCount; i++){</w:t>
-                            </w:r>
+                              <w:t xml:space="preserve">    for (let </w:t>
+                            </w:r>
+                            <w:proofErr w:type="spellStart"/>
+                            <w:r>
+                              <w:t>i</w:t>
+                            </w:r>
+                            <w:proofErr w:type="spellEnd"/>
+                            <w:r>
+                              <w:t xml:space="preserve"> = 0; </w:t>
+                            </w:r>
+                            <w:proofErr w:type="spellStart"/>
+                            <w:r>
+                              <w:t>i</w:t>
+                            </w:r>
+                            <w:proofErr w:type="spellEnd"/>
+                            <w:r>
+                              <w:t xml:space="preserve"> &lt; </w:t>
+                            </w:r>
+                            <w:proofErr w:type="spellStart"/>
+                            <w:r>
+                              <w:t>spritesCount</w:t>
+                            </w:r>
+                            <w:proofErr w:type="spellEnd"/>
+                            <w:r>
+                              <w:t xml:space="preserve">; </w:t>
+                            </w:r>
+                            <w:proofErr w:type="spellStart"/>
+                            <w:r>
+                              <w:t>i</w:t>
+                            </w:r>
+                            <w:proofErr w:type="spellEnd"/>
+                            <w:r>
+                              <w:t>+</w:t>
+                            </w:r>
+                            <w:proofErr w:type="gramStart"/>
+                            <w:r>
+                              <w:t>+){</w:t>
+                            </w:r>
+                            <w:proofErr w:type="gramEnd"/>
                             <w:r>
                               <w:br/>
-                              <w:t xml:space="preserve">        if (sprites[i].x &lt; 800)</w:t>
+                              <w:t xml:space="preserve">        if (sprites[</w:t>
+                            </w:r>
+                            <w:proofErr w:type="spellStart"/>
+                            <w:r>
+                              <w:t>i</w:t>
+                            </w:r>
+                            <w:proofErr w:type="spellEnd"/>
+                            <w:r>
+                              <w:t>].x &lt; 800)</w:t>
                             </w:r>
                             <w:r>
                               <w:br/>
-                              <w:t xml:space="preserve">            sprites[i].x += </w:t>
-                            </w:r>
-                            <w:r>
-                              <w:t xml:space="preserve"> i; //</w:t>
+                              <w:t xml:space="preserve">            sprites[</w:t>
+                            </w:r>
+                            <w:proofErr w:type="spellStart"/>
+                            <w:r>
+                              <w:t>i</w:t>
+                            </w:r>
+                            <w:proofErr w:type="spellEnd"/>
+                            <w:r>
+                              <w:t>].x +</w:t>
+                            </w:r>
+                            <w:proofErr w:type="gramStart"/>
+                            <w:r>
+                              <w:t xml:space="preserve">= </w:t>
+                            </w:r>
+                            <w:r>
+                              <w:t xml:space="preserve"> </w:t>
+                            </w:r>
+                            <w:proofErr w:type="spellStart"/>
+                            <w:r>
+                              <w:t>i</w:t>
+                            </w:r>
+                            <w:proofErr w:type="spellEnd"/>
+                            <w:proofErr w:type="gramEnd"/>
+                            <w:r>
+                              <w:t>; //</w:t>
                             </w:r>
                             <w:r>
                               <w:t>(i+1) % 20;</w:t>
@@ -3069,12 +3866,25 @@
                             </w:r>
                             <w:r>
                               <w:br/>
-                              <w:t xml:space="preserve">            sprites[i].x = 0;</w:t>
+                              <w:t xml:space="preserve">            sprites[</w:t>
+                            </w:r>
+                            <w:proofErr w:type="spellStart"/>
+                            <w:r>
+                              <w:t>i</w:t>
+                            </w:r>
+                            <w:proofErr w:type="spellEnd"/>
+                            <w:r>
+                              <w:t>].x = 0;</w:t>
                             </w:r>
                             <w:r>
                               <w:br/>
-                              <w:t xml:space="preserve">    }</w:t>
-                            </w:r>
+                              <w:t xml:space="preserve">  </w:t>
+                            </w:r>
+                            <w:proofErr w:type="gramStart"/>
+                            <w:r>
+                              <w:t xml:space="preserve">  }</w:t>
+                            </w:r>
+                            <w:proofErr w:type="gramEnd"/>
                             <w:r>
                               <w:br/>
                               <w:t>}</w:t>
@@ -3100,27 +3910,101 @@
           </mc:Choice>
           <mc:Fallback>
             <w:pict>
-              <v:shape w14:anchorId="29C54F28" id="_x0000_s1035" type="#_x0000_t202" style="position:absolute;left:0;text-align:left;margin-left:0;margin-top:23.55pt;width:486.8pt;height:174.3pt;z-index:251677696;visibility:visible;mso-wrap-style:square;mso-width-percent:0;mso-height-percent:0;mso-wrap-distance-left:9pt;mso-wrap-distance-top:3.6pt;mso-wrap-distance-right:9pt;mso-wrap-distance-bottom:3.6pt;mso-position-horizontal:left;mso-position-horizontal-relative:margin;mso-position-vertical:absolute;mso-position-vertical-relative:text;mso-width-percent:0;mso-height-percent:0;mso-width-relative:margin;mso-height-relative:margin;v-text-anchor:top" o:gfxdata="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">
+              <v:shape w14:anchorId="29C54F28" id="_x0000_s1035" type="#_x0000_t202" style="position:absolute;left:0;text-align:left;margin-left:0;margin-top:23.55pt;width:486.8pt;height:132.6pt;z-index:251677696;visibility:visible;mso-wrap-style:square;mso-width-percent:0;mso-height-percent:0;mso-wrap-distance-left:9pt;mso-wrap-distance-top:3.6pt;mso-wrap-distance-right:9pt;mso-wrap-distance-bottom:3.6pt;mso-position-horizontal:left;mso-position-horizontal-relative:margin;mso-position-vertical:absolute;mso-position-vertical-relative:text;mso-width-percent:0;mso-height-percent:0;mso-width-relative:margin;mso-height-relative:margin;v-text-anchor:top" o:gfxdata="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">
                 <v:textbox>
                   <w:txbxContent>
                     <w:p>
                       <w:r>
-                        <w:t>function update() {</w:t>
+                        <w:t xml:space="preserve">function </w:t>
+                      </w:r>
+                      <w:proofErr w:type="gramStart"/>
+                      <w:r>
+                        <w:t>update(</w:t>
+                      </w:r>
+                      <w:proofErr w:type="gramEnd"/>
+                      <w:r>
+                        <w:t>) {</w:t>
                       </w:r>
                       <w:r>
                         <w:br/>
-                        <w:t xml:space="preserve">    for (let i = 0; i &lt; spritesCount; i++){</w:t>
-                      </w:r>
+                        <w:t xml:space="preserve">    for (let </w:t>
+                      </w:r>
+                      <w:proofErr w:type="spellStart"/>
+                      <w:r>
+                        <w:t>i</w:t>
+                      </w:r>
+                      <w:proofErr w:type="spellEnd"/>
+                      <w:r>
+                        <w:t xml:space="preserve"> = 0; </w:t>
+                      </w:r>
+                      <w:proofErr w:type="spellStart"/>
+                      <w:r>
+                        <w:t>i</w:t>
+                      </w:r>
+                      <w:proofErr w:type="spellEnd"/>
+                      <w:r>
+                        <w:t xml:space="preserve"> &lt; </w:t>
+                      </w:r>
+                      <w:proofErr w:type="spellStart"/>
+                      <w:r>
+                        <w:t>spritesCount</w:t>
+                      </w:r>
+                      <w:proofErr w:type="spellEnd"/>
+                      <w:r>
+                        <w:t xml:space="preserve">; </w:t>
+                      </w:r>
+                      <w:proofErr w:type="spellStart"/>
+                      <w:r>
+                        <w:t>i</w:t>
+                      </w:r>
+                      <w:proofErr w:type="spellEnd"/>
+                      <w:r>
+                        <w:t>+</w:t>
+                      </w:r>
+                      <w:proofErr w:type="gramStart"/>
+                      <w:r>
+                        <w:t>+){</w:t>
+                      </w:r>
+                      <w:proofErr w:type="gramEnd"/>
                       <w:r>
                         <w:br/>
-                        <w:t xml:space="preserve">        if (sprites[i].x &lt; 800)</w:t>
+                        <w:t xml:space="preserve">        if (sprites[</w:t>
+                      </w:r>
+                      <w:proofErr w:type="spellStart"/>
+                      <w:r>
+                        <w:t>i</w:t>
+                      </w:r>
+                      <w:proofErr w:type="spellEnd"/>
+                      <w:r>
+                        <w:t>].x &lt; 800)</w:t>
                       </w:r>
                       <w:r>
                         <w:br/>
-                        <w:t xml:space="preserve">            sprites[i].x += </w:t>
-                      </w:r>
-                      <w:r>
-                        <w:t xml:space="preserve"> i; //</w:t>
+                        <w:t xml:space="preserve">            sprites[</w:t>
+                      </w:r>
+                      <w:proofErr w:type="spellStart"/>
+                      <w:r>
+                        <w:t>i</w:t>
+                      </w:r>
+                      <w:proofErr w:type="spellEnd"/>
+                      <w:r>
+                        <w:t>].x +</w:t>
+                      </w:r>
+                      <w:proofErr w:type="gramStart"/>
+                      <w:r>
+                        <w:t xml:space="preserve">= </w:t>
+                      </w:r>
+                      <w:r>
+                        <w:t xml:space="preserve"> </w:t>
+                      </w:r>
+                      <w:proofErr w:type="spellStart"/>
+                      <w:r>
+                        <w:t>i</w:t>
+                      </w:r>
+                      <w:proofErr w:type="spellEnd"/>
+                      <w:proofErr w:type="gramEnd"/>
+                      <w:r>
+                        <w:t>; //</w:t>
                       </w:r>
                       <w:r>
                         <w:t>(i+1) % 20;</w:t>
@@ -3131,12 +4015,25 @@
                       </w:r>
                       <w:r>
                         <w:br/>
-                        <w:t xml:space="preserve">            sprites[i].x = 0;</w:t>
+                        <w:t xml:space="preserve">            sprites[</w:t>
+                      </w:r>
+                      <w:proofErr w:type="spellStart"/>
+                      <w:r>
+                        <w:t>i</w:t>
+                      </w:r>
+                      <w:proofErr w:type="spellEnd"/>
+                      <w:r>
+                        <w:t>].x = 0;</w:t>
                       </w:r>
                       <w:r>
                         <w:br/>
-                        <w:t xml:space="preserve">    }</w:t>
-                      </w:r>
+                        <w:t xml:space="preserve">  </w:t>
+                      </w:r>
+                      <w:proofErr w:type="gramStart"/>
+                      <w:r>
+                        <w:t xml:space="preserve">  }</w:t>
+                      </w:r>
+                      <w:proofErr w:type="gramEnd"/>
                       <w:r>
                         <w:br/>
                         <w:t>}</w:t>
@@ -3206,8 +4103,17 @@
           <w:rFonts w:ascii="C64 Pro Mono" w:hAnsi="C64 Pro Mono" w:cstheme="majorBidi"/>
           <w:color w:val="FFFFFF" w:themeColor="background1"/>
         </w:rPr>
-        <w:t>Introducing player</w:t>
-      </w:r>
+        <w:t xml:space="preserve">Introducing </w:t>
+      </w:r>
+      <w:proofErr w:type="gramStart"/>
+      <w:r>
+        <w:rPr>
+          <w:rFonts w:ascii="C64 Pro Mono" w:hAnsi="C64 Pro Mono" w:cstheme="majorBidi"/>
+          <w:color w:val="FFFFFF" w:themeColor="background1"/>
+        </w:rPr>
+        <w:t>player</w:t>
+      </w:r>
+      <w:proofErr w:type="gramEnd"/>
     </w:p>
     <w:p>
       <w:pPr>
@@ -3231,8 +4137,17 @@
           <w:rFonts w:ascii="C64 Pro Mono" w:hAnsi="C64 Pro Mono" w:cstheme="majorBidi"/>
           <w:color w:val="FFFFFF" w:themeColor="background1"/>
         </w:rPr>
-        <w:t>Animated player sprite</w:t>
-      </w:r>
+        <w:t xml:space="preserve">Animated player </w:t>
+      </w:r>
+      <w:proofErr w:type="gramStart"/>
+      <w:r>
+        <w:rPr>
+          <w:rFonts w:ascii="C64 Pro Mono" w:hAnsi="C64 Pro Mono" w:cstheme="majorBidi"/>
+          <w:color w:val="FFFFFF" w:themeColor="background1"/>
+        </w:rPr>
+        <w:t>sprite</w:t>
+      </w:r>
+      <w:proofErr w:type="gramEnd"/>
     </w:p>
     <w:p>
       <w:pPr>
@@ -3317,49 +4232,915 @@
           <w:color w:val="FFFFFF" w:themeColor="background1"/>
         </w:rPr>
       </w:pPr>
-      <w:r>
+    </w:p>
+    <w:p>
+      <w:pPr>
+        <w:jc w:val="both"/>
         <w:rPr>
           <w:rFonts w:ascii="C64 Pro Mono" w:hAnsi="C64 Pro Mono" w:cstheme="majorBidi"/>
+          <w:color w:val="FFFFFF" w:themeColor="background1"/>
+        </w:rPr>
+      </w:pPr>
+    </w:p>
+    <w:p>
+      <w:pPr>
+        <w:jc w:val="both"/>
+        <w:rPr>
+          <w:rFonts w:ascii="C64 Pro Mono" w:hAnsi="C64 Pro Mono" w:cstheme="majorBidi"/>
+          <w:color w:val="FFFFFF" w:themeColor="background1"/>
+        </w:rPr>
+      </w:pPr>
+    </w:p>
+    <w:p>
+      <w:pPr>
+        <w:jc w:val="both"/>
+        <w:rPr>
+          <w:rFonts w:ascii="C64 Pro Mono" w:hAnsi="C64 Pro Mono" w:cstheme="majorBidi"/>
+          <w:color w:val="FFFFFF" w:themeColor="background1"/>
+        </w:rPr>
+      </w:pPr>
+    </w:p>
+    <w:p>
+      <w:pPr>
+        <w:jc w:val="both"/>
+        <w:rPr>
+          <w:rFonts w:ascii="C64 Pro Mono" w:hAnsi="C64 Pro Mono" w:cstheme="majorBidi"/>
+          <w:color w:val="FFFFFF" w:themeColor="background1"/>
+        </w:rPr>
+      </w:pPr>
+      <w:r>
+        <w:rPr>
+          <w:rFonts w:asciiTheme="majorBidi" w:hAnsiTheme="majorBidi" w:cstheme="majorBidi"/>
           <w:noProof/>
           <w:color w:val="FFFFFF" w:themeColor="background1"/>
+          <w:sz w:val="16"/>
+          <w:szCs w:val="16"/>
         </w:rPr>
         <w:lastRenderedPageBreak/>
-        <w:drawing>
-          <wp:inline distT="0" distB="0" distL="0" distR="0" wp14:anchorId="3919E782" wp14:editId="628041A2">
-            <wp:extent cx="5731510" cy="3186430"/>
-            <wp:effectExtent l="0" t="0" r="2540" b="0"/>
-            <wp:docPr id="1160405660" name="Picture 1" descr="A screen shot of a computer code&#10;&#10;AI-generated content may be incorrect."/>
-            <wp:cNvGraphicFramePr>
-              <a:graphicFrameLocks xmlns:a="http://schemas.openxmlformats.org/drawingml/2006/main" noChangeAspect="1"/>
-            </wp:cNvGraphicFramePr>
-            <a:graphic xmlns:a="http://schemas.openxmlformats.org/drawingml/2006/main">
-              <a:graphicData uri="http://schemas.openxmlformats.org/drawingml/2006/picture">
-                <pic:pic xmlns:pic="http://schemas.openxmlformats.org/drawingml/2006/picture">
-                  <pic:nvPicPr>
-                    <pic:cNvPr id="1160405660" name="Picture 1" descr="A screen shot of a computer code&#10;&#10;AI-generated content may be incorrect."/>
-                    <pic:cNvPicPr/>
-                  </pic:nvPicPr>
-                  <pic:blipFill>
-                    <a:blip r:embed="rId13"/>
-                    <a:stretch>
-                      <a:fillRect/>
-                    </a:stretch>
-                  </pic:blipFill>
-                  <pic:spPr>
-                    <a:xfrm>
-                      <a:off x="0" y="0"/>
-                      <a:ext cx="5731510" cy="3186430"/>
-                    </a:xfrm>
-                    <a:prstGeom prst="rect">
-                      <a:avLst/>
-                    </a:prstGeom>
-                  </pic:spPr>
-                </pic:pic>
-              </a:graphicData>
-            </a:graphic>
-          </wp:inline>
-        </w:drawing>
-      </w:r>
+        <mc:AlternateContent>
+          <mc:Choice Requires="wps">
+            <w:drawing>
+              <wp:anchor distT="45720" distB="45720" distL="114300" distR="114300" simplePos="0" relativeHeight="251679744" behindDoc="0" locked="0" layoutInCell="1" allowOverlap="1" wp14:anchorId="13E9017F" wp14:editId="300FF8A1">
+                <wp:simplePos x="0" y="0"/>
+                <wp:positionH relativeFrom="margin">
+                  <wp:posOffset>-125730</wp:posOffset>
+                </wp:positionH>
+                <wp:positionV relativeFrom="paragraph">
+                  <wp:posOffset>0</wp:posOffset>
+                </wp:positionV>
+                <wp:extent cx="6182360" cy="2068830"/>
+                <wp:effectExtent l="0" t="0" r="27940" b="26670"/>
+                <wp:wrapSquare wrapText="bothSides"/>
+                <wp:docPr id="44980754" name="Text Box 2"/>
+                <wp:cNvGraphicFramePr>
+                  <a:graphicFrameLocks xmlns:a="http://schemas.openxmlformats.org/drawingml/2006/main"/>
+                </wp:cNvGraphicFramePr>
+                <a:graphic xmlns:a="http://schemas.openxmlformats.org/drawingml/2006/main">
+                  <a:graphicData uri="http://schemas.microsoft.com/office/word/2010/wordprocessingShape">
+                    <wps:wsp>
+                      <wps:cNvSpPr txBox="1">
+                        <a:spLocks noChangeArrowheads="1"/>
+                      </wps:cNvSpPr>
+                      <wps:spPr bwMode="auto">
+                        <a:xfrm>
+                          <a:off x="0" y="0"/>
+                          <a:ext cx="6182360" cy="2068830"/>
+                        </a:xfrm>
+                        <a:prstGeom prst="rect">
+                          <a:avLst/>
+                        </a:prstGeom>
+                        <a:solidFill>
+                          <a:srgbClr val="FFFFFF"/>
+                        </a:solidFill>
+                        <a:ln w="9525">
+                          <a:solidFill>
+                            <a:srgbClr val="000000"/>
+                          </a:solidFill>
+                          <a:miter lim="800000"/>
+                          <a:headEnd/>
+                          <a:tailEnd/>
+                        </a:ln>
+                      </wps:spPr>
+                      <wps:txbx>
+                        <w:txbxContent>
+                          <w:p>
+                            <w:r>
+                              <w:t>let player = null;</w:t>
+                            </w:r>
+                            <w:r>
+                              <w:br/>
+                            </w:r>
+                            <w:r>
+                              <w:br/>
+                              <w:t xml:space="preserve">function </w:t>
+                            </w:r>
+                            <w:proofErr w:type="gramStart"/>
+                            <w:r>
+                              <w:t>preload(</w:t>
+                            </w:r>
+                            <w:proofErr w:type="gramEnd"/>
+                            <w:r>
+                              <w:t>) {</w:t>
+                            </w:r>
+                            <w:r>
+                              <w:br/>
+                              <w:t xml:space="preserve">    </w:t>
+                            </w:r>
+                            <w:proofErr w:type="spellStart"/>
+                            <w:proofErr w:type="gramStart"/>
+                            <w:r>
+                              <w:t>this.load</w:t>
+                            </w:r>
+                            <w:proofErr w:type="gramEnd"/>
+                            <w:r>
+                              <w:t>.</w:t>
+                            </w:r>
+                            <w:proofErr w:type="gramStart"/>
+                            <w:r>
+                              <w:t>image</w:t>
+                            </w:r>
+                            <w:proofErr w:type="spellEnd"/>
+                            <w:r>
+                              <w:t>(</w:t>
+                            </w:r>
+                            <w:proofErr w:type="gramEnd"/>
+                            <w:r>
+                              <w:t>'balloon', 'balloon.png'</w:t>
+                            </w:r>
+                            <w:proofErr w:type="gramStart"/>
+                            <w:r>
+                              <w:t>);</w:t>
+                            </w:r>
+                            <w:proofErr w:type="gramEnd"/>
+                          </w:p>
+                          <w:p>
+                            <w:r>
+                              <w:br/>
+                              <w:t xml:space="preserve">    </w:t>
+                            </w:r>
+                            <w:proofErr w:type="spellStart"/>
+                            <w:proofErr w:type="gramStart"/>
+                            <w:r>
+                              <w:t>this.load</w:t>
+                            </w:r>
+                            <w:proofErr w:type="gramEnd"/>
+                            <w:r>
+                              <w:t>.</w:t>
+                            </w:r>
+                            <w:proofErr w:type="gramStart"/>
+                            <w:r>
+                              <w:t>spritesheet</w:t>
+                            </w:r>
+                            <w:proofErr w:type="spellEnd"/>
+                            <w:r>
+                              <w:t>(</w:t>
+                            </w:r>
+                            <w:proofErr w:type="gramEnd"/>
+                            <w:r>
+                              <w:t>'</w:t>
+                            </w:r>
+                            <w:proofErr w:type="spellStart"/>
+                            <w:r>
+                              <w:t>digdug</w:t>
+                            </w:r>
+                            <w:proofErr w:type="spellEnd"/>
+                            <w:r>
+                              <w:t>', 'empty-project/dig-dug.png', {</w:t>
+                            </w:r>
+                            <w:r>
+                              <w:br/>
+                              <w:t xml:space="preserve">        </w:t>
+                            </w:r>
+                            <w:proofErr w:type="spellStart"/>
+                            <w:r>
+                              <w:t>frameWidth</w:t>
+                            </w:r>
+                            <w:proofErr w:type="spellEnd"/>
+                            <w:r>
+                              <w:t>: 75,</w:t>
+                            </w:r>
+                            <w:r>
+                              <w:br/>
+                              <w:t xml:space="preserve">        </w:t>
+                            </w:r>
+                            <w:proofErr w:type="spellStart"/>
+                            <w:r>
+                              <w:t>frameHeight</w:t>
+                            </w:r>
+                            <w:proofErr w:type="spellEnd"/>
+                            <w:r>
+                              <w:t>: 75</w:t>
+                            </w:r>
+                            <w:r>
+                              <w:br/>
+                              <w:t xml:space="preserve">    });</w:t>
+                            </w:r>
+                            <w:r>
+                              <w:br/>
+                              <w:t>}</w:t>
+                            </w:r>
+                          </w:p>
+                        </w:txbxContent>
+                      </wps:txbx>
+                      <wps:bodyPr rot="0" vert="horz" wrap="square" lIns="91440" tIns="45720" rIns="91440" bIns="45720" anchor="t" anchorCtr="0">
+                        <a:noAutofit/>
+                      </wps:bodyPr>
+                    </wps:wsp>
+                  </a:graphicData>
+                </a:graphic>
+                <wp14:sizeRelH relativeFrom="margin">
+                  <wp14:pctWidth>0</wp14:pctWidth>
+                </wp14:sizeRelH>
+                <wp14:sizeRelV relativeFrom="margin">
+                  <wp14:pctHeight>0</wp14:pctHeight>
+                </wp14:sizeRelV>
+              </wp:anchor>
+            </w:drawing>
+          </mc:Choice>
+          <mc:Fallback>
+            <w:pict>
+              <v:shape w14:anchorId="13E9017F" id="_x0000_s1036" type="#_x0000_t202" style="position:absolute;left:0;text-align:left;margin-left:-9.9pt;margin-top:0;width:486.8pt;height:162.9pt;z-index:251679744;visibility:visible;mso-wrap-style:square;mso-width-percent:0;mso-height-percent:0;mso-wrap-distance-left:9pt;mso-wrap-distance-top:3.6pt;mso-wrap-distance-right:9pt;mso-wrap-distance-bottom:3.6pt;mso-position-horizontal:absolute;mso-position-horizontal-relative:margin;mso-position-vertical:absolute;mso-position-vertical-relative:text;mso-width-percent:0;mso-height-percent:0;mso-width-relative:margin;mso-height-relative:margin;v-text-anchor:top" o:gfxdata="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">
+                <v:textbox>
+                  <w:txbxContent>
+                    <w:p>
+                      <w:r>
+                        <w:t>let player = null;</w:t>
+                      </w:r>
+                      <w:r>
+                        <w:br/>
+                      </w:r>
+                      <w:r>
+                        <w:br/>
+                        <w:t xml:space="preserve">function </w:t>
+                      </w:r>
+                      <w:proofErr w:type="gramStart"/>
+                      <w:r>
+                        <w:t>preload(</w:t>
+                      </w:r>
+                      <w:proofErr w:type="gramEnd"/>
+                      <w:r>
+                        <w:t>) {</w:t>
+                      </w:r>
+                      <w:r>
+                        <w:br/>
+                        <w:t xml:space="preserve">    </w:t>
+                      </w:r>
+                      <w:proofErr w:type="spellStart"/>
+                      <w:proofErr w:type="gramStart"/>
+                      <w:r>
+                        <w:t>this.load</w:t>
+                      </w:r>
+                      <w:proofErr w:type="gramEnd"/>
+                      <w:r>
+                        <w:t>.</w:t>
+                      </w:r>
+                      <w:proofErr w:type="gramStart"/>
+                      <w:r>
+                        <w:t>image</w:t>
+                      </w:r>
+                      <w:proofErr w:type="spellEnd"/>
+                      <w:r>
+                        <w:t>(</w:t>
+                      </w:r>
+                      <w:proofErr w:type="gramEnd"/>
+                      <w:r>
+                        <w:t>'balloon', 'balloon.png'</w:t>
+                      </w:r>
+                      <w:proofErr w:type="gramStart"/>
+                      <w:r>
+                        <w:t>);</w:t>
+                      </w:r>
+                      <w:proofErr w:type="gramEnd"/>
+                    </w:p>
+                    <w:p>
+                      <w:r>
+                        <w:br/>
+                        <w:t xml:space="preserve">    </w:t>
+                      </w:r>
+                      <w:proofErr w:type="spellStart"/>
+                      <w:proofErr w:type="gramStart"/>
+                      <w:r>
+                        <w:t>this.load</w:t>
+                      </w:r>
+                      <w:proofErr w:type="gramEnd"/>
+                      <w:r>
+                        <w:t>.</w:t>
+                      </w:r>
+                      <w:proofErr w:type="gramStart"/>
+                      <w:r>
+                        <w:t>spritesheet</w:t>
+                      </w:r>
+                      <w:proofErr w:type="spellEnd"/>
+                      <w:r>
+                        <w:t>(</w:t>
+                      </w:r>
+                      <w:proofErr w:type="gramEnd"/>
+                      <w:r>
+                        <w:t>'</w:t>
+                      </w:r>
+                      <w:proofErr w:type="spellStart"/>
+                      <w:r>
+                        <w:t>digdug</w:t>
+                      </w:r>
+                      <w:proofErr w:type="spellEnd"/>
+                      <w:r>
+                        <w:t>', 'empty-project/dig-dug.png', {</w:t>
+                      </w:r>
+                      <w:r>
+                        <w:br/>
+                        <w:t xml:space="preserve">        </w:t>
+                      </w:r>
+                      <w:proofErr w:type="spellStart"/>
+                      <w:r>
+                        <w:t>frameWidth</w:t>
+                      </w:r>
+                      <w:proofErr w:type="spellEnd"/>
+                      <w:r>
+                        <w:t>: 75,</w:t>
+                      </w:r>
+                      <w:r>
+                        <w:br/>
+                        <w:t xml:space="preserve">        </w:t>
+                      </w:r>
+                      <w:proofErr w:type="spellStart"/>
+                      <w:r>
+                        <w:t>frameHeight</w:t>
+                      </w:r>
+                      <w:proofErr w:type="spellEnd"/>
+                      <w:r>
+                        <w:t>: 75</w:t>
+                      </w:r>
+                      <w:r>
+                        <w:br/>
+                        <w:t xml:space="preserve">    });</w:t>
+                      </w:r>
+                      <w:r>
+                        <w:br/>
+                        <w:t>}</w:t>
+                      </w:r>
+                    </w:p>
+                  </w:txbxContent>
+                </v:textbox>
+                <w10:wrap type="square" anchorx="margin"/>
+              </v:shape>
+            </w:pict>
+          </mc:Fallback>
+        </mc:AlternateContent>
+      </w:r>
+    </w:p>
+    <w:p>
+      <w:pPr>
+        <w:jc w:val="both"/>
+        <w:rPr>
+          <w:rFonts w:ascii="C64 Pro Mono" w:hAnsi="C64 Pro Mono" w:cstheme="majorBidi"/>
+          <w:color w:val="FFFFFF" w:themeColor="background1"/>
+        </w:rPr>
+      </w:pPr>
+    </w:p>
+    <w:p>
+      <w:pPr>
+        <w:jc w:val="both"/>
+        <w:rPr>
+          <w:rFonts w:ascii="C64 Pro Mono" w:hAnsi="C64 Pro Mono" w:cstheme="majorBidi"/>
+          <w:color w:val="FFFFFF" w:themeColor="background1"/>
+        </w:rPr>
+      </w:pPr>
+    </w:p>
+    <w:p>
+      <w:pPr>
+        <w:jc w:val="both"/>
+        <w:rPr>
+          <w:rFonts w:ascii="C64 Pro Mono" w:hAnsi="C64 Pro Mono" w:cstheme="majorBidi"/>
+          <w:color w:val="FFFFFF" w:themeColor="background1"/>
+        </w:rPr>
+      </w:pPr>
+      <w:r>
+        <w:rPr>
+          <w:rFonts w:ascii="C64 Pro Mono" w:hAnsi="C64 Pro Mono" w:cstheme="majorBidi"/>
+          <w:color w:val="FFFFFF" w:themeColor="background1"/>
+        </w:rPr>
+        <w:br w:type="page"/>
+      </w:r>
+      <w:r>
+        <w:rPr>
+          <w:rFonts w:asciiTheme="majorBidi" w:hAnsiTheme="majorBidi" w:cstheme="majorBidi"/>
+          <w:noProof/>
+          <w:color w:val="FFFFFF" w:themeColor="background1"/>
+          <w:sz w:val="16"/>
+          <w:szCs w:val="16"/>
+        </w:rPr>
+        <w:lastRenderedPageBreak/>
+        <mc:AlternateContent>
+          <mc:Choice Requires="wps">
+            <w:drawing>
+              <wp:anchor distT="45720" distB="45720" distL="114300" distR="114300" simplePos="0" relativeHeight="251681792" behindDoc="0" locked="0" layoutInCell="1" allowOverlap="1" wp14:anchorId="66EE4AA1" wp14:editId="2E723CA2">
+                <wp:simplePos x="0" y="0"/>
+                <wp:positionH relativeFrom="margin">
+                  <wp:align>right</wp:align>
+                </wp:positionH>
+                <wp:positionV relativeFrom="paragraph">
+                  <wp:posOffset>346075</wp:posOffset>
+                </wp:positionV>
+                <wp:extent cx="6005830" cy="2781300"/>
+                <wp:effectExtent l="0" t="0" r="13970" b="19050"/>
+                <wp:wrapSquare wrapText="bothSides"/>
+                <wp:docPr id="338634624" name="Text Box 2"/>
+                <wp:cNvGraphicFramePr>
+                  <a:graphicFrameLocks xmlns:a="http://schemas.openxmlformats.org/drawingml/2006/main"/>
+                </wp:cNvGraphicFramePr>
+                <a:graphic xmlns:a="http://schemas.openxmlformats.org/drawingml/2006/main">
+                  <a:graphicData uri="http://schemas.microsoft.com/office/word/2010/wordprocessingShape">
+                    <wps:wsp>
+                      <wps:cNvSpPr txBox="1">
+                        <a:spLocks noChangeArrowheads="1"/>
+                      </wps:cNvSpPr>
+                      <wps:spPr bwMode="auto">
+                        <a:xfrm>
+                          <a:off x="0" y="0"/>
+                          <a:ext cx="6005830" cy="2781300"/>
+                        </a:xfrm>
+                        <a:prstGeom prst="rect">
+                          <a:avLst/>
+                        </a:prstGeom>
+                        <a:solidFill>
+                          <a:srgbClr val="FFFFFF"/>
+                        </a:solidFill>
+                        <a:ln w="9525">
+                          <a:solidFill>
+                            <a:srgbClr val="000000"/>
+                          </a:solidFill>
+                          <a:miter lim="800000"/>
+                          <a:headEnd/>
+                          <a:tailEnd/>
+                        </a:ln>
+                      </wps:spPr>
+                      <wps:txbx>
+                        <w:txbxContent>
+                          <w:p>
+                            <w:r>
+                              <w:t xml:space="preserve">function </w:t>
+                            </w:r>
+                            <w:proofErr w:type="gramStart"/>
+                            <w:r>
+                              <w:t>create</w:t>
+                            </w:r>
+                            <w:r>
+                              <w:t>(</w:t>
+                            </w:r>
+                            <w:proofErr w:type="gramEnd"/>
+                            <w:r>
+                              <w:t>) {</w:t>
+                            </w:r>
+                          </w:p>
+                          <w:p>
+                            <w:r>
+                              <w:t>//……….</w:t>
+                            </w:r>
+                            <w:r>
+                              <w:br/>
+                              <w:t xml:space="preserve"> </w:t>
+                            </w:r>
+                          </w:p>
+                          <w:p>
+                            <w:r>
+                              <w:t xml:space="preserve">   </w:t>
+                            </w:r>
+                            <w:r>
+                              <w:t xml:space="preserve"> </w:t>
+                            </w:r>
+                            <w:r>
+                              <w:t xml:space="preserve">player = </w:t>
+                            </w:r>
+                            <w:proofErr w:type="spellStart"/>
+                            <w:proofErr w:type="gramStart"/>
+                            <w:r>
+                              <w:t>this.add.sprite</w:t>
+                            </w:r>
+                            <w:proofErr w:type="spellEnd"/>
+                            <w:proofErr w:type="gramEnd"/>
+                            <w:r>
+                              <w:t>(400, 300, '</w:t>
+                            </w:r>
+                            <w:proofErr w:type="spellStart"/>
+                            <w:r>
+                              <w:t>digdug</w:t>
+                            </w:r>
+                            <w:proofErr w:type="spellEnd"/>
+                            <w:r>
+                              <w:t>');</w:t>
+                            </w:r>
+                            <w:r>
+                              <w:br/>
+                            </w:r>
+                            <w:r>
+                              <w:t xml:space="preserve">    </w:t>
+                            </w:r>
+                            <w:proofErr w:type="spellStart"/>
+                            <w:proofErr w:type="gramStart"/>
+                            <w:r>
+                              <w:t>this.anims</w:t>
+                            </w:r>
+                            <w:proofErr w:type="gramEnd"/>
+                            <w:r>
+                              <w:t>.</w:t>
+                            </w:r>
+                            <w:proofErr w:type="gramStart"/>
+                            <w:r>
+                              <w:t>create</w:t>
+                            </w:r>
+                            <w:proofErr w:type="spellEnd"/>
+                            <w:r>
+                              <w:t>(</w:t>
+                            </w:r>
+                            <w:proofErr w:type="gramEnd"/>
+                            <w:r>
+                              <w:t>{</w:t>
+                            </w:r>
+                            <w:r>
+                              <w:br/>
+                              <w:t xml:space="preserve">    </w:t>
+                            </w:r>
+                            <w:r>
+                              <w:t xml:space="preserve">    </w:t>
+                            </w:r>
+                            <w:r>
+                              <w:t>key: 'walk',</w:t>
+                            </w:r>
+                            <w:r>
+                              <w:br/>
+                              <w:t xml:space="preserve">   </w:t>
+                            </w:r>
+                            <w:r>
+                              <w:t xml:space="preserve">    </w:t>
+                            </w:r>
+                            <w:r>
+                              <w:t xml:space="preserve"> frames: </w:t>
+                            </w:r>
+                            <w:proofErr w:type="spellStart"/>
+                            <w:proofErr w:type="gramStart"/>
+                            <w:r>
+                              <w:t>this.anims</w:t>
+                            </w:r>
+                            <w:proofErr w:type="gramEnd"/>
+                            <w:r>
+                              <w:t>.</w:t>
+                            </w:r>
+                            <w:proofErr w:type="gramStart"/>
+                            <w:r>
+                              <w:t>generateFrameNumbers</w:t>
+                            </w:r>
+                            <w:proofErr w:type="spellEnd"/>
+                            <w:r>
+                              <w:t>(</w:t>
+                            </w:r>
+                            <w:proofErr w:type="gramEnd"/>
+                            <w:r>
+                              <w:t>'</w:t>
+                            </w:r>
+                            <w:proofErr w:type="spellStart"/>
+                            <w:r>
+                              <w:t>digdug</w:t>
+                            </w:r>
+                            <w:proofErr w:type="spellEnd"/>
+                            <w:r>
+                              <w:t xml:space="preserve">', </w:t>
+                            </w:r>
+                            <w:proofErr w:type="gramStart"/>
+                            <w:r>
+                              <w:t>{ start</w:t>
+                            </w:r>
+                            <w:proofErr w:type="gramEnd"/>
+                            <w:r>
+                              <w:t>: 0, end: 3 }),</w:t>
+                            </w:r>
+                            <w:r>
+                              <w:br/>
+                              <w:t xml:space="preserve">    </w:t>
+                            </w:r>
+                            <w:r>
+                              <w:t xml:space="preserve">    </w:t>
+                            </w:r>
+                            <w:proofErr w:type="spellStart"/>
+                            <w:r>
+                              <w:t>frameRate</w:t>
+                            </w:r>
+                            <w:proofErr w:type="spellEnd"/>
+                            <w:r>
+                              <w:t>: 5,</w:t>
+                            </w:r>
+                            <w:r>
+                              <w:br/>
+                              <w:t xml:space="preserve">   </w:t>
+                            </w:r>
+                            <w:r>
+                              <w:t xml:space="preserve">   </w:t>
+                            </w:r>
+                            <w:r>
+                              <w:t xml:space="preserve"> repeat: -1</w:t>
+                            </w:r>
+                            <w:r>
+                              <w:br/>
+                            </w:r>
+                            <w:r>
+                              <w:t xml:space="preserve">    </w:t>
+                            </w:r>
+                            <w:r>
+                              <w:t>});</w:t>
+                            </w:r>
+                            <w:r>
+                              <w:br/>
+                            </w:r>
+                            <w:r>
+                              <w:br/>
+                            </w:r>
+                            <w:proofErr w:type="spellStart"/>
+                            <w:proofErr w:type="gramStart"/>
+                            <w:r>
+                              <w:t>player.play</w:t>
+                            </w:r>
+                            <w:proofErr w:type="spellEnd"/>
+                            <w:proofErr w:type="gramEnd"/>
+                            <w:r>
+                              <w:t>('walk');</w:t>
+                            </w:r>
+                            <w:r>
+                              <w:br/>
+                              <w:t>}</w:t>
+                            </w:r>
+                          </w:p>
+                        </w:txbxContent>
+                      </wps:txbx>
+                      <wps:bodyPr rot="0" vert="horz" wrap="square" lIns="91440" tIns="45720" rIns="91440" bIns="45720" anchor="t" anchorCtr="0">
+                        <a:noAutofit/>
+                      </wps:bodyPr>
+                    </wps:wsp>
+                  </a:graphicData>
+                </a:graphic>
+                <wp14:sizeRelH relativeFrom="margin">
+                  <wp14:pctWidth>0</wp14:pctWidth>
+                </wp14:sizeRelH>
+                <wp14:sizeRelV relativeFrom="margin">
+                  <wp14:pctHeight>0</wp14:pctHeight>
+                </wp14:sizeRelV>
+              </wp:anchor>
+            </w:drawing>
+          </mc:Choice>
+          <mc:Fallback>
+            <w:pict>
+              <v:shape w14:anchorId="66EE4AA1" id="_x0000_s1037" type="#_x0000_t202" style="position:absolute;left:0;text-align:left;margin-left:421.7pt;margin-top:27.25pt;width:472.9pt;height:219pt;z-index:251681792;visibility:visible;mso-wrap-style:square;mso-width-percent:0;mso-height-percent:0;mso-wrap-distance-left:9pt;mso-wrap-distance-top:3.6pt;mso-wrap-distance-right:9pt;mso-wrap-distance-bottom:3.6pt;mso-position-horizontal:right;mso-position-horizontal-relative:margin;mso-position-vertical:absolute;mso-position-vertical-relative:text;mso-width-percent:0;mso-height-percent:0;mso-width-relative:margin;mso-height-relative:margin;v-text-anchor:top" o:gfxdata="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">
+                <v:textbox>
+                  <w:txbxContent>
+                    <w:p>
+                      <w:r>
+                        <w:t xml:space="preserve">function </w:t>
+                      </w:r>
+                      <w:proofErr w:type="gramStart"/>
+                      <w:r>
+                        <w:t>create</w:t>
+                      </w:r>
+                      <w:r>
+                        <w:t>(</w:t>
+                      </w:r>
+                      <w:proofErr w:type="gramEnd"/>
+                      <w:r>
+                        <w:t>) {</w:t>
+                      </w:r>
+                    </w:p>
+                    <w:p>
+                      <w:r>
+                        <w:t>//……….</w:t>
+                      </w:r>
+                      <w:r>
+                        <w:br/>
+                        <w:t xml:space="preserve"> </w:t>
+                      </w:r>
+                    </w:p>
+                    <w:p>
+                      <w:r>
+                        <w:t xml:space="preserve">   </w:t>
+                      </w:r>
+                      <w:r>
+                        <w:t xml:space="preserve"> </w:t>
+                      </w:r>
+                      <w:r>
+                        <w:t xml:space="preserve">player = </w:t>
+                      </w:r>
+                      <w:proofErr w:type="spellStart"/>
+                      <w:proofErr w:type="gramStart"/>
+                      <w:r>
+                        <w:t>this.add.sprite</w:t>
+                      </w:r>
+                      <w:proofErr w:type="spellEnd"/>
+                      <w:proofErr w:type="gramEnd"/>
+                      <w:r>
+                        <w:t>(400, 300, '</w:t>
+                      </w:r>
+                      <w:proofErr w:type="spellStart"/>
+                      <w:r>
+                        <w:t>digdug</w:t>
+                      </w:r>
+                      <w:proofErr w:type="spellEnd"/>
+                      <w:r>
+                        <w:t>');</w:t>
+                      </w:r>
+                      <w:r>
+                        <w:br/>
+                      </w:r>
+                      <w:r>
+                        <w:t xml:space="preserve">    </w:t>
+                      </w:r>
+                      <w:proofErr w:type="spellStart"/>
+                      <w:proofErr w:type="gramStart"/>
+                      <w:r>
+                        <w:t>this.anims</w:t>
+                      </w:r>
+                      <w:proofErr w:type="gramEnd"/>
+                      <w:r>
+                        <w:t>.</w:t>
+                      </w:r>
+                      <w:proofErr w:type="gramStart"/>
+                      <w:r>
+                        <w:t>create</w:t>
+                      </w:r>
+                      <w:proofErr w:type="spellEnd"/>
+                      <w:r>
+                        <w:t>(</w:t>
+                      </w:r>
+                      <w:proofErr w:type="gramEnd"/>
+                      <w:r>
+                        <w:t>{</w:t>
+                      </w:r>
+                      <w:r>
+                        <w:br/>
+                        <w:t xml:space="preserve">    </w:t>
+                      </w:r>
+                      <w:r>
+                        <w:t xml:space="preserve">    </w:t>
+                      </w:r>
+                      <w:r>
+                        <w:t>key: 'walk',</w:t>
+                      </w:r>
+                      <w:r>
+                        <w:br/>
+                        <w:t xml:space="preserve">   </w:t>
+                      </w:r>
+                      <w:r>
+                        <w:t xml:space="preserve">    </w:t>
+                      </w:r>
+                      <w:r>
+                        <w:t xml:space="preserve"> frames: </w:t>
+                      </w:r>
+                      <w:proofErr w:type="spellStart"/>
+                      <w:proofErr w:type="gramStart"/>
+                      <w:r>
+                        <w:t>this.anims</w:t>
+                      </w:r>
+                      <w:proofErr w:type="gramEnd"/>
+                      <w:r>
+                        <w:t>.</w:t>
+                      </w:r>
+                      <w:proofErr w:type="gramStart"/>
+                      <w:r>
+                        <w:t>generateFrameNumbers</w:t>
+                      </w:r>
+                      <w:proofErr w:type="spellEnd"/>
+                      <w:r>
+                        <w:t>(</w:t>
+                      </w:r>
+                      <w:proofErr w:type="gramEnd"/>
+                      <w:r>
+                        <w:t>'</w:t>
+                      </w:r>
+                      <w:proofErr w:type="spellStart"/>
+                      <w:r>
+                        <w:t>digdug</w:t>
+                      </w:r>
+                      <w:proofErr w:type="spellEnd"/>
+                      <w:r>
+                        <w:t xml:space="preserve">', </w:t>
+                      </w:r>
+                      <w:proofErr w:type="gramStart"/>
+                      <w:r>
+                        <w:t>{ start</w:t>
+                      </w:r>
+                      <w:proofErr w:type="gramEnd"/>
+                      <w:r>
+                        <w:t>: 0, end: 3 }),</w:t>
+                      </w:r>
+                      <w:r>
+                        <w:br/>
+                        <w:t xml:space="preserve">    </w:t>
+                      </w:r>
+                      <w:r>
+                        <w:t xml:space="preserve">    </w:t>
+                      </w:r>
+                      <w:proofErr w:type="spellStart"/>
+                      <w:r>
+                        <w:t>frameRate</w:t>
+                      </w:r>
+                      <w:proofErr w:type="spellEnd"/>
+                      <w:r>
+                        <w:t>: 5,</w:t>
+                      </w:r>
+                      <w:r>
+                        <w:br/>
+                        <w:t xml:space="preserve">   </w:t>
+                      </w:r>
+                      <w:r>
+                        <w:t xml:space="preserve">   </w:t>
+                      </w:r>
+                      <w:r>
+                        <w:t xml:space="preserve"> repeat: -1</w:t>
+                      </w:r>
+                      <w:r>
+                        <w:br/>
+                      </w:r>
+                      <w:r>
+                        <w:t xml:space="preserve">    </w:t>
+                      </w:r>
+                      <w:r>
+                        <w:t>});</w:t>
+                      </w:r>
+                      <w:r>
+                        <w:br/>
+                      </w:r>
+                      <w:r>
+                        <w:br/>
+                      </w:r>
+                      <w:proofErr w:type="spellStart"/>
+                      <w:proofErr w:type="gramStart"/>
+                      <w:r>
+                        <w:t>player.play</w:t>
+                      </w:r>
+                      <w:proofErr w:type="spellEnd"/>
+                      <w:proofErr w:type="gramEnd"/>
+                      <w:r>
+                        <w:t>('walk');</w:t>
+                      </w:r>
+                      <w:r>
+                        <w:br/>
+                        <w:t>}</w:t>
+                      </w:r>
+                    </w:p>
+                  </w:txbxContent>
+                </v:textbox>
+                <w10:wrap type="square" anchorx="margin"/>
+              </v:shape>
+            </w:pict>
+          </mc:Fallback>
+        </mc:AlternateContent>
+      </w:r>
+      <w:r>
+        <w:rPr>
+          <w:rFonts w:ascii="C64 Pro Mono" w:hAnsi="C64 Pro Mono" w:cstheme="majorBidi"/>
+          <w:color w:val="FFFFFF" w:themeColor="background1"/>
+        </w:rPr>
+        <w:t>Animating player</w:t>
+      </w:r>
+    </w:p>
+    <w:p>
+      <w:pPr>
+        <w:jc w:val="both"/>
+        <w:rPr>
+          <w:rFonts w:ascii="C64 Pro Mono" w:hAnsi="C64 Pro Mono" w:cstheme="majorBidi"/>
+          <w:color w:val="FFFFFF" w:themeColor="background1"/>
+        </w:rPr>
+      </w:pPr>
+    </w:p>
+    <w:p>
+      <w:pPr>
+        <w:jc w:val="both"/>
+        <w:rPr>
+          <w:rFonts w:ascii="C64 Pro Mono" w:hAnsi="C64 Pro Mono" w:cstheme="majorBidi"/>
+          <w:color w:val="FFFFFF" w:themeColor="background1"/>
+        </w:rPr>
+      </w:pPr>
+      <w:r>
+        <w:rPr>
+          <w:rFonts w:ascii="C64 Pro Mono" w:hAnsi="C64 Pro Mono" w:cstheme="majorBidi"/>
+          <w:color w:val="FFFFFF" w:themeColor="background1"/>
+        </w:rPr>
+        <w:lastRenderedPageBreak/>
+        <w:t>Moving player</w:t>
+      </w:r>
+    </w:p>
+    <w:p>
+      <w:pPr>
+        <w:jc w:val="both"/>
+        <w:rPr>
+          <w:rFonts w:ascii="C64 Pro Mono" w:hAnsi="C64 Pro Mono" w:cstheme="majorBidi"/>
+          <w:color w:val="FFFFFF" w:themeColor="background1"/>
+        </w:rPr>
+      </w:pPr>
+    </w:p>
+    <w:p>
+      <w:pPr>
+        <w:jc w:val="both"/>
+        <w:rPr>
+          <w:rFonts w:ascii="C64 Pro Mono" w:hAnsi="C64 Pro Mono" w:cstheme="majorBidi"/>
+          <w:color w:val="FFFFFF" w:themeColor="background1"/>
+        </w:rPr>
+      </w:pPr>
     </w:p>
     <w:sectPr>
       <w:pgSz w:w="11906" w:h="8391" w:orient="landscape" w:code="11"/>

</xml_diff>

<commit_message>
Sprites are cheap 7
</commit_message>
<xml_diff>
--- a/LECTURES/SpritesAreCheap/SPRAJTY SĄ TANIE.docx
+++ b/LECTURES/SpritesAreCheap/SPRAJTY SĄ TANIE.docx
@@ -579,6 +579,23 @@
           <w:color w:val="FFFFFF" w:themeColor="background1"/>
         </w:rPr>
         <w:t>collisions</w:t>
+      </w:r>
+    </w:p>
+    <w:p>
+      <w:pPr>
+        <w:pStyle w:val="ListParagraph"/>
+        <w:ind w:left="1080"/>
+        <w:rPr>
+          <w:rFonts w:ascii="C64 Pro Mono" w:hAnsi="C64 Pro Mono"/>
+          <w:color w:val="FFFFFF" w:themeColor="background1"/>
+        </w:rPr>
+      </w:pPr>
+      <w:r>
+        <w:rPr>
+          <w:rFonts w:ascii="C64 Pro Mono" w:hAnsi="C64 Pro Mono"/>
+          <w:color w:val="FFFFFF" w:themeColor="background1"/>
+        </w:rPr>
+        <w:t>score</w:t>
       </w:r>
     </w:p>
     <w:p>
@@ -1662,13 +1679,8 @@
                             </w:r>
                             <w:proofErr w:type="spellEnd"/>
                             <w:r>
-                              <w:t>(config</w:t>
-                            </w:r>
-                            <w:proofErr w:type="gramStart"/>
-                            <w:r>
-                              <w:t>);</w:t>
-                            </w:r>
-                            <w:proofErr w:type="gramEnd"/>
+                              <w:t>(config);</w:t>
+                            </w:r>
                           </w:p>
                           <w:p>
                             <w:r>
@@ -1708,13 +1720,8 @@
                       </w:r>
                       <w:proofErr w:type="spellEnd"/>
                       <w:r>
-                        <w:t>(config</w:t>
-                      </w:r>
-                      <w:proofErr w:type="gramStart"/>
-                      <w:r>
-                        <w:t>);</w:t>
-                      </w:r>
-                      <w:proofErr w:type="gramEnd"/>
+                        <w:t>(config);</w:t>
+                      </w:r>
                     </w:p>
                     <w:p>
                       <w:r>
@@ -1891,13 +1898,8 @@
                         <w:txbxContent>
                           <w:p>
                             <w:r>
-                              <w:t xml:space="preserve">function </w:t>
-                            </w:r>
-                            <w:proofErr w:type="gramStart"/>
-                            <w:r>
-                              <w:t>preload(){</w:t>
-                            </w:r>
-                            <w:proofErr w:type="gramEnd"/>
+                              <w:t>function preload(){</w:t>
+                            </w:r>
                             <w:r>
                               <w:br/>
                               <w:t>}</w:t>
@@ -1907,32 +1909,19 @@
                             </w:r>
                             <w:r>
                               <w:br/>
-                              <w:t xml:space="preserve">function </w:t>
-                            </w:r>
-                            <w:proofErr w:type="gramStart"/>
-                            <w:r>
-                              <w:t>create(){</w:t>
-                            </w:r>
-                            <w:proofErr w:type="gramEnd"/>
+                              <w:t>function create(){</w:t>
+                            </w:r>
                             <w:r>
                               <w:br/>
                               <w:t xml:space="preserve">    </w:t>
                             </w:r>
                             <w:proofErr w:type="spellStart"/>
                             <w:r>
-                              <w:t>this.add.</w:t>
-                            </w:r>
-                            <w:proofErr w:type="gramStart"/>
-                            <w:r>
-                              <w:t>text</w:t>
+                              <w:t>this.add.text</w:t>
                             </w:r>
                             <w:proofErr w:type="spellEnd"/>
                             <w:r>
-                              <w:t>(</w:t>
-                            </w:r>
-                            <w:proofErr w:type="gramEnd"/>
-                            <w:r>
-                              <w:t xml:space="preserve">20, 20, 'Super </w:t>
+                              <w:t xml:space="preserve">(20, 20, 'Super </w:t>
                             </w:r>
                             <w:proofErr w:type="spellStart"/>
                             <w:r>
@@ -1948,15 +1937,7 @@
                             </w:r>
                             <w:proofErr w:type="spellEnd"/>
                             <w:r>
-                              <w:t xml:space="preserve">!', </w:t>
-                            </w:r>
-                            <w:proofErr w:type="gramStart"/>
-                            <w:r>
-                              <w:t>{ font</w:t>
-                            </w:r>
-                            <w:proofErr w:type="gramEnd"/>
-                            <w:r>
-                              <w:t>: '24px Arial', fill: '#</w:t>
+                              <w:t>!', { font: '24px Arial', fill: '#</w:t>
                             </w:r>
                             <w:proofErr w:type="spellStart"/>
                             <w:r>
@@ -1975,13 +1956,8 @@
                             </w:r>
                             <w:r>
                               <w:br/>
-                              <w:t xml:space="preserve">function </w:t>
-                            </w:r>
-                            <w:proofErr w:type="gramStart"/>
-                            <w:r>
-                              <w:t>update(){</w:t>
-                            </w:r>
-                            <w:proofErr w:type="gramEnd"/>
+                              <w:t>function update(){</w:t>
+                            </w:r>
                             <w:r>
                               <w:br/>
                               <w:t>}</w:t>
@@ -2012,13 +1988,8 @@
                   <w:txbxContent>
                     <w:p>
                       <w:r>
-                        <w:t xml:space="preserve">function </w:t>
-                      </w:r>
-                      <w:proofErr w:type="gramStart"/>
-                      <w:r>
-                        <w:t>preload(){</w:t>
-                      </w:r>
-                      <w:proofErr w:type="gramEnd"/>
+                        <w:t>function preload(){</w:t>
+                      </w:r>
                       <w:r>
                         <w:br/>
                         <w:t>}</w:t>
@@ -2028,32 +1999,19 @@
                       </w:r>
                       <w:r>
                         <w:br/>
-                        <w:t xml:space="preserve">function </w:t>
-                      </w:r>
-                      <w:proofErr w:type="gramStart"/>
-                      <w:r>
-                        <w:t>create(){</w:t>
-                      </w:r>
-                      <w:proofErr w:type="gramEnd"/>
+                        <w:t>function create(){</w:t>
+                      </w:r>
                       <w:r>
                         <w:br/>
                         <w:t xml:space="preserve">    </w:t>
                       </w:r>
                       <w:proofErr w:type="spellStart"/>
                       <w:r>
-                        <w:t>this.add.</w:t>
-                      </w:r>
-                      <w:proofErr w:type="gramStart"/>
-                      <w:r>
-                        <w:t>text</w:t>
+                        <w:t>this.add.text</w:t>
                       </w:r>
                       <w:proofErr w:type="spellEnd"/>
                       <w:r>
-                        <w:t>(</w:t>
-                      </w:r>
-                      <w:proofErr w:type="gramEnd"/>
-                      <w:r>
-                        <w:t xml:space="preserve">20, 20, 'Super </w:t>
+                        <w:t xml:space="preserve">(20, 20, 'Super </w:t>
                       </w:r>
                       <w:proofErr w:type="spellStart"/>
                       <w:r>
@@ -2069,15 +2027,7 @@
                       </w:r>
                       <w:proofErr w:type="spellEnd"/>
                       <w:r>
-                        <w:t xml:space="preserve">!', </w:t>
-                      </w:r>
-                      <w:proofErr w:type="gramStart"/>
-                      <w:r>
-                        <w:t>{ font</w:t>
-                      </w:r>
-                      <w:proofErr w:type="gramEnd"/>
-                      <w:r>
-                        <w:t>: '24px Arial', fill: '#</w:t>
+                        <w:t>!', { font: '24px Arial', fill: '#</w:t>
                       </w:r>
                       <w:proofErr w:type="spellStart"/>
                       <w:r>
@@ -2096,13 +2046,8 @@
                       </w:r>
                       <w:r>
                         <w:br/>
-                        <w:t xml:space="preserve">function </w:t>
-                      </w:r>
-                      <w:proofErr w:type="gramStart"/>
-                      <w:r>
-                        <w:t>update(){</w:t>
-                      </w:r>
-                      <w:proofErr w:type="gramEnd"/>
+                        <w:t>function update(){</w:t>
+                      </w:r>
                       <w:r>
                         <w:br/>
                         <w:t>}</w:t>
@@ -2179,15 +2124,7 @@
                             </w:r>
                             <w:r>
                               <w:br/>
-                              <w:t xml:space="preserve">  </w:t>
-                            </w:r>
-                            <w:proofErr w:type="gramStart"/>
-                            <w:r>
-                              <w:t>create:</w:t>
-                            </w:r>
-                            <w:proofErr w:type="gramEnd"/>
-                            <w:r>
-                              <w:t xml:space="preserve"> create,</w:t>
+                              <w:t xml:space="preserve">  create: create,</w:t>
                             </w:r>
                             <w:r>
                               <w:br/>
@@ -2231,15 +2168,7 @@
                       </w:r>
                       <w:r>
                         <w:br/>
-                        <w:t xml:space="preserve">  </w:t>
-                      </w:r>
-                      <w:proofErr w:type="gramStart"/>
-                      <w:r>
-                        <w:t>create:</w:t>
-                      </w:r>
-                      <w:proofErr w:type="gramEnd"/>
-                      <w:r>
-                        <w:t xml:space="preserve"> create,</w:t>
+                        <w:t xml:space="preserve">  create: create,</w:t>
                       </w:r>
                       <w:r>
                         <w:br/>
@@ -2299,23 +2228,7 @@
           <w:rFonts w:ascii="C64 Pro Mono" w:hAnsi="C64 Pro Mono"/>
           <w:color w:val="FFFFFF" w:themeColor="background1"/>
         </w:rPr>
-        <w:t xml:space="preserve">), </w:t>
-      </w:r>
-      <w:proofErr w:type="gramStart"/>
-      <w:r>
-        <w:rPr>
-          <w:rFonts w:ascii="C64 Pro Mono" w:hAnsi="C64 Pro Mono"/>
-          <w:color w:val="FFFFFF" w:themeColor="background1"/>
-        </w:rPr>
-        <w:t>create(</w:t>
-      </w:r>
-      <w:proofErr w:type="gramEnd"/>
-      <w:r>
-        <w:rPr>
-          <w:rFonts w:ascii="C64 Pro Mono" w:hAnsi="C64 Pro Mono"/>
-          <w:color w:val="FFFFFF" w:themeColor="background1"/>
-        </w:rPr>
-        <w:t>) and update</w:t>
+        <w:t>), create() and update</w:t>
       </w:r>
     </w:p>
     <w:p>
@@ -2336,17 +2249,8 @@
           <w:color w:val="FFFFFF" w:themeColor="background1"/>
         </w:rPr>
         <w:lastRenderedPageBreak/>
-        <w:t xml:space="preserve">Adding a </w:t>
-      </w:r>
-      <w:proofErr w:type="gramStart"/>
-      <w:r>
-        <w:rPr>
-          <w:rFonts w:ascii="C64 Pro Mono" w:hAnsi="C64 Pro Mono"/>
-          <w:color w:val="FFFFFF" w:themeColor="background1"/>
-        </w:rPr>
-        <w:t>sprite</w:t>
-      </w:r>
-      <w:proofErr w:type="gramEnd"/>
+        <w:t>Adding a sprite</w:t>
+      </w:r>
     </w:p>
     <w:p>
       <w:pPr>
@@ -2417,17 +2321,8 @@
           <w:color w:val="FFFFFF" w:themeColor="background1"/>
         </w:rPr>
         <w:lastRenderedPageBreak/>
-        <w:t xml:space="preserve">Our </w:t>
-      </w:r>
-      <w:proofErr w:type="gramStart"/>
-      <w:r>
-        <w:rPr>
-          <w:rFonts w:ascii="C64 Pro Mono" w:hAnsi="C64 Pro Mono"/>
-          <w:color w:val="FFFFFF" w:themeColor="background1"/>
-        </w:rPr>
-        <w:t>sprite</w:t>
-      </w:r>
-      <w:proofErr w:type="gramEnd"/>
+        <w:t>Our sprite</w:t>
+      </w:r>
       <w:r>
         <w:rPr>
           <w:rFonts w:ascii="C64 Pro Mono" w:hAnsi="C64 Pro Mono"/>
@@ -2674,40 +2569,19 @@
                             </w:r>
                             <w:r>
                               <w:br/>
-                              <w:t xml:space="preserve">function </w:t>
-                            </w:r>
-                            <w:proofErr w:type="gramStart"/>
-                            <w:r>
-                              <w:t>preload(</w:t>
-                            </w:r>
-                            <w:proofErr w:type="gramEnd"/>
-                            <w:r>
-                              <w:t>) {</w:t>
+                              <w:t>function preload() {</w:t>
                             </w:r>
                             <w:r>
                               <w:br/>
                               <w:t xml:space="preserve">    </w:t>
                             </w:r>
                             <w:proofErr w:type="spellStart"/>
-                            <w:proofErr w:type="gramStart"/>
-                            <w:r>
-                              <w:t>this.load</w:t>
-                            </w:r>
-                            <w:proofErr w:type="gramEnd"/>
-                            <w:r>
-                              <w:t>.</w:t>
-                            </w:r>
-                            <w:proofErr w:type="gramStart"/>
-                            <w:r>
-                              <w:t>image</w:t>
+                            <w:r>
+                              <w:t>this.load.image</w:t>
                             </w:r>
                             <w:proofErr w:type="spellEnd"/>
                             <w:r>
-                              <w:t>(</w:t>
-                            </w:r>
-                            <w:proofErr w:type="gramEnd"/>
-                            <w:r>
-                              <w:t>'balloon', 'balloon.png');</w:t>
+                              <w:t>('balloon', 'balloon.png');</w:t>
                             </w:r>
                             <w:r>
                               <w:br/>
@@ -2718,15 +2592,7 @@
                             </w:r>
                             <w:r>
                               <w:br/>
-                              <w:t xml:space="preserve">function </w:t>
-                            </w:r>
-                            <w:proofErr w:type="gramStart"/>
-                            <w:r>
-                              <w:t>create(</w:t>
-                            </w:r>
-                            <w:proofErr w:type="gramEnd"/>
-                            <w:r>
-                              <w:t>) {</w:t>
+                              <w:t>function create() {</w:t>
                             </w:r>
                             <w:r>
                               <w:br/>
@@ -2734,19 +2600,11 @@
                             </w:r>
                             <w:proofErr w:type="spellStart"/>
                             <w:r>
-                              <w:t>this.add.</w:t>
-                            </w:r>
-                            <w:proofErr w:type="gramStart"/>
-                            <w:r>
-                              <w:t>text</w:t>
+                              <w:t>this.add.text</w:t>
                             </w:r>
                             <w:proofErr w:type="spellEnd"/>
                             <w:r>
-                              <w:t>(</w:t>
-                            </w:r>
-                            <w:proofErr w:type="gramEnd"/>
-                            <w:r>
-                              <w:t xml:space="preserve">20, 20, 'Super </w:t>
+                              <w:t xml:space="preserve">(20, 20, 'Super </w:t>
                             </w:r>
                             <w:proofErr w:type="spellStart"/>
                             <w:r>
@@ -2762,15 +2620,7 @@
                             </w:r>
                             <w:proofErr w:type="spellEnd"/>
                             <w:r>
-                              <w:t xml:space="preserve">!', </w:t>
-                            </w:r>
-                            <w:proofErr w:type="gramStart"/>
-                            <w:r>
-                              <w:t>{ font</w:t>
-                            </w:r>
-                            <w:proofErr w:type="gramEnd"/>
-                            <w:r>
-                              <w:t>: '24px Arial', fill: '#</w:t>
+                              <w:t>!', { font: '24px Arial', fill: '#</w:t>
                             </w:r>
                             <w:proofErr w:type="spellStart"/>
                             <w:r>
@@ -2785,12 +2635,10 @@
                               <w:t xml:space="preserve">    sprite = </w:t>
                             </w:r>
                             <w:proofErr w:type="spellStart"/>
-                            <w:proofErr w:type="gramStart"/>
                             <w:r>
                               <w:t>this.add.sprite</w:t>
                             </w:r>
                             <w:proofErr w:type="spellEnd"/>
-                            <w:proofErr w:type="gramEnd"/>
                             <w:r>
                               <w:t>(200, 200, 'balloon');</w:t>
                             </w:r>
@@ -2831,40 +2679,19 @@
                       </w:r>
                       <w:r>
                         <w:br/>
-                        <w:t xml:space="preserve">function </w:t>
-                      </w:r>
-                      <w:proofErr w:type="gramStart"/>
-                      <w:r>
-                        <w:t>preload(</w:t>
-                      </w:r>
-                      <w:proofErr w:type="gramEnd"/>
-                      <w:r>
-                        <w:t>) {</w:t>
+                        <w:t>function preload() {</w:t>
                       </w:r>
                       <w:r>
                         <w:br/>
                         <w:t xml:space="preserve">    </w:t>
                       </w:r>
                       <w:proofErr w:type="spellStart"/>
-                      <w:proofErr w:type="gramStart"/>
-                      <w:r>
-                        <w:t>this.load</w:t>
-                      </w:r>
-                      <w:proofErr w:type="gramEnd"/>
-                      <w:r>
-                        <w:t>.</w:t>
-                      </w:r>
-                      <w:proofErr w:type="gramStart"/>
-                      <w:r>
-                        <w:t>image</w:t>
+                      <w:r>
+                        <w:t>this.load.image</w:t>
                       </w:r>
                       <w:proofErr w:type="spellEnd"/>
                       <w:r>
-                        <w:t>(</w:t>
-                      </w:r>
-                      <w:proofErr w:type="gramEnd"/>
-                      <w:r>
-                        <w:t>'balloon', 'balloon.png');</w:t>
+                        <w:t>('balloon', 'balloon.png');</w:t>
                       </w:r>
                       <w:r>
                         <w:br/>
@@ -2875,15 +2702,7 @@
                       </w:r>
                       <w:r>
                         <w:br/>
-                        <w:t xml:space="preserve">function </w:t>
-                      </w:r>
-                      <w:proofErr w:type="gramStart"/>
-                      <w:r>
-                        <w:t>create(</w:t>
-                      </w:r>
-                      <w:proofErr w:type="gramEnd"/>
-                      <w:r>
-                        <w:t>) {</w:t>
+                        <w:t>function create() {</w:t>
                       </w:r>
                       <w:r>
                         <w:br/>
@@ -2891,19 +2710,11 @@
                       </w:r>
                       <w:proofErr w:type="spellStart"/>
                       <w:r>
-                        <w:t>this.add.</w:t>
-                      </w:r>
-                      <w:proofErr w:type="gramStart"/>
-                      <w:r>
-                        <w:t>text</w:t>
+                        <w:t>this.add.text</w:t>
                       </w:r>
                       <w:proofErr w:type="spellEnd"/>
                       <w:r>
-                        <w:t>(</w:t>
-                      </w:r>
-                      <w:proofErr w:type="gramEnd"/>
-                      <w:r>
-                        <w:t xml:space="preserve">20, 20, 'Super </w:t>
+                        <w:t xml:space="preserve">(20, 20, 'Super </w:t>
                       </w:r>
                       <w:proofErr w:type="spellStart"/>
                       <w:r>
@@ -2919,15 +2730,7 @@
                       </w:r>
                       <w:proofErr w:type="spellEnd"/>
                       <w:r>
-                        <w:t xml:space="preserve">!', </w:t>
-                      </w:r>
-                      <w:proofErr w:type="gramStart"/>
-                      <w:r>
-                        <w:t>{ font</w:t>
-                      </w:r>
-                      <w:proofErr w:type="gramEnd"/>
-                      <w:r>
-                        <w:t>: '24px Arial', fill: '#</w:t>
+                        <w:t>!', { font: '24px Arial', fill: '#</w:t>
                       </w:r>
                       <w:proofErr w:type="spellStart"/>
                       <w:r>
@@ -2942,12 +2745,10 @@
                         <w:t xml:space="preserve">    sprite = </w:t>
                       </w:r>
                       <w:proofErr w:type="spellStart"/>
-                      <w:proofErr w:type="gramStart"/>
                       <w:r>
                         <w:t>this.add.sprite</w:t>
                       </w:r>
                       <w:proofErr w:type="spellEnd"/>
-                      <w:proofErr w:type="gramEnd"/>
                       <w:r>
                         <w:t>(200, 200, 'balloon');</w:t>
                       </w:r>
@@ -3103,13 +2904,8 @@
                             </w:r>
                             <w:r>
                               <w:br/>
-                              <w:t>let sprites = [</w:t>
-                            </w:r>
-                            <w:proofErr w:type="gramStart"/>
-                            <w:r>
-                              <w:t>];</w:t>
-                            </w:r>
-                            <w:proofErr w:type="gramEnd"/>
+                              <w:t>let sprites = [];</w:t>
+                            </w:r>
                           </w:p>
                           <w:p>
                             <w:pPr>
@@ -3155,13 +2951,8 @@
                       </w:r>
                       <w:r>
                         <w:br/>
-                        <w:t>let sprites = [</w:t>
-                      </w:r>
-                      <w:proofErr w:type="gramStart"/>
-                      <w:r>
-                        <w:t>];</w:t>
-                      </w:r>
-                      <w:proofErr w:type="gramEnd"/>
+                        <w:t>let sprites = [];</w:t>
+                      </w:r>
                     </w:p>
                     <w:p>
                       <w:pPr>
@@ -3265,15 +3056,7 @@
                         <w:txbxContent>
                           <w:p>
                             <w:r>
-                              <w:t xml:space="preserve">function </w:t>
-                            </w:r>
-                            <w:proofErr w:type="gramStart"/>
-                            <w:r>
-                              <w:t>create(</w:t>
-                            </w:r>
-                            <w:proofErr w:type="gramEnd"/>
-                            <w:r>
-                              <w:t>) {</w:t>
+                              <w:t>function create() {</w:t>
                             </w:r>
                             <w:r>
                               <w:br/>
@@ -3281,152 +3064,122 @@
                             </w:r>
                             <w:proofErr w:type="spellStart"/>
                             <w:r>
-                              <w:t>this.add.</w:t>
-                            </w:r>
-                            <w:proofErr w:type="gramStart"/>
-                            <w:r>
-                              <w:t>text</w:t>
+                              <w:t>this.add.text</w:t>
                             </w:r>
                             <w:proofErr w:type="spellEnd"/>
                             <w:r>
+                              <w:t xml:space="preserve">(20, 20, 'Super </w:t>
+                            </w:r>
+                            <w:proofErr w:type="spellStart"/>
+                            <w:r>
+                              <w:t>fajna</w:t>
+                            </w:r>
+                            <w:proofErr w:type="spellEnd"/>
+                            <w:r>
+                              <w:t xml:space="preserve"> </w:t>
+                            </w:r>
+                            <w:proofErr w:type="spellStart"/>
+                            <w:r>
+                              <w:t>gra</w:t>
+                            </w:r>
+                            <w:proofErr w:type="spellEnd"/>
+                            <w:r>
+                              <w:t>!', { font: '24px Arial', fill: '#</w:t>
+                            </w:r>
+                            <w:proofErr w:type="spellStart"/>
+                            <w:r>
+                              <w:t>ffffff</w:t>
+                            </w:r>
+                            <w:proofErr w:type="spellEnd"/>
+                            <w:r>
+                              <w:t>' });</w:t>
+                            </w:r>
+                            <w:r>
+                              <w:br/>
+                            </w:r>
+                            <w:r>
+                              <w:br/>
+                              <w:t xml:space="preserve">    for (let </w:t>
+                            </w:r>
+                            <w:proofErr w:type="spellStart"/>
+                            <w:r>
+                              <w:t>i</w:t>
+                            </w:r>
+                            <w:proofErr w:type="spellEnd"/>
+                            <w:r>
+                              <w:t xml:space="preserve"> = 0; </w:t>
+                            </w:r>
+                            <w:proofErr w:type="spellStart"/>
+                            <w:r>
+                              <w:t>i</w:t>
+                            </w:r>
+                            <w:proofErr w:type="spellEnd"/>
+                            <w:r>
+                              <w:t xml:space="preserve"> &lt; </w:t>
+                            </w:r>
+                            <w:proofErr w:type="spellStart"/>
+                            <w:r>
+                              <w:t>spritesCount</w:t>
+                            </w:r>
+                            <w:proofErr w:type="spellEnd"/>
+                            <w:r>
+                              <w:t xml:space="preserve">; </w:t>
+                            </w:r>
+                            <w:proofErr w:type="spellStart"/>
+                            <w:r>
+                              <w:t>i</w:t>
+                            </w:r>
+                            <w:proofErr w:type="spellEnd"/>
+                            <w:r>
+                              <w:t>++){</w:t>
+                            </w:r>
+                            <w:r>
+                              <w:br/>
+                              <w:t xml:space="preserve">        let s = </w:t>
+                            </w:r>
+                            <w:proofErr w:type="spellStart"/>
+                            <w:r>
+                              <w:t>this.add.sprite</w:t>
+                            </w:r>
+                            <w:proofErr w:type="spellEnd"/>
+                            <w:r>
                               <w:t>(</w:t>
                             </w:r>
-                            <w:proofErr w:type="gramEnd"/>
-                            <w:r>
-                              <w:t xml:space="preserve">20, 20, 'Super </w:t>
-                            </w:r>
                             <w:proofErr w:type="spellStart"/>
                             <w:r>
-                              <w:t>fajna</w:t>
+                              <w:t>i</w:t>
                             </w:r>
                             <w:proofErr w:type="spellEnd"/>
                             <w:r>
+                              <w:t>, 50*</w:t>
+                            </w:r>
+                            <w:proofErr w:type="spellStart"/>
+                            <w:r>
+                              <w:t>i</w:t>
+                            </w:r>
+                            <w:proofErr w:type="spellEnd"/>
+                            <w:r>
+                              <w:t>, 'balloon');</w:t>
+                            </w:r>
+                            <w:r>
                               <w:t xml:space="preserve"> </w:t>
                             </w:r>
+                            <w:r>
+                              <w:br/>
+                              <w:t xml:space="preserve">        </w:t>
+                            </w:r>
                             <w:proofErr w:type="spellStart"/>
                             <w:r>
-                              <w:t>gra</w:t>
+                              <w:t>sprites.push</w:t>
                             </w:r>
                             <w:proofErr w:type="spellEnd"/>
                             <w:r>
-                              <w:t xml:space="preserve">!', </w:t>
-                            </w:r>
-                            <w:proofErr w:type="gramStart"/>
-                            <w:r>
-                              <w:t>{ font</w:t>
-                            </w:r>
-                            <w:proofErr w:type="gramEnd"/>
-                            <w:r>
-                              <w:t>: '24px Arial', fill: '#</w:t>
-                            </w:r>
-                            <w:proofErr w:type="spellStart"/>
-                            <w:r>
-                              <w:t>ffffff</w:t>
-                            </w:r>
-                            <w:proofErr w:type="spellEnd"/>
-                            <w:r>
-                              <w:t>' });</w:t>
-                            </w:r>
-                            <w:r>
-                              <w:br/>
-                            </w:r>
-                            <w:r>
-                              <w:br/>
-                              <w:t xml:space="preserve">    for (let </w:t>
-                            </w:r>
-                            <w:proofErr w:type="spellStart"/>
-                            <w:r>
-                              <w:t>i</w:t>
-                            </w:r>
-                            <w:proofErr w:type="spellEnd"/>
-                            <w:r>
-                              <w:t xml:space="preserve"> = 0; </w:t>
-                            </w:r>
-                            <w:proofErr w:type="spellStart"/>
-                            <w:r>
-                              <w:t>i</w:t>
-                            </w:r>
-                            <w:proofErr w:type="spellEnd"/>
-                            <w:r>
-                              <w:t xml:space="preserve"> &lt; </w:t>
-                            </w:r>
-                            <w:proofErr w:type="spellStart"/>
-                            <w:r>
-                              <w:t>spritesCount</w:t>
-                            </w:r>
-                            <w:proofErr w:type="spellEnd"/>
-                            <w:r>
-                              <w:t xml:space="preserve">; </w:t>
-                            </w:r>
-                            <w:proofErr w:type="spellStart"/>
-                            <w:r>
-                              <w:t>i</w:t>
-                            </w:r>
-                            <w:proofErr w:type="spellEnd"/>
-                            <w:r>
-                              <w:t>+</w:t>
-                            </w:r>
-                            <w:proofErr w:type="gramStart"/>
-                            <w:r>
-                              <w:t>+){</w:t>
-                            </w:r>
-                            <w:proofErr w:type="gramEnd"/>
-                            <w:r>
-                              <w:br/>
-                              <w:t xml:space="preserve">        let s = </w:t>
-                            </w:r>
-                            <w:proofErr w:type="spellStart"/>
-                            <w:proofErr w:type="gramStart"/>
-                            <w:r>
-                              <w:t>this.add.sprite</w:t>
-                            </w:r>
-                            <w:proofErr w:type="spellEnd"/>
-                            <w:proofErr w:type="gramEnd"/>
-                            <w:r>
-                              <w:t>(</w:t>
-                            </w:r>
-                            <w:proofErr w:type="spellStart"/>
-                            <w:r>
-                              <w:t>i</w:t>
-                            </w:r>
-                            <w:proofErr w:type="spellEnd"/>
-                            <w:r>
-                              <w:t>, 50*</w:t>
-                            </w:r>
-                            <w:proofErr w:type="spellStart"/>
-                            <w:r>
-                              <w:t>i</w:t>
-                            </w:r>
-                            <w:proofErr w:type="spellEnd"/>
-                            <w:r>
-                              <w:t>, 'balloon');</w:t>
-                            </w:r>
-                            <w:r>
-                              <w:t xml:space="preserve"> </w:t>
-                            </w:r>
-                            <w:r>
-                              <w:br/>
-                              <w:t xml:space="preserve">        </w:t>
-                            </w:r>
-                            <w:proofErr w:type="spellStart"/>
-                            <w:proofErr w:type="gramStart"/>
-                            <w:r>
-                              <w:t>sprites.push</w:t>
-                            </w:r>
-                            <w:proofErr w:type="spellEnd"/>
-                            <w:proofErr w:type="gramEnd"/>
-                            <w:r>
                               <w:t>(s);</w:t>
                             </w:r>
                             <w:r>
                               <w:br/>
-                              <w:t xml:space="preserve">  </w:t>
-                            </w:r>
-                            <w:proofErr w:type="gramStart"/>
-                            <w:r>
-                              <w:t xml:space="preserve">  }</w:t>
-                            </w:r>
-                            <w:proofErr w:type="gramEnd"/>
+                              <w:t xml:space="preserve">    }</w:t>
+                            </w:r>
                           </w:p>
                           <w:p>
                             <w:pPr>
@@ -3460,15 +3213,7 @@
                   <w:txbxContent>
                     <w:p>
                       <w:r>
-                        <w:t xml:space="preserve">function </w:t>
-                      </w:r>
-                      <w:proofErr w:type="gramStart"/>
-                      <w:r>
-                        <w:t>create(</w:t>
-                      </w:r>
-                      <w:proofErr w:type="gramEnd"/>
-                      <w:r>
-                        <w:t>) {</w:t>
+                        <w:t>function create() {</w:t>
                       </w:r>
                       <w:r>
                         <w:br/>
@@ -3476,152 +3221,122 @@
                       </w:r>
                       <w:proofErr w:type="spellStart"/>
                       <w:r>
-                        <w:t>this.add.</w:t>
-                      </w:r>
-                      <w:proofErr w:type="gramStart"/>
-                      <w:r>
-                        <w:t>text</w:t>
+                        <w:t>this.add.text</w:t>
                       </w:r>
                       <w:proofErr w:type="spellEnd"/>
                       <w:r>
+                        <w:t xml:space="preserve">(20, 20, 'Super </w:t>
+                      </w:r>
+                      <w:proofErr w:type="spellStart"/>
+                      <w:r>
+                        <w:t>fajna</w:t>
+                      </w:r>
+                      <w:proofErr w:type="spellEnd"/>
+                      <w:r>
+                        <w:t xml:space="preserve"> </w:t>
+                      </w:r>
+                      <w:proofErr w:type="spellStart"/>
+                      <w:r>
+                        <w:t>gra</w:t>
+                      </w:r>
+                      <w:proofErr w:type="spellEnd"/>
+                      <w:r>
+                        <w:t>!', { font: '24px Arial', fill: '#</w:t>
+                      </w:r>
+                      <w:proofErr w:type="spellStart"/>
+                      <w:r>
+                        <w:t>ffffff</w:t>
+                      </w:r>
+                      <w:proofErr w:type="spellEnd"/>
+                      <w:r>
+                        <w:t>' });</w:t>
+                      </w:r>
+                      <w:r>
+                        <w:br/>
+                      </w:r>
+                      <w:r>
+                        <w:br/>
+                        <w:t xml:space="preserve">    for (let </w:t>
+                      </w:r>
+                      <w:proofErr w:type="spellStart"/>
+                      <w:r>
+                        <w:t>i</w:t>
+                      </w:r>
+                      <w:proofErr w:type="spellEnd"/>
+                      <w:r>
+                        <w:t xml:space="preserve"> = 0; </w:t>
+                      </w:r>
+                      <w:proofErr w:type="spellStart"/>
+                      <w:r>
+                        <w:t>i</w:t>
+                      </w:r>
+                      <w:proofErr w:type="spellEnd"/>
+                      <w:r>
+                        <w:t xml:space="preserve"> &lt; </w:t>
+                      </w:r>
+                      <w:proofErr w:type="spellStart"/>
+                      <w:r>
+                        <w:t>spritesCount</w:t>
+                      </w:r>
+                      <w:proofErr w:type="spellEnd"/>
+                      <w:r>
+                        <w:t xml:space="preserve">; </w:t>
+                      </w:r>
+                      <w:proofErr w:type="spellStart"/>
+                      <w:r>
+                        <w:t>i</w:t>
+                      </w:r>
+                      <w:proofErr w:type="spellEnd"/>
+                      <w:r>
+                        <w:t>++){</w:t>
+                      </w:r>
+                      <w:r>
+                        <w:br/>
+                        <w:t xml:space="preserve">        let s = </w:t>
+                      </w:r>
+                      <w:proofErr w:type="spellStart"/>
+                      <w:r>
+                        <w:t>this.add.sprite</w:t>
+                      </w:r>
+                      <w:proofErr w:type="spellEnd"/>
+                      <w:r>
                         <w:t>(</w:t>
                       </w:r>
-                      <w:proofErr w:type="gramEnd"/>
-                      <w:r>
-                        <w:t xml:space="preserve">20, 20, 'Super </w:t>
-                      </w:r>
                       <w:proofErr w:type="spellStart"/>
                       <w:r>
-                        <w:t>fajna</w:t>
+                        <w:t>i</w:t>
                       </w:r>
                       <w:proofErr w:type="spellEnd"/>
                       <w:r>
+                        <w:t>, 50*</w:t>
+                      </w:r>
+                      <w:proofErr w:type="spellStart"/>
+                      <w:r>
+                        <w:t>i</w:t>
+                      </w:r>
+                      <w:proofErr w:type="spellEnd"/>
+                      <w:r>
+                        <w:t>, 'balloon');</w:t>
+                      </w:r>
+                      <w:r>
                         <w:t xml:space="preserve"> </w:t>
                       </w:r>
+                      <w:r>
+                        <w:br/>
+                        <w:t xml:space="preserve">        </w:t>
+                      </w:r>
                       <w:proofErr w:type="spellStart"/>
                       <w:r>
-                        <w:t>gra</w:t>
+                        <w:t>sprites.push</w:t>
                       </w:r>
                       <w:proofErr w:type="spellEnd"/>
                       <w:r>
-                        <w:t xml:space="preserve">!', </w:t>
-                      </w:r>
-                      <w:proofErr w:type="gramStart"/>
-                      <w:r>
-                        <w:t>{ font</w:t>
-                      </w:r>
-                      <w:proofErr w:type="gramEnd"/>
-                      <w:r>
-                        <w:t>: '24px Arial', fill: '#</w:t>
-                      </w:r>
-                      <w:proofErr w:type="spellStart"/>
-                      <w:r>
-                        <w:t>ffffff</w:t>
-                      </w:r>
-                      <w:proofErr w:type="spellEnd"/>
-                      <w:r>
-                        <w:t>' });</w:t>
-                      </w:r>
-                      <w:r>
-                        <w:br/>
-                      </w:r>
-                      <w:r>
-                        <w:br/>
-                        <w:t xml:space="preserve">    for (let </w:t>
-                      </w:r>
-                      <w:proofErr w:type="spellStart"/>
-                      <w:r>
-                        <w:t>i</w:t>
-                      </w:r>
-                      <w:proofErr w:type="spellEnd"/>
-                      <w:r>
-                        <w:t xml:space="preserve"> = 0; </w:t>
-                      </w:r>
-                      <w:proofErr w:type="spellStart"/>
-                      <w:r>
-                        <w:t>i</w:t>
-                      </w:r>
-                      <w:proofErr w:type="spellEnd"/>
-                      <w:r>
-                        <w:t xml:space="preserve"> &lt; </w:t>
-                      </w:r>
-                      <w:proofErr w:type="spellStart"/>
-                      <w:r>
-                        <w:t>spritesCount</w:t>
-                      </w:r>
-                      <w:proofErr w:type="spellEnd"/>
-                      <w:r>
-                        <w:t xml:space="preserve">; </w:t>
-                      </w:r>
-                      <w:proofErr w:type="spellStart"/>
-                      <w:r>
-                        <w:t>i</w:t>
-                      </w:r>
-                      <w:proofErr w:type="spellEnd"/>
-                      <w:r>
-                        <w:t>+</w:t>
-                      </w:r>
-                      <w:proofErr w:type="gramStart"/>
-                      <w:r>
-                        <w:t>+){</w:t>
-                      </w:r>
-                      <w:proofErr w:type="gramEnd"/>
-                      <w:r>
-                        <w:br/>
-                        <w:t xml:space="preserve">        let s = </w:t>
-                      </w:r>
-                      <w:proofErr w:type="spellStart"/>
-                      <w:proofErr w:type="gramStart"/>
-                      <w:r>
-                        <w:t>this.add.sprite</w:t>
-                      </w:r>
-                      <w:proofErr w:type="spellEnd"/>
-                      <w:proofErr w:type="gramEnd"/>
-                      <w:r>
-                        <w:t>(</w:t>
-                      </w:r>
-                      <w:proofErr w:type="spellStart"/>
-                      <w:r>
-                        <w:t>i</w:t>
-                      </w:r>
-                      <w:proofErr w:type="spellEnd"/>
-                      <w:r>
-                        <w:t>, 50*</w:t>
-                      </w:r>
-                      <w:proofErr w:type="spellStart"/>
-                      <w:r>
-                        <w:t>i</w:t>
-                      </w:r>
-                      <w:proofErr w:type="spellEnd"/>
-                      <w:r>
-                        <w:t>, 'balloon');</w:t>
-                      </w:r>
-                      <w:r>
-                        <w:t xml:space="preserve"> </w:t>
-                      </w:r>
-                      <w:r>
-                        <w:br/>
-                        <w:t xml:space="preserve">        </w:t>
-                      </w:r>
-                      <w:proofErr w:type="spellStart"/>
-                      <w:proofErr w:type="gramStart"/>
-                      <w:r>
-                        <w:t>sprites.push</w:t>
-                      </w:r>
-                      <w:proofErr w:type="spellEnd"/>
-                      <w:proofErr w:type="gramEnd"/>
-                      <w:r>
                         <w:t>(s);</w:t>
                       </w:r>
                       <w:r>
                         <w:br/>
-                        <w:t xml:space="preserve">  </w:t>
-                      </w:r>
-                      <w:proofErr w:type="gramStart"/>
-                      <w:r>
-                        <w:t xml:space="preserve">  }</w:t>
-                      </w:r>
-                      <w:proofErr w:type="gramEnd"/>
+                        <w:t xml:space="preserve">    }</w:t>
+                      </w:r>
                     </w:p>
                     <w:p>
                       <w:pPr>
@@ -3766,15 +3481,7 @@
                         <w:txbxContent>
                           <w:p>
                             <w:r>
-                              <w:t xml:space="preserve">function </w:t>
-                            </w:r>
-                            <w:proofErr w:type="gramStart"/>
-                            <w:r>
-                              <w:t>update(</w:t>
-                            </w:r>
-                            <w:proofErr w:type="gramEnd"/>
-                            <w:r>
-                              <w:t>) {</w:t>
+                              <w:t>function update() {</w:t>
                             </w:r>
                             <w:r>
                               <w:br/>
@@ -3810,13 +3517,8 @@
                             </w:r>
                             <w:proofErr w:type="spellEnd"/>
                             <w:r>
-                              <w:t>+</w:t>
-                            </w:r>
-                            <w:proofErr w:type="gramStart"/>
-                            <w:r>
-                              <w:t>+){</w:t>
-                            </w:r>
-                            <w:proofErr w:type="gramEnd"/>
+                              <w:t>++){</w:t>
+                            </w:r>
                             <w:r>
                               <w:br/>
                               <w:t xml:space="preserve">        if (sprites[</w:t>
@@ -3839,11 +3541,7 @@
                             </w:r>
                             <w:proofErr w:type="spellEnd"/>
                             <w:r>
-                              <w:t>].x +</w:t>
-                            </w:r>
-                            <w:proofErr w:type="gramStart"/>
-                            <w:r>
-                              <w:t xml:space="preserve">= </w:t>
+                              <w:t xml:space="preserve">].x += </w:t>
                             </w:r>
                             <w:r>
                               <w:t xml:space="preserve"> </w:t>
@@ -3853,7 +3551,6 @@
                               <w:t>i</w:t>
                             </w:r>
                             <w:proofErr w:type="spellEnd"/>
-                            <w:proofErr w:type="gramEnd"/>
                             <w:r>
                               <w:t>; //</w:t>
                             </w:r>
@@ -3878,13 +3575,8 @@
                             </w:r>
                             <w:r>
                               <w:br/>
-                              <w:t xml:space="preserve">  </w:t>
-                            </w:r>
-                            <w:proofErr w:type="gramStart"/>
-                            <w:r>
-                              <w:t xml:space="preserve">  }</w:t>
-                            </w:r>
-                            <w:proofErr w:type="gramEnd"/>
+                              <w:t xml:space="preserve">    }</w:t>
+                            </w:r>
                             <w:r>
                               <w:br/>
                               <w:t>}</w:t>
@@ -3915,15 +3607,7 @@
                   <w:txbxContent>
                     <w:p>
                       <w:r>
-                        <w:t xml:space="preserve">function </w:t>
-                      </w:r>
-                      <w:proofErr w:type="gramStart"/>
-                      <w:r>
-                        <w:t>update(</w:t>
-                      </w:r>
-                      <w:proofErr w:type="gramEnd"/>
-                      <w:r>
-                        <w:t>) {</w:t>
+                        <w:t>function update() {</w:t>
                       </w:r>
                       <w:r>
                         <w:br/>
@@ -3959,13 +3643,8 @@
                       </w:r>
                       <w:proofErr w:type="spellEnd"/>
                       <w:r>
-                        <w:t>+</w:t>
-                      </w:r>
-                      <w:proofErr w:type="gramStart"/>
-                      <w:r>
-                        <w:t>+){</w:t>
-                      </w:r>
-                      <w:proofErr w:type="gramEnd"/>
+                        <w:t>++){</w:t>
+                      </w:r>
                       <w:r>
                         <w:br/>
                         <w:t xml:space="preserve">        if (sprites[</w:t>
@@ -3988,11 +3667,7 @@
                       </w:r>
                       <w:proofErr w:type="spellEnd"/>
                       <w:r>
-                        <w:t>].x +</w:t>
-                      </w:r>
-                      <w:proofErr w:type="gramStart"/>
-                      <w:r>
-                        <w:t xml:space="preserve">= </w:t>
+                        <w:t xml:space="preserve">].x += </w:t>
                       </w:r>
                       <w:r>
                         <w:t xml:space="preserve"> </w:t>
@@ -4002,7 +3677,6 @@
                         <w:t>i</w:t>
                       </w:r>
                       <w:proofErr w:type="spellEnd"/>
-                      <w:proofErr w:type="gramEnd"/>
                       <w:r>
                         <w:t>; //</w:t>
                       </w:r>
@@ -4027,13 +3701,8 @@
                       </w:r>
                       <w:r>
                         <w:br/>
-                        <w:t xml:space="preserve">  </w:t>
-                      </w:r>
-                      <w:proofErr w:type="gramStart"/>
-                      <w:r>
-                        <w:t xml:space="preserve">  }</w:t>
-                      </w:r>
-                      <w:proofErr w:type="gramEnd"/>
+                        <w:t xml:space="preserve">    }</w:t>
+                      </w:r>
                       <w:r>
                         <w:br/>
                         <w:t>}</w:t>
@@ -4103,17 +3772,15 @@
           <w:rFonts w:ascii="C64 Pro Mono" w:hAnsi="C64 Pro Mono" w:cstheme="majorBidi"/>
           <w:color w:val="FFFFFF" w:themeColor="background1"/>
         </w:rPr>
-        <w:t xml:space="preserve">Introducing </w:t>
-      </w:r>
-      <w:proofErr w:type="gramStart"/>
+        <w:t xml:space="preserve">2.8 </w:t>
+      </w:r>
       <w:r>
         <w:rPr>
           <w:rFonts w:ascii="C64 Pro Mono" w:hAnsi="C64 Pro Mono" w:cstheme="majorBidi"/>
           <w:color w:val="FFFFFF" w:themeColor="background1"/>
         </w:rPr>
-        <w:t>player</w:t>
-      </w:r>
-      <w:proofErr w:type="gramEnd"/>
+        <w:t>Introducing player</w:t>
+      </w:r>
     </w:p>
     <w:p>
       <w:pPr>
@@ -4137,17 +3804,8 @@
           <w:rFonts w:ascii="C64 Pro Mono" w:hAnsi="C64 Pro Mono" w:cstheme="majorBidi"/>
           <w:color w:val="FFFFFF" w:themeColor="background1"/>
         </w:rPr>
-        <w:t xml:space="preserve">Animated player </w:t>
-      </w:r>
-      <w:proofErr w:type="gramStart"/>
-      <w:r>
-        <w:rPr>
-          <w:rFonts w:ascii="C64 Pro Mono" w:hAnsi="C64 Pro Mono" w:cstheme="majorBidi"/>
-          <w:color w:val="FFFFFF" w:themeColor="background1"/>
-        </w:rPr>
-        <w:t>sprite</w:t>
-      </w:r>
-      <w:proofErr w:type="gramEnd"/>
+        <w:t>Animated player sprite</w:t>
+      </w:r>
     </w:p>
     <w:p>
       <w:pPr>
@@ -4325,53 +3983,27 @@
                         <w:txbxContent>
                           <w:p>
                             <w:r>
-                              <w:t>let player = null;</w:t>
-                            </w:r>
-                            <w:r>
-                              <w:br/>
-                            </w:r>
-                            <w:r>
-                              <w:br/>
-                              <w:t xml:space="preserve">function </w:t>
-                            </w:r>
-                            <w:proofErr w:type="gramStart"/>
-                            <w:r>
-                              <w:t>preload(</w:t>
-                            </w:r>
-                            <w:proofErr w:type="gramEnd"/>
-                            <w:r>
-                              <w:t>) {</w:t>
+                              <w:t>let player;</w:t>
+                            </w:r>
+                            <w:r>
+                              <w:br/>
+                            </w:r>
+                            <w:r>
+                              <w:br/>
+                              <w:t>function preload() {</w:t>
                             </w:r>
                             <w:r>
                               <w:br/>
                               <w:t xml:space="preserve">    </w:t>
                             </w:r>
                             <w:proofErr w:type="spellStart"/>
-                            <w:proofErr w:type="gramStart"/>
-                            <w:r>
-                              <w:t>this.load</w:t>
-                            </w:r>
-                            <w:proofErr w:type="gramEnd"/>
-                            <w:r>
-                              <w:t>.</w:t>
-                            </w:r>
-                            <w:proofErr w:type="gramStart"/>
-                            <w:r>
-                              <w:t>image</w:t>
+                            <w:r>
+                              <w:t>this.load.image</w:t>
                             </w:r>
                             <w:proofErr w:type="spellEnd"/>
                             <w:r>
-                              <w:t>(</w:t>
-                            </w:r>
-                            <w:proofErr w:type="gramEnd"/>
-                            <w:r>
-                              <w:t>'balloon', 'balloon.png'</w:t>
-                            </w:r>
-                            <w:proofErr w:type="gramStart"/>
-                            <w:r>
-                              <w:t>);</w:t>
-                            </w:r>
-                            <w:proofErr w:type="gramEnd"/>
+                              <w:t>('balloon', 'balloon.png');</w:t>
+                            </w:r>
                           </w:p>
                           <w:p>
                             <w:r>
@@ -4379,25 +4011,12 @@
                               <w:t xml:space="preserve">    </w:t>
                             </w:r>
                             <w:proofErr w:type="spellStart"/>
-                            <w:proofErr w:type="gramStart"/>
-                            <w:r>
-                              <w:t>this.load</w:t>
-                            </w:r>
-                            <w:proofErr w:type="gramEnd"/>
-                            <w:r>
-                              <w:t>.</w:t>
-                            </w:r>
-                            <w:proofErr w:type="gramStart"/>
-                            <w:r>
-                              <w:t>spritesheet</w:t>
+                            <w:r>
+                              <w:t>this.load.spritesheet</w:t>
                             </w:r>
                             <w:proofErr w:type="spellEnd"/>
                             <w:r>
-                              <w:t>(</w:t>
-                            </w:r>
-                            <w:proofErr w:type="gramEnd"/>
-                            <w:r>
-                              <w:t>'</w:t>
+                              <w:t>('</w:t>
                             </w:r>
                             <w:proofErr w:type="spellStart"/>
                             <w:r>
@@ -4464,53 +4083,27 @@
                   <w:txbxContent>
                     <w:p>
                       <w:r>
-                        <w:t>let player = null;</w:t>
-                      </w:r>
-                      <w:r>
-                        <w:br/>
-                      </w:r>
-                      <w:r>
-                        <w:br/>
-                        <w:t xml:space="preserve">function </w:t>
-                      </w:r>
-                      <w:proofErr w:type="gramStart"/>
-                      <w:r>
-                        <w:t>preload(</w:t>
-                      </w:r>
-                      <w:proofErr w:type="gramEnd"/>
-                      <w:r>
-                        <w:t>) {</w:t>
+                        <w:t>let player;</w:t>
+                      </w:r>
+                      <w:r>
+                        <w:br/>
+                      </w:r>
+                      <w:r>
+                        <w:br/>
+                        <w:t>function preload() {</w:t>
                       </w:r>
                       <w:r>
                         <w:br/>
                         <w:t xml:space="preserve">    </w:t>
                       </w:r>
                       <w:proofErr w:type="spellStart"/>
-                      <w:proofErr w:type="gramStart"/>
-                      <w:r>
-                        <w:t>this.load</w:t>
-                      </w:r>
-                      <w:proofErr w:type="gramEnd"/>
-                      <w:r>
-                        <w:t>.</w:t>
-                      </w:r>
-                      <w:proofErr w:type="gramStart"/>
-                      <w:r>
-                        <w:t>image</w:t>
+                      <w:r>
+                        <w:t>this.load.image</w:t>
                       </w:r>
                       <w:proofErr w:type="spellEnd"/>
                       <w:r>
-                        <w:t>(</w:t>
-                      </w:r>
-                      <w:proofErr w:type="gramEnd"/>
-                      <w:r>
-                        <w:t>'balloon', 'balloon.png'</w:t>
-                      </w:r>
-                      <w:proofErr w:type="gramStart"/>
-                      <w:r>
-                        <w:t>);</w:t>
-                      </w:r>
-                      <w:proofErr w:type="gramEnd"/>
+                        <w:t>('balloon', 'balloon.png');</w:t>
+                      </w:r>
                     </w:p>
                     <w:p>
                       <w:r>
@@ -4518,25 +4111,12 @@
                         <w:t xml:space="preserve">    </w:t>
                       </w:r>
                       <w:proofErr w:type="spellStart"/>
-                      <w:proofErr w:type="gramStart"/>
-                      <w:r>
-                        <w:t>this.load</w:t>
-                      </w:r>
-                      <w:proofErr w:type="gramEnd"/>
-                      <w:r>
-                        <w:t>.</w:t>
-                      </w:r>
-                      <w:proofErr w:type="gramStart"/>
-                      <w:r>
-                        <w:t>spritesheet</w:t>
+                      <w:r>
+                        <w:t>this.load.spritesheet</w:t>
                       </w:r>
                       <w:proofErr w:type="spellEnd"/>
                       <w:r>
-                        <w:t>(</w:t>
-                      </w:r>
-                      <w:proofErr w:type="gramEnd"/>
-                      <w:r>
-                        <w:t>'</w:t>
+                        <w:t>('</w:t>
                       </w:r>
                       <w:proofErr w:type="spellStart"/>
                       <w:r>
@@ -4623,23 +4203,39 @@
       </w:r>
       <w:r>
         <w:rPr>
+          <w:rFonts w:ascii="C64 Pro Mono" w:hAnsi="C64 Pro Mono" w:cstheme="majorBidi"/>
+          <w:color w:val="FFFFFF" w:themeColor="background1"/>
+        </w:rPr>
+        <w:lastRenderedPageBreak/>
+        <w:t>Animating player</w:t>
+      </w:r>
+    </w:p>
+    <w:p>
+      <w:pPr>
+        <w:jc w:val="both"/>
+        <w:rPr>
+          <w:rFonts w:ascii="C64 Pro Mono" w:hAnsi="C64 Pro Mono" w:cstheme="majorBidi"/>
+          <w:color w:val="FFFFFF" w:themeColor="background1"/>
+        </w:rPr>
+      </w:pPr>
+      <w:r>
+        <w:rPr>
           <w:rFonts w:asciiTheme="majorBidi" w:hAnsiTheme="majorBidi" w:cstheme="majorBidi"/>
           <w:noProof/>
           <w:color w:val="FFFFFF" w:themeColor="background1"/>
           <w:sz w:val="16"/>
           <w:szCs w:val="16"/>
         </w:rPr>
-        <w:lastRenderedPageBreak/>
         <mc:AlternateContent>
           <mc:Choice Requires="wps">
             <w:drawing>
-              <wp:anchor distT="45720" distB="45720" distL="114300" distR="114300" simplePos="0" relativeHeight="251681792" behindDoc="0" locked="0" layoutInCell="1" allowOverlap="1" wp14:anchorId="66EE4AA1" wp14:editId="2E723CA2">
+              <wp:anchor distT="45720" distB="45720" distL="114300" distR="114300" simplePos="0" relativeHeight="251681792" behindDoc="0" locked="0" layoutInCell="1" allowOverlap="1" wp14:anchorId="66EE4AA1" wp14:editId="3709F359">
                 <wp:simplePos x="0" y="0"/>
                 <wp:positionH relativeFrom="margin">
-                  <wp:align>right</wp:align>
+                  <wp:posOffset>-288290</wp:posOffset>
                 </wp:positionH>
                 <wp:positionV relativeFrom="paragraph">
-                  <wp:posOffset>346075</wp:posOffset>
+                  <wp:posOffset>389656</wp:posOffset>
                 </wp:positionV>
                 <wp:extent cx="6005830" cy="2781300"/>
                 <wp:effectExtent l="0" t="0" r="13970" b="19050"/>
@@ -4680,16 +4276,11 @@
                             <w:r>
                               <w:t xml:space="preserve">function </w:t>
                             </w:r>
-                            <w:proofErr w:type="gramStart"/>
                             <w:r>
                               <w:t>create</w:t>
                             </w:r>
                             <w:r>
-                              <w:t>(</w:t>
-                            </w:r>
-                            <w:proofErr w:type="gramEnd"/>
-                            <w:r>
-                              <w:t>) {</w:t>
+                              <w:t>() {</w:t>
                             </w:r>
                           </w:p>
                           <w:p>
@@ -4712,12 +4303,10 @@
                               <w:t xml:space="preserve">player = </w:t>
                             </w:r>
                             <w:proofErr w:type="spellStart"/>
-                            <w:proofErr w:type="gramStart"/>
                             <w:r>
                               <w:t>this.add.sprite</w:t>
                             </w:r>
                             <w:proofErr w:type="spellEnd"/>
-                            <w:proofErr w:type="gramEnd"/>
                             <w:r>
                               <w:t>(400, 300, '</w:t>
                             </w:r>
@@ -4736,25 +4325,12 @@
                               <w:t xml:space="preserve">    </w:t>
                             </w:r>
                             <w:proofErr w:type="spellStart"/>
-                            <w:proofErr w:type="gramStart"/>
-                            <w:r>
-                              <w:t>this.anims</w:t>
-                            </w:r>
-                            <w:proofErr w:type="gramEnd"/>
-                            <w:r>
-                              <w:t>.</w:t>
-                            </w:r>
-                            <w:proofErr w:type="gramStart"/>
-                            <w:r>
-                              <w:t>create</w:t>
+                            <w:r>
+                              <w:t>this.anims.create</w:t>
                             </w:r>
                             <w:proofErr w:type="spellEnd"/>
                             <w:r>
-                              <w:t>(</w:t>
-                            </w:r>
-                            <w:proofErr w:type="gramEnd"/>
-                            <w:r>
-                              <w:t>{</w:t>
+                              <w:t>({</w:t>
                             </w:r>
                             <w:r>
                               <w:br/>
@@ -4777,25 +4353,12 @@
                               <w:t xml:space="preserve"> frames: </w:t>
                             </w:r>
                             <w:proofErr w:type="spellStart"/>
-                            <w:proofErr w:type="gramStart"/>
-                            <w:r>
-                              <w:t>this.anims</w:t>
-                            </w:r>
-                            <w:proofErr w:type="gramEnd"/>
-                            <w:r>
-                              <w:t>.</w:t>
-                            </w:r>
-                            <w:proofErr w:type="gramStart"/>
-                            <w:r>
-                              <w:t>generateFrameNumbers</w:t>
+                            <w:r>
+                              <w:t>this.anims.generateFrameNumbers</w:t>
                             </w:r>
                             <w:proofErr w:type="spellEnd"/>
                             <w:r>
-                              <w:t>(</w:t>
-                            </w:r>
-                            <w:proofErr w:type="gramEnd"/>
-                            <w:r>
-                              <w:t>'</w:t>
+                              <w:t>('</w:t>
                             </w:r>
                             <w:proofErr w:type="spellStart"/>
                             <w:r>
@@ -4803,15 +4366,7 @@
                             </w:r>
                             <w:proofErr w:type="spellEnd"/>
                             <w:r>
-                              <w:t xml:space="preserve">', </w:t>
-                            </w:r>
-                            <w:proofErr w:type="gramStart"/>
-                            <w:r>
-                              <w:t>{ start</w:t>
-                            </w:r>
-                            <w:proofErr w:type="gramEnd"/>
-                            <w:r>
-                              <w:t>: 0, end: 3 }),</w:t>
+                              <w:t>', { start: 0, end: 3 }),</w:t>
                             </w:r>
                             <w:r>
                               <w:br/>
@@ -4854,12 +4409,10 @@
                               <w:br/>
                             </w:r>
                             <w:proofErr w:type="spellStart"/>
-                            <w:proofErr w:type="gramStart"/>
                             <w:r>
                               <w:t>player.play</w:t>
                             </w:r>
                             <w:proofErr w:type="spellEnd"/>
-                            <w:proofErr w:type="gramEnd"/>
                             <w:r>
                               <w:t>('walk');</w:t>
                             </w:r>
@@ -4887,23 +4440,18 @@
           </mc:Choice>
           <mc:Fallback>
             <w:pict>
-              <v:shape w14:anchorId="66EE4AA1" id="_x0000_s1037" type="#_x0000_t202" style="position:absolute;left:0;text-align:left;margin-left:421.7pt;margin-top:27.25pt;width:472.9pt;height:219pt;z-index:251681792;visibility:visible;mso-wrap-style:square;mso-width-percent:0;mso-height-percent:0;mso-wrap-distance-left:9pt;mso-wrap-distance-top:3.6pt;mso-wrap-distance-right:9pt;mso-wrap-distance-bottom:3.6pt;mso-position-horizontal:right;mso-position-horizontal-relative:margin;mso-position-vertical:absolute;mso-position-vertical-relative:text;mso-width-percent:0;mso-height-percent:0;mso-width-relative:margin;mso-height-relative:margin;v-text-anchor:top" o:gfxdata="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">
+              <v:shape w14:anchorId="66EE4AA1" id="_x0000_s1037" type="#_x0000_t202" style="position:absolute;left:0;text-align:left;margin-left:-22.7pt;margin-top:30.7pt;width:472.9pt;height:219pt;z-index:251681792;visibility:visible;mso-wrap-style:square;mso-width-percent:0;mso-height-percent:0;mso-wrap-distance-left:9pt;mso-wrap-distance-top:3.6pt;mso-wrap-distance-right:9pt;mso-wrap-distance-bottom:3.6pt;mso-position-horizontal:absolute;mso-position-horizontal-relative:margin;mso-position-vertical:absolute;mso-position-vertical-relative:text;mso-width-percent:0;mso-height-percent:0;mso-width-relative:margin;mso-height-relative:margin;v-text-anchor:top" o:gfxdata="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">
                 <v:textbox>
                   <w:txbxContent>
                     <w:p>
                       <w:r>
                         <w:t xml:space="preserve">function </w:t>
                       </w:r>
-                      <w:proofErr w:type="gramStart"/>
                       <w:r>
                         <w:t>create</w:t>
                       </w:r>
                       <w:r>
-                        <w:t>(</w:t>
-                      </w:r>
-                      <w:proofErr w:type="gramEnd"/>
-                      <w:r>
-                        <w:t>) {</w:t>
+                        <w:t>() {</w:t>
                       </w:r>
                     </w:p>
                     <w:p>
@@ -4926,12 +4474,10 @@
                         <w:t xml:space="preserve">player = </w:t>
                       </w:r>
                       <w:proofErr w:type="spellStart"/>
-                      <w:proofErr w:type="gramStart"/>
                       <w:r>
                         <w:t>this.add.sprite</w:t>
                       </w:r>
                       <w:proofErr w:type="spellEnd"/>
-                      <w:proofErr w:type="gramEnd"/>
                       <w:r>
                         <w:t>(400, 300, '</w:t>
                       </w:r>
@@ -4950,25 +4496,12 @@
                         <w:t xml:space="preserve">    </w:t>
                       </w:r>
                       <w:proofErr w:type="spellStart"/>
-                      <w:proofErr w:type="gramStart"/>
-                      <w:r>
-                        <w:t>this.anims</w:t>
-                      </w:r>
-                      <w:proofErr w:type="gramEnd"/>
-                      <w:r>
-                        <w:t>.</w:t>
-                      </w:r>
-                      <w:proofErr w:type="gramStart"/>
-                      <w:r>
-                        <w:t>create</w:t>
+                      <w:r>
+                        <w:t>this.anims.create</w:t>
                       </w:r>
                       <w:proofErr w:type="spellEnd"/>
                       <w:r>
-                        <w:t>(</w:t>
-                      </w:r>
-                      <w:proofErr w:type="gramEnd"/>
-                      <w:r>
-                        <w:t>{</w:t>
+                        <w:t>({</w:t>
                       </w:r>
                       <w:r>
                         <w:br/>
@@ -4991,25 +4524,12 @@
                         <w:t xml:space="preserve"> frames: </w:t>
                       </w:r>
                       <w:proofErr w:type="spellStart"/>
-                      <w:proofErr w:type="gramStart"/>
-                      <w:r>
-                        <w:t>this.anims</w:t>
-                      </w:r>
-                      <w:proofErr w:type="gramEnd"/>
-                      <w:r>
-                        <w:t>.</w:t>
-                      </w:r>
-                      <w:proofErr w:type="gramStart"/>
-                      <w:r>
-                        <w:t>generateFrameNumbers</w:t>
+                      <w:r>
+                        <w:t>this.anims.generateFrameNumbers</w:t>
                       </w:r>
                       <w:proofErr w:type="spellEnd"/>
                       <w:r>
-                        <w:t>(</w:t>
-                      </w:r>
-                      <w:proofErr w:type="gramEnd"/>
-                      <w:r>
-                        <w:t>'</w:t>
+                        <w:t>('</w:t>
                       </w:r>
                       <w:proofErr w:type="spellStart"/>
                       <w:r>
@@ -5017,15 +4537,7 @@
                       </w:r>
                       <w:proofErr w:type="spellEnd"/>
                       <w:r>
-                        <w:t xml:space="preserve">', </w:t>
-                      </w:r>
-                      <w:proofErr w:type="gramStart"/>
-                      <w:r>
-                        <w:t>{ start</w:t>
-                      </w:r>
-                      <w:proofErr w:type="gramEnd"/>
-                      <w:r>
-                        <w:t>: 0, end: 3 }),</w:t>
+                        <w:t>', { start: 0, end: 3 }),</w:t>
                       </w:r>
                       <w:r>
                         <w:br/>
@@ -5068,12 +4580,10 @@
                         <w:br/>
                       </w:r>
                       <w:proofErr w:type="spellStart"/>
-                      <w:proofErr w:type="gramStart"/>
                       <w:r>
                         <w:t>player.play</w:t>
                       </w:r>
                       <w:proofErr w:type="spellEnd"/>
-                      <w:proofErr w:type="gramEnd"/>
                       <w:r>
                         <w:t>('walk');</w:t>
                       </w:r>
@@ -5090,17 +4600,728 @@
           </mc:Fallback>
         </mc:AlternateContent>
       </w:r>
-      <w:r>
+    </w:p>
+    <w:p>
+      <w:pPr>
+        <w:jc w:val="both"/>
         <w:rPr>
           <w:rFonts w:ascii="C64 Pro Mono" w:hAnsi="C64 Pro Mono" w:cstheme="majorBidi"/>
           <w:color w:val="FFFFFF" w:themeColor="background1"/>
         </w:rPr>
-        <w:t>Animating player</w:t>
+      </w:pPr>
+      <w:r>
+        <w:rPr>
+          <w:rFonts w:asciiTheme="majorBidi" w:hAnsiTheme="majorBidi" w:cstheme="majorBidi"/>
+          <w:noProof/>
+          <w:color w:val="FFFFFF" w:themeColor="background1"/>
+          <w:sz w:val="16"/>
+          <w:szCs w:val="16"/>
+        </w:rPr>
+        <w:lastRenderedPageBreak/>
+        <mc:AlternateContent>
+          <mc:Choice Requires="wps">
+            <w:drawing>
+              <wp:anchor distT="45720" distB="45720" distL="114300" distR="114300" simplePos="0" relativeHeight="251685888" behindDoc="0" locked="0" layoutInCell="1" allowOverlap="1" wp14:anchorId="23DCFE4C" wp14:editId="315371D8">
+                <wp:simplePos x="0" y="0"/>
+                <wp:positionH relativeFrom="margin">
+                  <wp:align>left</wp:align>
+                </wp:positionH>
+                <wp:positionV relativeFrom="paragraph">
+                  <wp:posOffset>1876425</wp:posOffset>
+                </wp:positionV>
+                <wp:extent cx="6005830" cy="923925"/>
+                <wp:effectExtent l="0" t="0" r="13970" b="28575"/>
+                <wp:wrapSquare wrapText="bothSides"/>
+                <wp:docPr id="189775150" name="Text Box 2"/>
+                <wp:cNvGraphicFramePr>
+                  <a:graphicFrameLocks xmlns:a="http://schemas.openxmlformats.org/drawingml/2006/main"/>
+                </wp:cNvGraphicFramePr>
+                <a:graphic xmlns:a="http://schemas.openxmlformats.org/drawingml/2006/main">
+                  <a:graphicData uri="http://schemas.microsoft.com/office/word/2010/wordprocessingShape">
+                    <wps:wsp>
+                      <wps:cNvSpPr txBox="1">
+                        <a:spLocks noChangeArrowheads="1"/>
+                      </wps:cNvSpPr>
+                      <wps:spPr bwMode="auto">
+                        <a:xfrm>
+                          <a:off x="0" y="0"/>
+                          <a:ext cx="6005830" cy="923925"/>
+                        </a:xfrm>
+                        <a:prstGeom prst="rect">
+                          <a:avLst/>
+                        </a:prstGeom>
+                        <a:solidFill>
+                          <a:srgbClr val="FFFFFF"/>
+                        </a:solidFill>
+                        <a:ln w="9525">
+                          <a:solidFill>
+                            <a:srgbClr val="000000"/>
+                          </a:solidFill>
+                          <a:miter lim="800000"/>
+                          <a:headEnd/>
+                          <a:tailEnd/>
+                        </a:ln>
+                      </wps:spPr>
+                      <wps:txbx>
+                        <w:txbxContent>
+                          <w:p>
+                            <w:r>
+                              <w:t>f</w:t>
+                            </w:r>
+                            <w:r>
+                              <w:t xml:space="preserve">unction </w:t>
+                            </w:r>
+                            <w:r>
+                              <w:t>update</w:t>
+                            </w:r>
+                            <w:r>
+                              <w:t>(){</w:t>
+                            </w:r>
+                          </w:p>
+                          <w:p>
+                            <w:r>
+                              <w:t xml:space="preserve">     //….</w:t>
+                            </w:r>
+                            <w:r>
+                              <w:br/>
+                              <w:t xml:space="preserve">     </w:t>
+                            </w:r>
+                            <w:proofErr w:type="spellStart"/>
+                            <w:r>
+                              <w:t>check</w:t>
+                            </w:r>
+                            <w:r>
+                              <w:t>Keys</w:t>
+                            </w:r>
+                            <w:proofErr w:type="spellEnd"/>
+                            <w:r>
+                              <w:t>();</w:t>
+                            </w:r>
+                            <w:r>
+                              <w:br/>
+                              <w:t>}</w:t>
+                            </w:r>
+                            <w:r>
+                              <w:br/>
+                            </w:r>
+                            <w:r>
+                              <w:br/>
+                            </w:r>
+                          </w:p>
+                        </w:txbxContent>
+                      </wps:txbx>
+                      <wps:bodyPr rot="0" vert="horz" wrap="square" lIns="91440" tIns="45720" rIns="91440" bIns="45720" anchor="t" anchorCtr="0">
+                        <a:noAutofit/>
+                      </wps:bodyPr>
+                    </wps:wsp>
+                  </a:graphicData>
+                </a:graphic>
+                <wp14:sizeRelH relativeFrom="margin">
+                  <wp14:pctWidth>0</wp14:pctWidth>
+                </wp14:sizeRelH>
+                <wp14:sizeRelV relativeFrom="margin">
+                  <wp14:pctHeight>0</wp14:pctHeight>
+                </wp14:sizeRelV>
+              </wp:anchor>
+            </w:drawing>
+          </mc:Choice>
+          <mc:Fallback>
+            <w:pict>
+              <v:shape w14:anchorId="23DCFE4C" id="_x0000_s1038" type="#_x0000_t202" style="position:absolute;left:0;text-align:left;margin-left:0;margin-top:147.75pt;width:472.9pt;height:72.75pt;z-index:251685888;visibility:visible;mso-wrap-style:square;mso-width-percent:0;mso-height-percent:0;mso-wrap-distance-left:9pt;mso-wrap-distance-top:3.6pt;mso-wrap-distance-right:9pt;mso-wrap-distance-bottom:3.6pt;mso-position-horizontal:left;mso-position-horizontal-relative:margin;mso-position-vertical:absolute;mso-position-vertical-relative:text;mso-width-percent:0;mso-height-percent:0;mso-width-relative:margin;mso-height-relative:margin;v-text-anchor:top" o:gfxdata="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">
+                <v:textbox>
+                  <w:txbxContent>
+                    <w:p>
+                      <w:r>
+                        <w:t>f</w:t>
+                      </w:r>
+                      <w:r>
+                        <w:t xml:space="preserve">unction </w:t>
+                      </w:r>
+                      <w:r>
+                        <w:t>update</w:t>
+                      </w:r>
+                      <w:r>
+                        <w:t>(){</w:t>
+                      </w:r>
+                    </w:p>
+                    <w:p>
+                      <w:r>
+                        <w:t xml:space="preserve">     //….</w:t>
+                      </w:r>
+                      <w:r>
+                        <w:br/>
+                        <w:t xml:space="preserve">     </w:t>
+                      </w:r>
+                      <w:proofErr w:type="spellStart"/>
+                      <w:r>
+                        <w:t>check</w:t>
+                      </w:r>
+                      <w:r>
+                        <w:t>Keys</w:t>
+                      </w:r>
+                      <w:proofErr w:type="spellEnd"/>
+                      <w:r>
+                        <w:t>();</w:t>
+                      </w:r>
+                      <w:r>
+                        <w:br/>
+                        <w:t>}</w:t>
+                      </w:r>
+                      <w:r>
+                        <w:br/>
+                      </w:r>
+                      <w:r>
+                        <w:br/>
+                      </w:r>
+                    </w:p>
+                  </w:txbxContent>
+                </v:textbox>
+                <w10:wrap type="square" anchorx="margin"/>
+              </v:shape>
+            </w:pict>
+          </mc:Fallback>
+        </mc:AlternateContent>
+      </w:r>
+      <w:r>
+        <w:rPr>
+          <w:rFonts w:asciiTheme="majorBidi" w:hAnsiTheme="majorBidi" w:cstheme="majorBidi"/>
+          <w:noProof/>
+          <w:color w:val="FFFFFF" w:themeColor="background1"/>
+          <w:sz w:val="16"/>
+          <w:szCs w:val="16"/>
+        </w:rPr>
+        <mc:AlternateContent>
+          <mc:Choice Requires="wps">
+            <w:drawing>
+              <wp:anchor distT="45720" distB="45720" distL="114300" distR="114300" simplePos="0" relativeHeight="251683840" behindDoc="0" locked="0" layoutInCell="1" allowOverlap="1" wp14:anchorId="64F55B64" wp14:editId="514A81AA">
+                <wp:simplePos x="0" y="0"/>
+                <wp:positionH relativeFrom="margin">
+                  <wp:align>left</wp:align>
+                </wp:positionH>
+                <wp:positionV relativeFrom="paragraph">
+                  <wp:posOffset>296545</wp:posOffset>
+                </wp:positionV>
+                <wp:extent cx="6005830" cy="1318260"/>
+                <wp:effectExtent l="0" t="0" r="13970" b="15240"/>
+                <wp:wrapSquare wrapText="bothSides"/>
+                <wp:docPr id="1211201311" name="Text Box 2"/>
+                <wp:cNvGraphicFramePr>
+                  <a:graphicFrameLocks xmlns:a="http://schemas.openxmlformats.org/drawingml/2006/main"/>
+                </wp:cNvGraphicFramePr>
+                <a:graphic xmlns:a="http://schemas.openxmlformats.org/drawingml/2006/main">
+                  <a:graphicData uri="http://schemas.microsoft.com/office/word/2010/wordprocessingShape">
+                    <wps:wsp>
+                      <wps:cNvSpPr txBox="1">
+                        <a:spLocks noChangeArrowheads="1"/>
+                      </wps:cNvSpPr>
+                      <wps:spPr bwMode="auto">
+                        <a:xfrm>
+                          <a:off x="0" y="0"/>
+                          <a:ext cx="6005830" cy="1318661"/>
+                        </a:xfrm>
+                        <a:prstGeom prst="rect">
+                          <a:avLst/>
+                        </a:prstGeom>
+                        <a:solidFill>
+                          <a:srgbClr val="FFFFFF"/>
+                        </a:solidFill>
+                        <a:ln w="9525">
+                          <a:solidFill>
+                            <a:srgbClr val="000000"/>
+                          </a:solidFill>
+                          <a:miter lim="800000"/>
+                          <a:headEnd/>
+                          <a:tailEnd/>
+                        </a:ln>
+                      </wps:spPr>
+                      <wps:txbx>
+                        <w:txbxContent>
+                          <w:p>
+                            <w:r>
+                              <w:t>let cursors;</w:t>
+                            </w:r>
+                          </w:p>
+                          <w:p>
+                            <w:r>
+                              <w:t>function create(){</w:t>
+                            </w:r>
+                          </w:p>
+                          <w:p>
+                            <w:r>
+                              <w:t xml:space="preserve">     //</w:t>
+                            </w:r>
+                            <w:r>
+                              <w:t>….</w:t>
+                            </w:r>
+                            <w:r>
+                              <w:br/>
+                            </w:r>
+                            <w:r>
+                              <w:t xml:space="preserve">     </w:t>
+                            </w:r>
+                            <w:r>
+                              <w:t xml:space="preserve">cursors = </w:t>
+                            </w:r>
+                            <w:proofErr w:type="spellStart"/>
+                            <w:r>
+                              <w:t>this.input.keyboard.createCursorKeys</w:t>
+                            </w:r>
+                            <w:proofErr w:type="spellEnd"/>
+                            <w:r>
+                              <w:t>();</w:t>
+                            </w:r>
+                            <w:r>
+                              <w:br/>
+                              <w:t>}</w:t>
+                            </w:r>
+                            <w:r>
+                              <w:br/>
+                            </w:r>
+                            <w:r>
+                              <w:br/>
+                            </w:r>
+                          </w:p>
+                        </w:txbxContent>
+                      </wps:txbx>
+                      <wps:bodyPr rot="0" vert="horz" wrap="square" lIns="91440" tIns="45720" rIns="91440" bIns="45720" anchor="t" anchorCtr="0">
+                        <a:noAutofit/>
+                      </wps:bodyPr>
+                    </wps:wsp>
+                  </a:graphicData>
+                </a:graphic>
+                <wp14:sizeRelH relativeFrom="margin">
+                  <wp14:pctWidth>0</wp14:pctWidth>
+                </wp14:sizeRelH>
+                <wp14:sizeRelV relativeFrom="margin">
+                  <wp14:pctHeight>0</wp14:pctHeight>
+                </wp14:sizeRelV>
+              </wp:anchor>
+            </w:drawing>
+          </mc:Choice>
+          <mc:Fallback>
+            <w:pict>
+              <v:shape w14:anchorId="64F55B64" id="_x0000_s1039" type="#_x0000_t202" style="position:absolute;left:0;text-align:left;margin-left:0;margin-top:23.35pt;width:472.9pt;height:103.8pt;z-index:251683840;visibility:visible;mso-wrap-style:square;mso-width-percent:0;mso-height-percent:0;mso-wrap-distance-left:9pt;mso-wrap-distance-top:3.6pt;mso-wrap-distance-right:9pt;mso-wrap-distance-bottom:3.6pt;mso-position-horizontal:left;mso-position-horizontal-relative:margin;mso-position-vertical:absolute;mso-position-vertical-relative:text;mso-width-percent:0;mso-height-percent:0;mso-width-relative:margin;mso-height-relative:margin;v-text-anchor:top" o:gfxdata="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">
+                <v:textbox>
+                  <w:txbxContent>
+                    <w:p>
+                      <w:r>
+                        <w:t>let cursors;</w:t>
+                      </w:r>
+                    </w:p>
+                    <w:p>
+                      <w:r>
+                        <w:t>function create(){</w:t>
+                      </w:r>
+                    </w:p>
+                    <w:p>
+                      <w:r>
+                        <w:t xml:space="preserve">     //</w:t>
+                      </w:r>
+                      <w:r>
+                        <w:t>….</w:t>
+                      </w:r>
+                      <w:r>
+                        <w:br/>
+                      </w:r>
+                      <w:r>
+                        <w:t xml:space="preserve">     </w:t>
+                      </w:r>
+                      <w:r>
+                        <w:t xml:space="preserve">cursors = </w:t>
+                      </w:r>
+                      <w:proofErr w:type="spellStart"/>
+                      <w:r>
+                        <w:t>this.input.keyboard.createCursorKeys</w:t>
+                      </w:r>
+                      <w:proofErr w:type="spellEnd"/>
+                      <w:r>
+                        <w:t>();</w:t>
+                      </w:r>
+                      <w:r>
+                        <w:br/>
+                        <w:t>}</w:t>
+                      </w:r>
+                      <w:r>
+                        <w:br/>
+                      </w:r>
+                      <w:r>
+                        <w:br/>
+                      </w:r>
+                    </w:p>
+                  </w:txbxContent>
+                </v:textbox>
+                <w10:wrap type="square" anchorx="margin"/>
+              </v:shape>
+            </w:pict>
+          </mc:Fallback>
+        </mc:AlternateContent>
+      </w:r>
+      <w:r>
+        <w:rPr>
+          <w:rFonts w:ascii="C64 Pro Mono" w:hAnsi="C64 Pro Mono" w:cstheme="majorBidi"/>
+          <w:color w:val="FFFFFF" w:themeColor="background1"/>
+        </w:rPr>
+        <w:t>Moving player</w:t>
       </w:r>
     </w:p>
     <w:p>
       <w:pPr>
         <w:jc w:val="both"/>
+      </w:pPr>
+    </w:p>
+    <w:p>
+      <w:pPr>
+        <w:jc w:val="both"/>
+      </w:pPr>
+    </w:p>
+    <w:p>
+      <w:pPr>
+        <w:jc w:val="both"/>
+      </w:pPr>
+      <w:r>
+        <w:rPr>
+          <w:rFonts w:asciiTheme="majorBidi" w:hAnsiTheme="majorBidi" w:cstheme="majorBidi"/>
+          <w:noProof/>
+          <w:color w:val="FFFFFF" w:themeColor="background1"/>
+          <w:sz w:val="16"/>
+          <w:szCs w:val="16"/>
+        </w:rPr>
+        <w:lastRenderedPageBreak/>
+        <mc:AlternateContent>
+          <mc:Choice Requires="wps">
+            <w:drawing>
+              <wp:anchor distT="45720" distB="45720" distL="114300" distR="114300" simplePos="0" relativeHeight="251687936" behindDoc="0" locked="0" layoutInCell="1" allowOverlap="1" wp14:anchorId="359EE0BA" wp14:editId="2E32F145">
+                <wp:simplePos x="0" y="0"/>
+                <wp:positionH relativeFrom="margin">
+                  <wp:align>left</wp:align>
+                </wp:positionH>
+                <wp:positionV relativeFrom="paragraph">
+                  <wp:posOffset>134</wp:posOffset>
+                </wp:positionV>
+                <wp:extent cx="6005830" cy="2540635"/>
+                <wp:effectExtent l="0" t="0" r="13970" b="12065"/>
+                <wp:wrapSquare wrapText="bothSides"/>
+                <wp:docPr id="1614762707" name="Text Box 2"/>
+                <wp:cNvGraphicFramePr>
+                  <a:graphicFrameLocks xmlns:a="http://schemas.openxmlformats.org/drawingml/2006/main"/>
+                </wp:cNvGraphicFramePr>
+                <a:graphic xmlns:a="http://schemas.openxmlformats.org/drawingml/2006/main">
+                  <a:graphicData uri="http://schemas.microsoft.com/office/word/2010/wordprocessingShape">
+                    <wps:wsp>
+                      <wps:cNvSpPr txBox="1">
+                        <a:spLocks noChangeArrowheads="1"/>
+                      </wps:cNvSpPr>
+                      <wps:spPr bwMode="auto">
+                        <a:xfrm>
+                          <a:off x="0" y="0"/>
+                          <a:ext cx="6005830" cy="2540635"/>
+                        </a:xfrm>
+                        <a:prstGeom prst="rect">
+                          <a:avLst/>
+                        </a:prstGeom>
+                        <a:solidFill>
+                          <a:srgbClr val="FFFFFF"/>
+                        </a:solidFill>
+                        <a:ln w="9525">
+                          <a:solidFill>
+                            <a:srgbClr val="000000"/>
+                          </a:solidFill>
+                          <a:miter lim="800000"/>
+                          <a:headEnd/>
+                          <a:tailEnd/>
+                        </a:ln>
+                      </wps:spPr>
+                      <wps:txbx>
+                        <w:txbxContent>
+                          <w:p>
+                            <w:r>
+                              <w:t xml:space="preserve">function </w:t>
+                            </w:r>
+                            <w:proofErr w:type="spellStart"/>
+                            <w:r>
+                              <w:t>checkKeys</w:t>
+                            </w:r>
+                            <w:proofErr w:type="spellEnd"/>
+                            <w:r>
+                              <w:t>(){</w:t>
+                            </w:r>
+                            <w:r>
+                              <w:br/>
+                              <w:t xml:space="preserve">   if (</w:t>
+                            </w:r>
+                            <w:proofErr w:type="spellStart"/>
+                            <w:r>
+                              <w:t>cursors.left.isDown</w:t>
+                            </w:r>
+                            <w:proofErr w:type="spellEnd"/>
+                            <w:r>
+                              <w:t>) {</w:t>
+                            </w:r>
+                            <w:r>
+                              <w:br/>
+                              <w:t xml:space="preserve">        </w:t>
+                            </w:r>
+                            <w:proofErr w:type="spellStart"/>
+                            <w:r>
+                              <w:t>player.x</w:t>
+                            </w:r>
+                            <w:proofErr w:type="spellEnd"/>
+                            <w:r>
+                              <w:t xml:space="preserve"> -= 1;</w:t>
+                            </w:r>
+                            <w:r>
+                              <w:br/>
+                              <w:t xml:space="preserve">    } else if (</w:t>
+                            </w:r>
+                            <w:proofErr w:type="spellStart"/>
+                            <w:r>
+                              <w:t>cursors.right.isDown</w:t>
+                            </w:r>
+                            <w:proofErr w:type="spellEnd"/>
+                            <w:r>
+                              <w:t>) {</w:t>
+                            </w:r>
+                            <w:r>
+                              <w:br/>
+                              <w:t xml:space="preserve">        </w:t>
+                            </w:r>
+                            <w:proofErr w:type="spellStart"/>
+                            <w:r>
+                              <w:t>player.x</w:t>
+                            </w:r>
+                            <w:proofErr w:type="spellEnd"/>
+                            <w:r>
+                              <w:t xml:space="preserve"> += 1;</w:t>
+                            </w:r>
+                            <w:r>
+                              <w:br/>
+                              <w:t xml:space="preserve">    }</w:t>
+                            </w:r>
+                            <w:r>
+                              <w:br/>
+                            </w:r>
+                            <w:r>
+                              <w:br/>
+                              <w:t xml:space="preserve">    if (</w:t>
+                            </w:r>
+                            <w:proofErr w:type="spellStart"/>
+                            <w:r>
+                              <w:t>cursors.up.isDown</w:t>
+                            </w:r>
+                            <w:proofErr w:type="spellEnd"/>
+                            <w:r>
+                              <w:t>) {</w:t>
+                            </w:r>
+                            <w:r>
+                              <w:br/>
+                              <w:t xml:space="preserve">        </w:t>
+                            </w:r>
+                            <w:proofErr w:type="spellStart"/>
+                            <w:r>
+                              <w:t>player.y</w:t>
+                            </w:r>
+                            <w:proofErr w:type="spellEnd"/>
+                            <w:r>
+                              <w:t xml:space="preserve"> -= 1;</w:t>
+                            </w:r>
+                            <w:r>
+                              <w:br/>
+                              <w:t xml:space="preserve">    } else if (</w:t>
+                            </w:r>
+                            <w:proofErr w:type="spellStart"/>
+                            <w:r>
+                              <w:t>cursors.down.isDown</w:t>
+                            </w:r>
+                            <w:proofErr w:type="spellEnd"/>
+                            <w:r>
+                              <w:t>) {</w:t>
+                            </w:r>
+                            <w:r>
+                              <w:br/>
+                              <w:t xml:space="preserve">        </w:t>
+                            </w:r>
+                            <w:proofErr w:type="spellStart"/>
+                            <w:r>
+                              <w:t>player.y</w:t>
+                            </w:r>
+                            <w:proofErr w:type="spellEnd"/>
+                            <w:r>
+                              <w:t xml:space="preserve"> += 1;</w:t>
+                            </w:r>
+                            <w:r>
+                              <w:br/>
+                              <w:t xml:space="preserve">    }</w:t>
+                            </w:r>
+                            <w:r>
+                              <w:br/>
+                              <w:t>}</w:t>
+                            </w:r>
+                          </w:p>
+                          <w:p/>
+                        </w:txbxContent>
+                      </wps:txbx>
+                      <wps:bodyPr rot="0" vert="horz" wrap="square" lIns="91440" tIns="45720" rIns="91440" bIns="45720" anchor="t" anchorCtr="0">
+                        <a:noAutofit/>
+                      </wps:bodyPr>
+                    </wps:wsp>
+                  </a:graphicData>
+                </a:graphic>
+                <wp14:sizeRelH relativeFrom="margin">
+                  <wp14:pctWidth>0</wp14:pctWidth>
+                </wp14:sizeRelH>
+                <wp14:sizeRelV relativeFrom="margin">
+                  <wp14:pctHeight>0</wp14:pctHeight>
+                </wp14:sizeRelV>
+              </wp:anchor>
+            </w:drawing>
+          </mc:Choice>
+          <mc:Fallback>
+            <w:pict>
+              <v:shape w14:anchorId="359EE0BA" id="_x0000_s1040" type="#_x0000_t202" style="position:absolute;left:0;text-align:left;margin-left:0;margin-top:0;width:472.9pt;height:200.05pt;z-index:251687936;visibility:visible;mso-wrap-style:square;mso-width-percent:0;mso-height-percent:0;mso-wrap-distance-left:9pt;mso-wrap-distance-top:3.6pt;mso-wrap-distance-right:9pt;mso-wrap-distance-bottom:3.6pt;mso-position-horizontal:left;mso-position-horizontal-relative:margin;mso-position-vertical:absolute;mso-position-vertical-relative:text;mso-width-percent:0;mso-height-percent:0;mso-width-relative:margin;mso-height-relative:margin;v-text-anchor:top" o:gfxdata="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">
+                <v:textbox>
+                  <w:txbxContent>
+                    <w:p>
+                      <w:r>
+                        <w:t xml:space="preserve">function </w:t>
+                      </w:r>
+                      <w:proofErr w:type="spellStart"/>
+                      <w:r>
+                        <w:t>checkKeys</w:t>
+                      </w:r>
+                      <w:proofErr w:type="spellEnd"/>
+                      <w:r>
+                        <w:t>(){</w:t>
+                      </w:r>
+                      <w:r>
+                        <w:br/>
+                        <w:t xml:space="preserve">   if (</w:t>
+                      </w:r>
+                      <w:proofErr w:type="spellStart"/>
+                      <w:r>
+                        <w:t>cursors.left.isDown</w:t>
+                      </w:r>
+                      <w:proofErr w:type="spellEnd"/>
+                      <w:r>
+                        <w:t>) {</w:t>
+                      </w:r>
+                      <w:r>
+                        <w:br/>
+                        <w:t xml:space="preserve">        </w:t>
+                      </w:r>
+                      <w:proofErr w:type="spellStart"/>
+                      <w:r>
+                        <w:t>player.x</w:t>
+                      </w:r>
+                      <w:proofErr w:type="spellEnd"/>
+                      <w:r>
+                        <w:t xml:space="preserve"> -= 1;</w:t>
+                      </w:r>
+                      <w:r>
+                        <w:br/>
+                        <w:t xml:space="preserve">    } else if (</w:t>
+                      </w:r>
+                      <w:proofErr w:type="spellStart"/>
+                      <w:r>
+                        <w:t>cursors.right.isDown</w:t>
+                      </w:r>
+                      <w:proofErr w:type="spellEnd"/>
+                      <w:r>
+                        <w:t>) {</w:t>
+                      </w:r>
+                      <w:r>
+                        <w:br/>
+                        <w:t xml:space="preserve">        </w:t>
+                      </w:r>
+                      <w:proofErr w:type="spellStart"/>
+                      <w:r>
+                        <w:t>player.x</w:t>
+                      </w:r>
+                      <w:proofErr w:type="spellEnd"/>
+                      <w:r>
+                        <w:t xml:space="preserve"> += 1;</w:t>
+                      </w:r>
+                      <w:r>
+                        <w:br/>
+                        <w:t xml:space="preserve">    }</w:t>
+                      </w:r>
+                      <w:r>
+                        <w:br/>
+                      </w:r>
+                      <w:r>
+                        <w:br/>
+                        <w:t xml:space="preserve">    if (</w:t>
+                      </w:r>
+                      <w:proofErr w:type="spellStart"/>
+                      <w:r>
+                        <w:t>cursors.up.isDown</w:t>
+                      </w:r>
+                      <w:proofErr w:type="spellEnd"/>
+                      <w:r>
+                        <w:t>) {</w:t>
+                      </w:r>
+                      <w:r>
+                        <w:br/>
+                        <w:t xml:space="preserve">        </w:t>
+                      </w:r>
+                      <w:proofErr w:type="spellStart"/>
+                      <w:r>
+                        <w:t>player.y</w:t>
+                      </w:r>
+                      <w:proofErr w:type="spellEnd"/>
+                      <w:r>
+                        <w:t xml:space="preserve"> -= 1;</w:t>
+                      </w:r>
+                      <w:r>
+                        <w:br/>
+                        <w:t xml:space="preserve">    } else if (</w:t>
+                      </w:r>
+                      <w:proofErr w:type="spellStart"/>
+                      <w:r>
+                        <w:t>cursors.down.isDown</w:t>
+                      </w:r>
+                      <w:proofErr w:type="spellEnd"/>
+                      <w:r>
+                        <w:t>) {</w:t>
+                      </w:r>
+                      <w:r>
+                        <w:br/>
+                        <w:t xml:space="preserve">        </w:t>
+                      </w:r>
+                      <w:proofErr w:type="spellStart"/>
+                      <w:r>
+                        <w:t>player.y</w:t>
+                      </w:r>
+                      <w:proofErr w:type="spellEnd"/>
+                      <w:r>
+                        <w:t xml:space="preserve"> += 1;</w:t>
+                      </w:r>
+                      <w:r>
+                        <w:br/>
+                        <w:t xml:space="preserve">    }</w:t>
+                      </w:r>
+                      <w:r>
+                        <w:br/>
+                        <w:t>}</w:t>
+                      </w:r>
+                    </w:p>
+                    <w:p/>
+                  </w:txbxContent>
+                </v:textbox>
+                <w10:wrap type="square" anchorx="margin"/>
+              </v:shape>
+            </w:pict>
+          </mc:Fallback>
+        </mc:AlternateContent>
+      </w:r>
+    </w:p>
+    <w:p>
+      <w:pPr>
+        <w:jc w:val="both"/>
+      </w:pPr>
+    </w:p>
+    <w:p>
+      <w:pPr>
+        <w:jc w:val="both"/>
         <w:rPr>
           <w:rFonts w:ascii="C64 Pro Mono" w:hAnsi="C64 Pro Mono" w:cstheme="majorBidi"/>
           <w:color w:val="FFFFFF" w:themeColor="background1"/>
@@ -5117,12 +5338,627 @@
       </w:pPr>
       <w:r>
         <w:rPr>
+          <w:rFonts w:asciiTheme="majorBidi" w:hAnsiTheme="majorBidi" w:cstheme="majorBidi"/>
+          <w:noProof/>
+          <w:color w:val="FFFFFF" w:themeColor="background1"/>
+          <w:sz w:val="16"/>
+          <w:szCs w:val="16"/>
+        </w:rPr>
+        <w:lastRenderedPageBreak/>
+        <mc:AlternateContent>
+          <mc:Choice Requires="wps">
+            <w:drawing>
+              <wp:anchor distT="45720" distB="45720" distL="114300" distR="114300" simplePos="0" relativeHeight="251689984" behindDoc="0" locked="0" layoutInCell="1" allowOverlap="1" wp14:anchorId="509B0EF3" wp14:editId="5A4B81E8">
+                <wp:simplePos x="0" y="0"/>
+                <wp:positionH relativeFrom="margin">
+                  <wp:align>left</wp:align>
+                </wp:positionH>
+                <wp:positionV relativeFrom="paragraph">
+                  <wp:posOffset>384843</wp:posOffset>
+                </wp:positionV>
+                <wp:extent cx="6005830" cy="1655445"/>
+                <wp:effectExtent l="0" t="0" r="13970" b="20955"/>
+                <wp:wrapSquare wrapText="bothSides"/>
+                <wp:docPr id="514016864" name="Text Box 2"/>
+                <wp:cNvGraphicFramePr>
+                  <a:graphicFrameLocks xmlns:a="http://schemas.openxmlformats.org/drawingml/2006/main"/>
+                </wp:cNvGraphicFramePr>
+                <a:graphic xmlns:a="http://schemas.openxmlformats.org/drawingml/2006/main">
+                  <a:graphicData uri="http://schemas.microsoft.com/office/word/2010/wordprocessingShape">
+                    <wps:wsp>
+                      <wps:cNvSpPr txBox="1">
+                        <a:spLocks noChangeArrowheads="1"/>
+                      </wps:cNvSpPr>
+                      <wps:spPr bwMode="auto">
+                        <a:xfrm>
+                          <a:off x="0" y="0"/>
+                          <a:ext cx="6005830" cy="1655445"/>
+                        </a:xfrm>
+                        <a:prstGeom prst="rect">
+                          <a:avLst/>
+                        </a:prstGeom>
+                        <a:solidFill>
+                          <a:srgbClr val="FFFFFF"/>
+                        </a:solidFill>
+                        <a:ln w="9525">
+                          <a:solidFill>
+                            <a:srgbClr val="000000"/>
+                          </a:solidFill>
+                          <a:miter lim="800000"/>
+                          <a:headEnd/>
+                          <a:tailEnd/>
+                        </a:ln>
+                      </wps:spPr>
+                      <wps:txbx>
+                        <w:txbxContent>
+                          <w:p>
+                            <w:r>
+                              <w:t xml:space="preserve">function </w:t>
+                            </w:r>
+                            <w:proofErr w:type="spellStart"/>
+                            <w:r>
+                              <w:t>checkHit</w:t>
+                            </w:r>
+                            <w:proofErr w:type="spellEnd"/>
+                            <w:r>
+                              <w:t>(sprite){</w:t>
+                            </w:r>
+                            <w:r>
+                              <w:br/>
+                              <w:t xml:space="preserve">    let d = </w:t>
+                            </w:r>
+                            <w:proofErr w:type="spellStart"/>
+                            <w:r>
+                              <w:t>Phaser.Math.Distance.Between</w:t>
+                            </w:r>
+                            <w:proofErr w:type="spellEnd"/>
+                            <w:r>
+                              <w:t>(</w:t>
+                            </w:r>
+                            <w:proofErr w:type="spellStart"/>
+                            <w:r>
+                              <w:t>sprite.x</w:t>
+                            </w:r>
+                            <w:proofErr w:type="spellEnd"/>
+                            <w:r>
+                              <w:t xml:space="preserve"> + </w:t>
+                            </w:r>
+                            <w:proofErr w:type="spellStart"/>
+                            <w:r>
+                              <w:t>sprite.width</w:t>
+                            </w:r>
+                            <w:proofErr w:type="spellEnd"/>
+                            <w:r>
+                              <w:t xml:space="preserve">/2, </w:t>
+                            </w:r>
+                            <w:proofErr w:type="spellStart"/>
+                            <w:r>
+                              <w:t>sprite.y</w:t>
+                            </w:r>
+                            <w:proofErr w:type="spellEnd"/>
+                            <w:r>
+                              <w:t xml:space="preserve"> + </w:t>
+                            </w:r>
+                            <w:proofErr w:type="spellStart"/>
+                            <w:r>
+                              <w:t>sprite.height</w:t>
+                            </w:r>
+                            <w:proofErr w:type="spellEnd"/>
+                            <w:r>
+                              <w:t>/2</w:t>
+                            </w:r>
+                            <w:r>
+                              <w:br/>
+                              <w:t xml:space="preserve">        , </w:t>
+                            </w:r>
+                            <w:proofErr w:type="spellStart"/>
+                            <w:r>
+                              <w:t>player.x</w:t>
+                            </w:r>
+                            <w:proofErr w:type="spellEnd"/>
+                            <w:r>
+                              <w:t xml:space="preserve"> + </w:t>
+                            </w:r>
+                            <w:proofErr w:type="spellStart"/>
+                            <w:r>
+                              <w:t>player.width</w:t>
+                            </w:r>
+                            <w:proofErr w:type="spellEnd"/>
+                            <w:r>
+                              <w:t xml:space="preserve">/2, </w:t>
+                            </w:r>
+                            <w:proofErr w:type="spellStart"/>
+                            <w:r>
+                              <w:t>player.y</w:t>
+                            </w:r>
+                            <w:proofErr w:type="spellEnd"/>
+                            <w:r>
+                              <w:t xml:space="preserve"> + </w:t>
+                            </w:r>
+                            <w:proofErr w:type="spellStart"/>
+                            <w:r>
+                              <w:t>player.height</w:t>
+                            </w:r>
+                            <w:proofErr w:type="spellEnd"/>
+                            <w:r>
+                              <w:t>/2);</w:t>
+                            </w:r>
+                            <w:r>
+                              <w:br/>
+                            </w:r>
+                            <w:r>
+                              <w:br/>
+                              <w:t xml:space="preserve">    if (d &lt; 20){</w:t>
+                            </w:r>
+                            <w:r>
+                              <w:br/>
+                              <w:t xml:space="preserve">        </w:t>
+                            </w:r>
+                            <w:proofErr w:type="spellStart"/>
+                            <w:r>
+                              <w:t>sprite.y</w:t>
+                            </w:r>
+                            <w:proofErr w:type="spellEnd"/>
+                            <w:r>
+                              <w:t xml:space="preserve"> = </w:t>
+                            </w:r>
+                            <w:proofErr w:type="spellStart"/>
+                            <w:r>
+                              <w:t>Math.pow</w:t>
+                            </w:r>
+                            <w:proofErr w:type="spellEnd"/>
+                            <w:r>
+                              <w:t>(10,16);</w:t>
+                            </w:r>
+                            <w:r>
+                              <w:br/>
+                              <w:t xml:space="preserve">    }</w:t>
+                            </w:r>
+                            <w:r>
+                              <w:br/>
+                              <w:t>}</w:t>
+                            </w:r>
+                          </w:p>
+                          <w:p/>
+                        </w:txbxContent>
+                      </wps:txbx>
+                      <wps:bodyPr rot="0" vert="horz" wrap="square" lIns="91440" tIns="45720" rIns="91440" bIns="45720" anchor="t" anchorCtr="0">
+                        <a:noAutofit/>
+                      </wps:bodyPr>
+                    </wps:wsp>
+                  </a:graphicData>
+                </a:graphic>
+                <wp14:sizeRelH relativeFrom="margin">
+                  <wp14:pctWidth>0</wp14:pctWidth>
+                </wp14:sizeRelH>
+                <wp14:sizeRelV relativeFrom="margin">
+                  <wp14:pctHeight>0</wp14:pctHeight>
+                </wp14:sizeRelV>
+              </wp:anchor>
+            </w:drawing>
+          </mc:Choice>
+          <mc:Fallback>
+            <w:pict>
+              <v:shape w14:anchorId="509B0EF3" id="_x0000_s1041" type="#_x0000_t202" style="position:absolute;left:0;text-align:left;margin-left:0;margin-top:30.3pt;width:472.9pt;height:130.35pt;z-index:251689984;visibility:visible;mso-wrap-style:square;mso-width-percent:0;mso-height-percent:0;mso-wrap-distance-left:9pt;mso-wrap-distance-top:3.6pt;mso-wrap-distance-right:9pt;mso-wrap-distance-bottom:3.6pt;mso-position-horizontal:left;mso-position-horizontal-relative:margin;mso-position-vertical:absolute;mso-position-vertical-relative:text;mso-width-percent:0;mso-height-percent:0;mso-width-relative:margin;mso-height-relative:margin;v-text-anchor:top" o:gfxdata="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">
+                <v:textbox>
+                  <w:txbxContent>
+                    <w:p>
+                      <w:r>
+                        <w:t xml:space="preserve">function </w:t>
+                      </w:r>
+                      <w:proofErr w:type="spellStart"/>
+                      <w:r>
+                        <w:t>checkHit</w:t>
+                      </w:r>
+                      <w:proofErr w:type="spellEnd"/>
+                      <w:r>
+                        <w:t>(sprite){</w:t>
+                      </w:r>
+                      <w:r>
+                        <w:br/>
+                        <w:t xml:space="preserve">    let d = </w:t>
+                      </w:r>
+                      <w:proofErr w:type="spellStart"/>
+                      <w:r>
+                        <w:t>Phaser.Math.Distance.Between</w:t>
+                      </w:r>
+                      <w:proofErr w:type="spellEnd"/>
+                      <w:r>
+                        <w:t>(</w:t>
+                      </w:r>
+                      <w:proofErr w:type="spellStart"/>
+                      <w:r>
+                        <w:t>sprite.x</w:t>
+                      </w:r>
+                      <w:proofErr w:type="spellEnd"/>
+                      <w:r>
+                        <w:t xml:space="preserve"> + </w:t>
+                      </w:r>
+                      <w:proofErr w:type="spellStart"/>
+                      <w:r>
+                        <w:t>sprite.width</w:t>
+                      </w:r>
+                      <w:proofErr w:type="spellEnd"/>
+                      <w:r>
+                        <w:t xml:space="preserve">/2, </w:t>
+                      </w:r>
+                      <w:proofErr w:type="spellStart"/>
+                      <w:r>
+                        <w:t>sprite.y</w:t>
+                      </w:r>
+                      <w:proofErr w:type="spellEnd"/>
+                      <w:r>
+                        <w:t xml:space="preserve"> + </w:t>
+                      </w:r>
+                      <w:proofErr w:type="spellStart"/>
+                      <w:r>
+                        <w:t>sprite.height</w:t>
+                      </w:r>
+                      <w:proofErr w:type="spellEnd"/>
+                      <w:r>
+                        <w:t>/2</w:t>
+                      </w:r>
+                      <w:r>
+                        <w:br/>
+                        <w:t xml:space="preserve">        , </w:t>
+                      </w:r>
+                      <w:proofErr w:type="spellStart"/>
+                      <w:r>
+                        <w:t>player.x</w:t>
+                      </w:r>
+                      <w:proofErr w:type="spellEnd"/>
+                      <w:r>
+                        <w:t xml:space="preserve"> + </w:t>
+                      </w:r>
+                      <w:proofErr w:type="spellStart"/>
+                      <w:r>
+                        <w:t>player.width</w:t>
+                      </w:r>
+                      <w:proofErr w:type="spellEnd"/>
+                      <w:r>
+                        <w:t xml:space="preserve">/2, </w:t>
+                      </w:r>
+                      <w:proofErr w:type="spellStart"/>
+                      <w:r>
+                        <w:t>player.y</w:t>
+                      </w:r>
+                      <w:proofErr w:type="spellEnd"/>
+                      <w:r>
+                        <w:t xml:space="preserve"> + </w:t>
+                      </w:r>
+                      <w:proofErr w:type="spellStart"/>
+                      <w:r>
+                        <w:t>player.height</w:t>
+                      </w:r>
+                      <w:proofErr w:type="spellEnd"/>
+                      <w:r>
+                        <w:t>/2);</w:t>
+                      </w:r>
+                      <w:r>
+                        <w:br/>
+                      </w:r>
+                      <w:r>
+                        <w:br/>
+                        <w:t xml:space="preserve">    if (d &lt; 20){</w:t>
+                      </w:r>
+                      <w:r>
+                        <w:br/>
+                        <w:t xml:space="preserve">        </w:t>
+                      </w:r>
+                      <w:proofErr w:type="spellStart"/>
+                      <w:r>
+                        <w:t>sprite.y</w:t>
+                      </w:r>
+                      <w:proofErr w:type="spellEnd"/>
+                      <w:r>
+                        <w:t xml:space="preserve"> = </w:t>
+                      </w:r>
+                      <w:proofErr w:type="spellStart"/>
+                      <w:r>
+                        <w:t>Math.pow</w:t>
+                      </w:r>
+                      <w:proofErr w:type="spellEnd"/>
+                      <w:r>
+                        <w:t>(10,16);</w:t>
+                      </w:r>
+                      <w:r>
+                        <w:br/>
+                        <w:t xml:space="preserve">    }</w:t>
+                      </w:r>
+                      <w:r>
+                        <w:br/>
+                        <w:t>}</w:t>
+                      </w:r>
+                    </w:p>
+                    <w:p/>
+                  </w:txbxContent>
+                </v:textbox>
+                <w10:wrap type="square" anchorx="margin"/>
+              </v:shape>
+            </w:pict>
+          </mc:Fallback>
+        </mc:AlternateContent>
+      </w:r>
+      <w:r>
+        <w:rPr>
           <w:rFonts w:ascii="C64 Pro Mono" w:hAnsi="C64 Pro Mono" w:cstheme="majorBidi"/>
           <w:color w:val="FFFFFF" w:themeColor="background1"/>
         </w:rPr>
+        <w:t>2.9 Collisions</w:t>
+      </w:r>
+    </w:p>
+    <w:p>
+      <w:pPr>
+        <w:jc w:val="both"/>
+        <w:rPr>
+          <w:rFonts w:ascii="C64 Pro Mono" w:hAnsi="C64 Pro Mono" w:cstheme="majorBidi"/>
+          <w:color w:val="FFFFFF" w:themeColor="background1"/>
+        </w:rPr>
+      </w:pPr>
+    </w:p>
+    <w:p>
+      <w:pPr>
+        <w:rPr>
+          <w:rFonts w:ascii="C64 Pro Mono" w:hAnsi="C64 Pro Mono" w:cstheme="majorBidi"/>
+          <w:color w:val="FFFFFF" w:themeColor="background1"/>
+        </w:rPr>
+      </w:pPr>
+      <w:r>
+        <w:rPr>
+          <w:rFonts w:ascii="C64 Pro Mono" w:hAnsi="C64 Pro Mono" w:cstheme="majorBidi"/>
+          <w:color w:val="FFFFFF" w:themeColor="background1"/>
+        </w:rPr>
+        <w:br w:type="page"/>
+      </w:r>
+    </w:p>
+    <w:p>
+      <w:pPr>
+        <w:jc w:val="both"/>
+        <w:rPr>
+          <w:rFonts w:ascii="C64 Pro Mono" w:hAnsi="C64 Pro Mono" w:cstheme="majorBidi"/>
+          <w:color w:val="FFFFFF" w:themeColor="background1"/>
+        </w:rPr>
+      </w:pPr>
+      <w:r>
+        <w:rPr>
+          <w:rFonts w:ascii="C64 Pro Mono" w:hAnsi="C64 Pro Mono" w:cstheme="majorBidi"/>
+          <w:color w:val="FFFFFF" w:themeColor="background1"/>
+        </w:rPr>
         <w:lastRenderedPageBreak/>
-        <w:t>Moving player</w:t>
-      </w:r>
+        <w:t>2.10 Score</w:t>
+      </w:r>
+    </w:p>
+    <w:p>
+      <w:pPr>
+        <w:jc w:val="both"/>
+        <w:rPr>
+          <w:rFonts w:ascii="C64 Pro Mono" w:hAnsi="C64 Pro Mono" w:cstheme="majorBidi"/>
+          <w:color w:val="FFFFFF" w:themeColor="background1"/>
+        </w:rPr>
+      </w:pPr>
+      <w:r>
+        <w:rPr>
+          <w:rFonts w:asciiTheme="majorBidi" w:hAnsiTheme="majorBidi" w:cstheme="majorBidi"/>
+          <w:noProof/>
+          <w:color w:val="FFFFFF" w:themeColor="background1"/>
+          <w:sz w:val="16"/>
+          <w:szCs w:val="16"/>
+        </w:rPr>
+        <mc:AlternateContent>
+          <mc:Choice Requires="wps">
+            <w:drawing>
+              <wp:anchor distT="45720" distB="45720" distL="114300" distR="114300" simplePos="0" relativeHeight="251692032" behindDoc="0" locked="0" layoutInCell="1" allowOverlap="1" wp14:anchorId="5DF22489" wp14:editId="2D709096">
+                <wp:simplePos x="0" y="0"/>
+                <wp:positionH relativeFrom="margin">
+                  <wp:align>left</wp:align>
+                </wp:positionH>
+                <wp:positionV relativeFrom="paragraph">
+                  <wp:posOffset>296545</wp:posOffset>
+                </wp:positionV>
+                <wp:extent cx="6005830" cy="2040255"/>
+                <wp:effectExtent l="0" t="0" r="13970" b="17145"/>
+                <wp:wrapSquare wrapText="bothSides"/>
+                <wp:docPr id="1917304863" name="Text Box 2"/>
+                <wp:cNvGraphicFramePr>
+                  <a:graphicFrameLocks xmlns:a="http://schemas.openxmlformats.org/drawingml/2006/main"/>
+                </wp:cNvGraphicFramePr>
+                <a:graphic xmlns:a="http://schemas.openxmlformats.org/drawingml/2006/main">
+                  <a:graphicData uri="http://schemas.microsoft.com/office/word/2010/wordprocessingShape">
+                    <wps:wsp>
+                      <wps:cNvSpPr txBox="1">
+                        <a:spLocks noChangeArrowheads="1"/>
+                      </wps:cNvSpPr>
+                      <wps:spPr bwMode="auto">
+                        <a:xfrm>
+                          <a:off x="0" y="0"/>
+                          <a:ext cx="6005830" cy="2040255"/>
+                        </a:xfrm>
+                        <a:prstGeom prst="rect">
+                          <a:avLst/>
+                        </a:prstGeom>
+                        <a:solidFill>
+                          <a:srgbClr val="FFFFFF"/>
+                        </a:solidFill>
+                        <a:ln w="9525">
+                          <a:solidFill>
+                            <a:srgbClr val="000000"/>
+                          </a:solidFill>
+                          <a:miter lim="800000"/>
+                          <a:headEnd/>
+                          <a:tailEnd/>
+                        </a:ln>
+                      </wps:spPr>
+                      <wps:txbx>
+                        <w:txbxContent>
+                          <w:p>
+                            <w:r>
+                              <w:t>&lt;div id="score"&gt;SCORE: 0&lt;/div&gt;</w:t>
+                            </w:r>
+                          </w:p>
+                          <w:p/>
+                          <w:p>
+                            <w:r>
+                              <w:t>…………</w:t>
+                            </w:r>
+                          </w:p>
+                          <w:p>
+                            <w:r>
+                              <w:t xml:space="preserve">function </w:t>
+                            </w:r>
+                            <w:proofErr w:type="spellStart"/>
+                            <w:r>
+                              <w:t>increaseScore</w:t>
+                            </w:r>
+                            <w:proofErr w:type="spellEnd"/>
+                            <w:r>
+                              <w:t>(){</w:t>
+                            </w:r>
+                            <w:r>
+                              <w:br/>
+                              <w:t xml:space="preserve">    score++;</w:t>
+                            </w:r>
+                            <w:r>
+                              <w:br/>
+                              <w:t xml:space="preserve">    const </w:t>
+                            </w:r>
+                            <w:proofErr w:type="spellStart"/>
+                            <w:r>
+                              <w:t>scoreDiv</w:t>
+                            </w:r>
+                            <w:proofErr w:type="spellEnd"/>
+                            <w:r>
+                              <w:t xml:space="preserve"> = </w:t>
+                            </w:r>
+                            <w:proofErr w:type="spellStart"/>
+                            <w:r>
+                              <w:t>document.getElementById</w:t>
+                            </w:r>
+                            <w:proofErr w:type="spellEnd"/>
+                            <w:r>
+                              <w:t>('score');</w:t>
+                            </w:r>
+                            <w:r>
+                              <w:br/>
+                              <w:t xml:space="preserve">    </w:t>
+                            </w:r>
+                            <w:proofErr w:type="spellStart"/>
+                            <w:r>
+                              <w:t>scoreDiv.innerText</w:t>
+                            </w:r>
+                            <w:proofErr w:type="spellEnd"/>
+                            <w:r>
+                              <w:t xml:space="preserve"> = 'SCORE: ' + score;</w:t>
+                            </w:r>
+                            <w:r>
+                              <w:br/>
+                              <w:t>}</w:t>
+                            </w:r>
+                          </w:p>
+                          <w:p/>
+                        </w:txbxContent>
+                      </wps:txbx>
+                      <wps:bodyPr rot="0" vert="horz" wrap="square" lIns="91440" tIns="45720" rIns="91440" bIns="45720" anchor="t" anchorCtr="0">
+                        <a:noAutofit/>
+                      </wps:bodyPr>
+                    </wps:wsp>
+                  </a:graphicData>
+                </a:graphic>
+                <wp14:sizeRelH relativeFrom="margin">
+                  <wp14:pctWidth>0</wp14:pctWidth>
+                </wp14:sizeRelH>
+                <wp14:sizeRelV relativeFrom="margin">
+                  <wp14:pctHeight>0</wp14:pctHeight>
+                </wp14:sizeRelV>
+              </wp:anchor>
+            </w:drawing>
+          </mc:Choice>
+          <mc:Fallback>
+            <w:pict>
+              <v:shape w14:anchorId="5DF22489" id="_x0000_s1042" type="#_x0000_t202" style="position:absolute;left:0;text-align:left;margin-left:0;margin-top:23.35pt;width:472.9pt;height:160.65pt;z-index:251692032;visibility:visible;mso-wrap-style:square;mso-width-percent:0;mso-height-percent:0;mso-wrap-distance-left:9pt;mso-wrap-distance-top:3.6pt;mso-wrap-distance-right:9pt;mso-wrap-distance-bottom:3.6pt;mso-position-horizontal:left;mso-position-horizontal-relative:margin;mso-position-vertical:absolute;mso-position-vertical-relative:text;mso-width-percent:0;mso-height-percent:0;mso-width-relative:margin;mso-height-relative:margin;v-text-anchor:top" o:gfxdata="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">
+                <v:textbox>
+                  <w:txbxContent>
+                    <w:p>
+                      <w:r>
+                        <w:t>&lt;div id="score"&gt;SCORE: 0&lt;/div&gt;</w:t>
+                      </w:r>
+                    </w:p>
+                    <w:p/>
+                    <w:p>
+                      <w:r>
+                        <w:t>…………</w:t>
+                      </w:r>
+                    </w:p>
+                    <w:p>
+                      <w:r>
+                        <w:t xml:space="preserve">function </w:t>
+                      </w:r>
+                      <w:proofErr w:type="spellStart"/>
+                      <w:r>
+                        <w:t>increaseScore</w:t>
+                      </w:r>
+                      <w:proofErr w:type="spellEnd"/>
+                      <w:r>
+                        <w:t>(){</w:t>
+                      </w:r>
+                      <w:r>
+                        <w:br/>
+                        <w:t xml:space="preserve">    score++;</w:t>
+                      </w:r>
+                      <w:r>
+                        <w:br/>
+                        <w:t xml:space="preserve">    const </w:t>
+                      </w:r>
+                      <w:proofErr w:type="spellStart"/>
+                      <w:r>
+                        <w:t>scoreDiv</w:t>
+                      </w:r>
+                      <w:proofErr w:type="spellEnd"/>
+                      <w:r>
+                        <w:t xml:space="preserve"> = </w:t>
+                      </w:r>
+                      <w:proofErr w:type="spellStart"/>
+                      <w:r>
+                        <w:t>document.getElementById</w:t>
+                      </w:r>
+                      <w:proofErr w:type="spellEnd"/>
+                      <w:r>
+                        <w:t>('score');</w:t>
+                      </w:r>
+                      <w:r>
+                        <w:br/>
+                        <w:t xml:space="preserve">    </w:t>
+                      </w:r>
+                      <w:proofErr w:type="spellStart"/>
+                      <w:r>
+                        <w:t>scoreDiv.innerText</w:t>
+                      </w:r>
+                      <w:proofErr w:type="spellEnd"/>
+                      <w:r>
+                        <w:t xml:space="preserve"> = 'SCORE: ' + score;</w:t>
+                      </w:r>
+                      <w:r>
+                        <w:br/>
+                        <w:t>}</w:t>
+                      </w:r>
+                    </w:p>
+                    <w:p/>
+                  </w:txbxContent>
+                </v:textbox>
+                <w10:wrap type="square" anchorx="margin"/>
+              </v:shape>
+            </w:pict>
+          </mc:Fallback>
+        </mc:AlternateContent>
+      </w:r>
+    </w:p>
+    <w:p>
+      <w:pPr>
+        <w:jc w:val="both"/>
+        <w:rPr>
+          <w:rFonts w:ascii="C64 Pro Mono" w:hAnsi="C64 Pro Mono" w:cstheme="majorBidi"/>
+          <w:color w:val="FFFFFF" w:themeColor="background1"/>
+        </w:rPr>
+      </w:pPr>
     </w:p>
     <w:p>
       <w:pPr>

</xml_diff>

<commit_message>
Sprites are cheap 9
</commit_message>
<xml_diff>
--- a/LECTURES/SpritesAreCheap/SPRAJTY SĄ TANIE.docx
+++ b/LECTURES/SpritesAreCheap/SPRAJTY SĄ TANIE.docx
@@ -124,7 +124,7 @@
     </w:p>
     <w:p>
       <w:pPr>
-        <w:jc w:val="center"/>
+        <w:jc w:val="right"/>
         <w:rPr>
           <w:rFonts w:ascii="C64 Pro Mono" w:hAnsi="C64 Pro Mono"/>
           <w:i/>
@@ -132,6 +132,15 @@
           <w:color w:val="FFFFFF" w:themeColor="background1"/>
         </w:rPr>
       </w:pPr>
+      <w:r>
+        <w:rPr>
+          <w:rFonts w:ascii="C64 Pro Mono" w:hAnsi="C64 Pro Mono"/>
+          <w:i/>
+          <w:iCs/>
+          <w:color w:val="FFFFFF" w:themeColor="background1"/>
+        </w:rPr>
+        <w:t>Krzysiek D.</w:t>
+      </w:r>
     </w:p>
     <w:p>
       <w:pPr>
@@ -145,9 +154,9 @@
       <w:r>
         <w:rPr>
           <w:rFonts w:ascii="C64 Pro Mono" w:hAnsi="C64 Pro Mono"/>
-          <w:color w:val="FFFFFF" w:themeColor="background1"/>
-          <w:sz w:val="28"/>
-          <w:szCs w:val="28"/>
+          <w:i/>
+          <w:iCs/>
+          <w:color w:val="FFFFFF" w:themeColor="background1"/>
         </w:rPr>
         <w:br w:type="page"/>
       </w:r>
@@ -413,10 +422,32 @@
         </w:rPr>
         <w:t xml:space="preserve"> </w:t>
       </w:r>
+      <w:r>
+        <w:rPr>
+          <w:rFonts w:ascii="C64 Pro Mono" w:hAnsi="C64 Pro Mono"/>
+          <w:color w:val="FFFFFF" w:themeColor="background1"/>
+        </w:rPr>
+        <w:t xml:space="preserve">+ </w:t>
+      </w:r>
+      <w:r>
+        <w:rPr>
+          <w:rFonts w:ascii="C64 Pro Mono" w:hAnsi="C64 Pro Mono"/>
+          <w:color w:val="FFFFFF" w:themeColor="background1"/>
+        </w:rPr>
+        <w:t>setup</w:t>
+      </w:r>
+      <w:r>
+        <w:rPr>
+          <w:rFonts w:ascii="C64 Pro Mono" w:hAnsi="C64 Pro Mono"/>
+          <w:color w:val="FFFFFF" w:themeColor="background1"/>
+        </w:rPr>
+        <w:t xml:space="preserve"> </w:t>
+      </w:r>
     </w:p>
     <w:p>
       <w:pPr>
         <w:pStyle w:val="ListParagraph"/>
+        <w:ind w:left="1080"/>
         <w:rPr>
           <w:rFonts w:ascii="C64 Pro Mono" w:hAnsi="C64 Pro Mono"/>
           <w:color w:val="FFFFFF" w:themeColor="background1"/>
@@ -440,20 +471,147 @@
           <w:rFonts w:ascii="C64 Pro Mono" w:hAnsi="C64 Pro Mono"/>
           <w:color w:val="FFFFFF" w:themeColor="background1"/>
         </w:rPr>
-        <w:t>Phaser setup</w:t>
-      </w:r>
-      <w:r>
-        <w:rPr>
-          <w:rFonts w:ascii="C64 Pro Mono" w:hAnsi="C64 Pro Mono"/>
-          <w:color w:val="FFFFFF" w:themeColor="background1"/>
-        </w:rPr>
-        <w:t xml:space="preserve"> </w:t>
-      </w:r>
+        <w:t>Live coding</w:t>
+      </w:r>
+      <w:r>
+        <w:rPr>
+          <w:rFonts w:ascii="C64 Pro Mono" w:hAnsi="C64 Pro Mono"/>
+          <w:color w:val="FFFFFF" w:themeColor="background1"/>
+        </w:rPr>
+        <w:t>:</w:t>
+      </w:r>
+    </w:p>
+    <w:p>
+      <w:pPr>
+        <w:pStyle w:val="ListParagraph"/>
+        <w:rPr>
+          <w:rFonts w:ascii="C64 Pro Mono" w:hAnsi="C64 Pro Mono"/>
+          <w:color w:val="FFFFFF" w:themeColor="background1"/>
+        </w:rPr>
+      </w:pPr>
     </w:p>
     <w:p>
       <w:pPr>
         <w:pStyle w:val="ListParagraph"/>
         <w:ind w:left="1080"/>
+        <w:rPr>
+          <w:rFonts w:ascii="C64 Pro Mono" w:hAnsi="C64 Pro Mono"/>
+          <w:color w:val="FFFFFF" w:themeColor="background1"/>
+        </w:rPr>
+      </w:pPr>
+      <w:r>
+        <w:rPr>
+          <w:rFonts w:ascii="C64 Pro Mono" w:hAnsi="C64 Pro Mono"/>
+          <w:color w:val="FFFFFF" w:themeColor="background1"/>
+        </w:rPr>
+        <w:t>static sprite</w:t>
+      </w:r>
+    </w:p>
+    <w:p>
+      <w:pPr>
+        <w:pStyle w:val="ListParagraph"/>
+        <w:ind w:left="1080"/>
+        <w:rPr>
+          <w:rFonts w:ascii="C64 Pro Mono" w:hAnsi="C64 Pro Mono"/>
+          <w:color w:val="FFFFFF" w:themeColor="background1"/>
+        </w:rPr>
+      </w:pPr>
+      <w:r>
+        <w:rPr>
+          <w:rFonts w:ascii="C64 Pro Mono" w:hAnsi="C64 Pro Mono"/>
+          <w:color w:val="FFFFFF" w:themeColor="background1"/>
+        </w:rPr>
+        <w:t>multiple sprites</w:t>
+      </w:r>
+    </w:p>
+    <w:p>
+      <w:pPr>
+        <w:pStyle w:val="ListParagraph"/>
+        <w:ind w:left="1080"/>
+        <w:rPr>
+          <w:rFonts w:ascii="C64 Pro Mono" w:hAnsi="C64 Pro Mono"/>
+          <w:color w:val="FFFFFF" w:themeColor="background1"/>
+        </w:rPr>
+      </w:pPr>
+      <w:r>
+        <w:rPr>
+          <w:rFonts w:ascii="C64 Pro Mono" w:hAnsi="C64 Pro Mono"/>
+          <w:color w:val="FFFFFF" w:themeColor="background1"/>
+        </w:rPr>
+        <w:t>sprite movement</w:t>
+      </w:r>
+    </w:p>
+    <w:p>
+      <w:pPr>
+        <w:pStyle w:val="ListParagraph"/>
+        <w:ind w:left="1080"/>
+        <w:rPr>
+          <w:rFonts w:ascii="C64 Pro Mono" w:hAnsi="C64 Pro Mono"/>
+          <w:color w:val="FFFFFF" w:themeColor="background1"/>
+        </w:rPr>
+      </w:pPr>
+      <w:r>
+        <w:rPr>
+          <w:rFonts w:ascii="C64 Pro Mono" w:hAnsi="C64 Pro Mono"/>
+          <w:color w:val="FFFFFF" w:themeColor="background1"/>
+        </w:rPr>
+        <w:t>animated sprite</w:t>
+      </w:r>
+    </w:p>
+    <w:p>
+      <w:pPr>
+        <w:pStyle w:val="ListParagraph"/>
+        <w:ind w:left="1080"/>
+        <w:rPr>
+          <w:rFonts w:ascii="C64 Pro Mono" w:hAnsi="C64 Pro Mono"/>
+          <w:color w:val="FFFFFF" w:themeColor="background1"/>
+        </w:rPr>
+      </w:pPr>
+      <w:r>
+        <w:rPr>
+          <w:rFonts w:ascii="C64 Pro Mono" w:hAnsi="C64 Pro Mono"/>
+          <w:color w:val="FFFFFF" w:themeColor="background1"/>
+        </w:rPr>
+        <w:t>sprite controls</w:t>
+      </w:r>
+    </w:p>
+    <w:p>
+      <w:pPr>
+        <w:pStyle w:val="ListParagraph"/>
+        <w:ind w:left="1080"/>
+        <w:rPr>
+          <w:rFonts w:ascii="C64 Pro Mono" w:hAnsi="C64 Pro Mono"/>
+          <w:color w:val="FFFFFF" w:themeColor="background1"/>
+        </w:rPr>
+      </w:pPr>
+      <w:r>
+        <w:rPr>
+          <w:rFonts w:ascii="C64 Pro Mono" w:hAnsi="C64 Pro Mono"/>
+          <w:color w:val="FFFFFF" w:themeColor="background1"/>
+        </w:rPr>
+        <w:t>collisions</w:t>
+      </w:r>
+    </w:p>
+    <w:p>
+      <w:pPr>
+        <w:pStyle w:val="ListParagraph"/>
+        <w:ind w:left="1080"/>
+        <w:rPr>
+          <w:rFonts w:ascii="C64 Pro Mono" w:hAnsi="C64 Pro Mono"/>
+          <w:color w:val="FFFFFF" w:themeColor="background1"/>
+        </w:rPr>
+      </w:pPr>
+      <w:r>
+        <w:rPr>
+          <w:rFonts w:ascii="C64 Pro Mono" w:hAnsi="C64 Pro Mono"/>
+          <w:color w:val="FFFFFF" w:themeColor="background1"/>
+        </w:rPr>
+        <w:t>score</w:t>
+      </w:r>
+    </w:p>
+    <w:p>
+      <w:pPr>
+        <w:pStyle w:val="ListParagraph"/>
         <w:rPr>
           <w:rFonts w:ascii="C64 Pro Mono" w:hAnsi="C64 Pro Mono"/>
           <w:color w:val="FFFFFF" w:themeColor="background1"/>
@@ -477,153 +635,6 @@
           <w:rFonts w:ascii="C64 Pro Mono" w:hAnsi="C64 Pro Mono"/>
           <w:color w:val="FFFFFF" w:themeColor="background1"/>
         </w:rPr>
-        <w:t>Live coding</w:t>
-      </w:r>
-      <w:r>
-        <w:rPr>
-          <w:rFonts w:ascii="C64 Pro Mono" w:hAnsi="C64 Pro Mono"/>
-          <w:color w:val="FFFFFF" w:themeColor="background1"/>
-        </w:rPr>
-        <w:t>:</w:t>
-      </w:r>
-    </w:p>
-    <w:p>
-      <w:pPr>
-        <w:pStyle w:val="ListParagraph"/>
-        <w:rPr>
-          <w:rFonts w:ascii="C64 Pro Mono" w:hAnsi="C64 Pro Mono"/>
-          <w:color w:val="FFFFFF" w:themeColor="background1"/>
-        </w:rPr>
-      </w:pPr>
-    </w:p>
-    <w:p>
-      <w:pPr>
-        <w:pStyle w:val="ListParagraph"/>
-        <w:ind w:left="1080"/>
-        <w:rPr>
-          <w:rFonts w:ascii="C64 Pro Mono" w:hAnsi="C64 Pro Mono"/>
-          <w:color w:val="FFFFFF" w:themeColor="background1"/>
-        </w:rPr>
-      </w:pPr>
-      <w:r>
-        <w:rPr>
-          <w:rFonts w:ascii="C64 Pro Mono" w:hAnsi="C64 Pro Mono"/>
-          <w:color w:val="FFFFFF" w:themeColor="background1"/>
-        </w:rPr>
-        <w:t>static sprite</w:t>
-      </w:r>
-    </w:p>
-    <w:p>
-      <w:pPr>
-        <w:pStyle w:val="ListParagraph"/>
-        <w:ind w:left="1080"/>
-        <w:rPr>
-          <w:rFonts w:ascii="C64 Pro Mono" w:hAnsi="C64 Pro Mono"/>
-          <w:color w:val="FFFFFF" w:themeColor="background1"/>
-        </w:rPr>
-      </w:pPr>
-      <w:r>
-        <w:rPr>
-          <w:rFonts w:ascii="C64 Pro Mono" w:hAnsi="C64 Pro Mono"/>
-          <w:color w:val="FFFFFF" w:themeColor="background1"/>
-        </w:rPr>
-        <w:t>multiple sprites</w:t>
-      </w:r>
-    </w:p>
-    <w:p>
-      <w:pPr>
-        <w:pStyle w:val="ListParagraph"/>
-        <w:ind w:left="1080"/>
-        <w:rPr>
-          <w:rFonts w:ascii="C64 Pro Mono" w:hAnsi="C64 Pro Mono"/>
-          <w:color w:val="FFFFFF" w:themeColor="background1"/>
-        </w:rPr>
-      </w:pPr>
-      <w:r>
-        <w:rPr>
-          <w:rFonts w:ascii="C64 Pro Mono" w:hAnsi="C64 Pro Mono"/>
-          <w:color w:val="FFFFFF" w:themeColor="background1"/>
-        </w:rPr>
-        <w:t>animated sprite</w:t>
-      </w:r>
-    </w:p>
-    <w:p>
-      <w:pPr>
-        <w:pStyle w:val="ListParagraph"/>
-        <w:ind w:left="1080"/>
-        <w:rPr>
-          <w:rFonts w:ascii="C64 Pro Mono" w:hAnsi="C64 Pro Mono"/>
-          <w:color w:val="FFFFFF" w:themeColor="background1"/>
-        </w:rPr>
-      </w:pPr>
-      <w:r>
-        <w:rPr>
-          <w:rFonts w:ascii="C64 Pro Mono" w:hAnsi="C64 Pro Mono"/>
-          <w:color w:val="FFFFFF" w:themeColor="background1"/>
-        </w:rPr>
-        <w:t>sprite controls</w:t>
-      </w:r>
-    </w:p>
-    <w:p>
-      <w:pPr>
-        <w:pStyle w:val="ListParagraph"/>
-        <w:ind w:left="1080"/>
-        <w:rPr>
-          <w:rFonts w:ascii="C64 Pro Mono" w:hAnsi="C64 Pro Mono"/>
-          <w:color w:val="FFFFFF" w:themeColor="background1"/>
-        </w:rPr>
-      </w:pPr>
-      <w:r>
-        <w:rPr>
-          <w:rFonts w:ascii="C64 Pro Mono" w:hAnsi="C64 Pro Mono"/>
-          <w:color w:val="FFFFFF" w:themeColor="background1"/>
-        </w:rPr>
-        <w:t>collisions</w:t>
-      </w:r>
-    </w:p>
-    <w:p>
-      <w:pPr>
-        <w:pStyle w:val="ListParagraph"/>
-        <w:ind w:left="1080"/>
-        <w:rPr>
-          <w:rFonts w:ascii="C64 Pro Mono" w:hAnsi="C64 Pro Mono"/>
-          <w:color w:val="FFFFFF" w:themeColor="background1"/>
-        </w:rPr>
-      </w:pPr>
-      <w:r>
-        <w:rPr>
-          <w:rFonts w:ascii="C64 Pro Mono" w:hAnsi="C64 Pro Mono"/>
-          <w:color w:val="FFFFFF" w:themeColor="background1"/>
-        </w:rPr>
-        <w:t>score</w:t>
-      </w:r>
-    </w:p>
-    <w:p>
-      <w:pPr>
-        <w:pStyle w:val="ListParagraph"/>
-        <w:rPr>
-          <w:rFonts w:ascii="C64 Pro Mono" w:hAnsi="C64 Pro Mono"/>
-          <w:color w:val="FFFFFF" w:themeColor="background1"/>
-        </w:rPr>
-      </w:pPr>
-    </w:p>
-    <w:p>
-      <w:pPr>
-        <w:pStyle w:val="ListParagraph"/>
-        <w:numPr>
-          <w:ilvl w:val="0"/>
-          <w:numId w:val="1"/>
-        </w:numPr>
-        <w:rPr>
-          <w:rFonts w:ascii="C64 Pro Mono" w:hAnsi="C64 Pro Mono"/>
-          <w:color w:val="FFFFFF" w:themeColor="background1"/>
-        </w:rPr>
-      </w:pPr>
-      <w:r>
-        <w:rPr>
-          <w:rFonts w:ascii="C64 Pro Mono" w:hAnsi="C64 Pro Mono"/>
-          <w:color w:val="FFFFFF" w:themeColor="background1"/>
-        </w:rPr>
         <w:t>Summary</w:t>
       </w:r>
     </w:p>
@@ -755,23 +766,7 @@
           <w:rFonts w:ascii="C64 Pro Mono" w:hAnsi="C64 Pro Mono"/>
           <w:color w:val="FFFFFF" w:themeColor="background1"/>
         </w:rPr>
-        <w:t xml:space="preserve"> (as </w:t>
-      </w:r>
-      <w:proofErr w:type="spellStart"/>
-      <w:r>
-        <w:rPr>
-          <w:rFonts w:ascii="C64 Pro Mono" w:hAnsi="C64 Pro Mono"/>
-          <w:color w:val="FFFFFF" w:themeColor="background1"/>
-        </w:rPr>
-        <w:t>LiveScript</w:t>
-      </w:r>
-      <w:proofErr w:type="spellEnd"/>
-      <w:r>
-        <w:rPr>
-          <w:rFonts w:ascii="C64 Pro Mono" w:hAnsi="C64 Pro Mono"/>
-          <w:color w:val="FFFFFF" w:themeColor="background1"/>
-        </w:rPr>
-        <w:t>)</w:t>
+        <w:t xml:space="preserve"> (as LiveScript)</w:t>
       </w:r>
       <w:r>
         <w:rPr>
@@ -1475,15 +1470,7 @@
                             </w:r>
                             <w:r>
                               <w:br/>
-                              <w:t xml:space="preserve">      type: </w:t>
-                            </w:r>
-                            <w:proofErr w:type="spellStart"/>
-                            <w:r>
-                              <w:t>Phaser.CANVAS</w:t>
-                            </w:r>
-                            <w:proofErr w:type="spellEnd"/>
-                            <w:r>
-                              <w:t>, // rendering style (WebGL or Canvas)</w:t>
+                              <w:t xml:space="preserve">      type: Phaser.CANVAS, // rendering style (WebGL or Canvas)</w:t>
                             </w:r>
                             <w:r>
                               <w:br/>
@@ -1544,15 +1531,7 @@
                       </w:r>
                       <w:r>
                         <w:br/>
-                        <w:t xml:space="preserve">      type: </w:t>
-                      </w:r>
-                      <w:proofErr w:type="spellStart"/>
-                      <w:r>
-                        <w:t>Phaser.CANVAS</w:t>
-                      </w:r>
-                      <w:proofErr w:type="spellEnd"/>
-                      <w:r>
-                        <w:t>, // rendering style (WebGL or Canvas)</w:t>
+                        <w:t xml:space="preserve">      type: Phaser.CANVAS, // rendering style (WebGL or Canvas)</w:t>
                       </w:r>
                       <w:r>
                         <w:br/>
@@ -1671,15 +1650,7 @@
                         <w:txbxContent>
                           <w:p>
                             <w:r>
-                              <w:t xml:space="preserve">const game = new </w:t>
-                            </w:r>
-                            <w:proofErr w:type="spellStart"/>
-                            <w:r>
-                              <w:t>Phaser.Game</w:t>
-                            </w:r>
-                            <w:proofErr w:type="spellEnd"/>
-                            <w:r>
-                              <w:t>(config);</w:t>
+                              <w:t>const game = new Phaser.Game(config);</w:t>
                             </w:r>
                           </w:p>
                           <w:p>
@@ -1712,15 +1683,7 @@
                   <w:txbxContent>
                     <w:p>
                       <w:r>
-                        <w:t xml:space="preserve">const game = new </w:t>
-                      </w:r>
-                      <w:proofErr w:type="spellStart"/>
-                      <w:r>
-                        <w:t>Phaser.Game</w:t>
-                      </w:r>
-                      <w:proofErr w:type="spellEnd"/>
-                      <w:r>
-                        <w:t>(config);</w:t>
+                        <w:t>const game = new Phaser.Game(config);</w:t>
                       </w:r>
                     </w:p>
                     <w:p>
@@ -1913,39 +1876,7 @@
                             </w:r>
                             <w:r>
                               <w:br/>
-                              <w:t xml:space="preserve">    </w:t>
-                            </w:r>
-                            <w:proofErr w:type="spellStart"/>
-                            <w:r>
-                              <w:t>this.add.text</w:t>
-                            </w:r>
-                            <w:proofErr w:type="spellEnd"/>
-                            <w:r>
-                              <w:t xml:space="preserve">(20, 20, 'Super </w:t>
-                            </w:r>
-                            <w:proofErr w:type="spellStart"/>
-                            <w:r>
-                              <w:t>fajna</w:t>
-                            </w:r>
-                            <w:proofErr w:type="spellEnd"/>
-                            <w:r>
-                              <w:t xml:space="preserve"> </w:t>
-                            </w:r>
-                            <w:proofErr w:type="spellStart"/>
-                            <w:r>
-                              <w:t>gra</w:t>
-                            </w:r>
-                            <w:proofErr w:type="spellEnd"/>
-                            <w:r>
-                              <w:t>!', { font: '24px Arial', fill: '#</w:t>
-                            </w:r>
-                            <w:proofErr w:type="spellStart"/>
-                            <w:r>
-                              <w:t>ffffff</w:t>
-                            </w:r>
-                            <w:proofErr w:type="spellEnd"/>
-                            <w:r>
-                              <w:t>' });</w:t>
+                              <w:t xml:space="preserve">    this.add.text(20, 20, 'Super fajna gra!', { font: '24px Arial', fill: '#ffffff' });</w:t>
                             </w:r>
                             <w:r>
                               <w:br/>
@@ -2003,39 +1934,7 @@
                       </w:r>
                       <w:r>
                         <w:br/>
-                        <w:t xml:space="preserve">    </w:t>
-                      </w:r>
-                      <w:proofErr w:type="spellStart"/>
-                      <w:r>
-                        <w:t>this.add.text</w:t>
-                      </w:r>
-                      <w:proofErr w:type="spellEnd"/>
-                      <w:r>
-                        <w:t xml:space="preserve">(20, 20, 'Super </w:t>
-                      </w:r>
-                      <w:proofErr w:type="spellStart"/>
-                      <w:r>
-                        <w:t>fajna</w:t>
-                      </w:r>
-                      <w:proofErr w:type="spellEnd"/>
-                      <w:r>
-                        <w:t xml:space="preserve"> </w:t>
-                      </w:r>
-                      <w:proofErr w:type="spellStart"/>
-                      <w:r>
-                        <w:t>gra</w:t>
-                      </w:r>
-                      <w:proofErr w:type="spellEnd"/>
-                      <w:r>
-                        <w:t>!', { font: '24px Arial', fill: '#</w:t>
-                      </w:r>
-                      <w:proofErr w:type="spellStart"/>
-                      <w:r>
-                        <w:t>ffffff</w:t>
-                      </w:r>
-                      <w:proofErr w:type="spellEnd"/>
-                      <w:r>
-                        <w:t>' });</w:t>
+                        <w:t xml:space="preserve">    this.add.text(20, 20, 'Super fajna gra!', { font: '24px Arial', fill: '#ffffff' });</w:t>
                       </w:r>
                       <w:r>
                         <w:br/>
@@ -2236,7 +2135,7 @@
         <w:pStyle w:val="ListParagraph"/>
         <w:numPr>
           <w:ilvl w:val="1"/>
-          <w:numId w:val="6"/>
+          <w:numId w:val="7"/>
         </w:numPr>
         <w:rPr>
           <w:rFonts w:ascii="C64 Pro Mono" w:hAnsi="C64 Pro Mono"/>
@@ -2573,15 +2472,7 @@
                             </w:r>
                             <w:r>
                               <w:br/>
-                              <w:t xml:space="preserve">    </w:t>
-                            </w:r>
-                            <w:proofErr w:type="spellStart"/>
-                            <w:r>
-                              <w:t>this.load.image</w:t>
-                            </w:r>
-                            <w:proofErr w:type="spellEnd"/>
-                            <w:r>
-                              <w:t>('balloon', 'balloon.png');</w:t>
+                              <w:t xml:space="preserve">    this.load.image('balloon', 'balloon.png');</w:t>
                             </w:r>
                             <w:r>
                               <w:br/>
@@ -2596,51 +2487,11 @@
                             </w:r>
                             <w:r>
                               <w:br/>
-                              <w:t xml:space="preserve">    </w:t>
-                            </w:r>
-                            <w:proofErr w:type="spellStart"/>
-                            <w:r>
-                              <w:t>this.add.text</w:t>
-                            </w:r>
-                            <w:proofErr w:type="spellEnd"/>
-                            <w:r>
-                              <w:t xml:space="preserve">(20, 20, 'Super </w:t>
-                            </w:r>
-                            <w:proofErr w:type="spellStart"/>
-                            <w:r>
-                              <w:t>fajna</w:t>
-                            </w:r>
-                            <w:proofErr w:type="spellEnd"/>
-                            <w:r>
-                              <w:t xml:space="preserve"> </w:t>
-                            </w:r>
-                            <w:proofErr w:type="spellStart"/>
-                            <w:r>
-                              <w:t>gra</w:t>
-                            </w:r>
-                            <w:proofErr w:type="spellEnd"/>
-                            <w:r>
-                              <w:t>!', { font: '24px Arial', fill: '#</w:t>
-                            </w:r>
-                            <w:proofErr w:type="spellStart"/>
-                            <w:r>
-                              <w:t>ffffff</w:t>
-                            </w:r>
-                            <w:proofErr w:type="spellEnd"/>
-                            <w:r>
-                              <w:t>' });</w:t>
-                            </w:r>
-                            <w:r>
-                              <w:br/>
-                              <w:t xml:space="preserve">    sprite = </w:t>
-                            </w:r>
-                            <w:proofErr w:type="spellStart"/>
-                            <w:r>
-                              <w:t>this.add.sprite</w:t>
-                            </w:r>
-                            <w:proofErr w:type="spellEnd"/>
-                            <w:r>
-                              <w:t>(200, 200, 'balloon');</w:t>
+                              <w:t xml:space="preserve">    this.add.text(20, 20, 'Super fajna gra!', { font: '24px Arial', fill: '#ffffff' });</w:t>
+                            </w:r>
+                            <w:r>
+                              <w:br/>
+                              <w:t xml:space="preserve">    sprite = this.add.sprite(200, 200, 'balloon');</w:t>
                             </w:r>
                             <w:r>
                               <w:br/>
@@ -2683,15 +2534,7 @@
                       </w:r>
                       <w:r>
                         <w:br/>
-                        <w:t xml:space="preserve">    </w:t>
-                      </w:r>
-                      <w:proofErr w:type="spellStart"/>
-                      <w:r>
-                        <w:t>this.load.image</w:t>
-                      </w:r>
-                      <w:proofErr w:type="spellEnd"/>
-                      <w:r>
-                        <w:t>('balloon', 'balloon.png');</w:t>
+                        <w:t xml:space="preserve">    this.load.image('balloon', 'balloon.png');</w:t>
                       </w:r>
                       <w:r>
                         <w:br/>
@@ -2706,51 +2549,11 @@
                       </w:r>
                       <w:r>
                         <w:br/>
-                        <w:t xml:space="preserve">    </w:t>
-                      </w:r>
-                      <w:proofErr w:type="spellStart"/>
-                      <w:r>
-                        <w:t>this.add.text</w:t>
-                      </w:r>
-                      <w:proofErr w:type="spellEnd"/>
-                      <w:r>
-                        <w:t xml:space="preserve">(20, 20, 'Super </w:t>
-                      </w:r>
-                      <w:proofErr w:type="spellStart"/>
-                      <w:r>
-                        <w:t>fajna</w:t>
-                      </w:r>
-                      <w:proofErr w:type="spellEnd"/>
-                      <w:r>
-                        <w:t xml:space="preserve"> </w:t>
-                      </w:r>
-                      <w:proofErr w:type="spellStart"/>
-                      <w:r>
-                        <w:t>gra</w:t>
-                      </w:r>
-                      <w:proofErr w:type="spellEnd"/>
-                      <w:r>
-                        <w:t>!', { font: '24px Arial', fill: '#</w:t>
-                      </w:r>
-                      <w:proofErr w:type="spellStart"/>
-                      <w:r>
-                        <w:t>ffffff</w:t>
-                      </w:r>
-                      <w:proofErr w:type="spellEnd"/>
-                      <w:r>
-                        <w:t>' });</w:t>
-                      </w:r>
-                      <w:r>
-                        <w:br/>
-                        <w:t xml:space="preserve">    sprite = </w:t>
-                      </w:r>
-                      <w:proofErr w:type="spellStart"/>
-                      <w:r>
-                        <w:t>this.add.sprite</w:t>
-                      </w:r>
-                      <w:proofErr w:type="spellEnd"/>
-                      <w:r>
-                        <w:t>(200, 200, 'balloon');</w:t>
+                        <w:t xml:space="preserve">    this.add.text(20, 20, 'Super fajna gra!', { font: '24px Arial', fill: '#ffffff' });</w:t>
+                      </w:r>
+                      <w:r>
+                        <w:br/>
+                        <w:t xml:space="preserve">    sprite = this.add.sprite(200, 200, 'balloon');</w:t>
                       </w:r>
                       <w:r>
                         <w:br/>
@@ -2774,6 +2577,21 @@
           <w:color w:val="FFFFFF" w:themeColor="background1"/>
         </w:rPr>
       </w:pPr>
+    </w:p>
+    <w:p>
+      <w:pPr>
+        <w:rPr>
+          <w:rFonts w:ascii="C64 Pro Mono" w:hAnsi="C64 Pro Mono"/>
+          <w:color w:val="FFFFFF" w:themeColor="background1"/>
+        </w:rPr>
+      </w:pPr>
+      <w:r>
+        <w:rPr>
+          <w:rFonts w:ascii="C64 Pro Mono" w:hAnsi="C64 Pro Mono"/>
+          <w:color w:val="FFFFFF" w:themeColor="background1"/>
+        </w:rPr>
+        <w:t xml:space="preserve">Sprite can be modified from browser console, using ‘sprite’ variable </w:t>
+      </w:r>
     </w:p>
     <w:p>
       <w:pPr>
@@ -2829,6 +2647,7 @@
     </w:p>
     <w:p>
       <w:pPr>
+        <w:ind w:firstLine="720"/>
         <w:jc w:val="both"/>
         <w:rPr>
           <w:rFonts w:ascii="C64 Pro Mono" w:hAnsi="C64 Pro Mono"/>
@@ -2892,15 +2711,7 @@
                         <w:txbxContent>
                           <w:p>
                             <w:r>
-                              <w:t xml:space="preserve">const </w:t>
-                            </w:r>
-                            <w:proofErr w:type="spellStart"/>
-                            <w:r>
-                              <w:t>spritesCount</w:t>
-                            </w:r>
-                            <w:proofErr w:type="spellEnd"/>
-                            <w:r>
-                              <w:t xml:space="preserve"> = 12;</w:t>
+                              <w:t>const spritesCount = 12;</w:t>
                             </w:r>
                             <w:r>
                               <w:br/>
@@ -2939,15 +2750,7 @@
                   <w:txbxContent>
                     <w:p>
                       <w:r>
-                        <w:t xml:space="preserve">const </w:t>
-                      </w:r>
-                      <w:proofErr w:type="spellStart"/>
-                      <w:r>
-                        <w:t>spritesCount</w:t>
-                      </w:r>
-                      <w:proofErr w:type="spellEnd"/>
-                      <w:r>
-                        <w:t xml:space="preserve"> = 12;</w:t>
+                        <w:t>const spritesCount = 12;</w:t>
                       </w:r>
                       <w:r>
                         <w:br/>
@@ -2969,6 +2772,13 @@
             </w:pict>
           </mc:Fallback>
         </mc:AlternateContent>
+      </w:r>
+      <w:r>
+        <w:rPr>
+          <w:rFonts w:ascii="C64 Pro Mono" w:hAnsi="C64 Pro Mono"/>
+          <w:color w:val="FFFFFF" w:themeColor="background1"/>
+        </w:rPr>
+        <w:t xml:space="preserve">3.2 </w:t>
       </w:r>
       <w:r>
         <w:rPr>
@@ -3060,121 +2870,25 @@
                             </w:r>
                             <w:r>
                               <w:br/>
-                              <w:t xml:space="preserve">    </w:t>
-                            </w:r>
-                            <w:proofErr w:type="spellStart"/>
-                            <w:r>
-                              <w:t>this.add.text</w:t>
-                            </w:r>
-                            <w:proofErr w:type="spellEnd"/>
-                            <w:r>
-                              <w:t xml:space="preserve">(20, 20, 'Super </w:t>
-                            </w:r>
-                            <w:proofErr w:type="spellStart"/>
-                            <w:r>
-                              <w:t>fajna</w:t>
-                            </w:r>
-                            <w:proofErr w:type="spellEnd"/>
+                              <w:t xml:space="preserve">    this.add.text(20, 20, 'Super fajna gra!', { font: '24px Arial', fill: '#ffffff' });</w:t>
+                            </w:r>
+                            <w:r>
+                              <w:br/>
+                            </w:r>
+                            <w:r>
+                              <w:br/>
+                              <w:t xml:space="preserve">    for (let i = 0; i &lt; spritesCount; i++){</w:t>
+                            </w:r>
+                            <w:r>
+                              <w:br/>
+                              <w:t xml:space="preserve">        let s = this.add.sprite(i, 50*i, 'balloon');</w:t>
+                            </w:r>
                             <w:r>
                               <w:t xml:space="preserve"> </w:t>
                             </w:r>
-                            <w:proofErr w:type="spellStart"/>
-                            <w:r>
-                              <w:t>gra</w:t>
-                            </w:r>
-                            <w:proofErr w:type="spellEnd"/>
-                            <w:r>
-                              <w:t>!', { font: '24px Arial', fill: '#</w:t>
-                            </w:r>
-                            <w:proofErr w:type="spellStart"/>
-                            <w:r>
-                              <w:t>ffffff</w:t>
-                            </w:r>
-                            <w:proofErr w:type="spellEnd"/>
-                            <w:r>
-                              <w:t>' });</w:t>
-                            </w:r>
-                            <w:r>
-                              <w:br/>
-                            </w:r>
-                            <w:r>
-                              <w:br/>
-                              <w:t xml:space="preserve">    for (let </w:t>
-                            </w:r>
-                            <w:proofErr w:type="spellStart"/>
-                            <w:r>
-                              <w:t>i</w:t>
-                            </w:r>
-                            <w:proofErr w:type="spellEnd"/>
-                            <w:r>
-                              <w:t xml:space="preserve"> = 0; </w:t>
-                            </w:r>
-                            <w:proofErr w:type="spellStart"/>
-                            <w:r>
-                              <w:t>i</w:t>
-                            </w:r>
-                            <w:proofErr w:type="spellEnd"/>
-                            <w:r>
-                              <w:t xml:space="preserve"> &lt; </w:t>
-                            </w:r>
-                            <w:proofErr w:type="spellStart"/>
-                            <w:r>
-                              <w:t>spritesCount</w:t>
-                            </w:r>
-                            <w:proofErr w:type="spellEnd"/>
-                            <w:r>
-                              <w:t xml:space="preserve">; </w:t>
-                            </w:r>
-                            <w:proofErr w:type="spellStart"/>
-                            <w:r>
-                              <w:t>i</w:t>
-                            </w:r>
-                            <w:proofErr w:type="spellEnd"/>
-                            <w:r>
-                              <w:t>++){</w:t>
-                            </w:r>
-                            <w:r>
-                              <w:br/>
-                              <w:t xml:space="preserve">        let s = </w:t>
-                            </w:r>
-                            <w:proofErr w:type="spellStart"/>
-                            <w:r>
-                              <w:t>this.add.sprite</w:t>
-                            </w:r>
-                            <w:proofErr w:type="spellEnd"/>
-                            <w:r>
-                              <w:t>(</w:t>
-                            </w:r>
-                            <w:proofErr w:type="spellStart"/>
-                            <w:r>
-                              <w:t>i</w:t>
-                            </w:r>
-                            <w:proofErr w:type="spellEnd"/>
-                            <w:r>
-                              <w:t>, 50*</w:t>
-                            </w:r>
-                            <w:proofErr w:type="spellStart"/>
-                            <w:r>
-                              <w:t>i</w:t>
-                            </w:r>
-                            <w:proofErr w:type="spellEnd"/>
-                            <w:r>
-                              <w:t>, 'balloon');</w:t>
-                            </w:r>
-                            <w:r>
-                              <w:t xml:space="preserve"> </w:t>
-                            </w:r>
-                            <w:r>
-                              <w:br/>
-                              <w:t xml:space="preserve">        </w:t>
-                            </w:r>
-                            <w:proofErr w:type="spellStart"/>
-                            <w:r>
-                              <w:t>sprites.push</w:t>
-                            </w:r>
-                            <w:proofErr w:type="spellEnd"/>
-                            <w:r>
-                              <w:t>(s);</w:t>
+                            <w:r>
+                              <w:br/>
+                              <w:t xml:space="preserve">        sprites.push(s);</w:t>
                             </w:r>
                             <w:r>
                               <w:br/>
@@ -3217,121 +2931,25 @@
                       </w:r>
                       <w:r>
                         <w:br/>
-                        <w:t xml:space="preserve">    </w:t>
-                      </w:r>
-                      <w:proofErr w:type="spellStart"/>
-                      <w:r>
-                        <w:t>this.add.text</w:t>
-                      </w:r>
-                      <w:proofErr w:type="spellEnd"/>
-                      <w:r>
-                        <w:t xml:space="preserve">(20, 20, 'Super </w:t>
-                      </w:r>
-                      <w:proofErr w:type="spellStart"/>
-                      <w:r>
-                        <w:t>fajna</w:t>
-                      </w:r>
-                      <w:proofErr w:type="spellEnd"/>
+                        <w:t xml:space="preserve">    this.add.text(20, 20, 'Super fajna gra!', { font: '24px Arial', fill: '#ffffff' });</w:t>
+                      </w:r>
+                      <w:r>
+                        <w:br/>
+                      </w:r>
+                      <w:r>
+                        <w:br/>
+                        <w:t xml:space="preserve">    for (let i = 0; i &lt; spritesCount; i++){</w:t>
+                      </w:r>
+                      <w:r>
+                        <w:br/>
+                        <w:t xml:space="preserve">        let s = this.add.sprite(i, 50*i, 'balloon');</w:t>
+                      </w:r>
                       <w:r>
                         <w:t xml:space="preserve"> </w:t>
                       </w:r>
-                      <w:proofErr w:type="spellStart"/>
-                      <w:r>
-                        <w:t>gra</w:t>
-                      </w:r>
-                      <w:proofErr w:type="spellEnd"/>
-                      <w:r>
-                        <w:t>!', { font: '24px Arial', fill: '#</w:t>
-                      </w:r>
-                      <w:proofErr w:type="spellStart"/>
-                      <w:r>
-                        <w:t>ffffff</w:t>
-                      </w:r>
-                      <w:proofErr w:type="spellEnd"/>
-                      <w:r>
-                        <w:t>' });</w:t>
-                      </w:r>
-                      <w:r>
-                        <w:br/>
-                      </w:r>
-                      <w:r>
-                        <w:br/>
-                        <w:t xml:space="preserve">    for (let </w:t>
-                      </w:r>
-                      <w:proofErr w:type="spellStart"/>
-                      <w:r>
-                        <w:t>i</w:t>
-                      </w:r>
-                      <w:proofErr w:type="spellEnd"/>
-                      <w:r>
-                        <w:t xml:space="preserve"> = 0; </w:t>
-                      </w:r>
-                      <w:proofErr w:type="spellStart"/>
-                      <w:r>
-                        <w:t>i</w:t>
-                      </w:r>
-                      <w:proofErr w:type="spellEnd"/>
-                      <w:r>
-                        <w:t xml:space="preserve"> &lt; </w:t>
-                      </w:r>
-                      <w:proofErr w:type="spellStart"/>
-                      <w:r>
-                        <w:t>spritesCount</w:t>
-                      </w:r>
-                      <w:proofErr w:type="spellEnd"/>
-                      <w:r>
-                        <w:t xml:space="preserve">; </w:t>
-                      </w:r>
-                      <w:proofErr w:type="spellStart"/>
-                      <w:r>
-                        <w:t>i</w:t>
-                      </w:r>
-                      <w:proofErr w:type="spellEnd"/>
-                      <w:r>
-                        <w:t>++){</w:t>
-                      </w:r>
-                      <w:r>
-                        <w:br/>
-                        <w:t xml:space="preserve">        let s = </w:t>
-                      </w:r>
-                      <w:proofErr w:type="spellStart"/>
-                      <w:r>
-                        <w:t>this.add.sprite</w:t>
-                      </w:r>
-                      <w:proofErr w:type="spellEnd"/>
-                      <w:r>
-                        <w:t>(</w:t>
-                      </w:r>
-                      <w:proofErr w:type="spellStart"/>
-                      <w:r>
-                        <w:t>i</w:t>
-                      </w:r>
-                      <w:proofErr w:type="spellEnd"/>
-                      <w:r>
-                        <w:t>, 50*</w:t>
-                      </w:r>
-                      <w:proofErr w:type="spellStart"/>
-                      <w:r>
-                        <w:t>i</w:t>
-                      </w:r>
-                      <w:proofErr w:type="spellEnd"/>
-                      <w:r>
-                        <w:t>, 'balloon');</w:t>
-                      </w:r>
-                      <w:r>
-                        <w:t xml:space="preserve"> </w:t>
-                      </w:r>
-                      <w:r>
-                        <w:br/>
-                        <w:t xml:space="preserve">        </w:t>
-                      </w:r>
-                      <w:proofErr w:type="spellStart"/>
-                      <w:r>
-                        <w:t>sprites.push</w:t>
-                      </w:r>
-                      <w:proofErr w:type="spellEnd"/>
-                      <w:r>
-                        <w:t>(s);</w:t>
+                      <w:r>
+                        <w:br/>
+                        <w:t xml:space="preserve">        sprites.push(s);</w:t>
                       </w:r>
                       <w:r>
                         <w:br/>
@@ -3379,6 +2997,7 @@
     </w:p>
     <w:p>
       <w:pPr>
+        <w:ind w:firstLine="720"/>
         <w:jc w:val="both"/>
         <w:rPr>
           <w:rFonts w:ascii="Courier New" w:hAnsi="Courier New" w:cs="Courier New"/>
@@ -3391,23 +3010,14 @@
           <w:color w:val="FFFFFF" w:themeColor="background1"/>
         </w:rPr>
         <w:lastRenderedPageBreak/>
-        <w:t xml:space="preserve">Let’s get </w:t>
-      </w:r>
-      <w:proofErr w:type="spellStart"/>
+        <w:t xml:space="preserve">3.3 </w:t>
+      </w:r>
       <w:r>
         <w:rPr>
           <w:rFonts w:ascii="C64 Pro Mono" w:hAnsi="C64 Pro Mono" w:cstheme="majorBidi"/>
           <w:color w:val="FFFFFF" w:themeColor="background1"/>
         </w:rPr>
-        <w:t>movin</w:t>
-      </w:r>
-      <w:proofErr w:type="spellEnd"/>
-      <w:r>
-        <w:rPr>
-          <w:rFonts w:ascii="C64 Pro Mono" w:hAnsi="C64 Pro Mono" w:cstheme="majorBidi"/>
-          <w:color w:val="FFFFFF" w:themeColor="background1"/>
-        </w:rPr>
-        <w:t>’</w:t>
+        <w:t>Let’s get movin’</w:t>
       </w:r>
       <w:r>
         <w:rPr>
@@ -3485,74 +3095,18 @@
                             </w:r>
                             <w:r>
                               <w:br/>
-                              <w:t xml:space="preserve">    for (let </w:t>
-                            </w:r>
-                            <w:proofErr w:type="spellStart"/>
-                            <w:r>
-                              <w:t>i</w:t>
-                            </w:r>
-                            <w:proofErr w:type="spellEnd"/>
-                            <w:r>
-                              <w:t xml:space="preserve"> = 0; </w:t>
-                            </w:r>
-                            <w:proofErr w:type="spellStart"/>
-                            <w:r>
-                              <w:t>i</w:t>
-                            </w:r>
-                            <w:proofErr w:type="spellEnd"/>
-                            <w:r>
-                              <w:t xml:space="preserve"> &lt; </w:t>
-                            </w:r>
-                            <w:proofErr w:type="spellStart"/>
-                            <w:r>
-                              <w:t>spritesCount</w:t>
-                            </w:r>
-                            <w:proofErr w:type="spellEnd"/>
-                            <w:r>
-                              <w:t xml:space="preserve">; </w:t>
-                            </w:r>
-                            <w:proofErr w:type="spellStart"/>
-                            <w:r>
-                              <w:t>i</w:t>
-                            </w:r>
-                            <w:proofErr w:type="spellEnd"/>
-                            <w:r>
-                              <w:t>++){</w:t>
-                            </w:r>
-                            <w:r>
-                              <w:br/>
-                              <w:t xml:space="preserve">        if (sprites[</w:t>
-                            </w:r>
-                            <w:proofErr w:type="spellStart"/>
-                            <w:r>
-                              <w:t>i</w:t>
-                            </w:r>
-                            <w:proofErr w:type="spellEnd"/>
-                            <w:r>
-                              <w:t>].x &lt; 800)</w:t>
-                            </w:r>
-                            <w:r>
-                              <w:br/>
-                              <w:t xml:space="preserve">            sprites[</w:t>
-                            </w:r>
-                            <w:proofErr w:type="spellStart"/>
-                            <w:r>
-                              <w:t>i</w:t>
-                            </w:r>
-                            <w:proofErr w:type="spellEnd"/>
-                            <w:r>
-                              <w:t xml:space="preserve">].x += </w:t>
-                            </w:r>
-                            <w:r>
-                              <w:t xml:space="preserve"> </w:t>
-                            </w:r>
-                            <w:proofErr w:type="spellStart"/>
-                            <w:r>
-                              <w:t>i</w:t>
-                            </w:r>
-                            <w:proofErr w:type="spellEnd"/>
-                            <w:r>
-                              <w:t>; //</w:t>
+                              <w:t xml:space="preserve">    for (let i = 0; i &lt; spritesCount; i++){</w:t>
+                            </w:r>
+                            <w:r>
+                              <w:br/>
+                              <w:t xml:space="preserve">        if (sprites[i].x &lt; 800)</w:t>
+                            </w:r>
+                            <w:r>
+                              <w:br/>
+                              <w:t xml:space="preserve">            sprites[i].x += </w:t>
+                            </w:r>
+                            <w:r>
+                              <w:t xml:space="preserve"> i; //</w:t>
                             </w:r>
                             <w:r>
                               <w:t>(i+1) % 20;</w:t>
@@ -3563,15 +3117,7 @@
                             </w:r>
                             <w:r>
                               <w:br/>
-                              <w:t xml:space="preserve">            sprites[</w:t>
-                            </w:r>
-                            <w:proofErr w:type="spellStart"/>
-                            <w:r>
-                              <w:t>i</w:t>
-                            </w:r>
-                            <w:proofErr w:type="spellEnd"/>
-                            <w:r>
-                              <w:t>].x = 0;</w:t>
+                              <w:t xml:space="preserve">            sprites[i].x = 0;</w:t>
                             </w:r>
                             <w:r>
                               <w:br/>
@@ -3611,74 +3157,18 @@
                       </w:r>
                       <w:r>
                         <w:br/>
-                        <w:t xml:space="preserve">    for (let </w:t>
-                      </w:r>
-                      <w:proofErr w:type="spellStart"/>
-                      <w:r>
-                        <w:t>i</w:t>
-                      </w:r>
-                      <w:proofErr w:type="spellEnd"/>
-                      <w:r>
-                        <w:t xml:space="preserve"> = 0; </w:t>
-                      </w:r>
-                      <w:proofErr w:type="spellStart"/>
-                      <w:r>
-                        <w:t>i</w:t>
-                      </w:r>
-                      <w:proofErr w:type="spellEnd"/>
-                      <w:r>
-                        <w:t xml:space="preserve"> &lt; </w:t>
-                      </w:r>
-                      <w:proofErr w:type="spellStart"/>
-                      <w:r>
-                        <w:t>spritesCount</w:t>
-                      </w:r>
-                      <w:proofErr w:type="spellEnd"/>
-                      <w:r>
-                        <w:t xml:space="preserve">; </w:t>
-                      </w:r>
-                      <w:proofErr w:type="spellStart"/>
-                      <w:r>
-                        <w:t>i</w:t>
-                      </w:r>
-                      <w:proofErr w:type="spellEnd"/>
-                      <w:r>
-                        <w:t>++){</w:t>
-                      </w:r>
-                      <w:r>
-                        <w:br/>
-                        <w:t xml:space="preserve">        if (sprites[</w:t>
-                      </w:r>
-                      <w:proofErr w:type="spellStart"/>
-                      <w:r>
-                        <w:t>i</w:t>
-                      </w:r>
-                      <w:proofErr w:type="spellEnd"/>
-                      <w:r>
-                        <w:t>].x &lt; 800)</w:t>
-                      </w:r>
-                      <w:r>
-                        <w:br/>
-                        <w:t xml:space="preserve">            sprites[</w:t>
-                      </w:r>
-                      <w:proofErr w:type="spellStart"/>
-                      <w:r>
-                        <w:t>i</w:t>
-                      </w:r>
-                      <w:proofErr w:type="spellEnd"/>
-                      <w:r>
-                        <w:t xml:space="preserve">].x += </w:t>
-                      </w:r>
-                      <w:r>
-                        <w:t xml:space="preserve"> </w:t>
-                      </w:r>
-                      <w:proofErr w:type="spellStart"/>
-                      <w:r>
-                        <w:t>i</w:t>
-                      </w:r>
-                      <w:proofErr w:type="spellEnd"/>
-                      <w:r>
-                        <w:t>; //</w:t>
+                        <w:t xml:space="preserve">    for (let i = 0; i &lt; spritesCount; i++){</w:t>
+                      </w:r>
+                      <w:r>
+                        <w:br/>
+                        <w:t xml:space="preserve">        if (sprites[i].x &lt; 800)</w:t>
+                      </w:r>
+                      <w:r>
+                        <w:br/>
+                        <w:t xml:space="preserve">            sprites[i].x += </w:t>
+                      </w:r>
+                      <w:r>
+                        <w:t xml:space="preserve"> i; //</w:t>
                       </w:r>
                       <w:r>
                         <w:t>(i+1) % 20;</w:t>
@@ -3689,15 +3179,7 @@
                       </w:r>
                       <w:r>
                         <w:br/>
-                        <w:t xml:space="preserve">            sprites[</w:t>
-                      </w:r>
-                      <w:proofErr w:type="spellStart"/>
-                      <w:r>
-                        <w:t>i</w:t>
-                      </w:r>
-                      <w:proofErr w:type="spellEnd"/>
-                      <w:r>
-                        <w:t>].x = 0;</w:t>
+                        <w:t xml:space="preserve">            sprites[i].x = 0;</w:t>
                       </w:r>
                       <w:r>
                         <w:br/>
@@ -3750,19 +3232,9 @@
     </w:p>
     <w:p>
       <w:pPr>
+        <w:ind w:firstLine="720"/>
         <w:jc w:val="both"/>
         <w:rPr>
-          <w:rFonts w:asciiTheme="majorBidi" w:hAnsiTheme="majorBidi" w:cstheme="majorBidi"/>
-          <w:color w:val="FFFFFF" w:themeColor="background1"/>
-          <w:sz w:val="16"/>
-          <w:szCs w:val="16"/>
-        </w:rPr>
-      </w:pPr>
-    </w:p>
-    <w:p>
-      <w:pPr>
-        <w:jc w:val="both"/>
-        <w:rPr>
           <w:rFonts w:ascii="C64 Pro Mono" w:hAnsi="C64 Pro Mono" w:cstheme="majorBidi"/>
           <w:color w:val="FFFFFF" w:themeColor="background1"/>
         </w:rPr>
@@ -3772,7 +3244,15 @@
           <w:rFonts w:ascii="C64 Pro Mono" w:hAnsi="C64 Pro Mono" w:cstheme="majorBidi"/>
           <w:color w:val="FFFFFF" w:themeColor="background1"/>
         </w:rPr>
-        <w:t xml:space="preserve">2.8 </w:t>
+        <w:lastRenderedPageBreak/>
+        <w:t>3.4</w:t>
+      </w:r>
+      <w:r>
+        <w:rPr>
+          <w:rFonts w:ascii="C64 Pro Mono" w:hAnsi="C64 Pro Mono" w:cstheme="majorBidi"/>
+          <w:color w:val="FFFFFF" w:themeColor="background1"/>
+        </w:rPr>
+        <w:t xml:space="preserve"> </w:t>
       </w:r>
       <w:r>
         <w:rPr>
@@ -3994,61 +3474,21 @@
                             </w:r>
                             <w:r>
                               <w:br/>
-                              <w:t xml:space="preserve">    </w:t>
-                            </w:r>
-                            <w:proofErr w:type="spellStart"/>
-                            <w:r>
-                              <w:t>this.load.image</w:t>
-                            </w:r>
-                            <w:proofErr w:type="spellEnd"/>
-                            <w:r>
-                              <w:t>('balloon', 'balloon.png');</w:t>
+                              <w:t xml:space="preserve">    this.load.image('balloon', 'balloon.png');</w:t>
                             </w:r>
                           </w:p>
                           <w:p>
                             <w:r>
                               <w:br/>
-                              <w:t xml:space="preserve">    </w:t>
-                            </w:r>
-                            <w:proofErr w:type="spellStart"/>
-                            <w:r>
-                              <w:t>this.load.spritesheet</w:t>
-                            </w:r>
-                            <w:proofErr w:type="spellEnd"/>
-                            <w:r>
-                              <w:t>('</w:t>
-                            </w:r>
-                            <w:proofErr w:type="spellStart"/>
-                            <w:r>
-                              <w:t>digdug</w:t>
-                            </w:r>
-                            <w:proofErr w:type="spellEnd"/>
-                            <w:r>
-                              <w:t>', 'empty-project/dig-dug.png', {</w:t>
-                            </w:r>
-                            <w:r>
-                              <w:br/>
-                              <w:t xml:space="preserve">        </w:t>
-                            </w:r>
-                            <w:proofErr w:type="spellStart"/>
-                            <w:r>
-                              <w:t>frameWidth</w:t>
-                            </w:r>
-                            <w:proofErr w:type="spellEnd"/>
-                            <w:r>
-                              <w:t>: 75,</w:t>
-                            </w:r>
-                            <w:r>
-                              <w:br/>
-                              <w:t xml:space="preserve">        </w:t>
-                            </w:r>
-                            <w:proofErr w:type="spellStart"/>
-                            <w:r>
-                              <w:t>frameHeight</w:t>
-                            </w:r>
-                            <w:proofErr w:type="spellEnd"/>
-                            <w:r>
-                              <w:t>: 75</w:t>
+                              <w:t xml:space="preserve">    this.load.spritesheet('digdug', 'empty-project/dig-dug.png', {</w:t>
+                            </w:r>
+                            <w:r>
+                              <w:br/>
+                              <w:t xml:space="preserve">        frameWidth: 75,</w:t>
+                            </w:r>
+                            <w:r>
+                              <w:br/>
+                              <w:t xml:space="preserve">        frameHeight: 75</w:t>
                             </w:r>
                             <w:r>
                               <w:br/>
@@ -4094,61 +3534,21 @@
                       </w:r>
                       <w:r>
                         <w:br/>
-                        <w:t xml:space="preserve">    </w:t>
-                      </w:r>
-                      <w:proofErr w:type="spellStart"/>
-                      <w:r>
-                        <w:t>this.load.image</w:t>
-                      </w:r>
-                      <w:proofErr w:type="spellEnd"/>
-                      <w:r>
-                        <w:t>('balloon', 'balloon.png');</w:t>
+                        <w:t xml:space="preserve">    this.load.image('balloon', 'balloon.png');</w:t>
                       </w:r>
                     </w:p>
                     <w:p>
                       <w:r>
                         <w:br/>
-                        <w:t xml:space="preserve">    </w:t>
-                      </w:r>
-                      <w:proofErr w:type="spellStart"/>
-                      <w:r>
-                        <w:t>this.load.spritesheet</w:t>
-                      </w:r>
-                      <w:proofErr w:type="spellEnd"/>
-                      <w:r>
-                        <w:t>('</w:t>
-                      </w:r>
-                      <w:proofErr w:type="spellStart"/>
-                      <w:r>
-                        <w:t>digdug</w:t>
-                      </w:r>
-                      <w:proofErr w:type="spellEnd"/>
-                      <w:r>
-                        <w:t>', 'empty-project/dig-dug.png', {</w:t>
-                      </w:r>
-                      <w:r>
-                        <w:br/>
-                        <w:t xml:space="preserve">        </w:t>
-                      </w:r>
-                      <w:proofErr w:type="spellStart"/>
-                      <w:r>
-                        <w:t>frameWidth</w:t>
-                      </w:r>
-                      <w:proofErr w:type="spellEnd"/>
-                      <w:r>
-                        <w:t>: 75,</w:t>
-                      </w:r>
-                      <w:r>
-                        <w:br/>
-                        <w:t xml:space="preserve">        </w:t>
-                      </w:r>
-                      <w:proofErr w:type="spellStart"/>
-                      <w:r>
-                        <w:t>frameHeight</w:t>
-                      </w:r>
-                      <w:proofErr w:type="spellEnd"/>
-                      <w:r>
-                        <w:t>: 75</w:t>
+                        <w:t xml:space="preserve">    this.load.spritesheet('digdug', 'empty-project/dig-dug.png', {</w:t>
+                      </w:r>
+                      <w:r>
+                        <w:br/>
+                        <w:t xml:space="preserve">        frameWidth: 75,</w:t>
+                      </w:r>
+                      <w:r>
+                        <w:br/>
+                        <w:t xml:space="preserve">        frameHeight: 75</w:t>
                       </w:r>
                       <w:r>
                         <w:br/>
@@ -4188,6 +3588,7 @@
     </w:p>
     <w:p>
       <w:pPr>
+        <w:ind w:firstLine="720"/>
         <w:jc w:val="both"/>
         <w:rPr>
           <w:rFonts w:ascii="C64 Pro Mono" w:hAnsi="C64 Pro Mono" w:cstheme="majorBidi"/>
@@ -4201,23 +3602,6 @@
         </w:rPr>
         <w:br w:type="page"/>
       </w:r>
-      <w:r>
-        <w:rPr>
-          <w:rFonts w:ascii="C64 Pro Mono" w:hAnsi="C64 Pro Mono" w:cstheme="majorBidi"/>
-          <w:color w:val="FFFFFF" w:themeColor="background1"/>
-        </w:rPr>
-        <w:lastRenderedPageBreak/>
-        <w:t>Animating player</w:t>
-      </w:r>
-    </w:p>
-    <w:p>
-      <w:pPr>
-        <w:jc w:val="both"/>
-        <w:rPr>
-          <w:rFonts w:ascii="C64 Pro Mono" w:hAnsi="C64 Pro Mono" w:cstheme="majorBidi"/>
-          <w:color w:val="FFFFFF" w:themeColor="background1"/>
-        </w:rPr>
-      </w:pPr>
       <w:r>
         <w:rPr>
           <w:rFonts w:asciiTheme="majorBidi" w:hAnsiTheme="majorBidi" w:cstheme="majorBidi"/>
@@ -4226,16 +3610,17 @@
           <w:sz w:val="16"/>
           <w:szCs w:val="16"/>
         </w:rPr>
+        <w:lastRenderedPageBreak/>
         <mc:AlternateContent>
           <mc:Choice Requires="wps">
             <w:drawing>
-              <wp:anchor distT="45720" distB="45720" distL="114300" distR="114300" simplePos="0" relativeHeight="251681792" behindDoc="0" locked="0" layoutInCell="1" allowOverlap="1" wp14:anchorId="66EE4AA1" wp14:editId="3709F359">
+              <wp:anchor distT="45720" distB="45720" distL="114300" distR="114300" simplePos="0" relativeHeight="251681792" behindDoc="0" locked="0" layoutInCell="1" allowOverlap="1" wp14:anchorId="66EE4AA1" wp14:editId="101F83C3">
                 <wp:simplePos x="0" y="0"/>
                 <wp:positionH relativeFrom="margin">
-                  <wp:posOffset>-288290</wp:posOffset>
+                  <wp:align>right</wp:align>
                 </wp:positionH>
                 <wp:positionV relativeFrom="paragraph">
-                  <wp:posOffset>389656</wp:posOffset>
+                  <wp:posOffset>410210</wp:posOffset>
                 </wp:positionV>
                 <wp:extent cx="6005830" cy="2781300"/>
                 <wp:effectExtent l="0" t="0" r="13970" b="19050"/>
@@ -4300,23 +3685,7 @@
                               <w:t xml:space="preserve"> </w:t>
                             </w:r>
                             <w:r>
-                              <w:t xml:space="preserve">player = </w:t>
-                            </w:r>
-                            <w:proofErr w:type="spellStart"/>
-                            <w:r>
-                              <w:t>this.add.sprite</w:t>
-                            </w:r>
-                            <w:proofErr w:type="spellEnd"/>
-                            <w:r>
-                              <w:t>(400, 300, '</w:t>
-                            </w:r>
-                            <w:proofErr w:type="spellStart"/>
-                            <w:r>
-                              <w:t>digdug</w:t>
-                            </w:r>
-                            <w:proofErr w:type="spellEnd"/>
-                            <w:r>
-                              <w:t>');</w:t>
+                              <w:t>player = this.add.sprite(400, 300, 'digdug');</w:t>
                             </w:r>
                             <w:r>
                               <w:br/>
@@ -4324,13 +3693,8 @@
                             <w:r>
                               <w:t xml:space="preserve">    </w:t>
                             </w:r>
-                            <w:proofErr w:type="spellStart"/>
-                            <w:r>
-                              <w:t>this.anims.create</w:t>
-                            </w:r>
-                            <w:proofErr w:type="spellEnd"/>
-                            <w:r>
-                              <w:t>({</w:t>
+                            <w:r>
+                              <w:t>this.anims.create({</w:t>
                             </w:r>
                             <w:r>
                               <w:br/>
@@ -4350,23 +3714,7 @@
                               <w:t xml:space="preserve">    </w:t>
                             </w:r>
                             <w:r>
-                              <w:t xml:space="preserve"> frames: </w:t>
-                            </w:r>
-                            <w:proofErr w:type="spellStart"/>
-                            <w:r>
-                              <w:t>this.anims.generateFrameNumbers</w:t>
-                            </w:r>
-                            <w:proofErr w:type="spellEnd"/>
-                            <w:r>
-                              <w:t>('</w:t>
-                            </w:r>
-                            <w:proofErr w:type="spellStart"/>
-                            <w:r>
-                              <w:t>digdug</w:t>
-                            </w:r>
-                            <w:proofErr w:type="spellEnd"/>
-                            <w:r>
-                              <w:t>', { start: 0, end: 3 }),</w:t>
+                              <w:t xml:space="preserve"> frames: this.anims.generateFrameNumbers('digdug', { start: 0, end: 3 }),</w:t>
                             </w:r>
                             <w:r>
                               <w:br/>
@@ -4375,13 +3723,8 @@
                             <w:r>
                               <w:t xml:space="preserve">    </w:t>
                             </w:r>
-                            <w:proofErr w:type="spellStart"/>
-                            <w:r>
-                              <w:t>frameRate</w:t>
-                            </w:r>
-                            <w:proofErr w:type="spellEnd"/>
-                            <w:r>
-                              <w:t>: 5,</w:t>
+                            <w:r>
+                              <w:t>frameRate: 5,</w:t>
                             </w:r>
                             <w:r>
                               <w:br/>
@@ -4407,14 +3750,7 @@
                             </w:r>
                             <w:r>
                               <w:br/>
-                            </w:r>
-                            <w:proofErr w:type="spellStart"/>
-                            <w:r>
-                              <w:t>player.play</w:t>
-                            </w:r>
-                            <w:proofErr w:type="spellEnd"/>
-                            <w:r>
-                              <w:t>('walk');</w:t>
+                              <w:t>player.play('walk');</w:t>
                             </w:r>
                             <w:r>
                               <w:br/>
@@ -4440,7 +3776,7 @@
           </mc:Choice>
           <mc:Fallback>
             <w:pict>
-              <v:shape w14:anchorId="66EE4AA1" id="_x0000_s1037" type="#_x0000_t202" style="position:absolute;left:0;text-align:left;margin-left:-22.7pt;margin-top:30.7pt;width:472.9pt;height:219pt;z-index:251681792;visibility:visible;mso-wrap-style:square;mso-width-percent:0;mso-height-percent:0;mso-wrap-distance-left:9pt;mso-wrap-distance-top:3.6pt;mso-wrap-distance-right:9pt;mso-wrap-distance-bottom:3.6pt;mso-position-horizontal:absolute;mso-position-horizontal-relative:margin;mso-position-vertical:absolute;mso-position-vertical-relative:text;mso-width-percent:0;mso-height-percent:0;mso-width-relative:margin;mso-height-relative:margin;v-text-anchor:top" o:gfxdata="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">
+              <v:shape w14:anchorId="66EE4AA1" id="_x0000_s1037" type="#_x0000_t202" style="position:absolute;left:0;text-align:left;margin-left:421.7pt;margin-top:32.3pt;width:472.9pt;height:219pt;z-index:251681792;visibility:visible;mso-wrap-style:square;mso-width-percent:0;mso-height-percent:0;mso-wrap-distance-left:9pt;mso-wrap-distance-top:3.6pt;mso-wrap-distance-right:9pt;mso-wrap-distance-bottom:3.6pt;mso-position-horizontal:right;mso-position-horizontal-relative:margin;mso-position-vertical:absolute;mso-position-vertical-relative:text;mso-width-percent:0;mso-height-percent:0;mso-width-relative:margin;mso-height-relative:margin;v-text-anchor:top" o:gfxdata="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">
                 <v:textbox>
                   <w:txbxContent>
                     <w:p>
@@ -4471,23 +3807,7 @@
                         <w:t xml:space="preserve"> </w:t>
                       </w:r>
                       <w:r>
-                        <w:t xml:space="preserve">player = </w:t>
-                      </w:r>
-                      <w:proofErr w:type="spellStart"/>
-                      <w:r>
-                        <w:t>this.add.sprite</w:t>
-                      </w:r>
-                      <w:proofErr w:type="spellEnd"/>
-                      <w:r>
-                        <w:t>(400, 300, '</w:t>
-                      </w:r>
-                      <w:proofErr w:type="spellStart"/>
-                      <w:r>
-                        <w:t>digdug</w:t>
-                      </w:r>
-                      <w:proofErr w:type="spellEnd"/>
-                      <w:r>
-                        <w:t>');</w:t>
+                        <w:t>player = this.add.sprite(400, 300, 'digdug');</w:t>
                       </w:r>
                       <w:r>
                         <w:br/>
@@ -4495,13 +3815,8 @@
                       <w:r>
                         <w:t xml:space="preserve">    </w:t>
                       </w:r>
-                      <w:proofErr w:type="spellStart"/>
-                      <w:r>
-                        <w:t>this.anims.create</w:t>
-                      </w:r>
-                      <w:proofErr w:type="spellEnd"/>
-                      <w:r>
-                        <w:t>({</w:t>
+                      <w:r>
+                        <w:t>this.anims.create({</w:t>
                       </w:r>
                       <w:r>
                         <w:br/>
@@ -4521,23 +3836,7 @@
                         <w:t xml:space="preserve">    </w:t>
                       </w:r>
                       <w:r>
-                        <w:t xml:space="preserve"> frames: </w:t>
-                      </w:r>
-                      <w:proofErr w:type="spellStart"/>
-                      <w:r>
-                        <w:t>this.anims.generateFrameNumbers</w:t>
-                      </w:r>
-                      <w:proofErr w:type="spellEnd"/>
-                      <w:r>
-                        <w:t>('</w:t>
-                      </w:r>
-                      <w:proofErr w:type="spellStart"/>
-                      <w:r>
-                        <w:t>digdug</w:t>
-                      </w:r>
-                      <w:proofErr w:type="spellEnd"/>
-                      <w:r>
-                        <w:t>', { start: 0, end: 3 }),</w:t>
+                        <w:t xml:space="preserve"> frames: this.anims.generateFrameNumbers('digdug', { start: 0, end: 3 }),</w:t>
                       </w:r>
                       <w:r>
                         <w:br/>
@@ -4546,13 +3845,8 @@
                       <w:r>
                         <w:t xml:space="preserve">    </w:t>
                       </w:r>
-                      <w:proofErr w:type="spellStart"/>
-                      <w:r>
-                        <w:t>frameRate</w:t>
-                      </w:r>
-                      <w:proofErr w:type="spellEnd"/>
-                      <w:r>
-                        <w:t>: 5,</w:t>
+                      <w:r>
+                        <w:t>frameRate: 5,</w:t>
                       </w:r>
                       <w:r>
                         <w:br/>
@@ -4578,14 +3872,7 @@
                       </w:r>
                       <w:r>
                         <w:br/>
-                      </w:r>
-                      <w:proofErr w:type="spellStart"/>
-                      <w:r>
-                        <w:t>player.play</w:t>
-                      </w:r>
-                      <w:proofErr w:type="spellEnd"/>
-                      <w:r>
-                        <w:t>('walk');</w:t>
+                        <w:t>player.play('walk');</w:t>
                       </w:r>
                       <w:r>
                         <w:br/>
@@ -4600,9 +3887,26 @@
           </mc:Fallback>
         </mc:AlternateContent>
       </w:r>
-    </w:p>
-    <w:p>
-      <w:pPr>
+      <w:r>
+        <w:rPr>
+          <w:rFonts w:ascii="C64 Pro Mono" w:hAnsi="C64 Pro Mono" w:cstheme="majorBidi"/>
+          <w:color w:val="FFFFFF" w:themeColor="background1"/>
+        </w:rPr>
+        <w:t>Animating player</w:t>
+      </w:r>
+    </w:p>
+    <w:p>
+      <w:pPr>
+        <w:jc w:val="both"/>
+        <w:rPr>
+          <w:rFonts w:ascii="C64 Pro Mono" w:hAnsi="C64 Pro Mono" w:cstheme="majorBidi"/>
+          <w:color w:val="FFFFFF" w:themeColor="background1"/>
+        </w:rPr>
+      </w:pPr>
+    </w:p>
+    <w:p>
+      <w:pPr>
+        <w:ind w:firstLine="720"/>
         <w:jc w:val="both"/>
         <w:rPr>
           <w:rFonts w:ascii="C64 Pro Mono" w:hAnsi="C64 Pro Mono" w:cstheme="majorBidi"/>
@@ -4684,16 +3988,11 @@
                             </w:r>
                             <w:r>
                               <w:br/>
-                              <w:t xml:space="preserve">     </w:t>
-                            </w:r>
-                            <w:proofErr w:type="spellStart"/>
-                            <w:r>
-                              <w:t>check</w:t>
+                              <w:t xml:space="preserve">     check</w:t>
                             </w:r>
                             <w:r>
                               <w:t>Keys</w:t>
                             </w:r>
-                            <w:proofErr w:type="spellEnd"/>
                             <w:r>
                               <w:t>();</w:t>
                             </w:r>
@@ -4750,16 +4049,11 @@
                       </w:r>
                       <w:r>
                         <w:br/>
-                        <w:t xml:space="preserve">     </w:t>
-                      </w:r>
-                      <w:proofErr w:type="spellStart"/>
-                      <w:r>
-                        <w:t>check</w:t>
+                        <w:t xml:space="preserve">     check</w:t>
                       </w:r>
                       <w:r>
                         <w:t>Keys</w:t>
                       </w:r>
-                      <w:proofErr w:type="spellEnd"/>
                       <w:r>
                         <w:t>();</w:t>
                       </w:r>
@@ -4860,15 +4154,7 @@
                               <w:t xml:space="preserve">     </w:t>
                             </w:r>
                             <w:r>
-                              <w:t xml:space="preserve">cursors = </w:t>
-                            </w:r>
-                            <w:proofErr w:type="spellStart"/>
-                            <w:r>
-                              <w:t>this.input.keyboard.createCursorKeys</w:t>
-                            </w:r>
-                            <w:proofErr w:type="spellEnd"/>
-                            <w:r>
-                              <w:t>();</w:t>
+                              <w:t>cursors = this.input.keyboard.createCursorKeys();</w:t>
                             </w:r>
                             <w:r>
                               <w:br/>
@@ -4927,15 +4213,7 @@
                         <w:t xml:space="preserve">     </w:t>
                       </w:r>
                       <w:r>
-                        <w:t xml:space="preserve">cursors = </w:t>
-                      </w:r>
-                      <w:proofErr w:type="spellStart"/>
-                      <w:r>
-                        <w:t>this.input.keyboard.createCursorKeys</w:t>
-                      </w:r>
-                      <w:proofErr w:type="spellEnd"/>
-                      <w:r>
-                        <w:t>();</w:t>
+                        <w:t>cursors = this.input.keyboard.createCursorKeys();</w:t>
                       </w:r>
                       <w:r>
                         <w:br/>
@@ -4955,6 +4233,27 @@
             </w:pict>
           </mc:Fallback>
         </mc:AlternateContent>
+      </w:r>
+      <w:r>
+        <w:rPr>
+          <w:rFonts w:ascii="C64 Pro Mono" w:hAnsi="C64 Pro Mono" w:cstheme="majorBidi"/>
+          <w:color w:val="FFFFFF" w:themeColor="background1"/>
+        </w:rPr>
+        <w:t>3.</w:t>
+      </w:r>
+      <w:r>
+        <w:rPr>
+          <w:rFonts w:ascii="C64 Pro Mono" w:hAnsi="C64 Pro Mono" w:cstheme="majorBidi"/>
+          <w:color w:val="FFFFFF" w:themeColor="background1"/>
+        </w:rPr>
+        <w:t>5</w:t>
+      </w:r>
+      <w:r>
+        <w:rPr>
+          <w:rFonts w:ascii="C64 Pro Mono" w:hAnsi="C64 Pro Mono" w:cstheme="majorBidi"/>
+          <w:color w:val="FFFFFF" w:themeColor="background1"/>
+        </w:rPr>
+        <w:t xml:space="preserve"> </w:t>
       </w:r>
       <w:r>
         <w:rPr>
@@ -5035,63 +4334,23 @@
                         <w:txbxContent>
                           <w:p>
                             <w:r>
-                              <w:t xml:space="preserve">function </w:t>
-                            </w:r>
-                            <w:proofErr w:type="spellStart"/>
-                            <w:r>
-                              <w:t>checkKeys</w:t>
-                            </w:r>
-                            <w:proofErr w:type="spellEnd"/>
-                            <w:r>
-                              <w:t>(){</w:t>
-                            </w:r>
-                            <w:r>
-                              <w:br/>
-                              <w:t xml:space="preserve">   if (</w:t>
-                            </w:r>
-                            <w:proofErr w:type="spellStart"/>
-                            <w:r>
-                              <w:t>cursors.left.isDown</w:t>
-                            </w:r>
-                            <w:proofErr w:type="spellEnd"/>
-                            <w:r>
-                              <w:t>) {</w:t>
-                            </w:r>
-                            <w:r>
-                              <w:br/>
-                              <w:t xml:space="preserve">        </w:t>
-                            </w:r>
-                            <w:proofErr w:type="spellStart"/>
-                            <w:r>
-                              <w:t>player.x</w:t>
-                            </w:r>
-                            <w:proofErr w:type="spellEnd"/>
-                            <w:r>
-                              <w:t xml:space="preserve"> -= 1;</w:t>
-                            </w:r>
-                            <w:r>
-                              <w:br/>
-                              <w:t xml:space="preserve">    } else if (</w:t>
-                            </w:r>
-                            <w:proofErr w:type="spellStart"/>
-                            <w:r>
-                              <w:t>cursors.right.isDown</w:t>
-                            </w:r>
-                            <w:proofErr w:type="spellEnd"/>
-                            <w:r>
-                              <w:t>) {</w:t>
-                            </w:r>
-                            <w:r>
-                              <w:br/>
-                              <w:t xml:space="preserve">        </w:t>
-                            </w:r>
-                            <w:proofErr w:type="spellStart"/>
-                            <w:r>
-                              <w:t>player.x</w:t>
-                            </w:r>
-                            <w:proofErr w:type="spellEnd"/>
-                            <w:r>
-                              <w:t xml:space="preserve"> += 1;</w:t>
+                              <w:t>function checkKeys(){</w:t>
+                            </w:r>
+                            <w:r>
+                              <w:br/>
+                              <w:t xml:space="preserve">   if (cursors.left.isDown) {</w:t>
+                            </w:r>
+                            <w:r>
+                              <w:br/>
+                              <w:t xml:space="preserve">        player.x -= 1;</w:t>
+                            </w:r>
+                            <w:r>
+                              <w:br/>
+                              <w:t xml:space="preserve">    } else if (cursors.right.isDown) {</w:t>
+                            </w:r>
+                            <w:r>
+                              <w:br/>
+                              <w:t xml:space="preserve">        player.x += 1;</w:t>
                             </w:r>
                             <w:r>
                               <w:br/>
@@ -5102,51 +4361,19 @@
                             </w:r>
                             <w:r>
                               <w:br/>
-                              <w:t xml:space="preserve">    if (</w:t>
-                            </w:r>
-                            <w:proofErr w:type="spellStart"/>
-                            <w:r>
-                              <w:t>cursors.up.isDown</w:t>
-                            </w:r>
-                            <w:proofErr w:type="spellEnd"/>
-                            <w:r>
-                              <w:t>) {</w:t>
-                            </w:r>
-                            <w:r>
-                              <w:br/>
-                              <w:t xml:space="preserve">        </w:t>
-                            </w:r>
-                            <w:proofErr w:type="spellStart"/>
-                            <w:r>
-                              <w:t>player.y</w:t>
-                            </w:r>
-                            <w:proofErr w:type="spellEnd"/>
-                            <w:r>
-                              <w:t xml:space="preserve"> -= 1;</w:t>
-                            </w:r>
-                            <w:r>
-                              <w:br/>
-                              <w:t xml:space="preserve">    } else if (</w:t>
-                            </w:r>
-                            <w:proofErr w:type="spellStart"/>
-                            <w:r>
-                              <w:t>cursors.down.isDown</w:t>
-                            </w:r>
-                            <w:proofErr w:type="spellEnd"/>
-                            <w:r>
-                              <w:t>) {</w:t>
-                            </w:r>
-                            <w:r>
-                              <w:br/>
-                              <w:t xml:space="preserve">        </w:t>
-                            </w:r>
-                            <w:proofErr w:type="spellStart"/>
-                            <w:r>
-                              <w:t>player.y</w:t>
-                            </w:r>
-                            <w:proofErr w:type="spellEnd"/>
-                            <w:r>
-                              <w:t xml:space="preserve"> += 1;</w:t>
+                              <w:t xml:space="preserve">    if (cursors.up.isDown) {</w:t>
+                            </w:r>
+                            <w:r>
+                              <w:br/>
+                              <w:t xml:space="preserve">        player.y -= 1;</w:t>
+                            </w:r>
+                            <w:r>
+                              <w:br/>
+                              <w:t xml:space="preserve">    } else if (cursors.down.isDown) {</w:t>
+                            </w:r>
+                            <w:r>
+                              <w:br/>
+                              <w:t xml:space="preserve">        player.y += 1;</w:t>
                             </w:r>
                             <w:r>
                               <w:br/>
@@ -5182,63 +4409,23 @@
                   <w:txbxContent>
                     <w:p>
                       <w:r>
-                        <w:t xml:space="preserve">function </w:t>
-                      </w:r>
-                      <w:proofErr w:type="spellStart"/>
-                      <w:r>
-                        <w:t>checkKeys</w:t>
-                      </w:r>
-                      <w:proofErr w:type="spellEnd"/>
-                      <w:r>
-                        <w:t>(){</w:t>
-                      </w:r>
-                      <w:r>
-                        <w:br/>
-                        <w:t xml:space="preserve">   if (</w:t>
-                      </w:r>
-                      <w:proofErr w:type="spellStart"/>
-                      <w:r>
-                        <w:t>cursors.left.isDown</w:t>
-                      </w:r>
-                      <w:proofErr w:type="spellEnd"/>
-                      <w:r>
-                        <w:t>) {</w:t>
-                      </w:r>
-                      <w:r>
-                        <w:br/>
-                        <w:t xml:space="preserve">        </w:t>
-                      </w:r>
-                      <w:proofErr w:type="spellStart"/>
-                      <w:r>
-                        <w:t>player.x</w:t>
-                      </w:r>
-                      <w:proofErr w:type="spellEnd"/>
-                      <w:r>
-                        <w:t xml:space="preserve"> -= 1;</w:t>
-                      </w:r>
-                      <w:r>
-                        <w:br/>
-                        <w:t xml:space="preserve">    } else if (</w:t>
-                      </w:r>
-                      <w:proofErr w:type="spellStart"/>
-                      <w:r>
-                        <w:t>cursors.right.isDown</w:t>
-                      </w:r>
-                      <w:proofErr w:type="spellEnd"/>
-                      <w:r>
-                        <w:t>) {</w:t>
-                      </w:r>
-                      <w:r>
-                        <w:br/>
-                        <w:t xml:space="preserve">        </w:t>
-                      </w:r>
-                      <w:proofErr w:type="spellStart"/>
-                      <w:r>
-                        <w:t>player.x</w:t>
-                      </w:r>
-                      <w:proofErr w:type="spellEnd"/>
-                      <w:r>
-                        <w:t xml:space="preserve"> += 1;</w:t>
+                        <w:t>function checkKeys(){</w:t>
+                      </w:r>
+                      <w:r>
+                        <w:br/>
+                        <w:t xml:space="preserve">   if (cursors.left.isDown) {</w:t>
+                      </w:r>
+                      <w:r>
+                        <w:br/>
+                        <w:t xml:space="preserve">        player.x -= 1;</w:t>
+                      </w:r>
+                      <w:r>
+                        <w:br/>
+                        <w:t xml:space="preserve">    } else if (cursors.right.isDown) {</w:t>
+                      </w:r>
+                      <w:r>
+                        <w:br/>
+                        <w:t xml:space="preserve">        player.x += 1;</w:t>
                       </w:r>
                       <w:r>
                         <w:br/>
@@ -5249,51 +4436,19 @@
                       </w:r>
                       <w:r>
                         <w:br/>
-                        <w:t xml:space="preserve">    if (</w:t>
-                      </w:r>
-                      <w:proofErr w:type="spellStart"/>
-                      <w:r>
-                        <w:t>cursors.up.isDown</w:t>
-                      </w:r>
-                      <w:proofErr w:type="spellEnd"/>
-                      <w:r>
-                        <w:t>) {</w:t>
-                      </w:r>
-                      <w:r>
-                        <w:br/>
-                        <w:t xml:space="preserve">        </w:t>
-                      </w:r>
-                      <w:proofErr w:type="spellStart"/>
-                      <w:r>
-                        <w:t>player.y</w:t>
-                      </w:r>
-                      <w:proofErr w:type="spellEnd"/>
-                      <w:r>
-                        <w:t xml:space="preserve"> -= 1;</w:t>
-                      </w:r>
-                      <w:r>
-                        <w:br/>
-                        <w:t xml:space="preserve">    } else if (</w:t>
-                      </w:r>
-                      <w:proofErr w:type="spellStart"/>
-                      <w:r>
-                        <w:t>cursors.down.isDown</w:t>
-                      </w:r>
-                      <w:proofErr w:type="spellEnd"/>
-                      <w:r>
-                        <w:t>) {</w:t>
-                      </w:r>
-                      <w:r>
-                        <w:br/>
-                        <w:t xml:space="preserve">        </w:t>
-                      </w:r>
-                      <w:proofErr w:type="spellStart"/>
-                      <w:r>
-                        <w:t>player.y</w:t>
-                      </w:r>
-                      <w:proofErr w:type="spellEnd"/>
-                      <w:r>
-                        <w:t xml:space="preserve"> += 1;</w:t>
+                        <w:t xml:space="preserve">    if (cursors.up.isDown) {</w:t>
+                      </w:r>
+                      <w:r>
+                        <w:br/>
+                        <w:t xml:space="preserve">        player.y -= 1;</w:t>
+                      </w:r>
+                      <w:r>
+                        <w:br/>
+                        <w:t xml:space="preserve">    } else if (cursors.down.isDown) {</w:t>
+                      </w:r>
+                      <w:r>
+                        <w:br/>
+                        <w:t xml:space="preserve">        player.y += 1;</w:t>
                       </w:r>
                       <w:r>
                         <w:br/>
@@ -5330,6 +4485,7 @@
     </w:p>
     <w:p>
       <w:pPr>
+        <w:ind w:firstLine="720"/>
         <w:jc w:val="both"/>
         <w:rPr>
           <w:rFonts w:ascii="C64 Pro Mono" w:hAnsi="C64 Pro Mono" w:cstheme="majorBidi"/>
@@ -5393,95 +4549,15 @@
                         <w:txbxContent>
                           <w:p>
                             <w:r>
-                              <w:t xml:space="preserve">function </w:t>
-                            </w:r>
-                            <w:proofErr w:type="spellStart"/>
-                            <w:r>
-                              <w:t>checkHit</w:t>
-                            </w:r>
-                            <w:proofErr w:type="spellEnd"/>
-                            <w:r>
-                              <w:t>(sprite){</w:t>
-                            </w:r>
-                            <w:r>
-                              <w:br/>
-                              <w:t xml:space="preserve">    let d = </w:t>
-                            </w:r>
-                            <w:proofErr w:type="spellStart"/>
-                            <w:r>
-                              <w:t>Phaser.Math.Distance.Between</w:t>
-                            </w:r>
-                            <w:proofErr w:type="spellEnd"/>
-                            <w:r>
-                              <w:t>(</w:t>
-                            </w:r>
-                            <w:proofErr w:type="spellStart"/>
-                            <w:r>
-                              <w:t>sprite.x</w:t>
-                            </w:r>
-                            <w:proofErr w:type="spellEnd"/>
-                            <w:r>
-                              <w:t xml:space="preserve"> + </w:t>
-                            </w:r>
-                            <w:proofErr w:type="spellStart"/>
-                            <w:r>
-                              <w:t>sprite.width</w:t>
-                            </w:r>
-                            <w:proofErr w:type="spellEnd"/>
-                            <w:r>
-                              <w:t xml:space="preserve">/2, </w:t>
-                            </w:r>
-                            <w:proofErr w:type="spellStart"/>
-                            <w:r>
-                              <w:t>sprite.y</w:t>
-                            </w:r>
-                            <w:proofErr w:type="spellEnd"/>
-                            <w:r>
-                              <w:t xml:space="preserve"> + </w:t>
-                            </w:r>
-                            <w:proofErr w:type="spellStart"/>
-                            <w:r>
-                              <w:t>sprite.height</w:t>
-                            </w:r>
-                            <w:proofErr w:type="spellEnd"/>
-                            <w:r>
-                              <w:t>/2</w:t>
-                            </w:r>
-                            <w:r>
-                              <w:br/>
-                              <w:t xml:space="preserve">        , </w:t>
-                            </w:r>
-                            <w:proofErr w:type="spellStart"/>
-                            <w:r>
-                              <w:t>player.x</w:t>
-                            </w:r>
-                            <w:proofErr w:type="spellEnd"/>
-                            <w:r>
-                              <w:t xml:space="preserve"> + </w:t>
-                            </w:r>
-                            <w:proofErr w:type="spellStart"/>
-                            <w:r>
-                              <w:t>player.width</w:t>
-                            </w:r>
-                            <w:proofErr w:type="spellEnd"/>
-                            <w:r>
-                              <w:t xml:space="preserve">/2, </w:t>
-                            </w:r>
-                            <w:proofErr w:type="spellStart"/>
-                            <w:r>
-                              <w:t>player.y</w:t>
-                            </w:r>
-                            <w:proofErr w:type="spellEnd"/>
-                            <w:r>
-                              <w:t xml:space="preserve"> + </w:t>
-                            </w:r>
-                            <w:proofErr w:type="spellStart"/>
-                            <w:r>
-                              <w:t>player.height</w:t>
-                            </w:r>
-                            <w:proofErr w:type="spellEnd"/>
-                            <w:r>
-                              <w:t>/2);</w:t>
+                              <w:t>function checkHit(sprite){</w:t>
+                            </w:r>
+                            <w:r>
+                              <w:br/>
+                              <w:t xml:space="preserve">    let d = Phaser.Math.Distance.Between(sprite.x + sprite.width/2, sprite.y + sprite.height/2</w:t>
+                            </w:r>
+                            <w:r>
+                              <w:br/>
+                              <w:t xml:space="preserve">        , player.x + player.width/2, player.y + player.height/2);</w:t>
                             </w:r>
                             <w:r>
                               <w:br/>
@@ -5492,23 +4568,7 @@
                             </w:r>
                             <w:r>
                               <w:br/>
-                              <w:t xml:space="preserve">        </w:t>
-                            </w:r>
-                            <w:proofErr w:type="spellStart"/>
-                            <w:r>
-                              <w:t>sprite.y</w:t>
-                            </w:r>
-                            <w:proofErr w:type="spellEnd"/>
-                            <w:r>
-                              <w:t xml:space="preserve"> = </w:t>
-                            </w:r>
-                            <w:proofErr w:type="spellStart"/>
-                            <w:r>
-                              <w:t>Math.pow</w:t>
-                            </w:r>
-                            <w:proofErr w:type="spellEnd"/>
-                            <w:r>
-                              <w:t>(10,16);</w:t>
+                              <w:t xml:space="preserve">        sprite.y = Math.pow(10,16);</w:t>
                             </w:r>
                             <w:r>
                               <w:br/>
@@ -5544,95 +4604,15 @@
                   <w:txbxContent>
                     <w:p>
                       <w:r>
-                        <w:t xml:space="preserve">function </w:t>
-                      </w:r>
-                      <w:proofErr w:type="spellStart"/>
-                      <w:r>
-                        <w:t>checkHit</w:t>
-                      </w:r>
-                      <w:proofErr w:type="spellEnd"/>
-                      <w:r>
-                        <w:t>(sprite){</w:t>
-                      </w:r>
-                      <w:r>
-                        <w:br/>
-                        <w:t xml:space="preserve">    let d = </w:t>
-                      </w:r>
-                      <w:proofErr w:type="spellStart"/>
-                      <w:r>
-                        <w:t>Phaser.Math.Distance.Between</w:t>
-                      </w:r>
-                      <w:proofErr w:type="spellEnd"/>
-                      <w:r>
-                        <w:t>(</w:t>
-                      </w:r>
-                      <w:proofErr w:type="spellStart"/>
-                      <w:r>
-                        <w:t>sprite.x</w:t>
-                      </w:r>
-                      <w:proofErr w:type="spellEnd"/>
-                      <w:r>
-                        <w:t xml:space="preserve"> + </w:t>
-                      </w:r>
-                      <w:proofErr w:type="spellStart"/>
-                      <w:r>
-                        <w:t>sprite.width</w:t>
-                      </w:r>
-                      <w:proofErr w:type="spellEnd"/>
-                      <w:r>
-                        <w:t xml:space="preserve">/2, </w:t>
-                      </w:r>
-                      <w:proofErr w:type="spellStart"/>
-                      <w:r>
-                        <w:t>sprite.y</w:t>
-                      </w:r>
-                      <w:proofErr w:type="spellEnd"/>
-                      <w:r>
-                        <w:t xml:space="preserve"> + </w:t>
-                      </w:r>
-                      <w:proofErr w:type="spellStart"/>
-                      <w:r>
-                        <w:t>sprite.height</w:t>
-                      </w:r>
-                      <w:proofErr w:type="spellEnd"/>
-                      <w:r>
-                        <w:t>/2</w:t>
-                      </w:r>
-                      <w:r>
-                        <w:br/>
-                        <w:t xml:space="preserve">        , </w:t>
-                      </w:r>
-                      <w:proofErr w:type="spellStart"/>
-                      <w:r>
-                        <w:t>player.x</w:t>
-                      </w:r>
-                      <w:proofErr w:type="spellEnd"/>
-                      <w:r>
-                        <w:t xml:space="preserve"> + </w:t>
-                      </w:r>
-                      <w:proofErr w:type="spellStart"/>
-                      <w:r>
-                        <w:t>player.width</w:t>
-                      </w:r>
-                      <w:proofErr w:type="spellEnd"/>
-                      <w:r>
-                        <w:t xml:space="preserve">/2, </w:t>
-                      </w:r>
-                      <w:proofErr w:type="spellStart"/>
-                      <w:r>
-                        <w:t>player.y</w:t>
-                      </w:r>
-                      <w:proofErr w:type="spellEnd"/>
-                      <w:r>
-                        <w:t xml:space="preserve"> + </w:t>
-                      </w:r>
-                      <w:proofErr w:type="spellStart"/>
-                      <w:r>
-                        <w:t>player.height</w:t>
-                      </w:r>
-                      <w:proofErr w:type="spellEnd"/>
-                      <w:r>
-                        <w:t>/2);</w:t>
+                        <w:t>function checkHit(sprite){</w:t>
+                      </w:r>
+                      <w:r>
+                        <w:br/>
+                        <w:t xml:space="preserve">    let d = Phaser.Math.Distance.Between(sprite.x + sprite.width/2, sprite.y + sprite.height/2</w:t>
+                      </w:r>
+                      <w:r>
+                        <w:br/>
+                        <w:t xml:space="preserve">        , player.x + player.width/2, player.y + player.height/2);</w:t>
                       </w:r>
                       <w:r>
                         <w:br/>
@@ -5643,23 +4623,7 @@
                       </w:r>
                       <w:r>
                         <w:br/>
-                        <w:t xml:space="preserve">        </w:t>
-                      </w:r>
-                      <w:proofErr w:type="spellStart"/>
-                      <w:r>
-                        <w:t>sprite.y</w:t>
-                      </w:r>
-                      <w:proofErr w:type="spellEnd"/>
-                      <w:r>
-                        <w:t xml:space="preserve"> = </w:t>
-                      </w:r>
-                      <w:proofErr w:type="spellStart"/>
-                      <w:r>
-                        <w:t>Math.pow</w:t>
-                      </w:r>
-                      <w:proofErr w:type="spellEnd"/>
-                      <w:r>
-                        <w:t>(10,16);</w:t>
+                        <w:t xml:space="preserve">        sprite.y = Math.pow(10,16);</w:t>
                       </w:r>
                       <w:r>
                         <w:br/>
@@ -5684,7 +4648,21 @@
           <w:rFonts w:ascii="C64 Pro Mono" w:hAnsi="C64 Pro Mono" w:cstheme="majorBidi"/>
           <w:color w:val="FFFFFF" w:themeColor="background1"/>
         </w:rPr>
-        <w:t>2.9 Collisions</w:t>
+        <w:t>3.</w:t>
+      </w:r>
+      <w:r>
+        <w:rPr>
+          <w:rFonts w:ascii="C64 Pro Mono" w:hAnsi="C64 Pro Mono" w:cstheme="majorBidi"/>
+          <w:color w:val="FFFFFF" w:themeColor="background1"/>
+        </w:rPr>
+        <w:t>6</w:t>
+      </w:r>
+      <w:r>
+        <w:rPr>
+          <w:rFonts w:ascii="C64 Pro Mono" w:hAnsi="C64 Pro Mono" w:cstheme="majorBidi"/>
+          <w:color w:val="FFFFFF" w:themeColor="background1"/>
+        </w:rPr>
+        <w:t xml:space="preserve"> Collisions</w:t>
       </w:r>
     </w:p>
     <w:p>
@@ -5713,6 +4691,7 @@
     </w:p>
     <w:p>
       <w:pPr>
+        <w:ind w:firstLine="720"/>
         <w:jc w:val="both"/>
         <w:rPr>
           <w:rFonts w:ascii="C64 Pro Mono" w:hAnsi="C64 Pro Mono" w:cstheme="majorBidi"/>
@@ -5725,7 +4704,21 @@
           <w:color w:val="FFFFFF" w:themeColor="background1"/>
         </w:rPr>
         <w:lastRenderedPageBreak/>
-        <w:t>2.10 Score</w:t>
+        <w:t>3.</w:t>
+      </w:r>
+      <w:r>
+        <w:rPr>
+          <w:rFonts w:ascii="C64 Pro Mono" w:hAnsi="C64 Pro Mono" w:cstheme="majorBidi"/>
+          <w:color w:val="FFFFFF" w:themeColor="background1"/>
+        </w:rPr>
+        <w:t>7</w:t>
+      </w:r>
+      <w:r>
+        <w:rPr>
+          <w:rFonts w:ascii="C64 Pro Mono" w:hAnsi="C64 Pro Mono" w:cstheme="majorBidi"/>
+          <w:color w:val="FFFFFF" w:themeColor="background1"/>
+        </w:rPr>
+        <w:t xml:space="preserve"> Score</w:t>
       </w:r>
     </w:p>
     <w:p>
@@ -5803,15 +4796,7 @@
                           </w:p>
                           <w:p>
                             <w:r>
-                              <w:t xml:space="preserve">function </w:t>
-                            </w:r>
-                            <w:proofErr w:type="spellStart"/>
-                            <w:r>
-                              <w:t>increaseScore</w:t>
-                            </w:r>
-                            <w:proofErr w:type="spellEnd"/>
-                            <w:r>
-                              <w:t>(){</w:t>
+                              <w:t>function increaseScore(){</w:t>
                             </w:r>
                             <w:r>
                               <w:br/>
@@ -5819,35 +4804,11 @@
                             </w:r>
                             <w:r>
                               <w:br/>
-                              <w:t xml:space="preserve">    const </w:t>
-                            </w:r>
-                            <w:proofErr w:type="spellStart"/>
-                            <w:r>
-                              <w:t>scoreDiv</w:t>
-                            </w:r>
-                            <w:proofErr w:type="spellEnd"/>
-                            <w:r>
-                              <w:t xml:space="preserve"> = </w:t>
-                            </w:r>
-                            <w:proofErr w:type="spellStart"/>
-                            <w:r>
-                              <w:t>document.getElementById</w:t>
-                            </w:r>
-                            <w:proofErr w:type="spellEnd"/>
-                            <w:r>
-                              <w:t>('score');</w:t>
-                            </w:r>
-                            <w:r>
-                              <w:br/>
-                              <w:t xml:space="preserve">    </w:t>
-                            </w:r>
-                            <w:proofErr w:type="spellStart"/>
-                            <w:r>
-                              <w:t>scoreDiv.innerText</w:t>
-                            </w:r>
-                            <w:proofErr w:type="spellEnd"/>
-                            <w:r>
-                              <w:t xml:space="preserve"> = 'SCORE: ' + score;</w:t>
+                              <w:t xml:space="preserve">    const scoreDiv = document.getElementById('score');</w:t>
+                            </w:r>
+                            <w:r>
+                              <w:br/>
+                              <w:t xml:space="preserve">    scoreDiv.innerText = 'SCORE: ' + score;</w:t>
                             </w:r>
                             <w:r>
                               <w:br/>
@@ -5890,15 +4851,7 @@
                     </w:p>
                     <w:p>
                       <w:r>
-                        <w:t xml:space="preserve">function </w:t>
-                      </w:r>
-                      <w:proofErr w:type="spellStart"/>
-                      <w:r>
-                        <w:t>increaseScore</w:t>
-                      </w:r>
-                      <w:proofErr w:type="spellEnd"/>
-                      <w:r>
-                        <w:t>(){</w:t>
+                        <w:t>function increaseScore(){</w:t>
                       </w:r>
                       <w:r>
                         <w:br/>
@@ -5906,35 +4859,11 @@
                       </w:r>
                       <w:r>
                         <w:br/>
-                        <w:t xml:space="preserve">    const </w:t>
-                      </w:r>
-                      <w:proofErr w:type="spellStart"/>
-                      <w:r>
-                        <w:t>scoreDiv</w:t>
-                      </w:r>
-                      <w:proofErr w:type="spellEnd"/>
-                      <w:r>
-                        <w:t xml:space="preserve"> = </w:t>
-                      </w:r>
-                      <w:proofErr w:type="spellStart"/>
-                      <w:r>
-                        <w:t>document.getElementById</w:t>
-                      </w:r>
-                      <w:proofErr w:type="spellEnd"/>
-                      <w:r>
-                        <w:t>('score');</w:t>
-                      </w:r>
-                      <w:r>
-                        <w:br/>
-                        <w:t xml:space="preserve">    </w:t>
-                      </w:r>
-                      <w:proofErr w:type="spellStart"/>
-                      <w:r>
-                        <w:t>scoreDiv.innerText</w:t>
-                      </w:r>
-                      <w:proofErr w:type="spellEnd"/>
-                      <w:r>
-                        <w:t xml:space="preserve"> = 'SCORE: ' + score;</w:t>
+                        <w:t xml:space="preserve">    const scoreDiv = document.getElementById('score');</w:t>
+                      </w:r>
+                      <w:r>
+                        <w:br/>
+                        <w:t xml:space="preserve">    scoreDiv.innerText = 'SCORE: ' + score;</w:t>
                       </w:r>
                       <w:r>
                         <w:br/>
@@ -5968,6 +4897,127 @@
           <w:color w:val="FFFFFF" w:themeColor="background1"/>
         </w:rPr>
       </w:pPr>
+    </w:p>
+    <w:p>
+      <w:pPr>
+        <w:jc w:val="both"/>
+        <w:rPr>
+          <w:rFonts w:ascii="C64 Pro Mono" w:hAnsi="C64 Pro Mono" w:cstheme="majorBidi"/>
+          <w:color w:val="FFFFFF" w:themeColor="background1"/>
+        </w:rPr>
+      </w:pPr>
+    </w:p>
+    <w:p>
+      <w:pPr>
+        <w:ind w:firstLine="720"/>
+        <w:jc w:val="both"/>
+        <w:rPr>
+          <w:rFonts w:ascii="C64 Pro Mono" w:hAnsi="C64 Pro Mono" w:cstheme="majorBidi"/>
+          <w:color w:val="FFFFFF" w:themeColor="background1"/>
+        </w:rPr>
+      </w:pPr>
+      <w:r>
+        <w:rPr>
+          <w:rFonts w:ascii="C64 Pro Mono" w:hAnsi="C64 Pro Mono" w:cstheme="majorBidi"/>
+          <w:color w:val="FFFFFF" w:themeColor="background1"/>
+        </w:rPr>
+        <w:lastRenderedPageBreak/>
+        <w:t>4</w:t>
+      </w:r>
+      <w:r>
+        <w:rPr>
+          <w:rFonts w:ascii="C64 Pro Mono" w:hAnsi="C64 Pro Mono" w:cstheme="majorBidi"/>
+          <w:color w:val="FFFFFF" w:themeColor="background1"/>
+        </w:rPr>
+        <w:t>. Summary</w:t>
+      </w:r>
+    </w:p>
+    <w:p>
+      <w:pPr>
+        <w:jc w:val="both"/>
+        <w:rPr>
+          <w:rFonts w:ascii="C64 Pro Mono" w:hAnsi="C64 Pro Mono" w:cstheme="majorBidi"/>
+          <w:color w:val="FFFFFF" w:themeColor="background1"/>
+        </w:rPr>
+      </w:pPr>
+    </w:p>
+    <w:p>
+      <w:pPr>
+        <w:pStyle w:val="ListParagraph"/>
+        <w:numPr>
+          <w:ilvl w:val="0"/>
+          <w:numId w:val="8"/>
+        </w:numPr>
+        <w:rPr>
+          <w:rFonts w:ascii="C64 Pro Mono" w:hAnsi="C64 Pro Mono" w:cstheme="majorBidi"/>
+          <w:color w:val="FFFFFF" w:themeColor="background1"/>
+        </w:rPr>
+      </w:pPr>
+      <w:r>
+        <w:rPr>
+          <w:rFonts w:ascii="C64 Pro Mono" w:hAnsi="C64 Pro Mono" w:cstheme="majorBidi"/>
+          <w:color w:val="FFFFFF" w:themeColor="background1"/>
+        </w:rPr>
+        <w:t>It is possible to quickly write a simple game using JS Phaser</w:t>
+      </w:r>
+    </w:p>
+    <w:p>
+      <w:pPr>
+        <w:pStyle w:val="ListParagraph"/>
+        <w:rPr>
+          <w:rFonts w:ascii="C64 Pro Mono" w:hAnsi="C64 Pro Mono" w:cstheme="majorBidi"/>
+          <w:color w:val="FFFFFF" w:themeColor="background1"/>
+        </w:rPr>
+      </w:pPr>
+    </w:p>
+    <w:p>
+      <w:pPr>
+        <w:pStyle w:val="ListParagraph"/>
+        <w:numPr>
+          <w:ilvl w:val="0"/>
+          <w:numId w:val="8"/>
+        </w:numPr>
+        <w:rPr>
+          <w:rFonts w:ascii="C64 Pro Mono" w:hAnsi="C64 Pro Mono" w:cstheme="majorBidi"/>
+          <w:color w:val="FFFFFF" w:themeColor="background1"/>
+        </w:rPr>
+      </w:pPr>
+      <w:r>
+        <w:rPr>
+          <w:rFonts w:ascii="C64 Pro Mono" w:hAnsi="C64 Pro Mono" w:cstheme="majorBidi"/>
+          <w:color w:val="FFFFFF" w:themeColor="background1"/>
+        </w:rPr>
+        <w:t>Phaser library significantly facilitated sprites creation and handling</w:t>
+      </w:r>
+    </w:p>
+    <w:p>
+      <w:pPr>
+        <w:pStyle w:val="ListParagraph"/>
+        <w:rPr>
+          <w:rFonts w:ascii="C64 Pro Mono" w:hAnsi="C64 Pro Mono" w:cstheme="majorBidi"/>
+          <w:color w:val="FFFFFF" w:themeColor="background1"/>
+        </w:rPr>
+      </w:pPr>
+    </w:p>
+    <w:p>
+      <w:pPr>
+        <w:pStyle w:val="ListParagraph"/>
+        <w:numPr>
+          <w:ilvl w:val="0"/>
+          <w:numId w:val="8"/>
+        </w:numPr>
+        <w:rPr>
+          <w:rFonts w:ascii="C64 Pro Mono" w:hAnsi="C64 Pro Mono" w:cstheme="majorBidi"/>
+          <w:color w:val="FFFFFF" w:themeColor="background1"/>
+        </w:rPr>
+      </w:pPr>
+      <w:r>
+        <w:rPr>
+          <w:rFonts w:ascii="C64 Pro Mono" w:hAnsi="C64 Pro Mono" w:cstheme="majorBidi"/>
+          <w:color w:val="FFFFFF" w:themeColor="background1"/>
+        </w:rPr>
+        <w:t>JavaScript with Phaser is a good tool to write a retro-style game</w:t>
+      </w:r>
     </w:p>
     <w:p>
       <w:pPr>
@@ -6279,9 +5329,9 @@
     </w:lvl>
   </w:abstractNum>
   <w:abstractNum w:abstractNumId="2" w15:restartNumberingAfterBreak="0">
-    <w:nsid w:val="48077187"/>
+    <w:nsid w:val="424C0DCE"/>
     <w:multiLevelType w:val="hybridMultilevel"/>
-    <w:tmpl w:val="41248E88"/>
+    <w:tmpl w:val="74348302"/>
     <w:lvl w:ilvl="0" w:tplc="04090001">
       <w:start w:val="1"/>
       <w:numFmt w:val="bullet"/>
@@ -6392,6 +5442,119 @@
     </w:lvl>
   </w:abstractNum>
   <w:abstractNum w:abstractNumId="3" w15:restartNumberingAfterBreak="0">
+    <w:nsid w:val="48077187"/>
+    <w:multiLevelType w:val="hybridMultilevel"/>
+    <w:tmpl w:val="41248E88"/>
+    <w:lvl w:ilvl="0" w:tplc="04090001">
+      <w:start w:val="1"/>
+      <w:numFmt w:val="bullet"/>
+      <w:lvlText w:val=""/>
+      <w:lvlJc w:val="left"/>
+      <w:pPr>
+        <w:ind w:left="720" w:hanging="360"/>
+      </w:pPr>
+      <w:rPr>
+        <w:rFonts w:ascii="Symbol" w:hAnsi="Symbol" w:hint="default"/>
+      </w:rPr>
+    </w:lvl>
+    <w:lvl w:ilvl="1" w:tplc="04090003" w:tentative="1">
+      <w:start w:val="1"/>
+      <w:numFmt w:val="bullet"/>
+      <w:lvlText w:val="o"/>
+      <w:lvlJc w:val="left"/>
+      <w:pPr>
+        <w:ind w:left="1440" w:hanging="360"/>
+      </w:pPr>
+      <w:rPr>
+        <w:rFonts w:ascii="Courier New" w:hAnsi="Courier New" w:cs="Courier New" w:hint="default"/>
+      </w:rPr>
+    </w:lvl>
+    <w:lvl w:ilvl="2" w:tplc="04090005" w:tentative="1">
+      <w:start w:val="1"/>
+      <w:numFmt w:val="bullet"/>
+      <w:lvlText w:val=""/>
+      <w:lvlJc w:val="left"/>
+      <w:pPr>
+        <w:ind w:left="2160" w:hanging="360"/>
+      </w:pPr>
+      <w:rPr>
+        <w:rFonts w:ascii="Wingdings" w:hAnsi="Wingdings" w:hint="default"/>
+      </w:rPr>
+    </w:lvl>
+    <w:lvl w:ilvl="3" w:tplc="04090001" w:tentative="1">
+      <w:start w:val="1"/>
+      <w:numFmt w:val="bullet"/>
+      <w:lvlText w:val=""/>
+      <w:lvlJc w:val="left"/>
+      <w:pPr>
+        <w:ind w:left="2880" w:hanging="360"/>
+      </w:pPr>
+      <w:rPr>
+        <w:rFonts w:ascii="Symbol" w:hAnsi="Symbol" w:hint="default"/>
+      </w:rPr>
+    </w:lvl>
+    <w:lvl w:ilvl="4" w:tplc="04090003" w:tentative="1">
+      <w:start w:val="1"/>
+      <w:numFmt w:val="bullet"/>
+      <w:lvlText w:val="o"/>
+      <w:lvlJc w:val="left"/>
+      <w:pPr>
+        <w:ind w:left="3600" w:hanging="360"/>
+      </w:pPr>
+      <w:rPr>
+        <w:rFonts w:ascii="Courier New" w:hAnsi="Courier New" w:cs="Courier New" w:hint="default"/>
+      </w:rPr>
+    </w:lvl>
+    <w:lvl w:ilvl="5" w:tplc="04090005" w:tentative="1">
+      <w:start w:val="1"/>
+      <w:numFmt w:val="bullet"/>
+      <w:lvlText w:val=""/>
+      <w:lvlJc w:val="left"/>
+      <w:pPr>
+        <w:ind w:left="4320" w:hanging="360"/>
+      </w:pPr>
+      <w:rPr>
+        <w:rFonts w:ascii="Wingdings" w:hAnsi="Wingdings" w:hint="default"/>
+      </w:rPr>
+    </w:lvl>
+    <w:lvl w:ilvl="6" w:tplc="04090001" w:tentative="1">
+      <w:start w:val="1"/>
+      <w:numFmt w:val="bullet"/>
+      <w:lvlText w:val=""/>
+      <w:lvlJc w:val="left"/>
+      <w:pPr>
+        <w:ind w:left="5040" w:hanging="360"/>
+      </w:pPr>
+      <w:rPr>
+        <w:rFonts w:ascii="Symbol" w:hAnsi="Symbol" w:hint="default"/>
+      </w:rPr>
+    </w:lvl>
+    <w:lvl w:ilvl="7" w:tplc="04090003" w:tentative="1">
+      <w:start w:val="1"/>
+      <w:numFmt w:val="bullet"/>
+      <w:lvlText w:val="o"/>
+      <w:lvlJc w:val="left"/>
+      <w:pPr>
+        <w:ind w:left="5760" w:hanging="360"/>
+      </w:pPr>
+      <w:rPr>
+        <w:rFonts w:ascii="Courier New" w:hAnsi="Courier New" w:cs="Courier New" w:hint="default"/>
+      </w:rPr>
+    </w:lvl>
+    <w:lvl w:ilvl="8" w:tplc="04090005" w:tentative="1">
+      <w:start w:val="1"/>
+      <w:numFmt w:val="bullet"/>
+      <w:lvlText w:val=""/>
+      <w:lvlJc w:val="left"/>
+      <w:pPr>
+        <w:ind w:left="6480" w:hanging="360"/>
+      </w:pPr>
+      <w:rPr>
+        <w:rFonts w:ascii="Wingdings" w:hAnsi="Wingdings" w:hint="default"/>
+      </w:rPr>
+    </w:lvl>
+  </w:abstractNum>
+  <w:abstractNum w:abstractNumId="4" w15:restartNumberingAfterBreak="0">
     <w:nsid w:val="58B97065"/>
     <w:multiLevelType w:val="multilevel"/>
     <w:tmpl w:val="641ABADE"/>
@@ -6504,7 +5667,7 @@
       </w:rPr>
     </w:lvl>
   </w:abstractNum>
-  <w:abstractNum w:abstractNumId="4" w15:restartNumberingAfterBreak="0">
+  <w:abstractNum w:abstractNumId="5" w15:restartNumberingAfterBreak="0">
     <w:nsid w:val="6CC46C18"/>
     <w:multiLevelType w:val="multilevel"/>
     <w:tmpl w:val="A6442816"/>
@@ -6649,7 +5812,7 @@
       </w:rPr>
     </w:lvl>
   </w:abstractNum>
-  <w:abstractNum w:abstractNumId="5" w15:restartNumberingAfterBreak="0">
+  <w:abstractNum w:abstractNumId="6" w15:restartNumberingAfterBreak="0">
     <w:nsid w:val="756440C3"/>
     <w:multiLevelType w:val="hybridMultilevel"/>
     <w:tmpl w:val="2B3E460C"/>
@@ -6738,6 +5901,119 @@
       </w:pPr>
     </w:lvl>
   </w:abstractNum>
+  <w:abstractNum w:abstractNumId="7" w15:restartNumberingAfterBreak="0">
+    <w:nsid w:val="7BFC47AD"/>
+    <w:multiLevelType w:val="multilevel"/>
+    <w:tmpl w:val="114A9494"/>
+    <w:lvl w:ilvl="0">
+      <w:start w:val="3"/>
+      <w:numFmt w:val="decimal"/>
+      <w:lvlText w:val="%1"/>
+      <w:lvlJc w:val="left"/>
+      <w:pPr>
+        <w:ind w:left="675" w:hanging="675"/>
+      </w:pPr>
+      <w:rPr>
+        <w:rFonts w:hint="default"/>
+      </w:rPr>
+    </w:lvl>
+    <w:lvl w:ilvl="1">
+      <w:start w:val="1"/>
+      <w:numFmt w:val="decimal"/>
+      <w:lvlText w:val="%1.%2"/>
+      <w:lvlJc w:val="left"/>
+      <w:pPr>
+        <w:ind w:left="1800" w:hanging="720"/>
+      </w:pPr>
+      <w:rPr>
+        <w:rFonts w:hint="default"/>
+      </w:rPr>
+    </w:lvl>
+    <w:lvl w:ilvl="2">
+      <w:start w:val="1"/>
+      <w:numFmt w:val="decimal"/>
+      <w:lvlText w:val="%1.%2.%3"/>
+      <w:lvlJc w:val="left"/>
+      <w:pPr>
+        <w:ind w:left="3600" w:hanging="1440"/>
+      </w:pPr>
+      <w:rPr>
+        <w:rFonts w:hint="default"/>
+      </w:rPr>
+    </w:lvl>
+    <w:lvl w:ilvl="3">
+      <w:start w:val="1"/>
+      <w:numFmt w:val="decimal"/>
+      <w:lvlText w:val="%1.%2.%3.%4"/>
+      <w:lvlJc w:val="left"/>
+      <w:pPr>
+        <w:ind w:left="5040" w:hanging="1800"/>
+      </w:pPr>
+      <w:rPr>
+        <w:rFonts w:hint="default"/>
+      </w:rPr>
+    </w:lvl>
+    <w:lvl w:ilvl="4">
+      <w:start w:val="1"/>
+      <w:numFmt w:val="decimal"/>
+      <w:lvlText w:val="%1.%2.%3.%4.%5"/>
+      <w:lvlJc w:val="left"/>
+      <w:pPr>
+        <w:ind w:left="6480" w:hanging="2160"/>
+      </w:pPr>
+      <w:rPr>
+        <w:rFonts w:hint="default"/>
+      </w:rPr>
+    </w:lvl>
+    <w:lvl w:ilvl="5">
+      <w:start w:val="1"/>
+      <w:numFmt w:val="decimal"/>
+      <w:lvlText w:val="%1.%2.%3.%4.%5.%6"/>
+      <w:lvlJc w:val="left"/>
+      <w:pPr>
+        <w:ind w:left="7920" w:hanging="2520"/>
+      </w:pPr>
+      <w:rPr>
+        <w:rFonts w:hint="default"/>
+      </w:rPr>
+    </w:lvl>
+    <w:lvl w:ilvl="6">
+      <w:start w:val="1"/>
+      <w:numFmt w:val="decimal"/>
+      <w:lvlText w:val="%1.%2.%3.%4.%5.%6.%7"/>
+      <w:lvlJc w:val="left"/>
+      <w:pPr>
+        <w:ind w:left="9360" w:hanging="2880"/>
+      </w:pPr>
+      <w:rPr>
+        <w:rFonts w:hint="default"/>
+      </w:rPr>
+    </w:lvl>
+    <w:lvl w:ilvl="7">
+      <w:start w:val="1"/>
+      <w:numFmt w:val="decimal"/>
+      <w:lvlText w:val="%1.%2.%3.%4.%5.%6.%7.%8"/>
+      <w:lvlJc w:val="left"/>
+      <w:pPr>
+        <w:ind w:left="11160" w:hanging="3600"/>
+      </w:pPr>
+      <w:rPr>
+        <w:rFonts w:hint="default"/>
+      </w:rPr>
+    </w:lvl>
+    <w:lvl w:ilvl="8">
+      <w:start w:val="1"/>
+      <w:numFmt w:val="decimal"/>
+      <w:lvlText w:val="%1.%2.%3.%4.%5.%6.%7.%8.%9"/>
+      <w:lvlJc w:val="left"/>
+      <w:pPr>
+        <w:ind w:left="12600" w:hanging="3960"/>
+      </w:pPr>
+      <w:rPr>
+        <w:rFonts w:hint="default"/>
+      </w:rPr>
+    </w:lvl>
+  </w:abstractNum>
   <w:num w:numId="1" w16cid:durableId="1452745568">
     <w:abstractNumId w:val="0"/>
   </w:num>
@@ -6745,16 +6021,22 @@
     <w:abstractNumId w:val="1"/>
   </w:num>
   <w:num w:numId="3" w16cid:durableId="1854685009">
+    <w:abstractNumId w:val="6"/>
+  </w:num>
+  <w:num w:numId="4" w16cid:durableId="876353396">
     <w:abstractNumId w:val="5"/>
   </w:num>
-  <w:num w:numId="4" w16cid:durableId="876353396">
+  <w:num w:numId="5" w16cid:durableId="562377112">
+    <w:abstractNumId w:val="3"/>
+  </w:num>
+  <w:num w:numId="6" w16cid:durableId="871915255">
     <w:abstractNumId w:val="4"/>
   </w:num>
-  <w:num w:numId="5" w16cid:durableId="562377112">
+  <w:num w:numId="7" w16cid:durableId="846024085">
+    <w:abstractNumId w:val="7"/>
+  </w:num>
+  <w:num w:numId="8" w16cid:durableId="1462846893">
     <w:abstractNumId w:val="2"/>
-  </w:num>
-  <w:num w:numId="6" w16cid:durableId="871915255">
-    <w:abstractNumId w:val="3"/>
   </w:num>
 </w:numbering>
 </file>
@@ -7362,6 +6644,7 @@
   <w:style w:type="character" w:default="1" w:styleId="DefaultParagraphFont">
     <w:name w:val="Default Paragraph Font"/>
     <w:uiPriority w:val="1"/>
+    <w:semiHidden/>
     <w:unhideWhenUsed/>
   </w:style>
   <w:style w:type="table" w:default="1" w:styleId="TableNormal">

</xml_diff>